<commit_message>
Deploying to gh-pages from @ Morrison-Lab/sds@fd0ce6eae0eb887782ec68c71c0eac154800bf85 🚀
</commit_message>
<xml_diff>
--- a/estimation-handout.docx
+++ b/estimation-handout.docx
@@ -15,7 +15,7 @@
         <w:pStyle w:val="Date"/>
       </w:pPr>
       <w:r>
-        <w:t xml:space="preserve">Last modified: 2026-10-08 18:31:00 (PDT)</w:t>
+        <w:t xml:space="preserve">Last modified: 2026-10-08 21:40:49 (PDT)</w:t>
       </w:r>
     </w:p>
     <w:bookmarkStart w:id="14" w:name="scientific-models"/>
@@ -3019,7 +3019,7 @@
     </w:p>
     <w:bookmarkEnd w:id="33"/>
     <w:bookmarkEnd w:id="34"/>
-    <w:bookmarkStart w:id="109" w:name="sec-est-accuracy"/>
+    <w:bookmarkStart w:id="112" w:name="sec-est-accuracy"/>
     <w:p>
       <w:pPr>
         <w:pStyle w:val="Heading2"/>
@@ -3581,7 +3581,7 @@
       </w:r>
     </w:p>
     <w:bookmarkEnd w:id="38"/>
-    <w:bookmarkStart w:id="58" w:name="residuals"/>
+    <w:bookmarkStart w:id="61" w:name="residuals"/>
     <w:p>
       <w:pPr>
         <w:pStyle w:val="Heading3"/>
@@ -5461,7 +5461,1626 @@
         <w:t xml:space="preserve">.</w:t>
       </w:r>
     </w:p>
-    <w:bookmarkStart w:id="47" w:name="rem-prediction-error"/>
+    <w:bookmarkStart w:id="47" w:name="cor-residual-prediction-error"/>
+    <w:p>
+      <w:pPr>
+        <w:pStyle w:val="BodyText"/>
+      </w:pPr>
+      <w:r>
+        <w:rPr>
+          <w:b/>
+          <w:bCs/>
+        </w:rPr>
+        <w:t xml:space="preserve">Corollary 1 (The residual is the negative of the prediction error)</w:t>
+      </w:r>
+      <w:r>
+        <w:t xml:space="preserve"> </w:t>
+      </w:r>
+      <w:r>
+        <w:t xml:space="preserve">For an observation</w:t>
+      </w:r>
+      <w:r>
+        <w:t xml:space="preserve"> </w:t>
+      </w:r>
+      <m:oMath>
+        <m:r>
+          <m:t>i</m:t>
+        </m:r>
+      </m:oMath>
+      <w:r>
+        <w:t xml:space="preserve"> </w:t>
+      </w:r>
+      <w:r>
+        <w:t xml:space="preserve">that was used to fit the model,</w:t>
+      </w:r>
+      <w:r>
+        <w:t xml:space="preserve"> </w:t>
+      </w:r>
+      <w:r>
+        <w:t xml:space="preserve">its</w:t>
+      </w:r>
+      <w:r>
+        <w:t xml:space="preserve"> </w:t>
+      </w:r>
+      <w:hyperlink w:anchor="def-residual">
+        <w:r>
+          <w:rPr>
+            <w:rStyle w:val="Hyperlink"/>
+          </w:rPr>
+          <w:t xml:space="preserve">residual</w:t>
+        </w:r>
+      </w:hyperlink>
+      <w:r>
+        <w:t xml:space="preserve"> </w:t>
+      </w:r>
+      <w:r>
+        <w:t xml:space="preserve">is the negative of</w:t>
+      </w:r>
+      <w:r>
+        <w:t xml:space="preserve"> </w:t>
+      </w:r>
+      <w:r>
+        <w:t xml:space="preserve">the</w:t>
+      </w:r>
+      <w:r>
+        <w:t xml:space="preserve"> </w:t>
+      </w:r>
+      <w:hyperlink w:anchor="def-prediction-error">
+        <w:r>
+          <w:rPr>
+            <w:rStyle w:val="Hyperlink"/>
+          </w:rPr>
+          <w:t xml:space="preserve">prediction error</w:t>
+        </w:r>
+      </w:hyperlink>
+      <w:r>
+        <w:t xml:space="preserve"> </w:t>
+      </w:r>
+      <w:r>
+        <w:t xml:space="preserve">of its</w:t>
+      </w:r>
+      <w:r>
+        <w:t xml:space="preserve"> </w:t>
+      </w:r>
+      <w:hyperlink w:anchor="def-fitted-value">
+        <w:r>
+          <w:rPr>
+            <w:rStyle w:val="Hyperlink"/>
+          </w:rPr>
+          <w:t xml:space="preserve">fitted value</w:t>
+        </w:r>
+      </w:hyperlink>
+      <w:r>
+        <w:t xml:space="preserve">:</w:t>
+      </w:r>
+    </w:p>
+    <w:p>
+      <w:pPr>
+        <w:pStyle w:val="BodyText"/>
+      </w:pPr>
+      <m:oMathPara>
+        <m:oMathParaPr>
+          <m:jc m:val="center"/>
+        </m:oMathParaPr>
+        <m:oMath>
+          <m:sSub>
+            <m:e>
+              <m:r>
+                <m:t>r</m:t>
+              </m:r>
+            </m:e>
+            <m:sub>
+              <m:r>
+                <m:t>i</m:t>
+              </m:r>
+            </m:sub>
+          </m:sSub>
+          <m:r>
+            <m:rPr>
+              <m:sty m:val="p"/>
+            </m:rPr>
+            <m:t>=</m:t>
+          </m:r>
+          <m:r>
+            <m:rPr>
+              <m:sty m:val="p"/>
+            </m:rPr>
+            <m:t>−</m:t>
+          </m:r>
+          <m:sSub>
+            <m:e>
+              <m:r>
+                <m:t>e</m:t>
+              </m:r>
+            </m:e>
+            <m:sub>
+              <m:r>
+                <m:t>i</m:t>
+              </m:r>
+            </m:sub>
+          </m:sSub>
+          <m:r>
+            <m:rPr>
+              <m:sty m:val="p"/>
+            </m:rPr>
+            <m:t>.</m:t>
+          </m:r>
+        </m:oMath>
+      </m:oMathPara>
+    </w:p>
+    <w:bookmarkEnd w:id="47"/>
+    <w:p>
+      <w:pPr>
+        <w:pStyle w:val="FirstParagraph"/>
+      </w:pPr>
+      <w:r>
+        <w:rPr>
+          <w:i/>
+          <w:iCs/>
+        </w:rPr>
+        <w:t xml:space="preserve">Proof</w:t>
+      </w:r>
+      <w:r>
+        <w:t xml:space="preserve">. </w:t>
+      </w:r>
+      <w:r>
+        <w:t xml:space="preserve">Multiply both sides of</w:t>
+      </w:r>
+      <w:r>
+        <w:t xml:space="preserve"> </w:t>
+      </w:r>
+      <w:hyperlink w:anchor="thm-prediction-error-residual">
+        <w:r>
+          <w:rPr>
+            <w:rStyle w:val="Hyperlink"/>
+          </w:rPr>
+          <w:t xml:space="preserve">Theorem 1</w:t>
+        </w:r>
+      </w:hyperlink>
+      <w:r>
+        <w:t xml:space="preserve"> </w:t>
+      </w:r>
+      <w:r>
+        <w:t xml:space="preserve">by</w:t>
+      </w:r>
+      <w:r>
+        <w:t xml:space="preserve"> </w:t>
+      </w:r>
+      <m:oMath>
+        <m:r>
+          <m:rPr>
+            <m:sty m:val="p"/>
+          </m:rPr>
+          <m:t>−</m:t>
+        </m:r>
+        <m:r>
+          <m:t>1</m:t>
+        </m:r>
+      </m:oMath>
+      <w:r>
+        <w:t xml:space="preserve">.</w:t>
+      </w:r>
+    </w:p>
+    <w:bookmarkStart w:id="49" w:name="exm-residual-prediction-error"/>
+    <w:p>
+      <w:pPr>
+        <w:pStyle w:val="BodyText"/>
+      </w:pPr>
+      <w:r>
+        <w:rPr>
+          <w:b/>
+          <w:bCs/>
+        </w:rPr>
+        <w:t xml:space="preserve">Example 7 (Residuals and prediction errors for birth weights)</w:t>
+      </w:r>
+      <w:r>
+        <w:t xml:space="preserve"> </w:t>
+      </w:r>
+      <w:r>
+        <w:t xml:space="preserve">The</w:t>
+      </w:r>
+      <w:r>
+        <w:t xml:space="preserve"> </w:t>
+      </w:r>
+      <w:r>
+        <w:rPr>
+          <w:rStyle w:val="VerbatimChar"/>
+        </w:rPr>
+        <w:t xml:space="preserve">birthwt</w:t>
+      </w:r>
+      <w:r>
+        <w:t xml:space="preserve"> </w:t>
+      </w:r>
+      <w:r>
+        <w:t xml:space="preserve">data record the birth weight (grams) of 189 babies</w:t>
+      </w:r>
+      <w:r>
+        <w:t xml:space="preserve"> </w:t>
+      </w:r>
+      <w:r>
+        <w:t xml:space="preserve">and their mothers’ weight at the last menstrual period (pounds),</w:t>
+      </w:r>
+      <w:r>
+        <w:t xml:space="preserve"> </w:t>
+      </w:r>
+      <w:r>
+        <w:t xml:space="preserve">from a study at Baystate Medical Center in Springfield, Massachusetts</w:t>
+      </w:r>
+      <w:r>
+        <w:t xml:space="preserve"> </w:t>
+      </w:r>
+      <w:r>
+        <w:t xml:space="preserve">(Hosmer and Lemeshow 1989)</w:t>
+      </w:r>
+      <w:r>
+        <w:t xml:space="preserve">.</w:t>
+      </w:r>
+      <w:r>
+        <w:t xml:space="preserve"> </w:t>
+      </w:r>
+      <w:r>
+        <w:t xml:space="preserve">They ship with the R package</w:t>
+      </w:r>
+      <w:r>
+        <w:t xml:space="preserve"> </w:t>
+      </w:r>
+      <w:hyperlink r:id="rId48">
+        <w:r>
+          <w:rPr>
+            <w:rStyle w:val="VerbatimChar"/>
+          </w:rPr>
+          <w:t xml:space="preserve">MASS</w:t>
+        </w:r>
+      </w:hyperlink>
+      <w:r>
+        <w:t xml:space="preserve"> </w:t>
+      </w:r>
+      <w:r>
+        <w:t xml:space="preserve">(</w:t>
+      </w:r>
+      <w:r>
+        <w:rPr>
+          <w:rStyle w:val="VerbatimChar"/>
+        </w:rPr>
+        <w:t xml:space="preserve">MASS::birthwt</w:t>
+      </w:r>
+      <w:r>
+        <w:t xml:space="preserve">),</w:t>
+      </w:r>
+      <w:r>
+        <w:t xml:space="preserve"> </w:t>
+      </w:r>
+      <w:r>
+        <w:t xml:space="preserve">and this repository holds a copy at</w:t>
+      </w:r>
+      <w:r>
+        <w:t xml:space="preserve"> </w:t>
+      </w:r>
+      <w:r>
+        <w:rPr>
+          <w:rStyle w:val="VerbatimChar"/>
+        </w:rPr>
+        <w:t xml:space="preserve">data/birthwt.csv</w:t>
+      </w:r>
+      <w:r>
+        <w:t xml:space="preserve">.</w:t>
+      </w:r>
+    </w:p>
+    <w:p>
+      <w:pPr>
+        <w:pStyle w:val="BodyText"/>
+      </w:pPr>
+      <w:r>
+        <w:t xml:space="preserve">The code below fits a line predicting birth weight from mother’s weight,</w:t>
+      </w:r>
+      <w:r>
+        <w:t xml:space="preserve"> </w:t>
+      </w:r>
+      <w:r>
+        <w:t xml:space="preserve">then compares each residual with the negative of its prediction error.</w:t>
+      </w:r>
+    </w:p>
+    <w:p>
+      <w:pPr>
+        <w:pStyle w:val="Heading4"/>
+      </w:pPr>
+      <w:r>
+        <w:t xml:space="preserve">R</w:t>
+      </w:r>
+    </w:p>
+    <w:p>
+      <w:pPr>
+        <w:pStyle w:val="SourceCode"/>
+      </w:pPr>
+      <w:r>
+        <w:rPr>
+          <w:rStyle w:val="NormalTok"/>
+        </w:rPr>
+        <w:t xml:space="preserve">birthwt </w:t>
+      </w:r>
+      <w:r>
+        <w:rPr>
+          <w:rStyle w:val="OtherTok"/>
+        </w:rPr>
+        <w:t xml:space="preserve">&lt;-</w:t>
+      </w:r>
+      <w:r>
+        <w:rPr>
+          <w:rStyle w:val="NormalTok"/>
+        </w:rPr>
+        <w:t xml:space="preserve"> </w:t>
+      </w:r>
+      <w:r>
+        <w:rPr>
+          <w:rStyle w:val="FunctionTok"/>
+        </w:rPr>
+        <w:t xml:space="preserve">read.csv</w:t>
+      </w:r>
+      <w:r>
+        <w:rPr>
+          <w:rStyle w:val="NormalTok"/>
+        </w:rPr>
+        <w:t xml:space="preserve">(</w:t>
+      </w:r>
+      <w:r>
+        <w:rPr>
+          <w:rStyle w:val="StringTok"/>
+        </w:rPr>
+        <w:t xml:space="preserve">"data/birthwt.csv"</w:t>
+      </w:r>
+      <w:r>
+        <w:rPr>
+          <w:rStyle w:val="NormalTok"/>
+        </w:rPr>
+        <w:t xml:space="preserve">)</w:t>
+      </w:r>
+      <w:r>
+        <w:br/>
+      </w:r>
+      <w:r>
+        <w:rPr>
+          <w:rStyle w:val="NormalTok"/>
+        </w:rPr>
+        <w:t xml:space="preserve">fit </w:t>
+      </w:r>
+      <w:r>
+        <w:rPr>
+          <w:rStyle w:val="OtherTok"/>
+        </w:rPr>
+        <w:t xml:space="preserve">&lt;-</w:t>
+      </w:r>
+      <w:r>
+        <w:rPr>
+          <w:rStyle w:val="NormalTok"/>
+        </w:rPr>
+        <w:t xml:space="preserve"> </w:t>
+      </w:r>
+      <w:r>
+        <w:rPr>
+          <w:rStyle w:val="FunctionTok"/>
+        </w:rPr>
+        <w:t xml:space="preserve">lm</w:t>
+      </w:r>
+      <w:r>
+        <w:rPr>
+          <w:rStyle w:val="NormalTok"/>
+        </w:rPr>
+        <w:t xml:space="preserve">(bwt </w:t>
+      </w:r>
+      <w:r>
+        <w:rPr>
+          <w:rStyle w:val="SpecialCharTok"/>
+        </w:rPr>
+        <w:t xml:space="preserve">~</w:t>
+      </w:r>
+      <w:r>
+        <w:rPr>
+          <w:rStyle w:val="NormalTok"/>
+        </w:rPr>
+        <w:t xml:space="preserve"> lwt, </w:t>
+      </w:r>
+      <w:r>
+        <w:rPr>
+          <w:rStyle w:val="AttributeTok"/>
+        </w:rPr>
+        <w:t xml:space="preserve">data =</w:t>
+      </w:r>
+      <w:r>
+        <w:rPr>
+          <w:rStyle w:val="NormalTok"/>
+        </w:rPr>
+        <w:t xml:space="preserve"> birthwt)</w:t>
+      </w:r>
+      <w:r>
+        <w:br/>
+      </w:r>
+      <w:r>
+        <w:rPr>
+          <w:rStyle w:val="NormalTok"/>
+        </w:rPr>
+        <w:t xml:space="preserve">fitted_bwt </w:t>
+      </w:r>
+      <w:r>
+        <w:rPr>
+          <w:rStyle w:val="OtherTok"/>
+        </w:rPr>
+        <w:t xml:space="preserve">&lt;-</w:t>
+      </w:r>
+      <w:r>
+        <w:rPr>
+          <w:rStyle w:val="NormalTok"/>
+        </w:rPr>
+        <w:t xml:space="preserve"> </w:t>
+      </w:r>
+      <w:r>
+        <w:rPr>
+          <w:rStyle w:val="FunctionTok"/>
+        </w:rPr>
+        <w:t xml:space="preserve">fitted</w:t>
+      </w:r>
+      <w:r>
+        <w:rPr>
+          <w:rStyle w:val="NormalTok"/>
+        </w:rPr>
+        <w:t xml:space="preserve">(fit)</w:t>
+      </w:r>
+      <w:r>
+        <w:br/>
+      </w:r>
+      <w:r>
+        <w:rPr>
+          <w:rStyle w:val="NormalTok"/>
+        </w:rPr>
+        <w:t xml:space="preserve">residual </w:t>
+      </w:r>
+      <w:r>
+        <w:rPr>
+          <w:rStyle w:val="OtherTok"/>
+        </w:rPr>
+        <w:t xml:space="preserve">&lt;-</w:t>
+      </w:r>
+      <w:r>
+        <w:rPr>
+          <w:rStyle w:val="NormalTok"/>
+        </w:rPr>
+        <w:t xml:space="preserve"> birthwt</w:t>
+      </w:r>
+      <w:r>
+        <w:rPr>
+          <w:rStyle w:val="SpecialCharTok"/>
+        </w:rPr>
+        <w:t xml:space="preserve">$</w:t>
+      </w:r>
+      <w:r>
+        <w:rPr>
+          <w:rStyle w:val="NormalTok"/>
+        </w:rPr>
+        <w:t xml:space="preserve">bwt </w:t>
+      </w:r>
+      <w:r>
+        <w:rPr>
+          <w:rStyle w:val="SpecialCharTok"/>
+        </w:rPr>
+        <w:t xml:space="preserve">-</w:t>
+      </w:r>
+      <w:r>
+        <w:rPr>
+          <w:rStyle w:val="NormalTok"/>
+        </w:rPr>
+        <w:t xml:space="preserve"> fitted_bwt</w:t>
+      </w:r>
+      <w:r>
+        <w:br/>
+      </w:r>
+      <w:r>
+        <w:rPr>
+          <w:rStyle w:val="NormalTok"/>
+        </w:rPr>
+        <w:t xml:space="preserve">prediction_error </w:t>
+      </w:r>
+      <w:r>
+        <w:rPr>
+          <w:rStyle w:val="OtherTok"/>
+        </w:rPr>
+        <w:t xml:space="preserve">&lt;-</w:t>
+      </w:r>
+      <w:r>
+        <w:rPr>
+          <w:rStyle w:val="NormalTok"/>
+        </w:rPr>
+        <w:t xml:space="preserve"> fitted_bwt </w:t>
+      </w:r>
+      <w:r>
+        <w:rPr>
+          <w:rStyle w:val="SpecialCharTok"/>
+        </w:rPr>
+        <w:t xml:space="preserve">-</w:t>
+      </w:r>
+      <w:r>
+        <w:rPr>
+          <w:rStyle w:val="NormalTok"/>
+        </w:rPr>
+        <w:t xml:space="preserve"> birthwt</w:t>
+      </w:r>
+      <w:r>
+        <w:rPr>
+          <w:rStyle w:val="SpecialCharTok"/>
+        </w:rPr>
+        <w:t xml:space="preserve">$</w:t>
+      </w:r>
+      <w:r>
+        <w:rPr>
+          <w:rStyle w:val="NormalTok"/>
+        </w:rPr>
+        <w:t xml:space="preserve">bwt</w:t>
+      </w:r>
+      <w:r>
+        <w:br/>
+      </w:r>
+      <w:r>
+        <w:rPr>
+          <w:rStyle w:val="FunctionTok"/>
+        </w:rPr>
+        <w:t xml:space="preserve">head</w:t>
+      </w:r>
+      <w:r>
+        <w:rPr>
+          <w:rStyle w:val="NormalTok"/>
+        </w:rPr>
+        <w:t xml:space="preserve">(</w:t>
+      </w:r>
+      <w:r>
+        <w:rPr>
+          <w:rStyle w:val="FunctionTok"/>
+        </w:rPr>
+        <w:t xml:space="preserve">data.frame</w:t>
+      </w:r>
+      <w:r>
+        <w:rPr>
+          <w:rStyle w:val="NormalTok"/>
+        </w:rPr>
+        <w:t xml:space="preserve">(</w:t>
+      </w:r>
+      <w:r>
+        <w:br/>
+      </w:r>
+      <w:r>
+        <w:rPr>
+          <w:rStyle w:val="NormalTok"/>
+        </w:rPr>
+        <w:t xml:space="preserve">  </w:t>
+      </w:r>
+      <w:r>
+        <w:rPr>
+          <w:rStyle w:val="AttributeTok"/>
+        </w:rPr>
+        <w:t xml:space="preserve">bwt =</w:t>
+      </w:r>
+      <w:r>
+        <w:rPr>
+          <w:rStyle w:val="NormalTok"/>
+        </w:rPr>
+        <w:t xml:space="preserve"> birthwt</w:t>
+      </w:r>
+      <w:r>
+        <w:rPr>
+          <w:rStyle w:val="SpecialCharTok"/>
+        </w:rPr>
+        <w:t xml:space="preserve">$</w:t>
+      </w:r>
+      <w:r>
+        <w:rPr>
+          <w:rStyle w:val="NormalTok"/>
+        </w:rPr>
+        <w:t xml:space="preserve">bwt,</w:t>
+      </w:r>
+      <w:r>
+        <w:br/>
+      </w:r>
+      <w:r>
+        <w:rPr>
+          <w:rStyle w:val="NormalTok"/>
+        </w:rPr>
+        <w:t xml:space="preserve">  </w:t>
+      </w:r>
+      <w:r>
+        <w:rPr>
+          <w:rStyle w:val="AttributeTok"/>
+        </w:rPr>
+        <w:t xml:space="preserve">fitted =</w:t>
+      </w:r>
+      <w:r>
+        <w:rPr>
+          <w:rStyle w:val="NormalTok"/>
+        </w:rPr>
+        <w:t xml:space="preserve"> </w:t>
+      </w:r>
+      <w:r>
+        <w:rPr>
+          <w:rStyle w:val="FunctionTok"/>
+        </w:rPr>
+        <w:t xml:space="preserve">round</w:t>
+      </w:r>
+      <w:r>
+        <w:rPr>
+          <w:rStyle w:val="NormalTok"/>
+        </w:rPr>
+        <w:t xml:space="preserve">(fitted_bwt, </w:t>
+      </w:r>
+      <w:r>
+        <w:rPr>
+          <w:rStyle w:val="DecValTok"/>
+        </w:rPr>
+        <w:t xml:space="preserve">1</w:t>
+      </w:r>
+      <w:r>
+        <w:rPr>
+          <w:rStyle w:val="NormalTok"/>
+        </w:rPr>
+        <w:t xml:space="preserve">),</w:t>
+      </w:r>
+      <w:r>
+        <w:br/>
+      </w:r>
+      <w:r>
+        <w:rPr>
+          <w:rStyle w:val="NormalTok"/>
+        </w:rPr>
+        <w:t xml:space="preserve">  </w:t>
+      </w:r>
+      <w:r>
+        <w:rPr>
+          <w:rStyle w:val="AttributeTok"/>
+        </w:rPr>
+        <w:t xml:space="preserve">residual =</w:t>
+      </w:r>
+      <w:r>
+        <w:rPr>
+          <w:rStyle w:val="NormalTok"/>
+        </w:rPr>
+        <w:t xml:space="preserve"> </w:t>
+      </w:r>
+      <w:r>
+        <w:rPr>
+          <w:rStyle w:val="FunctionTok"/>
+        </w:rPr>
+        <w:t xml:space="preserve">round</w:t>
+      </w:r>
+      <w:r>
+        <w:rPr>
+          <w:rStyle w:val="NormalTok"/>
+        </w:rPr>
+        <w:t xml:space="preserve">(residual, </w:t>
+      </w:r>
+      <w:r>
+        <w:rPr>
+          <w:rStyle w:val="DecValTok"/>
+        </w:rPr>
+        <w:t xml:space="preserve">1</w:t>
+      </w:r>
+      <w:r>
+        <w:rPr>
+          <w:rStyle w:val="NormalTok"/>
+        </w:rPr>
+        <w:t xml:space="preserve">),</w:t>
+      </w:r>
+      <w:r>
+        <w:br/>
+      </w:r>
+      <w:r>
+        <w:rPr>
+          <w:rStyle w:val="NormalTok"/>
+        </w:rPr>
+        <w:t xml:space="preserve">  </w:t>
+      </w:r>
+      <w:r>
+        <w:rPr>
+          <w:rStyle w:val="AttributeTok"/>
+        </w:rPr>
+        <w:t xml:space="preserve">minus_prediction_error =</w:t>
+      </w:r>
+      <w:r>
+        <w:rPr>
+          <w:rStyle w:val="NormalTok"/>
+        </w:rPr>
+        <w:t xml:space="preserve"> </w:t>
+      </w:r>
+      <w:r>
+        <w:rPr>
+          <w:rStyle w:val="FunctionTok"/>
+        </w:rPr>
+        <w:t xml:space="preserve">round</w:t>
+      </w:r>
+      <w:r>
+        <w:rPr>
+          <w:rStyle w:val="NormalTok"/>
+        </w:rPr>
+        <w:t xml:space="preserve">(</w:t>
+      </w:r>
+      <w:r>
+        <w:rPr>
+          <w:rStyle w:val="SpecialCharTok"/>
+        </w:rPr>
+        <w:t xml:space="preserve">-</w:t>
+      </w:r>
+      <w:r>
+        <w:rPr>
+          <w:rStyle w:val="NormalTok"/>
+        </w:rPr>
+        <w:t xml:space="preserve">prediction_error, </w:t>
+      </w:r>
+      <w:r>
+        <w:rPr>
+          <w:rStyle w:val="DecValTok"/>
+        </w:rPr>
+        <w:t xml:space="preserve">1</w:t>
+      </w:r>
+      <w:r>
+        <w:rPr>
+          <w:rStyle w:val="NormalTok"/>
+        </w:rPr>
+        <w:t xml:space="preserve">)</w:t>
+      </w:r>
+      <w:r>
+        <w:br/>
+      </w:r>
+      <w:r>
+        <w:rPr>
+          <w:rStyle w:val="NormalTok"/>
+        </w:rPr>
+        <w:t xml:space="preserve">))</w:t>
+      </w:r>
+      <w:r>
+        <w:br/>
+      </w:r>
+      <w:r>
+        <w:rPr>
+          <w:rStyle w:val="CommentTok"/>
+        </w:rPr>
+        <w:t xml:space="preserve">#&gt; # A tibble: 6 × 4</w:t>
+      </w:r>
+      <w:r>
+        <w:br/>
+      </w:r>
+      <w:r>
+        <w:rPr>
+          <w:rStyle w:val="CommentTok"/>
+        </w:rPr>
+        <w:t xml:space="preserve">#&gt;     bwt fitted residual minus_prediction_error</w:t>
+      </w:r>
+      <w:r>
+        <w:br/>
+      </w:r>
+      <w:r>
+        <w:rPr>
+          <w:rStyle w:val="CommentTok"/>
+        </w:rPr>
+        <w:t xml:space="preserve">#&gt;   &lt;int&gt;  &lt;dbl&gt;    &lt;dbl&gt;                  &lt;dbl&gt;</w:t>
+      </w:r>
+      <w:r>
+        <w:br/>
+      </w:r>
+      <w:r>
+        <w:rPr>
+          <w:rStyle w:val="CommentTok"/>
+        </w:rPr>
+        <w:t xml:space="preserve">#&gt; 1  2523  3176.    -653.                  -653.</w:t>
+      </w:r>
+      <w:r>
+        <w:br/>
+      </w:r>
+      <w:r>
+        <w:rPr>
+          <w:rStyle w:val="CommentTok"/>
+        </w:rPr>
+        <w:t xml:space="preserve">#&gt; 2  2551  3056.    -505.                  -505.</w:t>
+      </w:r>
+      <w:r>
+        <w:br/>
+      </w:r>
+      <w:r>
+        <w:rPr>
+          <w:rStyle w:val="CommentTok"/>
+        </w:rPr>
+        <w:t xml:space="preserve">#&gt; 3  2557  2835.    -278.                  -278.</w:t>
+      </w:r>
+      <w:r>
+        <w:br/>
+      </w:r>
+      <w:r>
+        <w:rPr>
+          <w:rStyle w:val="CommentTok"/>
+        </w:rPr>
+        <w:t xml:space="preserve">#&gt; 4  2594  2848     -254                   -254 </w:t>
+      </w:r>
+      <w:r>
+        <w:br/>
+      </w:r>
+      <w:r>
+        <w:rPr>
+          <w:rStyle w:val="CommentTok"/>
+        </w:rPr>
+        <w:t xml:space="preserve">#&gt; 5  2600  2844.    -244.                  -244.</w:t>
+      </w:r>
+      <w:r>
+        <w:br/>
+      </w:r>
+      <w:r>
+        <w:rPr>
+          <w:rStyle w:val="CommentTok"/>
+        </w:rPr>
+        <w:t xml:space="preserve">#&gt; 6  2622  2919.    -297.                  -297.</w:t>
+      </w:r>
+      <w:r>
+        <w:br/>
+      </w:r>
+      <w:r>
+        <w:rPr>
+          <w:rStyle w:val="FunctionTok"/>
+        </w:rPr>
+        <w:t xml:space="preserve">max</w:t>
+      </w:r>
+      <w:r>
+        <w:rPr>
+          <w:rStyle w:val="NormalTok"/>
+        </w:rPr>
+        <w:t xml:space="preserve">(</w:t>
+      </w:r>
+      <w:r>
+        <w:rPr>
+          <w:rStyle w:val="FunctionTok"/>
+        </w:rPr>
+        <w:t xml:space="preserve">abs</w:t>
+      </w:r>
+      <w:r>
+        <w:rPr>
+          <w:rStyle w:val="NormalTok"/>
+        </w:rPr>
+        <w:t xml:space="preserve">(residual </w:t>
+      </w:r>
+      <w:r>
+        <w:rPr>
+          <w:rStyle w:val="SpecialCharTok"/>
+        </w:rPr>
+        <w:t xml:space="preserve">-</w:t>
+      </w:r>
+      <w:r>
+        <w:rPr>
+          <w:rStyle w:val="NormalTok"/>
+        </w:rPr>
+        <w:t xml:space="preserve"> (</w:t>
+      </w:r>
+      <w:r>
+        <w:rPr>
+          <w:rStyle w:val="SpecialCharTok"/>
+        </w:rPr>
+        <w:t xml:space="preserve">-</w:t>
+      </w:r>
+      <w:r>
+        <w:rPr>
+          <w:rStyle w:val="NormalTok"/>
+        </w:rPr>
+        <w:t xml:space="preserve">prediction_error)))</w:t>
+      </w:r>
+      <w:r>
+        <w:br/>
+      </w:r>
+      <w:r>
+        <w:rPr>
+          <w:rStyle w:val="CommentTok"/>
+        </w:rPr>
+        <w:t xml:space="preserve">#&gt; [1] 0</w:t>
+      </w:r>
+    </w:p>
+    <w:p>
+      <w:pPr>
+        <w:pStyle w:val="Heading4"/>
+      </w:pPr>
+      <w:r>
+        <w:t xml:space="preserve">Python</w:t>
+      </w:r>
+    </w:p>
+    <w:p>
+      <w:pPr>
+        <w:pStyle w:val="SourceCode"/>
+      </w:pPr>
+      <w:r>
+        <w:rPr>
+          <w:rStyle w:val="ImportTok"/>
+        </w:rPr>
+        <w:t xml:space="preserve">import</w:t>
+      </w:r>
+      <w:r>
+        <w:rPr>
+          <w:rStyle w:val="NormalTok"/>
+        </w:rPr>
+        <w:t xml:space="preserve"> numpy </w:t>
+      </w:r>
+      <w:r>
+        <w:rPr>
+          <w:rStyle w:val="ImportTok"/>
+        </w:rPr>
+        <w:t xml:space="preserve">as</w:t>
+      </w:r>
+      <w:r>
+        <w:rPr>
+          <w:rStyle w:val="NormalTok"/>
+        </w:rPr>
+        <w:t xml:space="preserve"> np</w:t>
+      </w:r>
+      <w:r>
+        <w:br/>
+      </w:r>
+      <w:r>
+        <w:rPr>
+          <w:rStyle w:val="ImportTok"/>
+        </w:rPr>
+        <w:t xml:space="preserve">import</w:t>
+      </w:r>
+      <w:r>
+        <w:rPr>
+          <w:rStyle w:val="NormalTok"/>
+        </w:rPr>
+        <w:t xml:space="preserve"> pandas </w:t>
+      </w:r>
+      <w:r>
+        <w:rPr>
+          <w:rStyle w:val="ImportTok"/>
+        </w:rPr>
+        <w:t xml:space="preserve">as</w:t>
+      </w:r>
+      <w:r>
+        <w:rPr>
+          <w:rStyle w:val="NormalTok"/>
+        </w:rPr>
+        <w:t xml:space="preserve"> pd</w:t>
+      </w:r>
+      <w:r>
+        <w:br/>
+      </w:r>
+      <w:r>
+        <w:br/>
+      </w:r>
+      <w:r>
+        <w:rPr>
+          <w:rStyle w:val="NormalTok"/>
+        </w:rPr>
+        <w:t xml:space="preserve">birthwt </w:t>
+      </w:r>
+      <w:r>
+        <w:rPr>
+          <w:rStyle w:val="OperatorTok"/>
+        </w:rPr>
+        <w:t xml:space="preserve">=</w:t>
+      </w:r>
+      <w:r>
+        <w:rPr>
+          <w:rStyle w:val="NormalTok"/>
+        </w:rPr>
+        <w:t xml:space="preserve"> pd.read_csv(</w:t>
+      </w:r>
+      <w:r>
+        <w:rPr>
+          <w:rStyle w:val="StringTok"/>
+        </w:rPr>
+        <w:t xml:space="preserve">"data/birthwt.csv"</w:t>
+      </w:r>
+      <w:r>
+        <w:rPr>
+          <w:rStyle w:val="NormalTok"/>
+        </w:rPr>
+        <w:t xml:space="preserve">)</w:t>
+      </w:r>
+      <w:r>
+        <w:br/>
+      </w:r>
+      <w:r>
+        <w:rPr>
+          <w:rStyle w:val="NormalTok"/>
+        </w:rPr>
+        <w:t xml:space="preserve">X </w:t>
+      </w:r>
+      <w:r>
+        <w:rPr>
+          <w:rStyle w:val="OperatorTok"/>
+        </w:rPr>
+        <w:t xml:space="preserve">=</w:t>
+      </w:r>
+      <w:r>
+        <w:rPr>
+          <w:rStyle w:val="NormalTok"/>
+        </w:rPr>
+        <w:t xml:space="preserve"> np.column_stack([np.ones(</w:t>
+      </w:r>
+      <w:r>
+        <w:rPr>
+          <w:rStyle w:val="BuiltInTok"/>
+        </w:rPr>
+        <w:t xml:space="preserve">len</w:t>
+      </w:r>
+      <w:r>
+        <w:rPr>
+          <w:rStyle w:val="NormalTok"/>
+        </w:rPr>
+        <w:t xml:space="preserve">(birthwt)), birthwt[</w:t>
+      </w:r>
+      <w:r>
+        <w:rPr>
+          <w:rStyle w:val="StringTok"/>
+        </w:rPr>
+        <w:t xml:space="preserve">"lwt"</w:t>
+      </w:r>
+      <w:r>
+        <w:rPr>
+          <w:rStyle w:val="NormalTok"/>
+        </w:rPr>
+        <w:t xml:space="preserve">]])</w:t>
+      </w:r>
+      <w:r>
+        <w:br/>
+      </w:r>
+      <w:r>
+        <w:rPr>
+          <w:rStyle w:val="NormalTok"/>
+        </w:rPr>
+        <w:t xml:space="preserve">y </w:t>
+      </w:r>
+      <w:r>
+        <w:rPr>
+          <w:rStyle w:val="OperatorTok"/>
+        </w:rPr>
+        <w:t xml:space="preserve">=</w:t>
+      </w:r>
+      <w:r>
+        <w:rPr>
+          <w:rStyle w:val="NormalTok"/>
+        </w:rPr>
+        <w:t xml:space="preserve"> birthwt[</w:t>
+      </w:r>
+      <w:r>
+        <w:rPr>
+          <w:rStyle w:val="StringTok"/>
+        </w:rPr>
+        <w:t xml:space="preserve">"bwt"</w:t>
+      </w:r>
+      <w:r>
+        <w:rPr>
+          <w:rStyle w:val="NormalTok"/>
+        </w:rPr>
+        <w:t xml:space="preserve">].to_numpy(dtype</w:t>
+      </w:r>
+      <w:r>
+        <w:rPr>
+          <w:rStyle w:val="OperatorTok"/>
+        </w:rPr>
+        <w:t xml:space="preserve">=</w:t>
+      </w:r>
+      <w:r>
+        <w:rPr>
+          <w:rStyle w:val="BuiltInTok"/>
+        </w:rPr>
+        <w:t xml:space="preserve">float</w:t>
+      </w:r>
+      <w:r>
+        <w:rPr>
+          <w:rStyle w:val="NormalTok"/>
+        </w:rPr>
+        <w:t xml:space="preserve">)</w:t>
+      </w:r>
+      <w:r>
+        <w:br/>
+      </w:r>
+      <w:r>
+        <w:rPr>
+          <w:rStyle w:val="NormalTok"/>
+        </w:rPr>
+        <w:t xml:space="preserve">coef </w:t>
+      </w:r>
+      <w:r>
+        <w:rPr>
+          <w:rStyle w:val="OperatorTok"/>
+        </w:rPr>
+        <w:t xml:space="preserve">=</w:t>
+      </w:r>
+      <w:r>
+        <w:rPr>
+          <w:rStyle w:val="NormalTok"/>
+        </w:rPr>
+        <w:t xml:space="preserve"> np.linalg.lstsq(X, y, rcond</w:t>
+      </w:r>
+      <w:r>
+        <w:rPr>
+          <w:rStyle w:val="OperatorTok"/>
+        </w:rPr>
+        <w:t xml:space="preserve">=</w:t>
+      </w:r>
+      <w:r>
+        <w:rPr>
+          <w:rStyle w:val="VariableTok"/>
+        </w:rPr>
+        <w:t xml:space="preserve">None</w:t>
+      </w:r>
+      <w:r>
+        <w:rPr>
+          <w:rStyle w:val="NormalTok"/>
+        </w:rPr>
+        <w:t xml:space="preserve">)[</w:t>
+      </w:r>
+      <w:r>
+        <w:rPr>
+          <w:rStyle w:val="DecValTok"/>
+        </w:rPr>
+        <w:t xml:space="preserve">0</w:t>
+      </w:r>
+      <w:r>
+        <w:rPr>
+          <w:rStyle w:val="NormalTok"/>
+        </w:rPr>
+        <w:t xml:space="preserve">]</w:t>
+      </w:r>
+      <w:r>
+        <w:br/>
+      </w:r>
+      <w:r>
+        <w:rPr>
+          <w:rStyle w:val="NormalTok"/>
+        </w:rPr>
+        <w:t xml:space="preserve">fitted_bwt </w:t>
+      </w:r>
+      <w:r>
+        <w:rPr>
+          <w:rStyle w:val="OperatorTok"/>
+        </w:rPr>
+        <w:t xml:space="preserve">=</w:t>
+      </w:r>
+      <w:r>
+        <w:rPr>
+          <w:rStyle w:val="NormalTok"/>
+        </w:rPr>
+        <w:t xml:space="preserve"> X </w:t>
+      </w:r>
+      <w:r>
+        <w:rPr>
+          <w:rStyle w:val="OperatorTok"/>
+        </w:rPr>
+        <w:t xml:space="preserve">@</w:t>
+      </w:r>
+      <w:r>
+        <w:rPr>
+          <w:rStyle w:val="NormalTok"/>
+        </w:rPr>
+        <w:t xml:space="preserve"> coef</w:t>
+      </w:r>
+      <w:r>
+        <w:br/>
+      </w:r>
+      <w:r>
+        <w:rPr>
+          <w:rStyle w:val="NormalTok"/>
+        </w:rPr>
+        <w:t xml:space="preserve">residual </w:t>
+      </w:r>
+      <w:r>
+        <w:rPr>
+          <w:rStyle w:val="OperatorTok"/>
+        </w:rPr>
+        <w:t xml:space="preserve">=</w:t>
+      </w:r>
+      <w:r>
+        <w:rPr>
+          <w:rStyle w:val="NormalTok"/>
+        </w:rPr>
+        <w:t xml:space="preserve"> y </w:t>
+      </w:r>
+      <w:r>
+        <w:rPr>
+          <w:rStyle w:val="OperatorTok"/>
+        </w:rPr>
+        <w:t xml:space="preserve">-</w:t>
+      </w:r>
+      <w:r>
+        <w:rPr>
+          <w:rStyle w:val="NormalTok"/>
+        </w:rPr>
+        <w:t xml:space="preserve"> fitted_bwt</w:t>
+      </w:r>
+      <w:r>
+        <w:br/>
+      </w:r>
+      <w:r>
+        <w:rPr>
+          <w:rStyle w:val="NormalTok"/>
+        </w:rPr>
+        <w:t xml:space="preserve">prediction_error </w:t>
+      </w:r>
+      <w:r>
+        <w:rPr>
+          <w:rStyle w:val="OperatorTok"/>
+        </w:rPr>
+        <w:t xml:space="preserve">=</w:t>
+      </w:r>
+      <w:r>
+        <w:rPr>
+          <w:rStyle w:val="NormalTok"/>
+        </w:rPr>
+        <w:t xml:space="preserve"> fitted_bwt </w:t>
+      </w:r>
+      <w:r>
+        <w:rPr>
+          <w:rStyle w:val="OperatorTok"/>
+        </w:rPr>
+        <w:t xml:space="preserve">-</w:t>
+      </w:r>
+      <w:r>
+        <w:rPr>
+          <w:rStyle w:val="NormalTok"/>
+        </w:rPr>
+        <w:t xml:space="preserve"> y</w:t>
+      </w:r>
+      <w:r>
+        <w:br/>
+      </w:r>
+      <w:r>
+        <w:rPr>
+          <w:rStyle w:val="BuiltInTok"/>
+        </w:rPr>
+        <w:t xml:space="preserve">print</w:t>
+      </w:r>
+      <w:r>
+        <w:rPr>
+          <w:rStyle w:val="NormalTok"/>
+        </w:rPr>
+        <w:t xml:space="preserve">(pd.DataFrame({</w:t>
+      </w:r>
+      <w:r>
+        <w:br/>
+      </w:r>
+      <w:r>
+        <w:rPr>
+          <w:rStyle w:val="NormalTok"/>
+        </w:rPr>
+        <w:t xml:space="preserve">    </w:t>
+      </w:r>
+      <w:r>
+        <w:rPr>
+          <w:rStyle w:val="StringTok"/>
+        </w:rPr>
+        <w:t xml:space="preserve">"bwt"</w:t>
+      </w:r>
+      <w:r>
+        <w:rPr>
+          <w:rStyle w:val="NormalTok"/>
+        </w:rPr>
+        <w:t xml:space="preserve">: y,</w:t>
+      </w:r>
+      <w:r>
+        <w:br/>
+      </w:r>
+      <w:r>
+        <w:rPr>
+          <w:rStyle w:val="NormalTok"/>
+        </w:rPr>
+        <w:t xml:space="preserve">    </w:t>
+      </w:r>
+      <w:r>
+        <w:rPr>
+          <w:rStyle w:val="StringTok"/>
+        </w:rPr>
+        <w:t xml:space="preserve">"fitted"</w:t>
+      </w:r>
+      <w:r>
+        <w:rPr>
+          <w:rStyle w:val="NormalTok"/>
+        </w:rPr>
+        <w:t xml:space="preserve">: fitted_bwt.</w:t>
+      </w:r>
+      <w:r>
+        <w:rPr>
+          <w:rStyle w:val="BuiltInTok"/>
+        </w:rPr>
+        <w:t xml:space="preserve">round</w:t>
+      </w:r>
+      <w:r>
+        <w:rPr>
+          <w:rStyle w:val="NormalTok"/>
+        </w:rPr>
+        <w:t xml:space="preserve">(</w:t>
+      </w:r>
+      <w:r>
+        <w:rPr>
+          <w:rStyle w:val="DecValTok"/>
+        </w:rPr>
+        <w:t xml:space="preserve">1</w:t>
+      </w:r>
+      <w:r>
+        <w:rPr>
+          <w:rStyle w:val="NormalTok"/>
+        </w:rPr>
+        <w:t xml:space="preserve">),</w:t>
+      </w:r>
+      <w:r>
+        <w:br/>
+      </w:r>
+      <w:r>
+        <w:rPr>
+          <w:rStyle w:val="NormalTok"/>
+        </w:rPr>
+        <w:t xml:space="preserve">    </w:t>
+      </w:r>
+      <w:r>
+        <w:rPr>
+          <w:rStyle w:val="StringTok"/>
+        </w:rPr>
+        <w:t xml:space="preserve">"residual"</w:t>
+      </w:r>
+      <w:r>
+        <w:rPr>
+          <w:rStyle w:val="NormalTok"/>
+        </w:rPr>
+        <w:t xml:space="preserve">: residual.</w:t>
+      </w:r>
+      <w:r>
+        <w:rPr>
+          <w:rStyle w:val="BuiltInTok"/>
+        </w:rPr>
+        <w:t xml:space="preserve">round</w:t>
+      </w:r>
+      <w:r>
+        <w:rPr>
+          <w:rStyle w:val="NormalTok"/>
+        </w:rPr>
+        <w:t xml:space="preserve">(</w:t>
+      </w:r>
+      <w:r>
+        <w:rPr>
+          <w:rStyle w:val="DecValTok"/>
+        </w:rPr>
+        <w:t xml:space="preserve">1</w:t>
+      </w:r>
+      <w:r>
+        <w:rPr>
+          <w:rStyle w:val="NormalTok"/>
+        </w:rPr>
+        <w:t xml:space="preserve">),</w:t>
+      </w:r>
+      <w:r>
+        <w:br/>
+      </w:r>
+      <w:r>
+        <w:rPr>
+          <w:rStyle w:val="NormalTok"/>
+        </w:rPr>
+        <w:t xml:space="preserve">    </w:t>
+      </w:r>
+      <w:r>
+        <w:rPr>
+          <w:rStyle w:val="StringTok"/>
+        </w:rPr>
+        <w:t xml:space="preserve">"minus_prediction_error"</w:t>
+      </w:r>
+      <w:r>
+        <w:rPr>
+          <w:rStyle w:val="NormalTok"/>
+        </w:rPr>
+        <w:t xml:space="preserve">: (</w:t>
+      </w:r>
+      <w:r>
+        <w:rPr>
+          <w:rStyle w:val="OperatorTok"/>
+        </w:rPr>
+        <w:t xml:space="preserve">-</w:t>
+      </w:r>
+      <w:r>
+        <w:rPr>
+          <w:rStyle w:val="NormalTok"/>
+        </w:rPr>
+        <w:t xml:space="preserve">prediction_error).</w:t>
+      </w:r>
+      <w:r>
+        <w:rPr>
+          <w:rStyle w:val="BuiltInTok"/>
+        </w:rPr>
+        <w:t xml:space="preserve">round</w:t>
+      </w:r>
+      <w:r>
+        <w:rPr>
+          <w:rStyle w:val="NormalTok"/>
+        </w:rPr>
+        <w:t xml:space="preserve">(</w:t>
+      </w:r>
+      <w:r>
+        <w:rPr>
+          <w:rStyle w:val="DecValTok"/>
+        </w:rPr>
+        <w:t xml:space="preserve">1</w:t>
+      </w:r>
+      <w:r>
+        <w:rPr>
+          <w:rStyle w:val="NormalTok"/>
+        </w:rPr>
+        <w:t xml:space="preserve">),</w:t>
+      </w:r>
+      <w:r>
+        <w:br/>
+      </w:r>
+      <w:r>
+        <w:rPr>
+          <w:rStyle w:val="NormalTok"/>
+        </w:rPr>
+        <w:t xml:space="preserve">}).head())</w:t>
+      </w:r>
+      <w:r>
+        <w:br/>
+      </w:r>
+      <w:r>
+        <w:rPr>
+          <w:rStyle w:val="CommentTok"/>
+        </w:rPr>
+        <w:t xml:space="preserve">#&gt;       bwt  fitted  residual  minus_prediction_error</w:t>
+      </w:r>
+      <w:r>
+        <w:br/>
+      </w:r>
+      <w:r>
+        <w:rPr>
+          <w:rStyle w:val="CommentTok"/>
+        </w:rPr>
+        <w:t xml:space="preserve">#&gt; 0  2523.0  3175.7    -652.7                  -652.7</w:t>
+      </w:r>
+      <w:r>
+        <w:br/>
+      </w:r>
+      <w:r>
+        <w:rPr>
+          <w:rStyle w:val="CommentTok"/>
+        </w:rPr>
+        <w:t xml:space="preserve">#&gt; 1  2551.0  3056.1    -505.1                  -505.1</w:t>
+      </w:r>
+      <w:r>
+        <w:br/>
+      </w:r>
+      <w:r>
+        <w:rPr>
+          <w:rStyle w:val="CommentTok"/>
+        </w:rPr>
+        <w:t xml:space="preserve">#&gt; 2  2557.0  2834.7    -277.7                  -277.7</w:t>
+      </w:r>
+      <w:r>
+        <w:br/>
+      </w:r>
+      <w:r>
+        <w:rPr>
+          <w:rStyle w:val="CommentTok"/>
+        </w:rPr>
+        <w:t xml:space="preserve">#&gt; 3  2594.0  2848.0    -254.0                  -254.0</w:t>
+      </w:r>
+      <w:r>
+        <w:br/>
+      </w:r>
+      <w:r>
+        <w:rPr>
+          <w:rStyle w:val="CommentTok"/>
+        </w:rPr>
+        <w:t xml:space="preserve">#&gt; 4  2600.0  2843.5    -243.5                  -243.5</w:t>
+      </w:r>
+      <w:r>
+        <w:br/>
+      </w:r>
+      <w:r>
+        <w:rPr>
+          <w:rStyle w:val="BuiltInTok"/>
+        </w:rPr>
+        <w:t xml:space="preserve">print</w:t>
+      </w:r>
+      <w:r>
+        <w:rPr>
+          <w:rStyle w:val="NormalTok"/>
+        </w:rPr>
+        <w:t xml:space="preserve">(np.</w:t>
+      </w:r>
+      <w:r>
+        <w:rPr>
+          <w:rStyle w:val="BuiltInTok"/>
+        </w:rPr>
+        <w:t xml:space="preserve">max</w:t>
+      </w:r>
+      <w:r>
+        <w:rPr>
+          <w:rStyle w:val="NormalTok"/>
+        </w:rPr>
+        <w:t xml:space="preserve">(np.</w:t>
+      </w:r>
+      <w:r>
+        <w:rPr>
+          <w:rStyle w:val="BuiltInTok"/>
+        </w:rPr>
+        <w:t xml:space="preserve">abs</w:t>
+      </w:r>
+      <w:r>
+        <w:rPr>
+          <w:rStyle w:val="NormalTok"/>
+        </w:rPr>
+        <w:t xml:space="preserve">(residual </w:t>
+      </w:r>
+      <w:r>
+        <w:rPr>
+          <w:rStyle w:val="OperatorTok"/>
+        </w:rPr>
+        <w:t xml:space="preserve">-</w:t>
+      </w:r>
+      <w:r>
+        <w:rPr>
+          <w:rStyle w:val="NormalTok"/>
+        </w:rPr>
+        <w:t xml:space="preserve"> (</w:t>
+      </w:r>
+      <w:r>
+        <w:rPr>
+          <w:rStyle w:val="OperatorTok"/>
+        </w:rPr>
+        <w:t xml:space="preserve">-</w:t>
+      </w:r>
+      <w:r>
+        <w:rPr>
+          <w:rStyle w:val="NormalTok"/>
+        </w:rPr>
+        <w:t xml:space="preserve">prediction_error))))</w:t>
+      </w:r>
+      <w:r>
+        <w:br/>
+      </w:r>
+      <w:r>
+        <w:rPr>
+          <w:rStyle w:val="CommentTok"/>
+        </w:rPr>
+        <w:t xml:space="preserve">#&gt; 0.0</w:t>
+      </w:r>
+    </w:p>
+    <w:p>
+      <w:pPr>
+        <w:pStyle w:val="FirstParagraph"/>
+      </w:pPr>
+      <w:r>
+        <w:t xml:space="preserve">The last two columns agree in every row,</w:t>
+      </w:r>
+      <w:r>
+        <w:t xml:space="preserve"> </w:t>
+      </w:r>
+      <w:r>
+        <w:t xml:space="preserve">and the largest difference between them over all</w:t>
+      </w:r>
+      <w:r>
+        <w:t xml:space="preserve"> </w:t>
+      </w:r>
+      <w:r>
+        <w:t xml:space="preserve">189 babies is 0,</w:t>
+      </w:r>
+      <w:r>
+        <w:t xml:space="preserve"> </w:t>
+      </w:r>
+      <w:r>
+        <w:t xml:space="preserve">as</w:t>
+      </w:r>
+      <w:r>
+        <w:t xml:space="preserve"> </w:t>
+      </w:r>
+      <w:hyperlink w:anchor="cor-residual-prediction-error">
+        <w:r>
+          <w:rPr>
+            <w:rStyle w:val="Hyperlink"/>
+          </w:rPr>
+          <w:t xml:space="preserve">Corollary 1</w:t>
+        </w:r>
+      </w:hyperlink>
+      <w:r>
+        <w:t xml:space="preserve"> </w:t>
+      </w:r>
+      <w:r>
+        <w:t xml:space="preserve">says.</w:t>
+      </w:r>
+    </w:p>
+    <w:bookmarkEnd w:id="49"/>
+    <w:bookmarkStart w:id="50" w:name="rem-prediction-error"/>
     <w:p>
       <w:pPr>
         <w:pStyle w:val="BodyText"/>
@@ -5718,8 +7337,8 @@
         <w:t xml:space="preserve">so the two differ only in orientation.</w:t>
       </w:r>
     </w:p>
-    <w:bookmarkEnd w:id="47"/>
-    <w:bookmarkStart w:id="48" w:name="def-prediction-mse"/>
+    <w:bookmarkEnd w:id="50"/>
+    <w:bookmarkStart w:id="51" w:name="def-prediction-mse"/>
     <w:p>
       <w:pPr>
         <w:pStyle w:val="BodyText"/>
@@ -6018,8 +7637,8 @@
         </m:oMath>
       </m:oMathPara>
     </w:p>
-    <w:bookmarkEnd w:id="48"/>
-    <w:bookmarkStart w:id="51" w:name="rem-prediction-mse"/>
+    <w:bookmarkEnd w:id="51"/>
+    <w:bookmarkStart w:id="54" w:name="rem-prediction-mse"/>
     <w:p>
       <w:pPr>
         <w:pStyle w:val="FirstParagraph"/>
@@ -6086,7 +7705,7 @@
       <w:r>
         <w:t xml:space="preserve"> </w:t>
       </w:r>
-      <w:hyperlink r:id="rId49">
+      <w:hyperlink r:id="rId52">
         <w:r>
           <w:rPr>
             <w:rStyle w:val="Hyperlink"/>
@@ -6114,7 +7733,7 @@
       <w:r>
         <w:t xml:space="preserve">(</w:t>
       </w:r>
-      <w:hyperlink r:id="rId50">
+      <w:hyperlink r:id="rId53">
         <w:r>
           <w:rPr>
             <w:rStyle w:val="Hyperlink"/>
@@ -6322,8 +7941,8 @@
         </m:oMath>
       </m:oMathPara>
     </w:p>
-    <w:bookmarkEnd w:id="51"/>
-    <w:bookmarkStart w:id="57" w:name="exm-fitted-residual-error"/>
+    <w:bookmarkEnd w:id="54"/>
+    <w:bookmarkStart w:id="60" w:name="exm-fitted-residual-error"/>
     <w:p>
       <w:pPr>
         <w:pStyle w:val="FirstParagraph"/>
@@ -6333,7 +7952,7 @@
           <w:b/>
           <w:bCs/>
         </w:rPr>
-        <w:t xml:space="preserve">Example 7 (Fitted values, residuals, and prediction errors for three points)</w:t>
+        <w:t xml:space="preserve">Example 8 (Fitted values, residuals, and prediction errors for three points)</w:t>
       </w:r>
       <w:r>
         <w:t xml:space="preserve"> </w:t>
@@ -6507,7 +8126,7 @@
       <w:r>
         <w:t xml:space="preserve"> </w:t>
       </w:r>
-      <w:hyperlink r:id="rId52">
+      <w:hyperlink r:id="rId55">
         <w:r>
           <w:rPr>
             <w:rStyle w:val="Hyperlink"/>
@@ -7039,7 +8658,7 @@
       <w:tr>
         <w:tc>
           <w:tcPr/>
-          <w:bookmarkStart w:id="56" w:name="fig-fitted-residual-error"/>
+          <w:bookmarkStart w:id="59" w:name="fig-fitted-residual-error"/>
           <w:p>
             <w:pPr>
               <w:pStyle w:val="SourceCode"/>
@@ -8060,18 +9679,18 @@
                 <wp:inline>
                   <wp:extent cx="4620126" cy="3696101"/>
                   <wp:effectExtent b="0" l="0" r="0" t="0"/>
-                  <wp:docPr descr="" title="" id="54" name="Picture"/>
+                  <wp:docPr descr="" title="" id="57" name="Picture"/>
                   <a:graphic>
                     <a:graphicData uri="http://schemas.openxmlformats.org/drawingml/2006/picture">
                       <pic:pic>
                         <pic:nvPicPr>
-                          <pic:cNvPr descr="estimation_files/figure-docx/unnamed-chunk-1-1.png" id="55" name="Picture"/>
+                          <pic:cNvPr descr="estimation_files/figure-docx/unnamed-chunk-1-1.png" id="58" name="Picture"/>
                           <pic:cNvPicPr>
                             <a:picLocks noChangeArrowheads="1" noChangeAspect="1"/>
                           </pic:cNvPicPr>
                         </pic:nvPicPr>
                         <pic:blipFill>
-                          <a:blip r:embed="rId53"/>
+                          <a:blip r:embed="rId56"/>
                           <a:stretch>
                             <a:fillRect/>
                           </a:stretch>
@@ -8123,7 +9742,7 @@
               <w:t xml:space="preserve">which points up from its fitted value to its observed outcome</w:t>
             </w:r>
           </w:p>
-          <w:bookmarkEnd w:id="56"/>
+          <w:bookmarkEnd w:id="59"/>
         </w:tc>
       </w:tr>
     </w:tbl>
@@ -8338,9 +9957,9 @@
         <w:t xml:space="preserve">.</w:t>
       </w:r>
     </w:p>
-    <w:bookmarkEnd w:id="57"/>
-    <w:bookmarkEnd w:id="58"/>
-    <w:bookmarkStart w:id="65" w:name="bias"/>
+    <w:bookmarkEnd w:id="60"/>
+    <w:bookmarkEnd w:id="61"/>
+    <w:bookmarkStart w:id="68" w:name="bias"/>
     <w:p>
       <w:pPr>
         <w:pStyle w:val="Heading3"/>
@@ -8349,7 +9968,7 @@
         <w:t xml:space="preserve">3.4 Bias</w:t>
       </w:r>
     </w:p>
-    <w:bookmarkStart w:id="60" w:name="def-bias"/>
+    <w:bookmarkStart w:id="63" w:name="def-bias"/>
     <w:p>
       <w:pPr>
         <w:pStyle w:val="FirstParagraph"/>
@@ -8443,7 +10062,7 @@
       <w:pPr>
         <w:pStyle w:val="BodyText"/>
       </w:pPr>
-      <w:bookmarkStart w:id="59" w:name="eq-bias-def"/>
+      <w:bookmarkStart w:id="62" w:name="eq-bias-def"/>
       <m:oMathPara>
         <m:oMathParaPr>
           <m:jc m:val="center"/>
@@ -8571,10 +10190,10 @@
           </m:r>
         </m:oMath>
       </m:oMathPara>
-      <w:bookmarkEnd w:id="59"/>
+      <w:bookmarkEnd w:id="62"/>
     </w:p>
-    <w:bookmarkEnd w:id="60"/>
-    <w:bookmarkStart w:id="61" w:name="exr-bias-exprs"/>
+    <w:bookmarkEnd w:id="63"/>
+    <w:bookmarkStart w:id="64" w:name="exr-bias-exprs"/>
     <w:p>
       <w:pPr>
         <w:pStyle w:val="FirstParagraph"/>
@@ -8722,8 +10341,8 @@
         <w:t xml:space="preserve">.</w:t>
       </w:r>
     </w:p>
-    <w:bookmarkEnd w:id="61"/>
-    <w:bookmarkStart w:id="62" w:name="sol-bias-exprs"/>
+    <w:bookmarkEnd w:id="64"/>
+    <w:bookmarkStart w:id="65" w:name="sol-bias-exprs"/>
     <w:p>
       <w:pPr>
         <w:pStyle w:val="BodyText"/>
@@ -9100,8 +10719,8 @@
         </m:oMath>
       </m:oMathPara>
     </w:p>
-    <w:bookmarkEnd w:id="62"/>
-    <w:bookmarkStart w:id="63" w:name="thm-bias-exprs"/>
+    <w:bookmarkEnd w:id="65"/>
+    <w:bookmarkStart w:id="66" w:name="thm-bias-exprs"/>
     <w:p>
       <w:pPr>
         <w:pStyle w:val="FirstParagraph"/>
@@ -9205,7 +10824,7 @@
         </m:oMath>
       </m:oMathPara>
     </w:p>
-    <w:bookmarkEnd w:id="63"/>
+    <w:bookmarkEnd w:id="66"/>
     <w:p>
       <w:pPr>
         <w:pStyle w:val="FirstParagraph"/>
@@ -9238,7 +10857,7 @@
         <w:t xml:space="preserve">.</w:t>
       </w:r>
     </w:p>
-    <w:bookmarkStart w:id="64" w:name="exm-bias-sample-mean"/>
+    <w:bookmarkStart w:id="67" w:name="exm-bias-sample-mean"/>
     <w:p>
       <w:pPr>
         <w:pStyle w:val="BodyText"/>
@@ -9248,7 +10867,7 @@
           <w:b/>
           <w:bCs/>
         </w:rPr>
-        <w:t xml:space="preserve">Example 8 (Bias of two estimators of a mean)</w:t>
+        <w:t xml:space="preserve">Example 9 (Bias of two estimators of a mean)</w:t>
       </w:r>
       <w:r>
         <w:t xml:space="preserve"> </w:t>
@@ -10572,9 +12191,9 @@
         <w:t xml:space="preserve">uses only one.</w:t>
       </w:r>
     </w:p>
-    <w:bookmarkEnd w:id="64"/>
-    <w:bookmarkEnd w:id="65"/>
-    <w:bookmarkStart w:id="79" w:name="mean-squared-error"/>
+    <w:bookmarkEnd w:id="67"/>
+    <w:bookmarkEnd w:id="68"/>
+    <w:bookmarkStart w:id="82" w:name="mean-squared-error"/>
     <w:p>
       <w:pPr>
         <w:pStyle w:val="Heading3"/>
@@ -10583,7 +12202,7 @@
         <w:t xml:space="preserve">3.5 Mean squared error</w:t>
       </w:r>
     </w:p>
-    <w:bookmarkStart w:id="66" w:name="def-mse"/>
+    <w:bookmarkStart w:id="69" w:name="def-mse"/>
     <w:p>
       <w:pPr>
         <w:pStyle w:val="FirstParagraph"/>
@@ -10835,8 +12454,8 @@
         </m:oMath>
       </m:oMathPara>
     </w:p>
-    <w:bookmarkEnd w:id="66"/>
-    <w:bookmarkStart w:id="67" w:name="exr-sq-bias-expand"/>
+    <w:bookmarkEnd w:id="69"/>
+    <w:bookmarkStart w:id="70" w:name="exr-sq-bias-expand"/>
     <w:p>
       <w:pPr>
         <w:pStyle w:val="FirstParagraph"/>
@@ -11008,8 +12627,8 @@
         <w:t xml:space="preserve">.</w:t>
       </w:r>
     </w:p>
-    <w:bookmarkEnd w:id="67"/>
-    <w:bookmarkStart w:id="68" w:name="sol-sq-bias-expand"/>
+    <w:bookmarkEnd w:id="70"/>
+    <w:bookmarkStart w:id="71" w:name="sol-sq-bias-expand"/>
     <w:p>
       <w:pPr>
         <w:pStyle w:val="BodyText"/>
@@ -11329,8 +12948,8 @@
         </m:oMath>
       </m:oMathPara>
     </w:p>
-    <w:bookmarkEnd w:id="68"/>
-    <w:bookmarkStart w:id="69" w:name="exr-bias-sq-plus-var"/>
+    <w:bookmarkEnd w:id="71"/>
+    <w:bookmarkStart w:id="72" w:name="exr-bias-sq-plus-var"/>
     <w:p>
       <w:pPr>
         <w:pStyle w:val="FirstParagraph"/>
@@ -11575,8 +13194,8 @@
         <w:t xml:space="preserve">.</w:t>
       </w:r>
     </w:p>
-    <w:bookmarkEnd w:id="69"/>
-    <w:bookmarkStart w:id="71" w:name="sol-bias-sq-plus-var"/>
+    <w:bookmarkEnd w:id="72"/>
+    <w:bookmarkStart w:id="74" w:name="sol-bias-sq-plus-var"/>
     <w:p>
       <w:pPr>
         <w:pStyle w:val="BodyText"/>
@@ -11600,7 +13219,7 @@
       <w:r>
         <w:t xml:space="preserve">(</w:t>
       </w:r>
-      <w:hyperlink r:id="rId70">
+      <w:hyperlink r:id="rId73">
         <w:r>
           <w:rPr>
             <w:rStyle w:val="Hyperlink"/>
@@ -12658,8 +14277,8 @@
         </m:oMath>
       </m:oMathPara>
     </w:p>
-    <w:bookmarkEnd w:id="71"/>
-    <w:bookmarkStart w:id="72" w:name="exr-mse-expand"/>
+    <w:bookmarkEnd w:id="74"/>
+    <w:bookmarkStart w:id="75" w:name="exr-mse-expand"/>
     <w:p>
       <w:pPr>
         <w:pStyle w:val="FirstParagraph"/>
@@ -12832,8 +14451,8 @@
         <w:t xml:space="preserve">.</w:t>
       </w:r>
     </w:p>
-    <w:bookmarkEnd w:id="72"/>
-    <w:bookmarkStart w:id="73" w:name="sol-mse-expand"/>
+    <w:bookmarkEnd w:id="75"/>
+    <w:bookmarkStart w:id="76" w:name="sol-mse-expand"/>
     <w:p>
       <w:pPr>
         <w:pStyle w:val="BodyText"/>
@@ -13637,8 +15256,8 @@
         </m:oMath>
       </m:oMathPara>
     </w:p>
-    <w:bookmarkEnd w:id="73"/>
-    <w:bookmarkStart w:id="75" w:name="thm-mse-bias-variance"/>
+    <w:bookmarkEnd w:id="76"/>
+    <w:bookmarkStart w:id="78" w:name="thm-mse-bias-variance"/>
     <w:p>
       <w:pPr>
         <w:pStyle w:val="FirstParagraph"/>
@@ -13679,7 +15298,7 @@
       <w:pPr>
         <w:pStyle w:val="BodyText"/>
       </w:pPr>
-      <w:bookmarkStart w:id="74" w:name="eq-mse"/>
+      <w:bookmarkStart w:id="77" w:name="eq-mse"/>
       <m:oMathPara>
         <m:oMathParaPr>
           <m:jc m:val="center"/>
@@ -13838,9 +15457,9 @@
           </m:r>
         </m:oMath>
       </m:oMathPara>
-      <w:bookmarkEnd w:id="74"/>
+      <w:bookmarkEnd w:id="77"/>
     </w:p>
-    <w:bookmarkEnd w:id="75"/>
+    <w:bookmarkEnd w:id="78"/>
     <w:p>
       <w:pPr>
         <w:pStyle w:val="FirstParagraph"/>
@@ -14156,7 +15775,7 @@
         <w:t xml:space="preserve">so they are equal to each other.</w:t>
       </w:r>
     </w:p>
-    <w:bookmarkStart w:id="77" w:name="exm-mse-sample-mean"/>
+    <w:bookmarkStart w:id="80" w:name="exm-mse-sample-mean"/>
     <w:p>
       <w:pPr>
         <w:pStyle w:val="BodyText"/>
@@ -14166,7 +15785,7 @@
           <w:b/>
           <w:bCs/>
         </w:rPr>
-        <w:t xml:space="preserve">Example 9 (Mean squared error of two estimators of a mean)</w:t>
+        <w:t xml:space="preserve">Example 10 (Mean squared error of two estimators of a mean)</w:t>
       </w:r>
       <w:r>
         <w:t xml:space="preserve"> </w:t>
@@ -14182,7 +15801,7 @@
           <w:rPr>
             <w:rStyle w:val="Hyperlink"/>
           </w:rPr>
-          <w:t xml:space="preserve">Example 8</w:t>
+          <w:t xml:space="preserve">Example 9</w:t>
         </w:r>
       </w:hyperlink>
       <w:r>
@@ -15546,7 +17165,7 @@
       <w:r>
         <w:t xml:space="preserve"> </w:t>
       </w:r>
-      <w:hyperlink r:id="rId76">
+      <w:hyperlink r:id="rId79">
         <w:r>
           <w:rPr>
             <w:rStyle w:val="Hyperlink"/>
@@ -15815,8 +17434,8 @@
         <w:t xml:space="preserve">’s.</w:t>
       </w:r>
     </w:p>
-    <w:bookmarkEnd w:id="77"/>
-    <w:bookmarkStart w:id="78" w:name="def-rmse"/>
+    <w:bookmarkEnd w:id="80"/>
+    <w:bookmarkStart w:id="81" w:name="def-rmse"/>
     <w:p>
       <w:pPr>
         <w:pStyle w:val="BodyText"/>
@@ -16010,7 +17629,7 @@
           <w:rPr>
             <w:rStyle w:val="Hyperlink"/>
           </w:rPr>
-          <w:t xml:space="preserve">Example 9</w:t>
+          <w:t xml:space="preserve">Example 10</w:t>
         </w:r>
       </w:hyperlink>
       <w:r>
@@ -16072,9 +17691,9 @@
         <w:t xml:space="preserve">.</w:t>
       </w:r>
     </w:p>
-    <w:bookmarkEnd w:id="78"/>
-    <w:bookmarkEnd w:id="79"/>
-    <w:bookmarkStart w:id="91" w:name="sec-unbiased-estimators"/>
+    <w:bookmarkEnd w:id="81"/>
+    <w:bookmarkEnd w:id="82"/>
+    <w:bookmarkStart w:id="94" w:name="sec-unbiased-estimators"/>
     <w:p>
       <w:pPr>
         <w:pStyle w:val="Heading3"/>
@@ -16083,7 +17702,7 @@
         <w:t xml:space="preserve">3.6 Unbiased estimators</w:t>
       </w:r>
     </w:p>
-    <w:bookmarkStart w:id="80" w:name="def-unbiased"/>
+    <w:bookmarkStart w:id="83" w:name="def-unbiased"/>
     <w:p>
       <w:pPr>
         <w:pStyle w:val="FirstParagraph"/>
@@ -16230,8 +17849,8 @@
         <w:t xml:space="preserve">.</w:t>
       </w:r>
     </w:p>
-    <w:bookmarkEnd w:id="80"/>
-    <w:bookmarkStart w:id="81" w:name="exm-unbiased-sample-mean"/>
+    <w:bookmarkEnd w:id="83"/>
+    <w:bookmarkStart w:id="84" w:name="exm-unbiased-sample-mean"/>
     <w:p>
       <w:pPr>
         <w:pStyle w:val="BodyText"/>
@@ -16241,7 +17860,7 @@
           <w:b/>
           <w:bCs/>
         </w:rPr>
-        <w:t xml:space="preserve">Example 10 (The sample mean is unbiased)</w:t>
+        <w:t xml:space="preserve">Example 11 (The sample mean is unbiased)</w:t>
       </w:r>
       <w:r>
         <w:t xml:space="preserve"> </w:t>
@@ -16257,7 +17876,7 @@
           <w:rPr>
             <w:rStyle w:val="Hyperlink"/>
           </w:rPr>
-          <w:t xml:space="preserve">Example 8</w:t>
+          <w:t xml:space="preserve">Example 9</w:t>
         </w:r>
       </w:hyperlink>
       <w:r>
@@ -16445,8 +18064,8 @@
         <w:t xml:space="preserve">.</w:t>
       </w:r>
     </w:p>
-    <w:bookmarkEnd w:id="81"/>
-    <w:bookmarkStart w:id="83" w:name="exm-biased-variance-mle"/>
+    <w:bookmarkEnd w:id="84"/>
+    <w:bookmarkStart w:id="86" w:name="exm-biased-variance-mle"/>
     <w:p>
       <w:pPr>
         <w:pStyle w:val="BodyText"/>
@@ -16456,7 +18075,7 @@
           <w:b/>
           <w:bCs/>
         </w:rPr>
-        <w:t xml:space="preserve">Example 11 (A biased estimator of the variance)</w:t>
+        <w:t xml:space="preserve">Example 12 (A biased estimator of the variance)</w:t>
       </w:r>
       <w:r>
         <w:t xml:space="preserve"> </w:t>
@@ -16624,7 +18243,7 @@
       <w:r>
         <w:t xml:space="preserve"> </w:t>
       </w:r>
-      <w:hyperlink r:id="rId82">
+      <w:hyperlink r:id="rId85">
         <w:r>
           <w:rPr>
             <w:rStyle w:val="Hyperlink"/>
@@ -17438,7 +19057,7 @@
           <w:rPr>
             <w:rStyle w:val="Hyperlink"/>
           </w:rPr>
-          <w:t xml:space="preserve">Example 9</w:t>
+          <w:t xml:space="preserve">Example 10</w:t>
         </w:r>
       </w:hyperlink>
       <w:r>
@@ -17455,7 +19074,7 @@
           <w:rPr>
             <w:rStyle w:val="Hyperlink"/>
           </w:rPr>
-          <w:t xml:space="preserve">Example 8</w:t>
+          <w:t xml:space="preserve">Example 9</w:t>
         </w:r>
       </w:hyperlink>
       <w:r>
@@ -21730,8 +23349,8 @@
         <w:t xml:space="preserve">grows.</w:t>
       </w:r>
     </w:p>
-    <w:bookmarkEnd w:id="83"/>
-    <w:bookmarkStart w:id="84" w:name="exr-unbiased-exp"/>
+    <w:bookmarkEnd w:id="86"/>
+    <w:bookmarkStart w:id="87" w:name="exr-unbiased-exp"/>
     <w:p>
       <w:pPr>
         <w:pStyle w:val="BodyText"/>
@@ -21862,8 +23481,8 @@
         <w:t xml:space="preserve">.</w:t>
       </w:r>
     </w:p>
-    <w:bookmarkEnd w:id="84"/>
-    <w:bookmarkStart w:id="85" w:name="sol-unbiased-exp"/>
+    <w:bookmarkEnd w:id="87"/>
+    <w:bookmarkStart w:id="88" w:name="sol-unbiased-exp"/>
     <w:p>
       <w:pPr>
         <w:pStyle w:val="BodyText"/>
@@ -22088,8 +23707,8 @@
         <w:t xml:space="preserve">.</w:t>
       </w:r>
     </w:p>
-    <w:bookmarkEnd w:id="85"/>
-    <w:bookmarkStart w:id="86" w:name="exr-unbiased-mse"/>
+    <w:bookmarkEnd w:id="88"/>
+    <w:bookmarkStart w:id="89" w:name="exr-unbiased-mse"/>
     <w:p>
       <w:pPr>
         <w:pStyle w:val="BodyText"/>
@@ -22183,8 +23802,8 @@
         <w:t xml:space="preserve">in terms of its variance.</w:t>
       </w:r>
     </w:p>
-    <w:bookmarkEnd w:id="86"/>
-    <w:bookmarkStart w:id="87" w:name="sol-unbiased-mse"/>
+    <w:bookmarkEnd w:id="89"/>
+    <w:bookmarkStart w:id="90" w:name="sol-unbiased-mse"/>
     <w:p>
       <w:pPr>
         <w:pStyle w:val="BodyText"/>
@@ -22523,8 +24142,8 @@
         </m:oMath>
       </m:oMathPara>
     </w:p>
-    <w:bookmarkEnd w:id="87"/>
-    <w:bookmarkStart w:id="90" w:name="thm-unbiased-props"/>
+    <w:bookmarkEnd w:id="90"/>
+    <w:bookmarkStart w:id="93" w:name="thm-unbiased-props"/>
     <w:p>
       <w:pPr>
         <w:pStyle w:val="FirstParagraph"/>
@@ -22596,7 +24215,7 @@
       <w:pPr>
         <w:pStyle w:val="BodyText"/>
       </w:pPr>
-      <w:bookmarkStart w:id="88" w:name="eq-unbiased-exp"/>
+      <w:bookmarkStart w:id="91" w:name="eq-unbiased-exp"/>
       <m:oMathPara>
         <m:oMathParaPr>
           <m:jc m:val="center"/>
@@ -22663,13 +24282,13 @@
           </m:r>
         </m:oMath>
       </m:oMathPara>
-      <w:bookmarkEnd w:id="88"/>
+      <w:bookmarkEnd w:id="91"/>
     </w:p>
     <w:p>
       <w:pPr>
         <w:pStyle w:val="FirstParagraph"/>
       </w:pPr>
-      <w:bookmarkStart w:id="89" w:name="eq-unbiased-mse"/>
+      <w:bookmarkStart w:id="92" w:name="eq-unbiased-mse"/>
       <m:oMathPara>
         <m:oMathParaPr>
           <m:jc m:val="center"/>
@@ -22765,9 +24384,9 @@
           </m:r>
         </m:oMath>
       </m:oMathPara>
-      <w:bookmarkEnd w:id="89"/>
+      <w:bookmarkEnd w:id="92"/>
     </w:p>
-    <w:bookmarkEnd w:id="90"/>
+    <w:bookmarkEnd w:id="93"/>
     <w:p>
       <w:pPr>
         <w:pStyle w:val="FirstParagraph"/>
@@ -22848,8 +24467,8 @@
         <w:t xml:space="preserve">.</w:t>
       </w:r>
     </w:p>
-    <w:bookmarkEnd w:id="91"/>
-    <w:bookmarkStart w:id="94" w:name="mean-absolute-error"/>
+    <w:bookmarkEnd w:id="94"/>
+    <w:bookmarkStart w:id="97" w:name="mean-absolute-error"/>
     <w:p>
       <w:pPr>
         <w:pStyle w:val="Heading3"/>
@@ -22858,7 +24477,7 @@
         <w:t xml:space="preserve">3.7 Mean absolute error</w:t>
       </w:r>
     </w:p>
-    <w:bookmarkStart w:id="92" w:name="def-mae"/>
+    <w:bookmarkStart w:id="95" w:name="def-mae"/>
     <w:p>
       <w:pPr>
         <w:pStyle w:val="FirstParagraph"/>
@@ -23043,8 +24662,8 @@
         </m:oMath>
       </m:oMathPara>
     </w:p>
-    <w:bookmarkEnd w:id="92"/>
-    <w:bookmarkStart w:id="93" w:name="exm-mae-gaussian"/>
+    <w:bookmarkEnd w:id="95"/>
+    <w:bookmarkStart w:id="96" w:name="exm-mae-gaussian"/>
     <w:p>
       <w:pPr>
         <w:pStyle w:val="FirstParagraph"/>
@@ -23054,7 +24673,7 @@
           <w:b/>
           <w:bCs/>
         </w:rPr>
-        <w:t xml:space="preserve">Example 12 (Mean absolute error of a Gaussian estimator)</w:t>
+        <w:t xml:space="preserve">Example 13 (Mean absolute error of a Gaussian estimator)</w:t>
       </w:r>
       <w:r>
         <w:t xml:space="preserve"> </w:t>
@@ -25450,9 +27069,9 @@
         <w:t xml:space="preserve">).</w:t>
       </w:r>
     </w:p>
-    <w:bookmarkEnd w:id="93"/>
-    <w:bookmarkEnd w:id="94"/>
-    <w:bookmarkStart w:id="108" w:name="standard-error"/>
+    <w:bookmarkEnd w:id="96"/>
+    <w:bookmarkEnd w:id="97"/>
+    <w:bookmarkStart w:id="111" w:name="standard-error"/>
     <w:p>
       <w:pPr>
         <w:pStyle w:val="Heading3"/>
@@ -25461,7 +27080,7 @@
         <w:t xml:space="preserve">3.8 Standard error</w:t>
       </w:r>
     </w:p>
-    <w:bookmarkStart w:id="96" w:name="def-SE"/>
+    <w:bookmarkStart w:id="99" w:name="def-SE"/>
     <w:p>
       <w:pPr>
         <w:pStyle w:val="FirstParagraph"/>
@@ -25519,7 +27138,7 @@
       <w:r>
         <w:t xml:space="preserve"> </w:t>
       </w:r>
-      <w:hyperlink r:id="rId95">
+      <w:hyperlink r:id="rId98">
         <w:r>
           <w:rPr>
             <w:rStyle w:val="Hyperlink"/>
@@ -25647,8 +27266,8 @@
         </m:oMath>
       </m:oMathPara>
     </w:p>
-    <w:bookmarkEnd w:id="96"/>
-    <w:bookmarkStart w:id="97" w:name="exm-SE-sample-mean"/>
+    <w:bookmarkEnd w:id="99"/>
+    <w:bookmarkStart w:id="100" w:name="exm-SE-sample-mean"/>
     <w:p>
       <w:pPr>
         <w:pStyle w:val="FirstParagraph"/>
@@ -25658,7 +27277,7 @@
           <w:b/>
           <w:bCs/>
         </w:rPr>
-        <w:t xml:space="preserve">Example 13 (Standard error of the sample mean)</w:t>
+        <w:t xml:space="preserve">Example 14 (Standard error of the sample mean)</w:t>
       </w:r>
       <w:r>
         <w:t xml:space="preserve"> </w:t>
@@ -25674,7 +27293,7 @@
           <w:rPr>
             <w:rStyle w:val="Hyperlink"/>
           </w:rPr>
-          <w:t xml:space="preserve">Example 9</w:t>
+          <w:t xml:space="preserve">Example 10</w:t>
         </w:r>
       </w:hyperlink>
       <w:r>
@@ -25936,8 +27555,8 @@
         <w:t xml:space="preserve">.</w:t>
       </w:r>
     </w:p>
-    <w:bookmarkEnd w:id="97"/>
-    <w:bookmarkStart w:id="98" w:name="exr-se-error-sd"/>
+    <w:bookmarkEnd w:id="100"/>
+    <w:bookmarkStart w:id="101" w:name="exr-se-error-sd"/>
     <w:p>
       <w:pPr>
         <w:pStyle w:val="BodyText"/>
@@ -25958,7 +27577,7 @@
       <w:r>
         <w:t xml:space="preserve"> </w:t>
       </w:r>
-      <w:hyperlink r:id="rId95">
+      <w:hyperlink r:id="rId98">
         <w:r>
           <w:rPr>
             <w:rStyle w:val="Hyperlink"/>
@@ -26059,8 +27678,8 @@
         <w:t xml:space="preserve">.</w:t>
       </w:r>
     </w:p>
-    <w:bookmarkEnd w:id="98"/>
-    <w:bookmarkStart w:id="99" w:name="sol-se-error-sd"/>
+    <w:bookmarkEnd w:id="101"/>
+    <w:bookmarkStart w:id="102" w:name="sol-se-error-sd"/>
     <w:p>
       <w:pPr>
         <w:pStyle w:val="BodyText"/>
@@ -26405,8 +28024,8 @@
         <w:t xml:space="preserve">.</w:t>
       </w:r>
     </w:p>
-    <w:bookmarkEnd w:id="99"/>
-    <w:bookmarkStart w:id="100" w:name="thm-se-error-sd"/>
+    <w:bookmarkEnd w:id="102"/>
+    <w:bookmarkStart w:id="103" w:name="thm-se-error-sd"/>
     <w:p>
       <w:pPr>
         <w:pStyle w:val="BodyText"/>
@@ -26520,7 +28139,7 @@
         </m:oMath>
       </m:oMathPara>
     </w:p>
-    <w:bookmarkEnd w:id="100"/>
+    <w:bookmarkEnd w:id="103"/>
     <w:p>
       <w:pPr>
         <w:pStyle w:val="FirstParagraph"/>
@@ -26553,7 +28172,7 @@
         <w:t xml:space="preserve">.</w:t>
       </w:r>
     </w:p>
-    <w:bookmarkStart w:id="101" w:name="rem-standard-error-name"/>
+    <w:bookmarkStart w:id="104" w:name="rem-standard-error-name"/>
     <w:p>
       <w:pPr>
         <w:pStyle w:val="BodyText"/>
@@ -26663,8 +28282,8 @@
         <w:t xml:space="preserve">so they come up often enough to deserve their own name.</w:t>
       </w:r>
     </w:p>
-    <w:bookmarkEnd w:id="101"/>
-    <w:bookmarkStart w:id="102" w:name="exr-var-mse-bias"/>
+    <w:bookmarkEnd w:id="104"/>
+    <w:bookmarkStart w:id="105" w:name="exr-var-mse-bias"/>
     <w:p>
       <w:pPr>
         <w:pStyle w:val="BodyText"/>
@@ -26834,8 +28453,8 @@
         <w:t xml:space="preserve">.</w:t>
       </w:r>
     </w:p>
-    <w:bookmarkEnd w:id="102"/>
-    <w:bookmarkStart w:id="103" w:name="sol-var-mse-bias"/>
+    <w:bookmarkEnd w:id="105"/>
+    <w:bookmarkStart w:id="106" w:name="sol-var-mse-bias"/>
     <w:p>
       <w:pPr>
         <w:pStyle w:val="BodyText"/>
@@ -27762,8 +29381,8 @@
         </m:oMath>
       </m:oMathPara>
     </w:p>
-    <w:bookmarkEnd w:id="103"/>
-    <w:bookmarkStart w:id="104" w:name="cor-var-mse-bias"/>
+    <w:bookmarkEnd w:id="106"/>
+    <w:bookmarkStart w:id="107" w:name="cor-var-mse-bias"/>
     <w:p>
       <w:pPr>
         <w:pStyle w:val="FirstParagraph"/>
@@ -27773,7 +29392,7 @@
           <w:b/>
           <w:bCs/>
         </w:rPr>
-        <w:t xml:space="preserve">Corollary 1 (Standard error squared equals MSE minus squared bias)</w:t>
+        <w:t xml:space="preserve">Corollary 2 (Standard error squared equals MSE minus squared bias)</w:t>
       </w:r>
       <w:r>
         <w:t xml:space="preserve"> </w:t>
@@ -27958,7 +29577,7 @@
         </m:oMath>
       </m:oMathPara>
     </w:p>
-    <w:bookmarkEnd w:id="104"/>
+    <w:bookmarkEnd w:id="107"/>
     <w:p>
       <w:pPr>
         <w:pStyle w:val="FirstParagraph"/>
@@ -27991,7 +29610,7 @@
         <w:t xml:space="preserve">.</w:t>
       </w:r>
     </w:p>
-    <w:bookmarkStart w:id="105" w:name="exr-se-rmse-unbiased"/>
+    <w:bookmarkStart w:id="108" w:name="exr-se-rmse-unbiased"/>
     <w:p>
       <w:pPr>
         <w:pStyle w:val="BodyText"/>
@@ -28099,8 +29718,8 @@
         <w:t xml:space="preserve">.</w:t>
       </w:r>
     </w:p>
-    <w:bookmarkEnd w:id="105"/>
-    <w:bookmarkStart w:id="106" w:name="sol-se-rmse-unbiased"/>
+    <w:bookmarkEnd w:id="108"/>
+    <w:bookmarkStart w:id="109" w:name="sol-se-rmse-unbiased"/>
     <w:p>
       <w:pPr>
         <w:pStyle w:val="BodyText"/>
@@ -28341,8 +29960,8 @@
         <w:t xml:space="preserve">.</w:t>
       </w:r>
     </w:p>
-    <w:bookmarkEnd w:id="106"/>
-    <w:bookmarkStart w:id="107" w:name="cor-se-rmse-unbiased"/>
+    <w:bookmarkEnd w:id="109"/>
+    <w:bookmarkStart w:id="110" w:name="cor-se-rmse-unbiased"/>
     <w:p>
       <w:pPr>
         <w:pStyle w:val="BodyText"/>
@@ -28352,7 +29971,7 @@
           <w:b/>
           <w:bCs/>
         </w:rPr>
-        <w:t xml:space="preserve">Corollary 2 (For unbiased estimators, SE equals root MSE)</w:t>
+        <w:t xml:space="preserve">Corollary 3 (For unbiased estimators, SE equals root MSE)</w:t>
       </w:r>
       <w:r>
         <w:t xml:space="preserve"> </w:t>
@@ -28500,7 +30119,7 @@
         </m:oMath>
       </m:oMathPara>
     </w:p>
-    <w:bookmarkEnd w:id="107"/>
+    <w:bookmarkEnd w:id="110"/>
     <w:p>
       <w:pPr>
         <w:pStyle w:val="FirstParagraph"/>
@@ -28533,9 +30152,9 @@
         <w:t xml:space="preserve">.</w:t>
       </w:r>
     </w:p>
-    <w:bookmarkEnd w:id="108"/>
-    <w:bookmarkEnd w:id="109"/>
-    <w:bookmarkStart w:id="120" w:name="references"/>
+    <w:bookmarkEnd w:id="111"/>
+    <w:bookmarkEnd w:id="112"/>
+    <w:bookmarkStart w:id="124" w:name="references"/>
     <w:p>
       <w:pPr>
         <w:pStyle w:val="Heading2"/>
@@ -28544,8 +30163,8 @@
         <w:t xml:space="preserve">References</w:t>
       </w:r>
     </w:p>
-    <w:bookmarkStart w:id="119" w:name="refs"/>
-    <w:bookmarkStart w:id="110" w:name="ref-box_draper_1987"/>
+    <w:bookmarkStart w:id="123" w:name="refs"/>
+    <w:bookmarkStart w:id="113" w:name="ref-box_draper_1987"/>
     <w:p>
       <w:pPr>
         <w:pStyle w:val="Bibliography"/>
@@ -28567,8 +30186,8 @@
         <w:t xml:space="preserve">. Wiley Series in Probability and Mathematical Statistics. Applied Probability and Statistics. Wiley.</w:t>
       </w:r>
     </w:p>
-    <w:bookmarkEnd w:id="110"/>
-    <w:bookmarkStart w:id="112" w:name="ref-dunn2018generalized"/>
+    <w:bookmarkEnd w:id="113"/>
+    <w:bookmarkStart w:id="115" w:name="ref-dunn2018generalized"/>
     <w:p>
       <w:pPr>
         <w:pStyle w:val="Bibliography"/>
@@ -28606,7 +30225,7 @@
       <w:r>
         <w:t xml:space="preserve"> </w:t>
       </w:r>
-      <w:hyperlink r:id="rId111">
+      <w:hyperlink r:id="rId114">
         <w:r>
           <w:rPr>
             <w:rStyle w:val="Hyperlink"/>
@@ -28618,8 +30237,31 @@
         <w:t xml:space="preserve">.</w:t>
       </w:r>
     </w:p>
-    <w:bookmarkEnd w:id="112"/>
-    <w:bookmarkStart w:id="114" w:name="ref-lawrance2020estimand"/>
+    <w:bookmarkEnd w:id="115"/>
+    <w:bookmarkStart w:id="116" w:name="ref-hosmer1989applied"/>
+    <w:p>
+      <w:pPr>
+        <w:pStyle w:val="Bibliography"/>
+      </w:pPr>
+      <w:r>
+        <w:t xml:space="preserve">Hosmer, David W., and Stanley Lemeshow. 1989.</w:t>
+      </w:r>
+      <w:r>
+        <w:t xml:space="preserve"> </w:t>
+      </w:r>
+      <w:r>
+        <w:rPr>
+          <w:i/>
+          <w:iCs/>
+        </w:rPr>
+        <w:t xml:space="preserve">Applied Logistic Regression</w:t>
+      </w:r>
+      <w:r>
+        <w:t xml:space="preserve">. Wiley.</w:t>
+      </w:r>
+    </w:p>
+    <w:bookmarkEnd w:id="116"/>
+    <w:bookmarkStart w:id="118" w:name="ref-lawrance2020estimand"/>
     <w:p>
       <w:pPr>
         <w:pStyle w:val="Bibliography"/>
@@ -28652,7 +30294,7 @@
       <w:r>
         <w:t xml:space="preserve"> </w:t>
       </w:r>
-      <w:hyperlink r:id="rId113">
+      <w:hyperlink r:id="rId117">
         <w:r>
           <w:rPr>
             <w:rStyle w:val="Hyperlink"/>
@@ -28664,8 +30306,8 @@
         <w:t xml:space="preserve">.</w:t>
       </w:r>
     </w:p>
-    <w:bookmarkEnd w:id="114"/>
-    <w:bookmarkStart w:id="116" w:name="ref-pohl2021estimands"/>
+    <w:bookmarkEnd w:id="118"/>
+    <w:bookmarkStart w:id="120" w:name="ref-pohl2021estimands"/>
     <w:p>
       <w:pPr>
         <w:pStyle w:val="Bibliography"/>
@@ -28725,7 +30367,7 @@
       <w:r>
         <w:t xml:space="preserve"> </w:t>
       </w:r>
-      <w:hyperlink r:id="rId115">
+      <w:hyperlink r:id="rId119">
         <w:r>
           <w:rPr>
             <w:rStyle w:val="Hyperlink"/>
@@ -28737,8 +30379,8 @@
         <w:t xml:space="preserve">.</w:t>
       </w:r>
     </w:p>
-    <w:bookmarkEnd w:id="116"/>
-    <w:bookmarkStart w:id="118" w:name="ref-van2018flexible"/>
+    <w:bookmarkEnd w:id="120"/>
+    <w:bookmarkStart w:id="122" w:name="ref-van2018flexible"/>
     <w:p>
       <w:pPr>
         <w:pStyle w:val="Bibliography"/>
@@ -28762,7 +30404,7 @@
       <w:r>
         <w:t xml:space="preserve"> </w:t>
       </w:r>
-      <w:hyperlink r:id="rId117">
+      <w:hyperlink r:id="rId121">
         <w:r>
           <w:rPr>
             <w:rStyle w:val="Hyperlink"/>
@@ -28774,9 +30416,9 @@
         <w:t xml:space="preserve">.</w:t>
       </w:r>
     </w:p>
-    <w:bookmarkEnd w:id="118"/>
-    <w:bookmarkEnd w:id="119"/>
-    <w:bookmarkEnd w:id="120"/>
+    <w:bookmarkEnd w:id="122"/>
+    <w:bookmarkEnd w:id="123"/>
+    <w:bookmarkEnd w:id="124"/>
     <w:sectPr>
       <w:footnotePr>
         <w:numRestart w:val="eachSect"/>

</xml_diff>

<commit_message>
Deploying to gh-pages from @ Morrison-Lab/sds@d084f7f5a5181010855dcc12cb8bb9325ccb9702 🚀
</commit_message>
<xml_diff>
--- a/estimation-handout.docx
+++ b/estimation-handout.docx
@@ -15,7 +15,7 @@
         <w:pStyle w:val="Date"/>
       </w:pPr>
       <w:r>
-        <w:t xml:space="preserve">Last modified: 2026-10-09 01:37:12 (PDT)</w:t>
+        <w:t xml:space="preserve">Last modified: 2026-10-09 02:03:36 (PDT)</w:t>
       </w:r>
     </w:p>
     <w:bookmarkStart w:id="14" w:name="scientific-models"/>
@@ -3019,7 +3019,7 @@
     </w:p>
     <w:bookmarkEnd w:id="33"/>
     <w:bookmarkEnd w:id="34"/>
-    <w:bookmarkStart w:id="112" w:name="sec-est-accuracy"/>
+    <w:bookmarkStart w:id="114" w:name="sec-est-accuracy"/>
     <w:p>
       <w:pPr>
         <w:pStyle w:val="Heading2"/>
@@ -12210,7 +12210,7 @@
     </w:p>
     <w:bookmarkEnd w:id="67"/>
     <w:bookmarkEnd w:id="68"/>
-    <w:bookmarkStart w:id="82" w:name="mean-squared-error"/>
+    <w:bookmarkStart w:id="84" w:name="mean-squared-error"/>
     <w:p>
       <w:pPr>
         <w:pStyle w:val="Heading3"/>
@@ -13212,7 +13212,7 @@
       </w:r>
     </w:p>
     <w:bookmarkEnd w:id="72"/>
-    <w:bookmarkStart w:id="74" w:name="sol-bias-sq-plus-var"/>
+    <w:bookmarkStart w:id="76" w:name="sol-bias-sq-plus-var"/>
     <w:p>
       <w:pPr>
         <w:pStyle w:val="BodyText"/>
@@ -13252,6 +13252,7 @@
       <w:pPr>
         <w:pStyle w:val="BodyText"/>
       </w:pPr>
+      <w:bookmarkStart w:id="74" w:name="eq-bias-sq-plus-var-exr"/>
       <m:oMathPara>
         <m:oMathParaPr>
           <m:jc m:val="center"/>
@@ -13399,8 +13400,27 @@
           <m:r>
             <m:t>​</m:t>
           </m:r>
+          <m:r>
+            <m:t>  </m:t>
+          </m:r>
+          <m:r>
+            <m:rPr>
+              <m:sty m:val="p"/>
+            </m:rPr>
+            <m:t>(</m:t>
+          </m:r>
+          <m:r>
+            <m:t>2</m:t>
+          </m:r>
+          <m:r>
+            <m:rPr>
+              <m:sty m:val="p"/>
+            </m:rPr>
+            <m:t>)</m:t>
+          </m:r>
         </m:oMath>
       </m:oMathPara>
+      <w:bookmarkEnd w:id="74"/>
     </w:p>
     <w:p>
       <w:pPr>
@@ -13431,6 +13451,7 @@
       <w:pPr>
         <w:pStyle w:val="BodyText"/>
       </w:pPr>
+      <w:bookmarkStart w:id="75" w:name="eq-bias-sq-plus-var-exr-2"/>
       <m:oMathPara>
         <m:oMathParaPr>
           <m:jc m:val="center"/>
@@ -13980,74 +14001,6 @@
                 <m:rPr>
                   <m:sty m:val="p"/>
                 </m:rPr>
-                <m:t>−</m:t>
-              </m:r>
-              <m:r>
-                <m:t>2</m:t>
-              </m:r>
-              <m:r>
-                <m:rPr>
-                  <m:sty m:val="p"/>
-                </m:rPr>
-                <m:t>E</m:t>
-              </m:r>
-              <m:r>
-                <m:t>​</m:t>
-              </m:r>
-              <m:d>
-                <m:dPr>
-                  <m:begChr m:val="["/>
-                  <m:sepChr m:val=""/>
-                  <m:endChr m:val="]"/>
-                  <m:grow/>
-                </m:dPr>
-                <m:e>
-                  <m:acc>
-                    <m:accPr>
-                      <m:chr m:val="̂"/>
-                    </m:accPr>
-                    <m:e>
-                      <m:r>
-                        <m:t>θ</m:t>
-                      </m:r>
-                    </m:e>
-                  </m:acc>
-                </m:e>
-              </m:d>
-              <m:r>
-                <m:t>​</m:t>
-              </m:r>
-              <m:r>
-                <m:t>θ</m:t>
-              </m:r>
-              <m:r>
-                <m:rPr>
-                  <m:sty m:val="p"/>
-                </m:rPr>
-                <m:t>+</m:t>
-              </m:r>
-              <m:sSup>
-                <m:e>
-                  <m:r>
-                    <m:t>θ</m:t>
-                  </m:r>
-                </m:e>
-                <m:sup>
-                  <m:r>
-                    <m:t>2</m:t>
-                  </m:r>
-                </m:sup>
-              </m:sSup>
-              <m:r>
-                <m:rPr>
-                  <m:sty m:val="p"/>
-                </m:rPr>
-                <m:t>+</m:t>
-              </m:r>
-              <m:r>
-                <m:rPr>
-                  <m:sty m:val="p"/>
-                </m:rPr>
                 <m:t>E</m:t>
               </m:r>
               <m:r>
@@ -14086,17 +14039,72 @@
                 <m:t>​</m:t>
               </m:r>
               <m:r>
-                <m:t>&amp;</m:t>
-              </m:r>
-              <m:r>
-                <m:t>&amp;</m:t>
-              </m:r>
-              <m:r>
-                <m:rPr>
-                  <m:nor/>
-                  <m:sty m:val="p"/>
-                </m:rPr>
-                <m:t>(cancel </m:t>
+                <m:rPr>
+                  <m:sty m:val="p"/>
+                </m:rPr>
+                <m:t>−</m:t>
+              </m:r>
+              <m:r>
+                <m:t>2</m:t>
+              </m:r>
+              <m:r>
+                <m:rPr>
+                  <m:sty m:val="p"/>
+                </m:rPr>
+                <m:t>E</m:t>
+              </m:r>
+              <m:r>
+                <m:t>​</m:t>
+              </m:r>
+              <m:d>
+                <m:dPr>
+                  <m:begChr m:val="["/>
+                  <m:sepChr m:val=""/>
+                  <m:endChr m:val="]"/>
+                  <m:grow/>
+                </m:dPr>
+                <m:e>
+                  <m:acc>
+                    <m:accPr>
+                      <m:chr m:val="̂"/>
+                    </m:accPr>
+                    <m:e>
+                      <m:r>
+                        <m:t>θ</m:t>
+                      </m:r>
+                    </m:e>
+                  </m:acc>
+                </m:e>
+              </m:d>
+              <m:r>
+                <m:t>​</m:t>
+              </m:r>
+              <m:r>
+                <m:t>θ</m:t>
+              </m:r>
+              <m:r>
+                <m:rPr>
+                  <m:sty m:val="p"/>
+                </m:rPr>
+                <m:t>+</m:t>
+              </m:r>
+              <m:sSup>
+                <m:e>
+                  <m:r>
+                    <m:t>θ</m:t>
+                  </m:r>
+                </m:e>
+                <m:sup>
+                  <m:r>
+                    <m:t>2</m:t>
+                  </m:r>
+                </m:sup>
+              </m:sSup>
+              <m:r>
+                <m:rPr>
+                  <m:sty m:val="p"/>
+                </m:rPr>
+                <m:t>+</m:t>
               </m:r>
               <m:r>
                 <m:t>​</m:t>
@@ -14157,10 +14165,79 @@
               </m:r>
               <m:r>
                 <m:rPr>
+                  <m:sty m:val="p"/>
+                </m:rPr>
+                <m:t>−</m:t>
+              </m:r>
+              <m:r>
+                <m:t>​</m:t>
+              </m:r>
+              <m:sSup>
+                <m:e>
+                  <m:d>
+                    <m:dPr>
+                      <m:begChr m:val="("/>
+                      <m:sepChr m:val=""/>
+                      <m:endChr m:val=")"/>
+                      <m:grow/>
+                    </m:dPr>
+                    <m:e>
+                      <m:r>
+                        <m:rPr>
+                          <m:sty m:val="p"/>
+                        </m:rPr>
+                        <m:t>E</m:t>
+                      </m:r>
+                      <m:r>
+                        <m:t>​</m:t>
+                      </m:r>
+                      <m:d>
+                        <m:dPr>
+                          <m:begChr m:val="["/>
+                          <m:sepChr m:val=""/>
+                          <m:endChr m:val="]"/>
+                          <m:grow/>
+                        </m:dPr>
+                        <m:e>
+                          <m:acc>
+                            <m:accPr>
+                              <m:chr m:val="̂"/>
+                            </m:accPr>
+                            <m:e>
+                              <m:r>
+                                <m:t>θ</m:t>
+                              </m:r>
+                            </m:e>
+                          </m:acc>
+                        </m:e>
+                      </m:d>
+                      <m:r>
+                        <m:t>​</m:t>
+                      </m:r>
+                    </m:e>
+                  </m:d>
+                </m:e>
+                <m:sup>
+                  <m:r>
+                    <m:t>2</m:t>
+                  </m:r>
+                </m:sup>
+              </m:sSup>
+              <m:r>
+                <m:t>​</m:t>
+              </m:r>
+              <m:r>
+                <m:t>&amp;</m:t>
+              </m:r>
+              <m:r>
+                <m:t>&amp;</m:t>
+              </m:r>
+              <m:r>
+                <m:rPr>
                   <m:nor/>
                   <m:sty m:val="p"/>
                 </m:rPr>
-                <m:t>)</m:t>
+                <m:t>(reorder the terms)</m:t>
               </m:r>
             </m:e>
             <m:e>
@@ -14277,6 +14354,148 @@
                 </m:sup>
               </m:sSup>
               <m:r>
+                <m:rPr>
+                  <m:sty m:val="p"/>
+                </m:rPr>
+                <m:t>+</m:t>
+              </m:r>
+              <m:r>
+                <m:t>​</m:t>
+              </m:r>
+              <m:d>
+                <m:dPr>
+                  <m:begChr m:val="("/>
+                  <m:sepChr m:val=""/>
+                  <m:endChr m:val=")"/>
+                  <m:grow/>
+                </m:dPr>
+                <m:e>
+                  <m:r>
+                    <m:t>​</m:t>
+                  </m:r>
+                  <m:sSup>
+                    <m:e>
+                      <m:d>
+                        <m:dPr>
+                          <m:begChr m:val="("/>
+                          <m:sepChr m:val=""/>
+                          <m:endChr m:val=")"/>
+                          <m:grow/>
+                        </m:dPr>
+                        <m:e>
+                          <m:r>
+                            <m:rPr>
+                              <m:sty m:val="p"/>
+                            </m:rPr>
+                            <m:t>E</m:t>
+                          </m:r>
+                          <m:r>
+                            <m:t>​</m:t>
+                          </m:r>
+                          <m:d>
+                            <m:dPr>
+                              <m:begChr m:val="["/>
+                              <m:sepChr m:val=""/>
+                              <m:endChr m:val="]"/>
+                              <m:grow/>
+                            </m:dPr>
+                            <m:e>
+                              <m:acc>
+                                <m:accPr>
+                                  <m:chr m:val="̂"/>
+                                </m:accPr>
+                                <m:e>
+                                  <m:r>
+                                    <m:t>θ</m:t>
+                                  </m:r>
+                                </m:e>
+                              </m:acc>
+                            </m:e>
+                          </m:d>
+                          <m:r>
+                            <m:t>​</m:t>
+                          </m:r>
+                        </m:e>
+                      </m:d>
+                    </m:e>
+                    <m:sup>
+                      <m:r>
+                        <m:t>2</m:t>
+                      </m:r>
+                    </m:sup>
+                  </m:sSup>
+                  <m:r>
+                    <m:t>​</m:t>
+                  </m:r>
+                  <m:r>
+                    <m:rPr>
+                      <m:sty m:val="p"/>
+                    </m:rPr>
+                    <m:t>−</m:t>
+                  </m:r>
+                  <m:r>
+                    <m:t>​</m:t>
+                  </m:r>
+                  <m:sSup>
+                    <m:e>
+                      <m:d>
+                        <m:dPr>
+                          <m:begChr m:val="("/>
+                          <m:sepChr m:val=""/>
+                          <m:endChr m:val=")"/>
+                          <m:grow/>
+                        </m:dPr>
+                        <m:e>
+                          <m:r>
+                            <m:rPr>
+                              <m:sty m:val="p"/>
+                            </m:rPr>
+                            <m:t>E</m:t>
+                          </m:r>
+                          <m:r>
+                            <m:t>​</m:t>
+                          </m:r>
+                          <m:d>
+                            <m:dPr>
+                              <m:begChr m:val="["/>
+                              <m:sepChr m:val=""/>
+                              <m:endChr m:val="]"/>
+                              <m:grow/>
+                            </m:dPr>
+                            <m:e>
+                              <m:acc>
+                                <m:accPr>
+                                  <m:chr m:val="̂"/>
+                                </m:accPr>
+                                <m:e>
+                                  <m:r>
+                                    <m:t>θ</m:t>
+                                  </m:r>
+                                </m:e>
+                              </m:acc>
+                            </m:e>
+                          </m:d>
+                          <m:r>
+                            <m:t>​</m:t>
+                          </m:r>
+                        </m:e>
+                      </m:d>
+                    </m:e>
+                    <m:sup>
+                      <m:r>
+                        <m:t>2</m:t>
+                      </m:r>
+                    </m:sup>
+                  </m:sSup>
+                  <m:r>
+                    <m:t>​</m:t>
+                  </m:r>
+                </m:e>
+              </m:d>
+              <m:r>
+                <m:t>​</m:t>
+              </m:r>
+              <m:r>
                 <m:t>&amp;</m:t>
               </m:r>
               <m:r>
@@ -14287,15 +14506,353 @@
                   <m:nor/>
                   <m:sty m:val="p"/>
                 </m:rPr>
-                <m:t>(reorder the terms)</m:t>
+                <m:t>(group the last two terms)</m:t>
+              </m:r>
+            </m:e>
+            <m:e>
+              <m:r>
+                <m:t>&amp;</m:t>
+              </m:r>
+              <m:r>
+                <m:rPr>
+                  <m:sty m:val="p"/>
+                </m:rPr>
+                <m:t>=</m:t>
+              </m:r>
+              <m:r>
+                <m:rPr>
+                  <m:sty m:val="p"/>
+                </m:rPr>
+                <m:t>E</m:t>
+              </m:r>
+              <m:r>
+                <m:t>​</m:t>
+              </m:r>
+              <m:d>
+                <m:dPr>
+                  <m:begChr m:val="["/>
+                  <m:sepChr m:val=""/>
+                  <m:endChr m:val="]"/>
+                  <m:grow/>
+                </m:dPr>
+                <m:e>
+                  <m:sSup>
+                    <m:e>
+                      <m:acc>
+                        <m:accPr>
+                          <m:chr m:val="̂"/>
+                        </m:accPr>
+                        <m:e>
+                          <m:r>
+                            <m:t>θ</m:t>
+                          </m:r>
+                        </m:e>
+                      </m:acc>
+                    </m:e>
+                    <m:sup>
+                      <m:r>
+                        <m:t>2</m:t>
+                      </m:r>
+                    </m:sup>
+                  </m:sSup>
+                </m:e>
+              </m:d>
+              <m:r>
+                <m:t>​</m:t>
+              </m:r>
+              <m:r>
+                <m:rPr>
+                  <m:sty m:val="p"/>
+                </m:rPr>
+                <m:t>−</m:t>
+              </m:r>
+              <m:r>
+                <m:t>2</m:t>
+              </m:r>
+              <m:r>
+                <m:rPr>
+                  <m:sty m:val="p"/>
+                </m:rPr>
+                <m:t>E</m:t>
+              </m:r>
+              <m:r>
+                <m:t>​</m:t>
+              </m:r>
+              <m:d>
+                <m:dPr>
+                  <m:begChr m:val="["/>
+                  <m:sepChr m:val=""/>
+                  <m:endChr m:val="]"/>
+                  <m:grow/>
+                </m:dPr>
+                <m:e>
+                  <m:acc>
+                    <m:accPr>
+                      <m:chr m:val="̂"/>
+                    </m:accPr>
+                    <m:e>
+                      <m:r>
+                        <m:t>θ</m:t>
+                      </m:r>
+                    </m:e>
+                  </m:acc>
+                </m:e>
+              </m:d>
+              <m:r>
+                <m:t>​</m:t>
+              </m:r>
+              <m:r>
+                <m:t>θ</m:t>
+              </m:r>
+              <m:r>
+                <m:rPr>
+                  <m:sty m:val="p"/>
+                </m:rPr>
+                <m:t>+</m:t>
+              </m:r>
+              <m:sSup>
+                <m:e>
+                  <m:r>
+                    <m:t>θ</m:t>
+                  </m:r>
+                </m:e>
+                <m:sup>
+                  <m:r>
+                    <m:t>2</m:t>
+                  </m:r>
+                </m:sup>
+              </m:sSup>
+              <m:r>
+                <m:rPr>
+                  <m:sty m:val="p"/>
+                </m:rPr>
+                <m:t>+</m:t>
+              </m:r>
+              <m:r>
+                <m:t>0</m:t>
+              </m:r>
+              <m:r>
+                <m:t>&amp;</m:t>
+              </m:r>
+              <m:r>
+                <m:t>&amp;</m:t>
+              </m:r>
+              <m:r>
+                <m:rPr>
+                  <m:nor/>
+                  <m:sty m:val="p"/>
+                </m:rPr>
+                <m:t>(</m:t>
+              </m:r>
+              <m:r>
+                <m:t>a</m:t>
+              </m:r>
+              <m:r>
+                <m:rPr>
+                  <m:sty m:val="p"/>
+                </m:rPr>
+                <m:t>−</m:t>
+              </m:r>
+              <m:r>
+                <m:t>a</m:t>
+              </m:r>
+              <m:r>
+                <m:rPr>
+                  <m:sty m:val="p"/>
+                </m:rPr>
+                <m:t>=</m:t>
+              </m:r>
+              <m:r>
+                <m:t>0</m:t>
+              </m:r>
+              <m:r>
+                <m:rPr>
+                  <m:nor/>
+                  <m:sty m:val="p"/>
+                </m:rPr>
+                <m:t>)</m:t>
+              </m:r>
+            </m:e>
+            <m:e>
+              <m:r>
+                <m:t>&amp;</m:t>
+              </m:r>
+              <m:r>
+                <m:rPr>
+                  <m:sty m:val="p"/>
+                </m:rPr>
+                <m:t>=</m:t>
+              </m:r>
+              <m:r>
+                <m:rPr>
+                  <m:sty m:val="p"/>
+                </m:rPr>
+                <m:t>E</m:t>
+              </m:r>
+              <m:r>
+                <m:t>​</m:t>
+              </m:r>
+              <m:d>
+                <m:dPr>
+                  <m:begChr m:val="["/>
+                  <m:sepChr m:val=""/>
+                  <m:endChr m:val="]"/>
+                  <m:grow/>
+                </m:dPr>
+                <m:e>
+                  <m:sSup>
+                    <m:e>
+                      <m:acc>
+                        <m:accPr>
+                          <m:chr m:val="̂"/>
+                        </m:accPr>
+                        <m:e>
+                          <m:r>
+                            <m:t>θ</m:t>
+                          </m:r>
+                        </m:e>
+                      </m:acc>
+                    </m:e>
+                    <m:sup>
+                      <m:r>
+                        <m:t>2</m:t>
+                      </m:r>
+                    </m:sup>
+                  </m:sSup>
+                </m:e>
+              </m:d>
+              <m:r>
+                <m:t>​</m:t>
+              </m:r>
+              <m:r>
+                <m:rPr>
+                  <m:sty m:val="p"/>
+                </m:rPr>
+                <m:t>−</m:t>
+              </m:r>
+              <m:r>
+                <m:t>2</m:t>
+              </m:r>
+              <m:r>
+                <m:rPr>
+                  <m:sty m:val="p"/>
+                </m:rPr>
+                <m:t>E</m:t>
+              </m:r>
+              <m:r>
+                <m:t>​</m:t>
+              </m:r>
+              <m:d>
+                <m:dPr>
+                  <m:begChr m:val="["/>
+                  <m:sepChr m:val=""/>
+                  <m:endChr m:val="]"/>
+                  <m:grow/>
+                </m:dPr>
+                <m:e>
+                  <m:acc>
+                    <m:accPr>
+                      <m:chr m:val="̂"/>
+                    </m:accPr>
+                    <m:e>
+                      <m:r>
+                        <m:t>θ</m:t>
+                      </m:r>
+                    </m:e>
+                  </m:acc>
+                </m:e>
+              </m:d>
+              <m:r>
+                <m:t>​</m:t>
+              </m:r>
+              <m:r>
+                <m:t>θ</m:t>
+              </m:r>
+              <m:r>
+                <m:rPr>
+                  <m:sty m:val="p"/>
+                </m:rPr>
+                <m:t>+</m:t>
+              </m:r>
+              <m:sSup>
+                <m:e>
+                  <m:r>
+                    <m:t>θ</m:t>
+                  </m:r>
+                </m:e>
+                <m:sup>
+                  <m:r>
+                    <m:t>2</m:t>
+                  </m:r>
+                </m:sup>
+              </m:sSup>
+              <m:r>
+                <m:t>&amp;</m:t>
+              </m:r>
+              <m:r>
+                <m:t>&amp;</m:t>
+              </m:r>
+              <m:r>
+                <m:rPr>
+                  <m:nor/>
+                  <m:sty m:val="p"/>
+                </m:rPr>
+                <m:t>(</m:t>
+              </m:r>
+              <m:r>
+                <m:t>a</m:t>
+              </m:r>
+              <m:r>
+                <m:rPr>
+                  <m:sty m:val="p"/>
+                </m:rPr>
+                <m:t>+</m:t>
+              </m:r>
+              <m:r>
+                <m:t>0</m:t>
+              </m:r>
+              <m:r>
+                <m:rPr>
+                  <m:sty m:val="p"/>
+                </m:rPr>
+                <m:t>=</m:t>
+              </m:r>
+              <m:r>
+                <m:t>a</m:t>
+              </m:r>
+              <m:r>
+                <m:rPr>
+                  <m:nor/>
+                  <m:sty m:val="p"/>
+                </m:rPr>
+                <m:t>)</m:t>
               </m:r>
             </m:e>
           </m:eqArr>
+          <m:r>
+            <m:t>  </m:t>
+          </m:r>
+          <m:r>
+            <m:rPr>
+              <m:sty m:val="p"/>
+            </m:rPr>
+            <m:t>(</m:t>
+          </m:r>
+          <m:r>
+            <m:t>3</m:t>
+          </m:r>
+          <m:r>
+            <m:rPr>
+              <m:sty m:val="p"/>
+            </m:rPr>
+            <m:t>)</m:t>
+          </m:r>
         </m:oMath>
       </m:oMathPara>
+      <w:bookmarkEnd w:id="75"/>
     </w:p>
-    <w:bookmarkEnd w:id="74"/>
-    <w:bookmarkStart w:id="75" w:name="exr-mse-expand"/>
+    <w:bookmarkEnd w:id="76"/>
+    <w:bookmarkStart w:id="77" w:name="exr-mse-expand"/>
     <w:p>
       <w:pPr>
         <w:pStyle w:val="FirstParagraph"/>
@@ -14468,8 +15025,8 @@
         <w:t xml:space="preserve">.</w:t>
       </w:r>
     </w:p>
-    <w:bookmarkEnd w:id="75"/>
-    <w:bookmarkStart w:id="76" w:name="sol-mse-expand"/>
+    <w:bookmarkEnd w:id="77"/>
+    <w:bookmarkStart w:id="78" w:name="sol-mse-expand"/>
     <w:p>
       <w:pPr>
         <w:pStyle w:val="BodyText"/>
@@ -15273,8 +15830,8 @@
         </m:oMath>
       </m:oMathPara>
     </w:p>
-    <w:bookmarkEnd w:id="76"/>
-    <w:bookmarkStart w:id="78" w:name="thm-mse-bias-variance"/>
+    <w:bookmarkEnd w:id="78"/>
+    <w:bookmarkStart w:id="80" w:name="thm-mse-bias-variance"/>
     <w:p>
       <w:pPr>
         <w:pStyle w:val="FirstParagraph"/>
@@ -15315,7 +15872,7 @@
       <w:pPr>
         <w:pStyle w:val="BodyText"/>
       </w:pPr>
-      <w:bookmarkStart w:id="77" w:name="eq-mse"/>
+      <w:bookmarkStart w:id="79" w:name="eq-mse"/>
       <m:oMathPara>
         <m:oMathParaPr>
           <m:jc m:val="center"/>
@@ -15464,7 +16021,7 @@
             <m:t>(</m:t>
           </m:r>
           <m:r>
-            <m:t>2</m:t>
+            <m:t>4</m:t>
           </m:r>
           <m:r>
             <m:rPr>
@@ -15474,9 +16031,9 @@
           </m:r>
         </m:oMath>
       </m:oMathPara>
-      <w:bookmarkEnd w:id="77"/>
+      <w:bookmarkEnd w:id="79"/>
     </w:p>
-    <w:bookmarkEnd w:id="78"/>
+    <w:bookmarkEnd w:id="80"/>
     <w:p>
       <w:pPr>
         <w:pStyle w:val="FirstParagraph"/>
@@ -15792,7 +16349,7 @@
         <w:t xml:space="preserve">so they are equal to each other.</w:t>
       </w:r>
     </w:p>
-    <w:bookmarkStart w:id="80" w:name="exm-mse-sample-mean"/>
+    <w:bookmarkStart w:id="82" w:name="exm-mse-sample-mean"/>
     <w:p>
       <w:pPr>
         <w:pStyle w:val="BodyText"/>
@@ -17182,7 +17739,7 @@
       <w:r>
         <w:t xml:space="preserve"> </w:t>
       </w:r>
-      <w:hyperlink r:id="rId79">
+      <w:hyperlink r:id="rId81">
         <w:r>
           <w:rPr>
             <w:rStyle w:val="Hyperlink"/>
@@ -17451,8 +18008,8 @@
         <w:t xml:space="preserve">’s.</w:t>
       </w:r>
     </w:p>
-    <w:bookmarkEnd w:id="80"/>
-    <w:bookmarkStart w:id="81" w:name="def-rmse"/>
+    <w:bookmarkEnd w:id="82"/>
+    <w:bookmarkStart w:id="83" w:name="def-rmse"/>
     <w:p>
       <w:pPr>
         <w:pStyle w:val="BodyText"/>
@@ -17708,9 +18265,9 @@
         <w:t xml:space="preserve">.</w:t>
       </w:r>
     </w:p>
-    <w:bookmarkEnd w:id="81"/>
-    <w:bookmarkEnd w:id="82"/>
-    <w:bookmarkStart w:id="94" w:name="sec-unbiased-estimators"/>
+    <w:bookmarkEnd w:id="83"/>
+    <w:bookmarkEnd w:id="84"/>
+    <w:bookmarkStart w:id="96" w:name="sec-unbiased-estimators"/>
     <w:p>
       <w:pPr>
         <w:pStyle w:val="Heading3"/>
@@ -17719,7 +18276,7 @@
         <w:t xml:space="preserve">3.6 Unbiased estimators</w:t>
       </w:r>
     </w:p>
-    <w:bookmarkStart w:id="83" w:name="def-unbiased"/>
+    <w:bookmarkStart w:id="85" w:name="def-unbiased"/>
     <w:p>
       <w:pPr>
         <w:pStyle w:val="FirstParagraph"/>
@@ -17866,8 +18423,8 @@
         <w:t xml:space="preserve">.</w:t>
       </w:r>
     </w:p>
-    <w:bookmarkEnd w:id="83"/>
-    <w:bookmarkStart w:id="84" w:name="exm-unbiased-sample-mean"/>
+    <w:bookmarkEnd w:id="85"/>
+    <w:bookmarkStart w:id="86" w:name="exm-unbiased-sample-mean"/>
     <w:p>
       <w:pPr>
         <w:pStyle w:val="BodyText"/>
@@ -18081,8 +18638,8 @@
         <w:t xml:space="preserve">.</w:t>
       </w:r>
     </w:p>
-    <w:bookmarkEnd w:id="84"/>
-    <w:bookmarkStart w:id="86" w:name="exm-biased-variance-mle"/>
+    <w:bookmarkEnd w:id="86"/>
+    <w:bookmarkStart w:id="88" w:name="exm-biased-variance-mle"/>
     <w:p>
       <w:pPr>
         <w:pStyle w:val="BodyText"/>
@@ -18260,7 +18817,7 @@
       <w:r>
         <w:t xml:space="preserve"> </w:t>
       </w:r>
-      <w:hyperlink r:id="rId85">
+      <w:hyperlink r:id="rId87">
         <w:r>
           <w:rPr>
             <w:rStyle w:val="Hyperlink"/>
@@ -23366,8 +23923,8 @@
         <w:t xml:space="preserve">grows.</w:t>
       </w:r>
     </w:p>
-    <w:bookmarkEnd w:id="86"/>
-    <w:bookmarkStart w:id="87" w:name="exr-unbiased-exp"/>
+    <w:bookmarkEnd w:id="88"/>
+    <w:bookmarkStart w:id="89" w:name="exr-unbiased-exp"/>
     <w:p>
       <w:pPr>
         <w:pStyle w:val="BodyText"/>
@@ -23498,8 +24055,8 @@
         <w:t xml:space="preserve">.</w:t>
       </w:r>
     </w:p>
-    <w:bookmarkEnd w:id="87"/>
-    <w:bookmarkStart w:id="88" w:name="sol-unbiased-exp"/>
+    <w:bookmarkEnd w:id="89"/>
+    <w:bookmarkStart w:id="90" w:name="sol-unbiased-exp"/>
     <w:p>
       <w:pPr>
         <w:pStyle w:val="BodyText"/>
@@ -23724,8 +24281,8 @@
         <w:t xml:space="preserve">.</w:t>
       </w:r>
     </w:p>
-    <w:bookmarkEnd w:id="88"/>
-    <w:bookmarkStart w:id="89" w:name="exr-unbiased-mse"/>
+    <w:bookmarkEnd w:id="90"/>
+    <w:bookmarkStart w:id="91" w:name="exr-unbiased-mse"/>
     <w:p>
       <w:pPr>
         <w:pStyle w:val="BodyText"/>
@@ -23819,8 +24376,8 @@
         <w:t xml:space="preserve">in terms of its variance.</w:t>
       </w:r>
     </w:p>
-    <w:bookmarkEnd w:id="89"/>
-    <w:bookmarkStart w:id="90" w:name="sol-unbiased-mse"/>
+    <w:bookmarkEnd w:id="91"/>
+    <w:bookmarkStart w:id="92" w:name="sol-unbiased-mse"/>
     <w:p>
       <w:pPr>
         <w:pStyle w:val="BodyText"/>
@@ -24159,8 +24716,8 @@
         </m:oMath>
       </m:oMathPara>
     </w:p>
-    <w:bookmarkEnd w:id="90"/>
-    <w:bookmarkStart w:id="93" w:name="thm-unbiased-props"/>
+    <w:bookmarkEnd w:id="92"/>
+    <w:bookmarkStart w:id="95" w:name="thm-unbiased-props"/>
     <w:p>
       <w:pPr>
         <w:pStyle w:val="FirstParagraph"/>
@@ -24232,7 +24789,7 @@
       <w:pPr>
         <w:pStyle w:val="BodyText"/>
       </w:pPr>
-      <w:bookmarkStart w:id="91" w:name="eq-unbiased-exp"/>
+      <w:bookmarkStart w:id="93" w:name="eq-unbiased-exp"/>
       <m:oMathPara>
         <m:oMathParaPr>
           <m:jc m:val="center"/>
@@ -24289,7 +24846,7 @@
             <m:t>(</m:t>
           </m:r>
           <m:r>
-            <m:t>3</m:t>
+            <m:t>5</m:t>
           </m:r>
           <m:r>
             <m:rPr>
@@ -24299,13 +24856,13 @@
           </m:r>
         </m:oMath>
       </m:oMathPara>
-      <w:bookmarkEnd w:id="91"/>
+      <w:bookmarkEnd w:id="93"/>
     </w:p>
     <w:p>
       <w:pPr>
         <w:pStyle w:val="FirstParagraph"/>
       </w:pPr>
-      <w:bookmarkStart w:id="92" w:name="eq-unbiased-mse"/>
+      <w:bookmarkStart w:id="94" w:name="eq-unbiased-mse"/>
       <m:oMathPara>
         <m:oMathParaPr>
           <m:jc m:val="center"/>
@@ -24391,7 +24948,7 @@
             <m:t>(</m:t>
           </m:r>
           <m:r>
-            <m:t>4</m:t>
+            <m:t>6</m:t>
           </m:r>
           <m:r>
             <m:rPr>
@@ -24401,9 +24958,9 @@
           </m:r>
         </m:oMath>
       </m:oMathPara>
-      <w:bookmarkEnd w:id="92"/>
+      <w:bookmarkEnd w:id="94"/>
     </w:p>
-    <w:bookmarkEnd w:id="93"/>
+    <w:bookmarkEnd w:id="95"/>
     <w:p>
       <w:pPr>
         <w:pStyle w:val="FirstParagraph"/>
@@ -24423,7 +24980,7 @@
           <w:rPr>
             <w:rStyle w:val="Hyperlink"/>
           </w:rPr>
-          <w:t xml:space="preserve">Equation 3</w:t>
+          <w:t xml:space="preserve">Equation 5</w:t>
         </w:r>
       </w:hyperlink>
       <w:r>
@@ -24460,7 +25017,7 @@
           <w:rPr>
             <w:rStyle w:val="Hyperlink"/>
           </w:rPr>
-          <w:t xml:space="preserve">Equation 4</w:t>
+          <w:t xml:space="preserve">Equation 6</w:t>
         </w:r>
       </w:hyperlink>
       <w:r>
@@ -24484,8 +25041,8 @@
         <w:t xml:space="preserve">.</w:t>
       </w:r>
     </w:p>
-    <w:bookmarkEnd w:id="94"/>
-    <w:bookmarkStart w:id="97" w:name="mean-absolute-error"/>
+    <w:bookmarkEnd w:id="96"/>
+    <w:bookmarkStart w:id="99" w:name="mean-absolute-error"/>
     <w:p>
       <w:pPr>
         <w:pStyle w:val="Heading3"/>
@@ -24494,7 +25051,7 @@
         <w:t xml:space="preserve">3.7 Mean absolute error</w:t>
       </w:r>
     </w:p>
-    <w:bookmarkStart w:id="95" w:name="def-mae"/>
+    <w:bookmarkStart w:id="97" w:name="def-mae"/>
     <w:p>
       <w:pPr>
         <w:pStyle w:val="FirstParagraph"/>
@@ -24679,8 +25236,8 @@
         </m:oMath>
       </m:oMathPara>
     </w:p>
-    <w:bookmarkEnd w:id="95"/>
-    <w:bookmarkStart w:id="96" w:name="exm-mae-gaussian"/>
+    <w:bookmarkEnd w:id="97"/>
+    <w:bookmarkStart w:id="98" w:name="exm-mae-gaussian"/>
     <w:p>
       <w:pPr>
         <w:pStyle w:val="FirstParagraph"/>
@@ -27086,9 +27643,9 @@
         <w:t xml:space="preserve">).</w:t>
       </w:r>
     </w:p>
-    <w:bookmarkEnd w:id="96"/>
-    <w:bookmarkEnd w:id="97"/>
-    <w:bookmarkStart w:id="111" w:name="standard-error"/>
+    <w:bookmarkEnd w:id="98"/>
+    <w:bookmarkEnd w:id="99"/>
+    <w:bookmarkStart w:id="113" w:name="standard-error"/>
     <w:p>
       <w:pPr>
         <w:pStyle w:val="Heading3"/>
@@ -27097,7 +27654,7 @@
         <w:t xml:space="preserve">3.8 Standard error</w:t>
       </w:r>
     </w:p>
-    <w:bookmarkStart w:id="99" w:name="def-SE"/>
+    <w:bookmarkStart w:id="101" w:name="def-SE"/>
     <w:p>
       <w:pPr>
         <w:pStyle w:val="FirstParagraph"/>
@@ -27155,7 +27712,7 @@
       <w:r>
         <w:t xml:space="preserve"> </w:t>
       </w:r>
-      <w:hyperlink r:id="rId98">
+      <w:hyperlink r:id="rId100">
         <w:r>
           <w:rPr>
             <w:rStyle w:val="Hyperlink"/>
@@ -27283,8 +27840,8 @@
         </m:oMath>
       </m:oMathPara>
     </w:p>
-    <w:bookmarkEnd w:id="99"/>
-    <w:bookmarkStart w:id="100" w:name="exm-SE-sample-mean"/>
+    <w:bookmarkEnd w:id="101"/>
+    <w:bookmarkStart w:id="102" w:name="exm-SE-sample-mean"/>
     <w:p>
       <w:pPr>
         <w:pStyle w:val="FirstParagraph"/>
@@ -27572,8 +28129,8 @@
         <w:t xml:space="preserve">.</w:t>
       </w:r>
     </w:p>
-    <w:bookmarkEnd w:id="100"/>
-    <w:bookmarkStart w:id="101" w:name="exr-se-error-sd"/>
+    <w:bookmarkEnd w:id="102"/>
+    <w:bookmarkStart w:id="103" w:name="exr-se-error-sd"/>
     <w:p>
       <w:pPr>
         <w:pStyle w:val="BodyText"/>
@@ -27594,7 +28151,7 @@
       <w:r>
         <w:t xml:space="preserve"> </w:t>
       </w:r>
-      <w:hyperlink r:id="rId98">
+      <w:hyperlink r:id="rId100">
         <w:r>
           <w:rPr>
             <w:rStyle w:val="Hyperlink"/>
@@ -27695,8 +28252,8 @@
         <w:t xml:space="preserve">.</w:t>
       </w:r>
     </w:p>
-    <w:bookmarkEnd w:id="101"/>
-    <w:bookmarkStart w:id="102" w:name="sol-se-error-sd"/>
+    <w:bookmarkEnd w:id="103"/>
+    <w:bookmarkStart w:id="104" w:name="sol-se-error-sd"/>
     <w:p>
       <w:pPr>
         <w:pStyle w:val="BodyText"/>
@@ -28041,8 +28598,8 @@
         <w:t xml:space="preserve">.</w:t>
       </w:r>
     </w:p>
-    <w:bookmarkEnd w:id="102"/>
-    <w:bookmarkStart w:id="103" w:name="thm-se-error-sd"/>
+    <w:bookmarkEnd w:id="104"/>
+    <w:bookmarkStart w:id="105" w:name="thm-se-error-sd"/>
     <w:p>
       <w:pPr>
         <w:pStyle w:val="BodyText"/>
@@ -28156,7 +28713,7 @@
         </m:oMath>
       </m:oMathPara>
     </w:p>
-    <w:bookmarkEnd w:id="103"/>
+    <w:bookmarkEnd w:id="105"/>
     <w:p>
       <w:pPr>
         <w:pStyle w:val="FirstParagraph"/>
@@ -28189,7 +28746,7 @@
         <w:t xml:space="preserve">.</w:t>
       </w:r>
     </w:p>
-    <w:bookmarkStart w:id="104" w:name="rem-standard-error-name"/>
+    <w:bookmarkStart w:id="106" w:name="rem-standard-error-name"/>
     <w:p>
       <w:pPr>
         <w:pStyle w:val="BodyText"/>
@@ -28299,8 +28856,8 @@
         <w:t xml:space="preserve">so they come up often enough to deserve their own name.</w:t>
       </w:r>
     </w:p>
-    <w:bookmarkEnd w:id="104"/>
-    <w:bookmarkStart w:id="105" w:name="exr-var-mse-bias"/>
+    <w:bookmarkEnd w:id="106"/>
+    <w:bookmarkStart w:id="107" w:name="exr-var-mse-bias"/>
     <w:p>
       <w:pPr>
         <w:pStyle w:val="BodyText"/>
@@ -28470,8 +29027,8 @@
         <w:t xml:space="preserve">.</w:t>
       </w:r>
     </w:p>
-    <w:bookmarkEnd w:id="105"/>
-    <w:bookmarkStart w:id="106" w:name="sol-var-mse-bias"/>
+    <w:bookmarkEnd w:id="107"/>
+    <w:bookmarkStart w:id="108" w:name="sol-var-mse-bias"/>
     <w:p>
       <w:pPr>
         <w:pStyle w:val="BodyText"/>
@@ -29398,8 +29955,8 @@
         </m:oMath>
       </m:oMathPara>
     </w:p>
-    <w:bookmarkEnd w:id="106"/>
-    <w:bookmarkStart w:id="107" w:name="cor-var-mse-bias"/>
+    <w:bookmarkEnd w:id="108"/>
+    <w:bookmarkStart w:id="109" w:name="cor-var-mse-bias"/>
     <w:p>
       <w:pPr>
         <w:pStyle w:val="FirstParagraph"/>
@@ -29594,7 +30151,7 @@
         </m:oMath>
       </m:oMathPara>
     </w:p>
-    <w:bookmarkEnd w:id="107"/>
+    <w:bookmarkEnd w:id="109"/>
     <w:p>
       <w:pPr>
         <w:pStyle w:val="FirstParagraph"/>
@@ -29627,7 +30184,7 @@
         <w:t xml:space="preserve">.</w:t>
       </w:r>
     </w:p>
-    <w:bookmarkStart w:id="108" w:name="exr-se-rmse-unbiased"/>
+    <w:bookmarkStart w:id="110" w:name="exr-se-rmse-unbiased"/>
     <w:p>
       <w:pPr>
         <w:pStyle w:val="BodyText"/>
@@ -29653,7 +30210,7 @@
           <w:rPr>
             <w:rStyle w:val="Hyperlink"/>
           </w:rPr>
-          <w:t xml:space="preserve">Equation 4</w:t>
+          <w:t xml:space="preserve">Equation 6</w:t>
         </w:r>
       </w:hyperlink>
       <w:r>
@@ -29735,8 +30292,8 @@
         <w:t xml:space="preserve">.</w:t>
       </w:r>
     </w:p>
-    <w:bookmarkEnd w:id="108"/>
-    <w:bookmarkStart w:id="109" w:name="sol-se-rmse-unbiased"/>
+    <w:bookmarkEnd w:id="110"/>
+    <w:bookmarkStart w:id="111" w:name="sol-se-rmse-unbiased"/>
     <w:p>
       <w:pPr>
         <w:pStyle w:val="BodyText"/>
@@ -29762,7 +30319,7 @@
           <w:rPr>
             <w:rStyle w:val="Hyperlink"/>
           </w:rPr>
-          <w:t xml:space="preserve">Equation 4</w:t>
+          <w:t xml:space="preserve">Equation 6</w:t>
         </w:r>
       </w:hyperlink>
       <w:r>
@@ -29977,8 +30534,8 @@
         <w:t xml:space="preserve">.</w:t>
       </w:r>
     </w:p>
-    <w:bookmarkEnd w:id="109"/>
-    <w:bookmarkStart w:id="110" w:name="cor-se-rmse-unbiased"/>
+    <w:bookmarkEnd w:id="111"/>
+    <w:bookmarkStart w:id="112" w:name="cor-se-rmse-unbiased"/>
     <w:p>
       <w:pPr>
         <w:pStyle w:val="BodyText"/>
@@ -30136,7 +30693,7 @@
         </m:oMath>
       </m:oMathPara>
     </w:p>
-    <w:bookmarkEnd w:id="110"/>
+    <w:bookmarkEnd w:id="112"/>
     <w:p>
       <w:pPr>
         <w:pStyle w:val="FirstParagraph"/>
@@ -30169,9 +30726,9 @@
         <w:t xml:space="preserve">.</w:t>
       </w:r>
     </w:p>
-    <w:bookmarkEnd w:id="111"/>
-    <w:bookmarkEnd w:id="112"/>
-    <w:bookmarkStart w:id="124" w:name="references"/>
+    <w:bookmarkEnd w:id="113"/>
+    <w:bookmarkEnd w:id="114"/>
+    <w:bookmarkStart w:id="126" w:name="references"/>
     <w:p>
       <w:pPr>
         <w:pStyle w:val="Heading2"/>
@@ -30180,8 +30737,8 @@
         <w:t xml:space="preserve">References</w:t>
       </w:r>
     </w:p>
-    <w:bookmarkStart w:id="123" w:name="refs"/>
-    <w:bookmarkStart w:id="113" w:name="ref-box_draper_1987"/>
+    <w:bookmarkStart w:id="125" w:name="refs"/>
+    <w:bookmarkStart w:id="115" w:name="ref-box_draper_1987"/>
     <w:p>
       <w:pPr>
         <w:pStyle w:val="Bibliography"/>
@@ -30203,8 +30760,8 @@
         <w:t xml:space="preserve">. Wiley Series in Probability and Mathematical Statistics. Applied Probability and Statistics. Wiley.</w:t>
       </w:r>
     </w:p>
-    <w:bookmarkEnd w:id="113"/>
-    <w:bookmarkStart w:id="115" w:name="ref-dunn2018generalized"/>
+    <w:bookmarkEnd w:id="115"/>
+    <w:bookmarkStart w:id="117" w:name="ref-dunn2018generalized"/>
     <w:p>
       <w:pPr>
         <w:pStyle w:val="Bibliography"/>
@@ -30242,7 +30799,7 @@
       <w:r>
         <w:t xml:space="preserve"> </w:t>
       </w:r>
-      <w:hyperlink r:id="rId114">
+      <w:hyperlink r:id="rId116">
         <w:r>
           <w:rPr>
             <w:rStyle w:val="Hyperlink"/>
@@ -30254,8 +30811,8 @@
         <w:t xml:space="preserve">.</w:t>
       </w:r>
     </w:p>
-    <w:bookmarkEnd w:id="115"/>
-    <w:bookmarkStart w:id="116" w:name="ref-hosmer1989applied"/>
+    <w:bookmarkEnd w:id="117"/>
+    <w:bookmarkStart w:id="118" w:name="ref-hosmer1989applied"/>
     <w:p>
       <w:pPr>
         <w:pStyle w:val="Bibliography"/>
@@ -30277,8 +30834,8 @@
         <w:t xml:space="preserve">. Wiley.</w:t>
       </w:r>
     </w:p>
-    <w:bookmarkEnd w:id="116"/>
-    <w:bookmarkStart w:id="118" w:name="ref-lawrance2020estimand"/>
+    <w:bookmarkEnd w:id="118"/>
+    <w:bookmarkStart w:id="120" w:name="ref-lawrance2020estimand"/>
     <w:p>
       <w:pPr>
         <w:pStyle w:val="Bibliography"/>
@@ -30311,7 +30868,7 @@
       <w:r>
         <w:t xml:space="preserve"> </w:t>
       </w:r>
-      <w:hyperlink r:id="rId117">
+      <w:hyperlink r:id="rId119">
         <w:r>
           <w:rPr>
             <w:rStyle w:val="Hyperlink"/>
@@ -30323,8 +30880,8 @@
         <w:t xml:space="preserve">.</w:t>
       </w:r>
     </w:p>
-    <w:bookmarkEnd w:id="118"/>
-    <w:bookmarkStart w:id="120" w:name="ref-pohl2021estimands"/>
+    <w:bookmarkEnd w:id="120"/>
+    <w:bookmarkStart w:id="122" w:name="ref-pohl2021estimands"/>
     <w:p>
       <w:pPr>
         <w:pStyle w:val="Bibliography"/>
@@ -30384,7 +30941,7 @@
       <w:r>
         <w:t xml:space="preserve"> </w:t>
       </w:r>
-      <w:hyperlink r:id="rId119">
+      <w:hyperlink r:id="rId121">
         <w:r>
           <w:rPr>
             <w:rStyle w:val="Hyperlink"/>
@@ -30396,8 +30953,8 @@
         <w:t xml:space="preserve">.</w:t>
       </w:r>
     </w:p>
-    <w:bookmarkEnd w:id="120"/>
-    <w:bookmarkStart w:id="122" w:name="ref-van2018flexible"/>
+    <w:bookmarkEnd w:id="122"/>
+    <w:bookmarkStart w:id="124" w:name="ref-van2018flexible"/>
     <w:p>
       <w:pPr>
         <w:pStyle w:val="Bibliography"/>
@@ -30421,7 +30978,7 @@
       <w:r>
         <w:t xml:space="preserve"> </w:t>
       </w:r>
-      <w:hyperlink r:id="rId121">
+      <w:hyperlink r:id="rId123">
         <w:r>
           <w:rPr>
             <w:rStyle w:val="Hyperlink"/>
@@ -30433,9 +30990,9 @@
         <w:t xml:space="preserve">.</w:t>
       </w:r>
     </w:p>
-    <w:bookmarkEnd w:id="122"/>
-    <w:bookmarkEnd w:id="123"/>
     <w:bookmarkEnd w:id="124"/>
+    <w:bookmarkEnd w:id="125"/>
+    <w:bookmarkEnd w:id="126"/>
     <w:sectPr>
       <w:footnotePr>
         <w:numRestart w:val="eachSect"/>

</xml_diff>

<commit_message>
Deploying to gh-pages from @ Morrison-Lab/sds@767d5a9a214c0f57906e0cecff792e6fd74a87fe 🚀
</commit_message>
<xml_diff>
--- a/estimation-handout.docx
+++ b/estimation-handout.docx
@@ -15,7 +15,7 @@
         <w:pStyle w:val="Date"/>
       </w:pPr>
       <w:r>
-        <w:t xml:space="preserve">Last modified: 2026-10-12 20:28:22 (PDT)</w:t>
+        <w:t xml:space="preserve">Last modified: 2026-10-12 20:39:40 (PDT)</w:t>
       </w:r>
     </w:p>
     <w:bookmarkStart w:id="14" w:name="scientific-models"/>
@@ -3019,7 +3019,7 @@
     </w:p>
     <w:bookmarkEnd w:id="33"/>
     <w:bookmarkEnd w:id="34"/>
-    <w:bookmarkStart w:id="115" w:name="sec-est-accuracy"/>
+    <w:bookmarkStart w:id="116" w:name="sec-est-accuracy"/>
     <w:p>
       <w:pPr>
         <w:pStyle w:val="Heading2"/>
@@ -18320,7 +18320,7 @@
     </w:p>
     <w:bookmarkEnd w:id="84"/>
     <w:bookmarkEnd w:id="85"/>
-    <w:bookmarkStart w:id="97" w:name="sec-unbiased-estimators"/>
+    <w:bookmarkStart w:id="98" w:name="sec-unbiased-estimators"/>
     <w:p>
       <w:pPr>
         <w:pStyle w:val="Heading3"/>
@@ -25160,8 +25160,45 @@
         <w:t xml:space="preserve">.</w:t>
       </w:r>
     </w:p>
-    <w:bookmarkEnd w:id="97"/>
-    <w:bookmarkStart w:id="100" w:name="mean-absolute-error"/>
+    <w:p>
+      <w:pPr>
+        <w:pStyle w:val="BodyText"/>
+      </w:pPr>
+      <w:r>
+        <w:t xml:space="preserve">5MinuteAI covers the</w:t>
+      </w:r>
+      <w:r>
+        <w:t xml:space="preserve"> </w:t>
+      </w:r>
+      <w:hyperlink r:id="rId97">
+        <w:r>
+          <w:rPr>
+            <w:rStyle w:val="Hyperlink"/>
+          </w:rPr>
+          <w:t xml:space="preserve">properties of estimators</w:t>
+        </w:r>
+      </w:hyperlink>
+      <w:r>
+        <w:t xml:space="preserve">, including bias,</w:t>
+      </w:r>
+      <w:r>
+        <w:t xml:space="preserve"> </w:t>
+      </w:r>
+      <w:r>
+        <w:t xml:space="preserve">following the University of Washington’s CSE 312</w:t>
+      </w:r>
+      <w:r>
+        <w:t xml:space="preserve"> </w:t>
+      </w:r>
+      <w:r>
+        <w:t xml:space="preserve">(5MinuteAI, n.d.)</w:t>
+      </w:r>
+      <w:r>
+        <w:t xml:space="preserve">.</w:t>
+      </w:r>
+    </w:p>
+    <w:bookmarkEnd w:id="98"/>
+    <w:bookmarkStart w:id="101" w:name="mean-absolute-error"/>
     <w:p>
       <w:pPr>
         <w:pStyle w:val="Heading3"/>
@@ -25170,7 +25207,7 @@
         <w:t xml:space="preserve">3.7 Mean absolute error</w:t>
       </w:r>
     </w:p>
-    <w:bookmarkStart w:id="98" w:name="def-mae"/>
+    <w:bookmarkStart w:id="99" w:name="def-mae"/>
     <w:p>
       <w:pPr>
         <w:pStyle w:val="FirstParagraph"/>
@@ -25355,8 +25392,8 @@
         </m:oMath>
       </m:oMathPara>
     </w:p>
-    <w:bookmarkEnd w:id="98"/>
-    <w:bookmarkStart w:id="99" w:name="exm-mae-gaussian"/>
+    <w:bookmarkEnd w:id="99"/>
+    <w:bookmarkStart w:id="100" w:name="exm-mae-gaussian"/>
     <w:p>
       <w:pPr>
         <w:pStyle w:val="FirstParagraph"/>
@@ -27762,9 +27799,9 @@
         <w:t xml:space="preserve">).</w:t>
       </w:r>
     </w:p>
-    <w:bookmarkEnd w:id="99"/>
     <w:bookmarkEnd w:id="100"/>
-    <w:bookmarkStart w:id="114" w:name="standard-error"/>
+    <w:bookmarkEnd w:id="101"/>
+    <w:bookmarkStart w:id="115" w:name="standard-error"/>
     <w:p>
       <w:pPr>
         <w:pStyle w:val="Heading3"/>
@@ -27773,7 +27810,7 @@
         <w:t xml:space="preserve">3.8 Standard error</w:t>
       </w:r>
     </w:p>
-    <w:bookmarkStart w:id="102" w:name="def-SE"/>
+    <w:bookmarkStart w:id="103" w:name="def-SE"/>
     <w:p>
       <w:pPr>
         <w:pStyle w:val="FirstParagraph"/>
@@ -27831,7 +27868,7 @@
       <w:r>
         <w:t xml:space="preserve"> </w:t>
       </w:r>
-      <w:hyperlink r:id="rId101">
+      <w:hyperlink r:id="rId102">
         <w:r>
           <w:rPr>
             <w:rStyle w:val="Hyperlink"/>
@@ -27959,8 +27996,8 @@
         </m:oMath>
       </m:oMathPara>
     </w:p>
-    <w:bookmarkEnd w:id="102"/>
-    <w:bookmarkStart w:id="103" w:name="exm-SE-sample-mean"/>
+    <w:bookmarkEnd w:id="103"/>
+    <w:bookmarkStart w:id="104" w:name="exm-SE-sample-mean"/>
     <w:p>
       <w:pPr>
         <w:pStyle w:val="FirstParagraph"/>
@@ -28272,8 +28309,8 @@
         <w:t xml:space="preserve">.</w:t>
       </w:r>
     </w:p>
-    <w:bookmarkEnd w:id="103"/>
-    <w:bookmarkStart w:id="104" w:name="exr-se-error-sd"/>
+    <w:bookmarkEnd w:id="104"/>
+    <w:bookmarkStart w:id="105" w:name="exr-se-error-sd"/>
     <w:p>
       <w:pPr>
         <w:pStyle w:val="BodyText"/>
@@ -28294,7 +28331,7 @@
       <w:r>
         <w:t xml:space="preserve"> </w:t>
       </w:r>
-      <w:hyperlink r:id="rId101">
+      <w:hyperlink r:id="rId102">
         <w:r>
           <w:rPr>
             <w:rStyle w:val="Hyperlink"/>
@@ -28395,8 +28432,8 @@
         <w:t xml:space="preserve">.</w:t>
       </w:r>
     </w:p>
-    <w:bookmarkEnd w:id="104"/>
-    <w:bookmarkStart w:id="105" w:name="sol-se-error-sd"/>
+    <w:bookmarkEnd w:id="105"/>
+    <w:bookmarkStart w:id="106" w:name="sol-se-error-sd"/>
     <w:p>
       <w:pPr>
         <w:pStyle w:val="BodyText"/>
@@ -28763,8 +28800,8 @@
         </m:oMath>
       </m:oMathPara>
     </w:p>
-    <w:bookmarkEnd w:id="105"/>
-    <w:bookmarkStart w:id="106" w:name="thm-se-error-sd"/>
+    <w:bookmarkEnd w:id="106"/>
+    <w:bookmarkStart w:id="107" w:name="thm-se-error-sd"/>
     <w:p>
       <w:pPr>
         <w:pStyle w:val="FirstParagraph"/>
@@ -28878,7 +28915,7 @@
         </m:oMath>
       </m:oMathPara>
     </w:p>
-    <w:bookmarkEnd w:id="106"/>
+    <w:bookmarkEnd w:id="107"/>
     <w:p>
       <w:pPr>
         <w:pStyle w:val="FirstParagraph"/>
@@ -28911,7 +28948,7 @@
         <w:t xml:space="preserve">.</w:t>
       </w:r>
     </w:p>
-    <w:bookmarkStart w:id="107" w:name="rem-standard-error-name"/>
+    <w:bookmarkStart w:id="108" w:name="rem-standard-error-name"/>
     <w:p>
       <w:pPr>
         <w:pStyle w:val="BodyText"/>
@@ -29021,8 +29058,8 @@
         <w:t xml:space="preserve">so they come up often enough to deserve their own name.</w:t>
       </w:r>
     </w:p>
-    <w:bookmarkEnd w:id="107"/>
-    <w:bookmarkStart w:id="108" w:name="exr-var-mse-bias"/>
+    <w:bookmarkEnd w:id="108"/>
+    <w:bookmarkStart w:id="109" w:name="exr-var-mse-bias"/>
     <w:p>
       <w:pPr>
         <w:pStyle w:val="BodyText"/>
@@ -29192,8 +29229,8 @@
         <w:t xml:space="preserve">.</w:t>
       </w:r>
     </w:p>
-    <w:bookmarkEnd w:id="108"/>
-    <w:bookmarkStart w:id="109" w:name="sol-var-mse-bias"/>
+    <w:bookmarkEnd w:id="109"/>
+    <w:bookmarkStart w:id="110" w:name="sol-var-mse-bias"/>
     <w:p>
       <w:pPr>
         <w:pStyle w:val="BodyText"/>
@@ -30120,8 +30157,8 @@
         </m:oMath>
       </m:oMathPara>
     </w:p>
-    <w:bookmarkEnd w:id="109"/>
-    <w:bookmarkStart w:id="110" w:name="cor-var-mse-bias"/>
+    <w:bookmarkEnd w:id="110"/>
+    <w:bookmarkStart w:id="111" w:name="cor-var-mse-bias"/>
     <w:p>
       <w:pPr>
         <w:pStyle w:val="FirstParagraph"/>
@@ -30316,7 +30353,7 @@
         </m:oMath>
       </m:oMathPara>
     </w:p>
-    <w:bookmarkEnd w:id="110"/>
+    <w:bookmarkEnd w:id="111"/>
     <w:p>
       <w:pPr>
         <w:pStyle w:val="FirstParagraph"/>
@@ -30349,7 +30386,7 @@
         <w:t xml:space="preserve">.</w:t>
       </w:r>
     </w:p>
-    <w:bookmarkStart w:id="111" w:name="exr-se-rmse-unbiased"/>
+    <w:bookmarkStart w:id="112" w:name="exr-se-rmse-unbiased"/>
     <w:p>
       <w:pPr>
         <w:pStyle w:val="BodyText"/>
@@ -30457,8 +30494,8 @@
         <w:t xml:space="preserve">.</w:t>
       </w:r>
     </w:p>
-    <w:bookmarkEnd w:id="111"/>
-    <w:bookmarkStart w:id="112" w:name="sol-se-rmse-unbiased"/>
+    <w:bookmarkEnd w:id="112"/>
+    <w:bookmarkStart w:id="113" w:name="sol-se-rmse-unbiased"/>
     <w:p>
       <w:pPr>
         <w:pStyle w:val="BodyText"/>
@@ -30721,8 +30758,8 @@
         </m:oMath>
       </m:oMathPara>
     </w:p>
-    <w:bookmarkEnd w:id="112"/>
-    <w:bookmarkStart w:id="113" w:name="cor-se-rmse-unbiased"/>
+    <w:bookmarkEnd w:id="113"/>
+    <w:bookmarkStart w:id="114" w:name="cor-se-rmse-unbiased"/>
     <w:p>
       <w:pPr>
         <w:pStyle w:val="FirstParagraph"/>
@@ -30880,7 +30917,7 @@
         </m:oMath>
       </m:oMathPara>
     </w:p>
-    <w:bookmarkEnd w:id="113"/>
+    <w:bookmarkEnd w:id="114"/>
     <w:p>
       <w:pPr>
         <w:pStyle w:val="FirstParagraph"/>
@@ -30913,9 +30950,9 @@
         <w:t xml:space="preserve">.</w:t>
       </w:r>
     </w:p>
-    <w:bookmarkEnd w:id="114"/>
     <w:bookmarkEnd w:id="115"/>
-    <w:bookmarkStart w:id="127" w:name="references"/>
+    <w:bookmarkEnd w:id="116"/>
+    <w:bookmarkStart w:id="130" w:name="references"/>
     <w:p>
       <w:pPr>
         <w:pStyle w:val="Heading2"/>
@@ -30924,8 +30961,45 @@
         <w:t xml:space="preserve">References</w:t>
       </w:r>
     </w:p>
-    <w:bookmarkStart w:id="126" w:name="refs"/>
-    <w:bookmarkStart w:id="116" w:name="ref-box_draper_1987"/>
+    <w:bookmarkStart w:id="129" w:name="refs"/>
+    <w:bookmarkStart w:id="118" w:name="ref-fiveminuteai_probstat"/>
+    <w:p>
+      <w:pPr>
+        <w:pStyle w:val="Bibliography"/>
+      </w:pPr>
+      <w:r>
+        <w:t xml:space="preserve">5MinuteAI. n.d.</w:t>
+      </w:r>
+      <w:r>
+        <w:t xml:space="preserve"> </w:t>
+      </w:r>
+      <w:r>
+        <w:rPr>
+          <w:i/>
+          <w:iCs/>
+        </w:rPr>
+        <w:t xml:space="preserve">Probability &amp; Statistics</w:t>
+      </w:r>
+      <w:r>
+        <w:t xml:space="preserve">. Video playlist on YouTube. Accessed October 12, 2026.</w:t>
+      </w:r>
+      <w:r>
+        <w:t xml:space="preserve"> </w:t>
+      </w:r>
+      <w:hyperlink r:id="rId117">
+        <w:r>
+          <w:rPr>
+            <w:rStyle w:val="Hyperlink"/>
+          </w:rPr>
+          <w:t xml:space="preserve">https://www.youtube.com/playlist?list=PLeB45KifGiuHesi4PALNZSYZFhViVGQJK</w:t>
+        </w:r>
+      </w:hyperlink>
+      <w:r>
+        <w:t xml:space="preserve">.</w:t>
+      </w:r>
+    </w:p>
+    <w:bookmarkEnd w:id="118"/>
+    <w:bookmarkStart w:id="119" w:name="ref-box_draper_1987"/>
     <w:p>
       <w:pPr>
         <w:pStyle w:val="Bibliography"/>
@@ -30947,8 +31021,8 @@
         <w:t xml:space="preserve">. Wiley Series in Probability and Mathematical Statistics. Applied Probability and Statistics. Wiley.</w:t>
       </w:r>
     </w:p>
-    <w:bookmarkEnd w:id="116"/>
-    <w:bookmarkStart w:id="118" w:name="ref-dunn2018generalized"/>
+    <w:bookmarkEnd w:id="119"/>
+    <w:bookmarkStart w:id="121" w:name="ref-dunn2018generalized"/>
     <w:p>
       <w:pPr>
         <w:pStyle w:val="Bibliography"/>
@@ -30986,7 +31060,7 @@
       <w:r>
         <w:t xml:space="preserve"> </w:t>
       </w:r>
-      <w:hyperlink r:id="rId117">
+      <w:hyperlink r:id="rId120">
         <w:r>
           <w:rPr>
             <w:rStyle w:val="Hyperlink"/>
@@ -30998,8 +31072,8 @@
         <w:t xml:space="preserve">.</w:t>
       </w:r>
     </w:p>
-    <w:bookmarkEnd w:id="118"/>
-    <w:bookmarkStart w:id="119" w:name="ref-hosmer1989applied"/>
+    <w:bookmarkEnd w:id="121"/>
+    <w:bookmarkStart w:id="122" w:name="ref-hosmer1989applied"/>
     <w:p>
       <w:pPr>
         <w:pStyle w:val="Bibliography"/>
@@ -31021,8 +31095,8 @@
         <w:t xml:space="preserve">. Wiley.</w:t>
       </w:r>
     </w:p>
-    <w:bookmarkEnd w:id="119"/>
-    <w:bookmarkStart w:id="121" w:name="ref-lawrance2020estimand"/>
+    <w:bookmarkEnd w:id="122"/>
+    <w:bookmarkStart w:id="124" w:name="ref-lawrance2020estimand"/>
     <w:p>
       <w:pPr>
         <w:pStyle w:val="Bibliography"/>
@@ -31055,7 +31129,7 @@
       <w:r>
         <w:t xml:space="preserve"> </w:t>
       </w:r>
-      <w:hyperlink r:id="rId120">
+      <w:hyperlink r:id="rId123">
         <w:r>
           <w:rPr>
             <w:rStyle w:val="Hyperlink"/>
@@ -31067,8 +31141,8 @@
         <w:t xml:space="preserve">.</w:t>
       </w:r>
     </w:p>
-    <w:bookmarkEnd w:id="121"/>
-    <w:bookmarkStart w:id="123" w:name="ref-pohl2021estimands"/>
+    <w:bookmarkEnd w:id="124"/>
+    <w:bookmarkStart w:id="126" w:name="ref-pohl2021estimands"/>
     <w:p>
       <w:pPr>
         <w:pStyle w:val="Bibliography"/>
@@ -31128,7 +31202,7 @@
       <w:r>
         <w:t xml:space="preserve"> </w:t>
       </w:r>
-      <w:hyperlink r:id="rId122">
+      <w:hyperlink r:id="rId125">
         <w:r>
           <w:rPr>
             <w:rStyle w:val="Hyperlink"/>
@@ -31140,8 +31214,8 @@
         <w:t xml:space="preserve">.</w:t>
       </w:r>
     </w:p>
-    <w:bookmarkEnd w:id="123"/>
-    <w:bookmarkStart w:id="125" w:name="ref-van2018flexible"/>
+    <w:bookmarkEnd w:id="126"/>
+    <w:bookmarkStart w:id="128" w:name="ref-van2018flexible"/>
     <w:p>
       <w:pPr>
         <w:pStyle w:val="Bibliography"/>
@@ -31165,7 +31239,7 @@
       <w:r>
         <w:t xml:space="preserve"> </w:t>
       </w:r>
-      <w:hyperlink r:id="rId124">
+      <w:hyperlink r:id="rId127">
         <w:r>
           <w:rPr>
             <w:rStyle w:val="Hyperlink"/>
@@ -31177,9 +31251,9 @@
         <w:t xml:space="preserve">.</w:t>
       </w:r>
     </w:p>
-    <w:bookmarkEnd w:id="125"/>
-    <w:bookmarkEnd w:id="126"/>
-    <w:bookmarkEnd w:id="127"/>
+    <w:bookmarkEnd w:id="128"/>
+    <w:bookmarkEnd w:id="129"/>
+    <w:bookmarkEnd w:id="130"/>
     <w:sectPr>
       <w:footnotePr>
         <w:numRestart w:val="eachSect"/>

</xml_diff>

<commit_message>
Deploying to gh-pages from @ Morrison-Lab/sds@57cd7f7f8c1f5126423cf23408daff44de66501b 🚀
</commit_message>
<xml_diff>
--- a/estimation-handout.docx
+++ b/estimation-handout.docx
@@ -15,7 +15,7 @@
         <w:pStyle w:val="Date"/>
       </w:pPr>
       <w:r>
-        <w:t xml:space="preserve">Last modified: 2026-10-14 23:57:22 (PDT)</w:t>
+        <w:t xml:space="preserve">Last modified: 2026-10-15 00:35:18 (PDT)</w:t>
       </w:r>
     </w:p>
     <w:bookmarkStart w:id="14" w:name="scientific-models"/>
@@ -12959,7 +12959,7 @@
         <w:pStyle w:val="Heading3"/>
       </w:pPr>
       <w:r>
-        <w:t xml:space="preserve">3.5 Mean squared error</w:t>
+        <w:t xml:space="preserve">3.5 Mean squared error of an estimator</w:t>
       </w:r>
     </w:p>
     <w:bookmarkStart w:id="72" w:name="def-mse"/>

</xml_diff>

<commit_message>
Deploying to gh-pages from @ Morrison-Lab/sds@1ba7b5ff5940ac1b95dc7e5cae291d6d0bf6c7a3 🚀
</commit_message>
<xml_diff>
--- a/estimation-handout.docx
+++ b/estimation-handout.docx
@@ -15,7 +15,7 @@
         <w:pStyle w:val="Date"/>
       </w:pPr>
       <w:r>
-        <w:t xml:space="preserve">Last modified: 2026-10-15 01:20:20 (PDT)</w:t>
+        <w:t xml:space="preserve">Last modified: 2026-10-15 01:31:51 (PDT)</w:t>
       </w:r>
     </w:p>
     <w:bookmarkStart w:id="14" w:name="scientific-models"/>
@@ -6830,11 +6830,11 @@
               <m:grow/>
             </m:dPr>
             <m:e>
-              <m:r>
-                <m:t>​</m:t>
-              </m:r>
               <m:sSup>
                 <m:e>
+                  <m:r>
+                    <m:t>​</m:t>
+                  </m:r>
                   <m:d>
                     <m:dPr>
                       <m:begChr m:val="("/>
@@ -6874,6 +6874,9 @@
                       </m:r>
                     </m:e>
                   </m:d>
+                  <m:r>
+                    <m:t>​</m:t>
+                  </m:r>
                 </m:e>
                 <m:sup>
                   <m:r>
@@ -6881,9 +6884,6 @@
                   </m:r>
                 </m:sup>
               </m:sSup>
-              <m:r>
-                <m:t>​</m:t>
-              </m:r>
             </m:e>
           </m:d>
           <m:r>
@@ -6946,11 +6946,11 @@
         <w:t xml:space="preserve"> </w:t>
       </w:r>
       <m:oMath>
-        <m:r>
-          <m:t>​</m:t>
-        </m:r>
         <m:sSup>
           <m:e>
+            <m:r>
+              <m:t>​</m:t>
+            </m:r>
             <m:d>
               <m:dPr>
                 <m:begChr m:val="("/>
@@ -6993,6 +6993,9 @@
                 </m:r>
               </m:e>
             </m:d>
+            <m:r>
+              <m:t>​</m:t>
+            </m:r>
           </m:e>
           <m:sup>
             <m:r>
@@ -7000,9 +7003,6 @@
             </m:r>
           </m:sup>
         </m:sSup>
-        <m:r>
-          <m:t>​</m:t>
-        </m:r>
       </m:oMath>
       <w:r>
         <w:t xml:space="preserve"> </w:t>
@@ -7093,11 +7093,11 @@
         <m:oMath>
           <m:eqArr>
             <m:e>
-              <m:r>
-                <m:t>​</m:t>
-              </m:r>
               <m:sSup>
                 <m:e>
+                  <m:r>
+                    <m:t>​</m:t>
+                  </m:r>
                   <m:d>
                     <m:dPr>
                       <m:begChr m:val="("/>
@@ -7140,6 +7140,9 @@
                       </m:r>
                     </m:e>
                   </m:d>
+                  <m:r>
+                    <m:t>​</m:t>
+                  </m:r>
                 </m:e>
                 <m:sup>
                   <m:r>
@@ -7148,9 +7151,6 @@
                 </m:sup>
               </m:sSup>
               <m:r>
-                <m:t>​</m:t>
-              </m:r>
-              <m:r>
                 <m:t>&amp;</m:t>
               </m:r>
               <m:r>
@@ -7159,11 +7159,11 @@
                 </m:rPr>
                 <m:t>=</m:t>
               </m:r>
-              <m:r>
-                <m:t>​</m:t>
-              </m:r>
               <m:sSup>
                 <m:e>
+                  <m:r>
+                    <m:t>​</m:t>
+                  </m:r>
                   <m:d>
                     <m:dPr>
                       <m:begChr m:val="("/>
@@ -7215,6 +7215,9 @@
                       </m:r>
                     </m:e>
                   </m:d>
+                  <m:r>
+                    <m:t>​</m:t>
+                  </m:r>
                 </m:e>
                 <m:sup>
                   <m:r>
@@ -7223,9 +7226,6 @@
                 </m:sup>
               </m:sSup>
               <m:r>
-                <m:t>​</m:t>
-              </m:r>
-              <m:r>
                 <m:t>&amp;</m:t>
               </m:r>
               <m:r>
@@ -7249,11 +7249,11 @@
                 </m:rPr>
                 <m:t>=</m:t>
               </m:r>
-              <m:r>
-                <m:t>​</m:t>
-              </m:r>
               <m:sSup>
                 <m:e>
+                  <m:r>
+                    <m:t>​</m:t>
+                  </m:r>
                   <m:d>
                     <m:dPr>
                       <m:begChr m:val="("/>
@@ -7296,6 +7296,9 @@
                       </m:r>
                     </m:e>
                   </m:d>
+                  <m:r>
+                    <m:t>​</m:t>
+                  </m:r>
                 </m:e>
                 <m:sup>
                   <m:r>
@@ -7303,9 +7306,6 @@
                   </m:r>
                 </m:sup>
               </m:sSup>
-              <m:r>
-                <m:t>​</m:t>
-              </m:r>
               <m:r>
                 <m:rPr>
                   <m:sty m:val="p"/>
@@ -7429,11 +7429,11 @@
         <w:t xml:space="preserve"> </w:t>
       </w:r>
       <m:oMath>
-        <m:r>
-          <m:t>​</m:t>
-        </m:r>
         <m:sSup>
           <m:e>
+            <m:r>
+              <m:t>​</m:t>
+            </m:r>
             <m:d>
               <m:dPr>
                 <m:begChr m:val="("/>
@@ -7476,6 +7476,9 @@
                 </m:r>
               </m:e>
             </m:d>
+            <m:r>
+              <m:t>​</m:t>
+            </m:r>
           </m:e>
           <m:sup>
             <m:r>
@@ -7483,9 +7486,6 @@
             </m:r>
           </m:sup>
         </m:sSup>
-        <m:r>
-          <m:t>​</m:t>
-        </m:r>
         <m:r>
           <m:rPr>
             <m:sty m:val="p"/>
@@ -7764,11 +7764,11 @@
             </m:rPr>
             <m:t>−</m:t>
           </m:r>
-          <m:r>
-            <m:t>​</m:t>
-          </m:r>
           <m:sSup>
             <m:e>
+              <m:r>
+                <m:t>​</m:t>
+              </m:r>
               <m:d>
                 <m:dPr>
                   <m:begChr m:val="("/>
@@ -7811,6 +7811,9 @@
                   </m:r>
                 </m:e>
               </m:d>
+              <m:r>
+                <m:t>​</m:t>
+              </m:r>
             </m:e>
             <m:sup>
               <m:r>
@@ -7818,9 +7821,6 @@
               </m:r>
             </m:sup>
           </m:sSup>
-          <m:r>
-            <m:t>​</m:t>
-          </m:r>
           <m:r>
             <m:t>  </m:t>
           </m:r>
@@ -7880,11 +7880,11 @@
         <m:oMath>
           <m:eqArr>
             <m:e>
-              <m:r>
-                <m:t>​</m:t>
-              </m:r>
               <m:sSup>
                 <m:e>
+                  <m:r>
+                    <m:t>​</m:t>
+                  </m:r>
                   <m:d>
                     <m:dPr>
                       <m:begChr m:val="("/>
@@ -7927,6 +7927,9 @@
                       </m:r>
                     </m:e>
                   </m:d>
+                  <m:r>
+                    <m:t>​</m:t>
+                  </m:r>
                 </m:e>
                 <m:sup>
                   <m:r>
@@ -7934,9 +7937,6 @@
                   </m:r>
                 </m:sup>
               </m:sSup>
-              <m:r>
-                <m:t>​</m:t>
-              </m:r>
               <m:r>
                 <m:rPr>
                   <m:sty m:val="p"/>
@@ -7984,11 +7984,11 @@
                 </m:rPr>
                 <m:t>=</m:t>
               </m:r>
-              <m:r>
-                <m:t>​</m:t>
-              </m:r>
               <m:sSup>
                 <m:e>
+                  <m:r>
+                    <m:t>​</m:t>
+                  </m:r>
                   <m:d>
                     <m:dPr>
                       <m:begChr m:val="("/>
@@ -8031,6 +8031,9 @@
                       </m:r>
                     </m:e>
                   </m:d>
+                  <m:r>
+                    <m:t>​</m:t>
+                  </m:r>
                 </m:e>
                 <m:sup>
                   <m:r>
@@ -8038,9 +8041,6 @@
                   </m:r>
                 </m:sup>
               </m:sSup>
-              <m:r>
-                <m:t>​</m:t>
-              </m:r>
               <m:r>
                 <m:rPr>
                   <m:sty m:val="p"/>
@@ -8165,11 +8165,11 @@
                 </m:rPr>
                 <m:t>=</m:t>
               </m:r>
-              <m:r>
-                <m:t>​</m:t>
-              </m:r>
               <m:sSup>
                 <m:e>
+                  <m:r>
+                    <m:t>​</m:t>
+                  </m:r>
                   <m:d>
                     <m:dPr>
                       <m:begChr m:val="("/>
@@ -8212,6 +8212,9 @@
                       </m:r>
                     </m:e>
                   </m:d>
+                  <m:r>
+                    <m:t>​</m:t>
+                  </m:r>
                 </m:e>
                 <m:sup>
                   <m:r>
@@ -8219,9 +8222,6 @@
                   </m:r>
                 </m:sup>
               </m:sSup>
-              <m:r>
-                <m:t>​</m:t>
-              </m:r>
               <m:r>
                 <m:rPr>
                   <m:sty m:val="p"/>
@@ -8337,11 +8337,11 @@
                 </m:rPr>
                 <m:t>−</m:t>
               </m:r>
-              <m:r>
-                <m:t>​</m:t>
-              </m:r>
               <m:sSup>
                 <m:e>
+                  <m:r>
+                    <m:t>​</m:t>
+                  </m:r>
                   <m:d>
                     <m:dPr>
                       <m:begChr m:val="("/>
@@ -8384,6 +8384,9 @@
                       </m:r>
                     </m:e>
                   </m:d>
+                  <m:r>
+                    <m:t>​</m:t>
+                  </m:r>
                 </m:e>
                 <m:sup>
                   <m:r>
@@ -8391,9 +8394,6 @@
                   </m:r>
                 </m:sup>
               </m:sSup>
-              <m:r>
-                <m:t>​</m:t>
-              </m:r>
               <m:r>
                 <m:t>&amp;</m:t>
               </m:r>
@@ -8527,11 +8527,11 @@
                 </m:rPr>
                 <m:t>+</m:t>
               </m:r>
-              <m:r>
-                <m:t>​</m:t>
-              </m:r>
               <m:sSup>
                 <m:e>
+                  <m:r>
+                    <m:t>​</m:t>
+                  </m:r>
                   <m:d>
                     <m:dPr>
                       <m:begChr m:val="("/>
@@ -8574,6 +8574,9 @@
                       </m:r>
                     </m:e>
                   </m:d>
+                  <m:r>
+                    <m:t>​</m:t>
+                  </m:r>
                 </m:e>
                 <m:sup>
                   <m:r>
@@ -8582,19 +8585,16 @@
                 </m:sup>
               </m:sSup>
               <m:r>
-                <m:t>​</m:t>
-              </m:r>
-              <m:r>
                 <m:rPr>
                   <m:sty m:val="p"/>
                 </m:rPr>
                 <m:t>−</m:t>
               </m:r>
-              <m:r>
-                <m:t>​</m:t>
-              </m:r>
               <m:sSup>
                 <m:e>
+                  <m:r>
+                    <m:t>​</m:t>
+                  </m:r>
                   <m:d>
                     <m:dPr>
                       <m:begChr m:val="("/>
@@ -8637,6 +8637,9 @@
                       </m:r>
                     </m:e>
                   </m:d>
+                  <m:r>
+                    <m:t>​</m:t>
+                  </m:r>
                 </m:e>
                 <m:sup>
                   <m:r>
@@ -8644,9 +8647,6 @@
                   </m:r>
                 </m:sup>
               </m:sSup>
-              <m:r>
-                <m:t>​</m:t>
-              </m:r>
               <m:r>
                 <m:t>&amp;</m:t>
               </m:r>
@@ -8791,11 +8791,11 @@
                   <m:grow/>
                 </m:dPr>
                 <m:e>
-                  <m:r>
-                    <m:t>​</m:t>
-                  </m:r>
                   <m:sSup>
                     <m:e>
+                      <m:r>
+                        <m:t>​</m:t>
+                      </m:r>
                       <m:d>
                         <m:dPr>
                           <m:begChr m:val="("/>
@@ -8838,6 +8838,9 @@
                           </m:r>
                         </m:e>
                       </m:d>
+                      <m:r>
+                        <m:t>​</m:t>
+                      </m:r>
                     </m:e>
                     <m:sup>
                       <m:r>
@@ -8845,20 +8848,17 @@
                       </m:r>
                     </m:sup>
                   </m:sSup>
-                  <m:r>
-                    <m:t>​</m:t>
-                  </m:r>
                   <m:r>
                     <m:rPr>
                       <m:sty m:val="p"/>
                     </m:rPr>
                     <m:t>−</m:t>
                   </m:r>
-                  <m:r>
-                    <m:t>​</m:t>
-                  </m:r>
                   <m:sSup>
                     <m:e>
+                      <m:r>
+                        <m:t>​</m:t>
+                      </m:r>
                       <m:d>
                         <m:dPr>
                           <m:begChr m:val="("/>
@@ -8901,6 +8901,9 @@
                           </m:r>
                         </m:e>
                       </m:d>
+                      <m:r>
+                        <m:t>​</m:t>
+                      </m:r>
                     </m:e>
                     <m:sup>
                       <m:r>
@@ -8908,9 +8911,6 @@
                       </m:r>
                     </m:sup>
                   </m:sSup>
-                  <m:r>
-                    <m:t>​</m:t>
-                  </m:r>
                 </m:e>
               </m:d>
               <m:r>
@@ -9545,11 +9545,11 @@
                   <m:grow/>
                 </m:dPr>
                 <m:e>
-                  <m:r>
-                    <m:t>​</m:t>
-                  </m:r>
                   <m:sSup>
                     <m:e>
+                      <m:r>
+                        <m:t>​</m:t>
+                      </m:r>
                       <m:d>
                         <m:dPr>
                           <m:begChr m:val="("/>
@@ -9589,6 +9589,9 @@
                           </m:r>
                         </m:e>
                       </m:d>
+                      <m:r>
+                        <m:t>​</m:t>
+                      </m:r>
                     </m:e>
                     <m:sup>
                       <m:r>
@@ -9596,9 +9599,6 @@
                       </m:r>
                     </m:sup>
                   </m:sSup>
-                  <m:r>
-                    <m:t>​</m:t>
-                  </m:r>
                 </m:e>
               </m:d>
               <m:r>
@@ -10337,11 +10337,11 @@
             </m:rPr>
             <m:t>=</m:t>
           </m:r>
-          <m:r>
-            <m:t>​</m:t>
-          </m:r>
           <m:sSup>
             <m:e>
+              <m:r>
+                <m:t>​</m:t>
+              </m:r>
               <m:d>
                 <m:dPr>
                   <m:begChr m:val="("/>
@@ -10384,6 +10384,9 @@
                   </m:r>
                 </m:e>
               </m:d>
+              <m:r>
+                <m:t>​</m:t>
+              </m:r>
             </m:e>
             <m:sup>
               <m:r>
@@ -10391,9 +10394,6 @@
               </m:r>
             </m:sup>
           </m:sSup>
-          <m:r>
-            <m:t>​</m:t>
-          </m:r>
           <m:r>
             <m:rPr>
               <m:sty m:val="p"/>
@@ -10550,11 +10550,11 @@
         <w:t xml:space="preserve"> </w:t>
       </w:r>
       <m:oMath>
-        <m:r>
-          <m:t>​</m:t>
-        </m:r>
         <m:sSup>
           <m:e>
+            <m:r>
+              <m:t>​</m:t>
+            </m:r>
             <m:d>
               <m:dPr>
                 <m:begChr m:val="("/>
@@ -10597,6 +10597,9 @@
                 </m:r>
               </m:e>
             </m:d>
+            <m:r>
+              <m:t>​</m:t>
+            </m:r>
           </m:e>
           <m:sup>
             <m:r>
@@ -10604,9 +10607,6 @@
             </m:r>
           </m:sup>
         </m:sSup>
-        <m:r>
-          <m:t>​</m:t>
-        </m:r>
         <m:r>
           <m:rPr>
             <m:sty m:val="p"/>
@@ -11253,11 +11253,11 @@
                 </m:rPr>
                 <m:t>=</m:t>
               </m:r>
-              <m:r>
-                <m:t>​</m:t>
-              </m:r>
               <m:sSup>
                 <m:e>
+                  <m:r>
+                    <m:t>​</m:t>
+                  </m:r>
                   <m:d>
                     <m:dPr>
                       <m:begChr m:val="("/>
@@ -11300,6 +11300,9 @@
                       </m:r>
                     </m:e>
                   </m:d>
+                  <m:r>
+                    <m:t>​</m:t>
+                  </m:r>
                 </m:e>
                 <m:sup>
                   <m:r>
@@ -11307,9 +11310,6 @@
                   </m:r>
                 </m:sup>
               </m:sSup>
-              <m:r>
-                <m:t>​</m:t>
-              </m:r>
               <m:r>
                 <m:rPr>
                   <m:sty m:val="p"/>
@@ -13938,11 +13938,11 @@
                 </m:rPr>
                 <m:t>+</m:t>
               </m:r>
-              <m:r>
-                <m:t>​</m:t>
-              </m:r>
               <m:sSup>
                 <m:e>
+                  <m:r>
+                    <m:t>​</m:t>
+                  </m:r>
                   <m:d>
                     <m:dPr>
                       <m:begChr m:val="("/>
@@ -13987,6 +13987,9 @@
                       </m:r>
                     </m:e>
                   </m:d>
+                  <m:r>
+                    <m:t>​</m:t>
+                  </m:r>
                 </m:e>
                 <m:sup>
                   <m:r>
@@ -13994,9 +13997,6 @@
                   </m:r>
                 </m:sup>
               </m:sSup>
-              <m:r>
-                <m:t>​</m:t>
-              </m:r>
             </m:e>
             <m:e>
               <m:r>
@@ -14150,11 +14150,11 @@
                 </m:rPr>
                 <m:t>+</m:t>
               </m:r>
-              <m:r>
-                <m:t>​</m:t>
-              </m:r>
               <m:sSup>
                 <m:e>
+                  <m:r>
+                    <m:t>​</m:t>
+                  </m:r>
                   <m:d>
                     <m:dPr>
                       <m:begChr m:val="("/>
@@ -14197,6 +14197,9 @@
                       </m:r>
                     </m:e>
                   </m:d>
+                  <m:r>
+                    <m:t>​</m:t>
+                  </m:r>
                 </m:e>
                 <m:sup>
                   <m:r>
@@ -14204,9 +14207,6 @@
                   </m:r>
                 </m:sup>
               </m:sSup>
-              <m:r>
-                <m:t>​</m:t>
-              </m:r>
             </m:e>
             <m:e>
               <m:r>
@@ -19115,11 +19115,11 @@
                 </m:rPr>
                 <m:t>=</m:t>
               </m:r>
-              <m:r>
-                <m:t>​</m:t>
-              </m:r>
               <m:sSup>
                 <m:e>
+                  <m:r>
+                    <m:t>​</m:t>
+                  </m:r>
                   <m:d>
                     <m:dPr>
                       <m:begChr m:val="("/>
@@ -19162,6 +19162,9 @@
                       </m:r>
                     </m:e>
                   </m:d>
+                  <m:r>
+                    <m:t>​</m:t>
+                  </m:r>
                 </m:e>
                 <m:sup>
                   <m:r>
@@ -19169,9 +19172,6 @@
                   </m:r>
                 </m:sup>
               </m:sSup>
-              <m:r>
-                <m:t>​</m:t>
-              </m:r>
               <m:r>
                 <m:rPr>
                   <m:sty m:val="p"/>
@@ -23663,11 +23663,11 @@
         <w:t xml:space="preserve"> </w:t>
       </w:r>
       <m:oMath>
-        <m:r>
-          <m:t>​</m:t>
-        </m:r>
         <m:sSup>
           <m:e>
+            <m:r>
+              <m:t>​</m:t>
+            </m:r>
             <m:d>
               <m:dPr>
                 <m:begChr m:val="("/>
@@ -23710,6 +23710,9 @@
                 </m:r>
               </m:e>
             </m:d>
+            <m:r>
+              <m:t>​</m:t>
+            </m:r>
           </m:e>
           <m:sup>
             <m:r>
@@ -23717,9 +23720,6 @@
             </m:r>
           </m:sup>
         </m:sSup>
-        <m:r>
-          <m:t>​</m:t>
-        </m:r>
       </m:oMath>
       <w:r>
         <w:t xml:space="preserve"> </w:t>
@@ -23849,11 +23849,11 @@
                 </m:rPr>
                 <m:t>=</m:t>
               </m:r>
-              <m:r>
-                <m:t>​</m:t>
-              </m:r>
               <m:sSup>
                 <m:e>
+                  <m:r>
+                    <m:t>​</m:t>
+                  </m:r>
                   <m:d>
                     <m:dPr>
                       <m:begChr m:val="("/>
@@ -23896,6 +23896,9 @@
                       </m:r>
                     </m:e>
                   </m:d>
+                  <m:r>
+                    <m:t>​</m:t>
+                  </m:r>
                 </m:e>
                 <m:sup>
                   <m:r>
@@ -23903,9 +23906,6 @@
                   </m:r>
                 </m:sup>
               </m:sSup>
-              <m:r>
-                <m:t>​</m:t>
-              </m:r>
               <m:r>
                 <m:rPr>
                   <m:sty m:val="p"/>
@@ -24038,11 +24038,11 @@
                 </m:rPr>
                 <m:t>−</m:t>
               </m:r>
-              <m:r>
-                <m:t>​</m:t>
-              </m:r>
               <m:sSup>
                 <m:e>
+                  <m:r>
+                    <m:t>​</m:t>
+                  </m:r>
                   <m:d>
                     <m:dPr>
                       <m:begChr m:val="("/>
@@ -24085,6 +24085,9 @@
                       </m:r>
                     </m:e>
                   </m:d>
+                  <m:r>
+                    <m:t>​</m:t>
+                  </m:r>
                 </m:e>
                 <m:sup>
                   <m:r>
@@ -24093,9 +24096,6 @@
                 </m:sup>
               </m:sSup>
               <m:r>
-                <m:t>​</m:t>
-              </m:r>
-              <m:r>
                 <m:t>&amp;</m:t>
               </m:r>
               <m:r>
@@ -24108,11 +24108,11 @@
                 </m:rPr>
                 <m:t>(subtract </m:t>
               </m:r>
-              <m:r>
-                <m:t>​</m:t>
-              </m:r>
               <m:sSup>
                 <m:e>
+                  <m:r>
+                    <m:t>​</m:t>
+                  </m:r>
                   <m:d>
                     <m:dPr>
                       <m:begChr m:val="("/>
@@ -24155,6 +24155,9 @@
                       </m:r>
                     </m:e>
                   </m:d>
+                  <m:r>
+                    <m:t>​</m:t>
+                  </m:r>
                 </m:e>
                 <m:sup>
                   <m:r>
@@ -24163,9 +24166,6 @@
                 </m:sup>
               </m:sSup>
               <m:r>
-                <m:t>​</m:t>
-              </m:r>
-              <m:r>
                 <m:rPr>
                   <m:nor/>
                   <m:sty m:val="p"/>
@@ -24174,11 +24174,11 @@
               </m:r>
             </m:e>
             <m:e>
-              <m:r>
-                <m:t>​</m:t>
-              </m:r>
               <m:sSup>
                 <m:e>
+                  <m:r>
+                    <m:t>​</m:t>
+                  </m:r>
                   <m:d>
                     <m:dPr>
                       <m:begChr m:val="("/>
@@ -24221,6 +24221,9 @@
                       </m:r>
                     </m:e>
                   </m:d>
+                  <m:r>
+                    <m:t>​</m:t>
+                  </m:r>
                 </m:e>
                 <m:sup>
                   <m:r>
@@ -24228,9 +24231,6 @@
                   </m:r>
                 </m:sup>
               </m:sSup>
-              <m:r>
-                <m:t>​</m:t>
-              </m:r>
               <m:r>
                 <m:t>&amp;</m:t>
               </m:r>
@@ -24278,11 +24278,11 @@
                 </m:rPr>
                 <m:t>−</m:t>
               </m:r>
-              <m:r>
-                <m:t>​</m:t>
-              </m:r>
               <m:sSup>
                 <m:e>
+                  <m:r>
+                    <m:t>​</m:t>
+                  </m:r>
                   <m:d>
                     <m:dPr>
                       <m:begChr m:val="("/>
@@ -24325,6 +24325,9 @@
                       </m:r>
                     </m:e>
                   </m:d>
+                  <m:r>
+                    <m:t>​</m:t>
+                  </m:r>
                 </m:e>
                 <m:sup>
                   <m:r>
@@ -24332,9 +24335,6 @@
                   </m:r>
                 </m:sup>
               </m:sSup>
-              <m:r>
-                <m:t>​</m:t>
-              </m:r>
               <m:r>
                 <m:t>&amp;</m:t>
               </m:r>
@@ -24386,11 +24386,11 @@
                 </m:rPr>
                 <m:t>=</m:t>
               </m:r>
-              <m:r>
-                <m:t>​</m:t>
-              </m:r>
               <m:sSup>
                 <m:e>
+                  <m:r>
+                    <m:t>​</m:t>
+                  </m:r>
                   <m:d>
                     <m:dPr>
                       <m:begChr m:val="("/>
@@ -24433,6 +24433,9 @@
                       </m:r>
                     </m:e>
                   </m:d>
+                  <m:r>
+                    <m:t>​</m:t>
+                  </m:r>
                 </m:e>
                 <m:sup>
                   <m:r>
@@ -24441,9 +24444,6 @@
                 </m:sup>
               </m:sSup>
               <m:r>
-                <m:t>​</m:t>
-              </m:r>
-              <m:r>
                 <m:rPr>
                   <m:nor/>
                   <m:sty m:val="p"/>
@@ -24452,11 +24452,11 @@
               </m:r>
             </m:e>
             <m:e>
-              <m:r>
-                <m:t>​</m:t>
-              </m:r>
               <m:sSup>
                 <m:e>
+                  <m:r>
+                    <m:t>​</m:t>
+                  </m:r>
                   <m:d>
                     <m:dPr>
                       <m:begChr m:val="("/>
@@ -24499,6 +24499,9 @@
                       </m:r>
                     </m:e>
                   </m:d>
+                  <m:r>
+                    <m:t>​</m:t>
+                  </m:r>
                 </m:e>
                 <m:sup>
                   <m:r>
@@ -24506,9 +24509,6 @@
                   </m:r>
                 </m:sup>
               </m:sSup>
-              <m:r>
-                <m:t>​</m:t>
-              </m:r>
               <m:r>
                 <m:t>&amp;</m:t>
               </m:r>
@@ -24556,11 +24556,11 @@
                 </m:rPr>
                 <m:t>−</m:t>
               </m:r>
-              <m:r>
-                <m:t>​</m:t>
-              </m:r>
               <m:sSup>
                 <m:e>
+                  <m:r>
+                    <m:t>​</m:t>
+                  </m:r>
                   <m:d>
                     <m:dPr>
                       <m:begChr m:val="("/>
@@ -24603,6 +24603,9 @@
                       </m:r>
                     </m:e>
                   </m:d>
+                  <m:r>
+                    <m:t>​</m:t>
+                  </m:r>
                 </m:e>
                 <m:sup>
                   <m:r>
@@ -24610,9 +24613,6 @@
                   </m:r>
                 </m:sup>
               </m:sSup>
-              <m:r>
-                <m:t>​</m:t>
-              </m:r>
               <m:r>
                 <m:t>&amp;</m:t>
               </m:r>
@@ -24743,11 +24743,11 @@
           <m:jc m:val="center"/>
         </m:oMathParaPr>
         <m:oMath>
-          <m:r>
-            <m:t>​</m:t>
-          </m:r>
           <m:sSup>
             <m:e>
+              <m:r>
+                <m:t>​</m:t>
+              </m:r>
               <m:d>
                 <m:dPr>
                   <m:begChr m:val="("/>
@@ -24790,6 +24790,9 @@
                   </m:r>
                 </m:e>
               </m:d>
+              <m:r>
+                <m:t>​</m:t>
+              </m:r>
             </m:e>
             <m:sup>
               <m:r>
@@ -24797,9 +24800,6 @@
               </m:r>
             </m:sup>
           </m:sSup>
-          <m:r>
-            <m:t>​</m:t>
-          </m:r>
           <m:r>
             <m:rPr>
               <m:sty m:val="p"/>
@@ -24844,11 +24844,11 @@
             </m:rPr>
             <m:t>−</m:t>
           </m:r>
-          <m:r>
-            <m:t>​</m:t>
-          </m:r>
           <m:sSup>
             <m:e>
+              <m:r>
+                <m:t>​</m:t>
+              </m:r>
               <m:d>
                 <m:dPr>
                   <m:begChr m:val="("/>
@@ -24891,6 +24891,9 @@
                   </m:r>
                 </m:e>
               </m:d>
+              <m:r>
+                <m:t>​</m:t>
+              </m:r>
             </m:e>
             <m:sup>
               <m:r>
@@ -24898,9 +24901,6 @@
               </m:r>
             </m:sup>
           </m:sSup>
-          <m:r>
-            <m:t>​</m:t>
-          </m:r>
         </m:oMath>
       </m:oMathPara>
     </w:p>

</xml_diff>

<commit_message>
Deploying to gh-pages from @ Morrison-Lab/sds@4c74203b2baf602da5774bac47bd75eb58ecf505 🚀
</commit_message>
<xml_diff>
--- a/estimation-handout.docx
+++ b/estimation-handout.docx
@@ -15,7 +15,7 @@
         <w:pStyle w:val="Date"/>
       </w:pPr>
       <w:r>
-        <w:t xml:space="preserve">Last modified: 2026-10-15 01:50:16 (PDT)</w:t>
+        <w:t xml:space="preserve">Last modified: 2026-10-15 02:19:11 (PDT)</w:t>
       </w:r>
     </w:p>
     <w:bookmarkStart w:id="14" w:name="scientific-models"/>
@@ -3760,7 +3760,7 @@
     </w:p>
     <w:bookmarkEnd w:id="35"/>
     <w:bookmarkEnd w:id="36"/>
-    <w:bookmarkStart w:id="99" w:name="sec-est-accuracy"/>
+    <w:bookmarkStart w:id="102" w:name="sec-est-accuracy"/>
     <w:p>
       <w:pPr>
         <w:pStyle w:val="Heading2"/>
@@ -6631,7 +6631,7 @@
     </w:p>
     <w:bookmarkEnd w:id="48"/>
     <w:bookmarkEnd w:id="49"/>
-    <w:bookmarkStart w:id="67" w:name="mean-squared-error"/>
+    <w:bookmarkStart w:id="70" w:name="mean-squared-error"/>
     <w:p>
       <w:pPr>
         <w:pStyle w:val="Heading3"/>
@@ -7387,10 +7387,325 @@
       </m:oMathPara>
     </w:p>
     <w:bookmarkEnd w:id="52"/>
-    <w:bookmarkStart w:id="53" w:name="exr-bias-sq-plus-var"/>
+    <w:bookmarkStart w:id="53" w:name="thm-sq-bias-expand"/>
     <w:p>
       <w:pPr>
         <w:pStyle w:val="FirstParagraph"/>
+      </w:pPr>
+      <w:r>
+        <w:rPr>
+          <w:b/>
+          <w:bCs/>
+        </w:rPr>
+        <w:t xml:space="preserve">Theorem 2 (Expanded squared bias)</w:t>
+      </w:r>
+      <w:r>
+        <w:t xml:space="preserve"> </w:t>
+      </w:r>
+      <w:r>
+        <w:t xml:space="preserve">For any one-dimensional estimator</w:t>
+      </w:r>
+      <w:r>
+        <w:t xml:space="preserve"> </w:t>
+      </w:r>
+      <m:oMath>
+        <m:acc>
+          <m:accPr>
+            <m:chr m:val="̂"/>
+          </m:accPr>
+          <m:e>
+            <m:r>
+              <m:t>θ</m:t>
+            </m:r>
+          </m:e>
+        </m:acc>
+      </m:oMath>
+      <w:r>
+        <w:t xml:space="preserve"> </w:t>
+      </w:r>
+      <w:r>
+        <w:t xml:space="preserve">of an estimand</w:t>
+      </w:r>
+      <w:r>
+        <w:t xml:space="preserve"> </w:t>
+      </w:r>
+      <m:oMath>
+        <m:r>
+          <m:t>θ</m:t>
+        </m:r>
+      </m:oMath>
+      <w:r>
+        <w:t xml:space="preserve">,</w:t>
+      </w:r>
+      <w:r>
+        <w:t xml:space="preserve"> </w:t>
+      </w:r>
+      <w:r>
+        <w:t xml:space="preserve">the squared</w:t>
+      </w:r>
+      <w:r>
+        <w:t xml:space="preserve"> </w:t>
+      </w:r>
+      <w:hyperlink w:anchor="def-bias">
+        <w:r>
+          <w:rPr>
+            <w:rStyle w:val="Hyperlink"/>
+          </w:rPr>
+          <w:t xml:space="preserve">bias</w:t>
+        </w:r>
+      </w:hyperlink>
+      <w:r>
+        <w:t xml:space="preserve"> </w:t>
+      </w:r>
+      <w:r>
+        <w:t xml:space="preserve">is:</w:t>
+      </w:r>
+    </w:p>
+    <w:p>
+      <w:pPr>
+        <w:pStyle w:val="BodyText"/>
+      </w:pPr>
+      <m:oMathPara>
+        <m:oMathParaPr>
+          <m:jc m:val="center"/>
+        </m:oMathParaPr>
+        <m:oMath>
+          <m:sSup>
+            <m:e>
+              <m:r>
+                <m:t>​</m:t>
+              </m:r>
+              <m:d>
+                <m:dPr>
+                  <m:begChr m:val="("/>
+                  <m:sepChr m:val=""/>
+                  <m:endChr m:val=")"/>
+                  <m:grow/>
+                </m:dPr>
+                <m:e>
+                  <m:r>
+                    <m:rPr>
+                      <m:sty m:val="p"/>
+                    </m:rPr>
+                    <m:t>Bias</m:t>
+                  </m:r>
+                  <m:r>
+                    <m:t>​</m:t>
+                  </m:r>
+                  <m:d>
+                    <m:dPr>
+                      <m:begChr m:val="("/>
+                      <m:sepChr m:val=""/>
+                      <m:endChr m:val=")"/>
+                      <m:grow/>
+                    </m:dPr>
+                    <m:e>
+                      <m:acc>
+                        <m:accPr>
+                          <m:chr m:val="̂"/>
+                        </m:accPr>
+                        <m:e>
+                          <m:r>
+                            <m:t>θ</m:t>
+                          </m:r>
+                        </m:e>
+                      </m:acc>
+                    </m:e>
+                  </m:d>
+                  <m:r>
+                    <m:t>​</m:t>
+                  </m:r>
+                </m:e>
+              </m:d>
+              <m:r>
+                <m:t>​</m:t>
+              </m:r>
+            </m:e>
+            <m:sup>
+              <m:r>
+                <m:t>2</m:t>
+              </m:r>
+            </m:sup>
+          </m:sSup>
+          <m:r>
+            <m:rPr>
+              <m:sty m:val="p"/>
+            </m:rPr>
+            <m:t>=</m:t>
+          </m:r>
+          <m:sSup>
+            <m:e>
+              <m:r>
+                <m:t>​</m:t>
+              </m:r>
+              <m:d>
+                <m:dPr>
+                  <m:begChr m:val="("/>
+                  <m:sepChr m:val=""/>
+                  <m:endChr m:val=")"/>
+                  <m:grow/>
+                </m:dPr>
+                <m:e>
+                  <m:r>
+                    <m:rPr>
+                      <m:sty m:val="p"/>
+                    </m:rPr>
+                    <m:t>E</m:t>
+                  </m:r>
+                  <m:r>
+                    <m:t>​</m:t>
+                  </m:r>
+                  <m:d>
+                    <m:dPr>
+                      <m:begChr m:val="["/>
+                      <m:sepChr m:val=""/>
+                      <m:endChr m:val="]"/>
+                      <m:grow/>
+                    </m:dPr>
+                    <m:e>
+                      <m:acc>
+                        <m:accPr>
+                          <m:chr m:val="̂"/>
+                        </m:accPr>
+                        <m:e>
+                          <m:r>
+                            <m:t>θ</m:t>
+                          </m:r>
+                        </m:e>
+                      </m:acc>
+                    </m:e>
+                  </m:d>
+                  <m:r>
+                    <m:t>​</m:t>
+                  </m:r>
+                </m:e>
+              </m:d>
+              <m:r>
+                <m:t>​</m:t>
+              </m:r>
+            </m:e>
+            <m:sup>
+              <m:r>
+                <m:t>2</m:t>
+              </m:r>
+            </m:sup>
+          </m:sSup>
+          <m:r>
+            <m:rPr>
+              <m:sty m:val="p"/>
+            </m:rPr>
+            <m:t>−</m:t>
+          </m:r>
+          <m:r>
+            <m:t>2</m:t>
+          </m:r>
+          <m:r>
+            <m:rPr>
+              <m:sty m:val="p"/>
+            </m:rPr>
+            <m:t>E</m:t>
+          </m:r>
+          <m:r>
+            <m:t>​</m:t>
+          </m:r>
+          <m:d>
+            <m:dPr>
+              <m:begChr m:val="["/>
+              <m:sepChr m:val=""/>
+              <m:endChr m:val="]"/>
+              <m:grow/>
+            </m:dPr>
+            <m:e>
+              <m:acc>
+                <m:accPr>
+                  <m:chr m:val="̂"/>
+                </m:accPr>
+                <m:e>
+                  <m:r>
+                    <m:t>θ</m:t>
+                  </m:r>
+                </m:e>
+              </m:acc>
+            </m:e>
+          </m:d>
+          <m:r>
+            <m:t>​</m:t>
+          </m:r>
+          <m:r>
+            <m:t>θ</m:t>
+          </m:r>
+          <m:r>
+            <m:rPr>
+              <m:sty m:val="p"/>
+            </m:rPr>
+            <m:t>+</m:t>
+          </m:r>
+          <m:sSup>
+            <m:e>
+              <m:r>
+                <m:t>θ</m:t>
+              </m:r>
+            </m:e>
+            <m:sup>
+              <m:r>
+                <m:t>2</m:t>
+              </m:r>
+            </m:sup>
+          </m:sSup>
+        </m:oMath>
+      </m:oMathPara>
+    </w:p>
+    <w:bookmarkEnd w:id="53"/>
+    <w:p>
+      <w:pPr>
+        <w:pStyle w:val="FirstParagraph"/>
+      </w:pPr>
+      <w:r>
+        <w:rPr>
+          <w:i/>
+          <w:iCs/>
+        </w:rPr>
+        <w:t xml:space="preserve">Proof</w:t>
+      </w:r>
+      <w:r>
+        <w:t xml:space="preserve">. </w:t>
+      </w:r>
+      <w:r>
+        <w:t xml:space="preserve">This is the solution to</w:t>
+      </w:r>
+      <w:r>
+        <w:t xml:space="preserve"> </w:t>
+      </w:r>
+      <w:hyperlink w:anchor="exr-sq-bias-expand">
+        <w:r>
+          <w:rPr>
+            <w:rStyle w:val="Hyperlink"/>
+          </w:rPr>
+          <w:t xml:space="preserve">Exercise 2</w:t>
+        </w:r>
+      </w:hyperlink>
+      <w:r>
+        <w:t xml:space="preserve">, worked in</w:t>
+      </w:r>
+      <w:r>
+        <w:t xml:space="preserve"> </w:t>
+      </w:r>
+      <w:hyperlink w:anchor="sol-sq-bias-expand">
+        <w:r>
+          <w:rPr>
+            <w:rStyle w:val="Hyperlink"/>
+          </w:rPr>
+          <w:t xml:space="preserve">Solution 2</w:t>
+        </w:r>
+      </w:hyperlink>
+      <w:r>
+        <w:t xml:space="preserve">.</w:t>
+      </w:r>
+    </w:p>
+    <w:bookmarkStart w:id="54" w:name="exr-bias-sq-plus-var"/>
+    <w:p>
+      <w:pPr>
+        <w:pStyle w:val="BodyText"/>
       </w:pPr>
       <w:r>
         <w:rPr>
@@ -7632,8 +7947,8 @@
         <w:t xml:space="preserve">.</w:t>
       </w:r>
     </w:p>
-    <w:bookmarkEnd w:id="53"/>
-    <w:bookmarkStart w:id="57" w:name="sol-bias-sq-plus-var"/>
+    <w:bookmarkEnd w:id="54"/>
+    <w:bookmarkStart w:id="58" w:name="sol-bias-sq-plus-var"/>
     <w:p>
       <w:pPr>
         <w:pStyle w:val="BodyText"/>
@@ -7657,7 +7972,7 @@
       <w:r>
         <w:t xml:space="preserve">(</w:t>
       </w:r>
-      <w:hyperlink r:id="rId54">
+      <w:hyperlink r:id="rId55">
         <w:r>
           <w:rPr>
             <w:rStyle w:val="Hyperlink"/>
@@ -7673,7 +7988,7 @@
       <w:pPr>
         <w:pStyle w:val="BodyText"/>
       </w:pPr>
-      <w:bookmarkStart w:id="55" w:name="eq-bias-sq-plus-var-exr"/>
+      <w:bookmarkStart w:id="56" w:name="eq-bias-sq-plus-var-exr"/>
       <m:oMathPara>
         <m:oMathParaPr>
           <m:jc m:val="center"/>
@@ -7841,7 +8156,7 @@
           </m:r>
         </m:oMath>
       </m:oMathPara>
-      <w:bookmarkEnd w:id="55"/>
+      <w:bookmarkEnd w:id="56"/>
     </w:p>
     <w:p>
       <w:pPr>
@@ -7872,7 +8187,7 @@
       <w:pPr>
         <w:pStyle w:val="BodyText"/>
       </w:pPr>
-      <w:bookmarkStart w:id="56" w:name="eq-bias-sq-plus-var-exr-2"/>
+      <w:bookmarkStart w:id="57" w:name="eq-bias-sq-plus-var-exr-2"/>
       <m:oMathPara>
         <m:oMathParaPr>
           <m:jc m:val="center"/>
@@ -9270,13 +9585,353 @@
           </m:r>
         </m:oMath>
       </m:oMathPara>
-      <w:bookmarkEnd w:id="56"/>
+      <w:bookmarkEnd w:id="57"/>
     </w:p>
-    <w:bookmarkEnd w:id="57"/>
-    <w:bookmarkStart w:id="58" w:name="exr-mse-expand"/>
+    <w:bookmarkEnd w:id="58"/>
+    <w:bookmarkStart w:id="59" w:name="thm-bias-sq-plus-var"/>
     <w:p>
       <w:pPr>
         <w:pStyle w:val="FirstParagraph"/>
+      </w:pPr>
+      <w:r>
+        <w:rPr>
+          <w:b/>
+          <w:bCs/>
+        </w:rPr>
+        <w:t xml:space="preserve">Theorem 3 (Expanded squared bias plus variance)</w:t>
+      </w:r>
+      <w:r>
+        <w:t xml:space="preserve"> </w:t>
+      </w:r>
+      <w:r>
+        <w:t xml:space="preserve">For any one-dimensional estimator</w:t>
+      </w:r>
+      <w:r>
+        <w:t xml:space="preserve"> </w:t>
+      </w:r>
+      <m:oMath>
+        <m:acc>
+          <m:accPr>
+            <m:chr m:val="̂"/>
+          </m:accPr>
+          <m:e>
+            <m:r>
+              <m:t>θ</m:t>
+            </m:r>
+          </m:e>
+        </m:acc>
+      </m:oMath>
+      <w:r>
+        <w:t xml:space="preserve"> </w:t>
+      </w:r>
+      <w:r>
+        <w:t xml:space="preserve">of an estimand</w:t>
+      </w:r>
+      <w:r>
+        <w:t xml:space="preserve"> </w:t>
+      </w:r>
+      <m:oMath>
+        <m:r>
+          <m:t>θ</m:t>
+        </m:r>
+      </m:oMath>
+      <w:r>
+        <w:t xml:space="preserve">,</w:t>
+      </w:r>
+      <w:r>
+        <w:t xml:space="preserve"> </w:t>
+      </w:r>
+      <w:r>
+        <w:t xml:space="preserve">the squared bias plus the variance is:</w:t>
+      </w:r>
+    </w:p>
+    <w:p>
+      <w:pPr>
+        <w:pStyle w:val="BodyText"/>
+      </w:pPr>
+      <m:oMathPara>
+        <m:oMathParaPr>
+          <m:jc m:val="center"/>
+        </m:oMathParaPr>
+        <m:oMath>
+          <m:sSup>
+            <m:e>
+              <m:r>
+                <m:t>​</m:t>
+              </m:r>
+              <m:d>
+                <m:dPr>
+                  <m:begChr m:val="("/>
+                  <m:sepChr m:val=""/>
+                  <m:endChr m:val=")"/>
+                  <m:grow/>
+                </m:dPr>
+                <m:e>
+                  <m:r>
+                    <m:rPr>
+                      <m:sty m:val="p"/>
+                    </m:rPr>
+                    <m:t>Bias</m:t>
+                  </m:r>
+                  <m:r>
+                    <m:t>​</m:t>
+                  </m:r>
+                  <m:d>
+                    <m:dPr>
+                      <m:begChr m:val="("/>
+                      <m:sepChr m:val=""/>
+                      <m:endChr m:val=")"/>
+                      <m:grow/>
+                    </m:dPr>
+                    <m:e>
+                      <m:acc>
+                        <m:accPr>
+                          <m:chr m:val="̂"/>
+                        </m:accPr>
+                        <m:e>
+                          <m:r>
+                            <m:t>θ</m:t>
+                          </m:r>
+                        </m:e>
+                      </m:acc>
+                    </m:e>
+                  </m:d>
+                  <m:r>
+                    <m:t>​</m:t>
+                  </m:r>
+                </m:e>
+              </m:d>
+              <m:r>
+                <m:t>​</m:t>
+              </m:r>
+            </m:e>
+            <m:sup>
+              <m:r>
+                <m:t>2</m:t>
+              </m:r>
+            </m:sup>
+          </m:sSup>
+          <m:r>
+            <m:rPr>
+              <m:sty m:val="p"/>
+            </m:rPr>
+            <m:t>+</m:t>
+          </m:r>
+          <m:r>
+            <m:rPr>
+              <m:sty m:val="p"/>
+            </m:rPr>
+            <m:t>Var</m:t>
+          </m:r>
+          <m:r>
+            <m:t>​</m:t>
+          </m:r>
+          <m:d>
+            <m:dPr>
+              <m:begChr m:val="("/>
+              <m:sepChr m:val=""/>
+              <m:endChr m:val=")"/>
+              <m:grow/>
+            </m:dPr>
+            <m:e>
+              <m:acc>
+                <m:accPr>
+                  <m:chr m:val="̂"/>
+                </m:accPr>
+                <m:e>
+                  <m:r>
+                    <m:t>θ</m:t>
+                  </m:r>
+                </m:e>
+              </m:acc>
+            </m:e>
+          </m:d>
+          <m:r>
+            <m:t>​</m:t>
+          </m:r>
+          <m:r>
+            <m:rPr>
+              <m:sty m:val="p"/>
+            </m:rPr>
+            <m:t>=</m:t>
+          </m:r>
+          <m:r>
+            <m:rPr>
+              <m:sty m:val="p"/>
+            </m:rPr>
+            <m:t>E</m:t>
+          </m:r>
+          <m:r>
+            <m:t>​</m:t>
+          </m:r>
+          <m:d>
+            <m:dPr>
+              <m:begChr m:val="["/>
+              <m:sepChr m:val=""/>
+              <m:endChr m:val="]"/>
+              <m:grow/>
+            </m:dPr>
+            <m:e>
+              <m:sSup>
+                <m:e>
+                  <m:acc>
+                    <m:accPr>
+                      <m:chr m:val="̂"/>
+                    </m:accPr>
+                    <m:e>
+                      <m:r>
+                        <m:t>θ</m:t>
+                      </m:r>
+                    </m:e>
+                  </m:acc>
+                </m:e>
+                <m:sup>
+                  <m:r>
+                    <m:t>2</m:t>
+                  </m:r>
+                </m:sup>
+              </m:sSup>
+            </m:e>
+          </m:d>
+          <m:r>
+            <m:t>​</m:t>
+          </m:r>
+          <m:r>
+            <m:rPr>
+              <m:sty m:val="p"/>
+            </m:rPr>
+            <m:t>−</m:t>
+          </m:r>
+          <m:r>
+            <m:t>2</m:t>
+          </m:r>
+          <m:r>
+            <m:rPr>
+              <m:sty m:val="p"/>
+            </m:rPr>
+            <m:t>E</m:t>
+          </m:r>
+          <m:r>
+            <m:t>​</m:t>
+          </m:r>
+          <m:d>
+            <m:dPr>
+              <m:begChr m:val="["/>
+              <m:sepChr m:val=""/>
+              <m:endChr m:val="]"/>
+              <m:grow/>
+            </m:dPr>
+            <m:e>
+              <m:acc>
+                <m:accPr>
+                  <m:chr m:val="̂"/>
+                </m:accPr>
+                <m:e>
+                  <m:r>
+                    <m:t>θ</m:t>
+                  </m:r>
+                </m:e>
+              </m:acc>
+            </m:e>
+          </m:d>
+          <m:r>
+            <m:t>​</m:t>
+          </m:r>
+          <m:r>
+            <m:t>θ</m:t>
+          </m:r>
+          <m:r>
+            <m:rPr>
+              <m:sty m:val="p"/>
+            </m:rPr>
+            <m:t>+</m:t>
+          </m:r>
+          <m:sSup>
+            <m:e>
+              <m:r>
+                <m:t>θ</m:t>
+              </m:r>
+            </m:e>
+            <m:sup>
+              <m:r>
+                <m:t>2</m:t>
+              </m:r>
+            </m:sup>
+          </m:sSup>
+        </m:oMath>
+      </m:oMathPara>
+    </w:p>
+    <w:bookmarkEnd w:id="59"/>
+    <w:p>
+      <w:pPr>
+        <w:pStyle w:val="FirstParagraph"/>
+      </w:pPr>
+      <w:r>
+        <w:rPr>
+          <w:i/>
+          <w:iCs/>
+        </w:rPr>
+        <w:t xml:space="preserve">Proof</w:t>
+      </w:r>
+      <w:r>
+        <w:t xml:space="preserve">. </w:t>
+      </w:r>
+      <w:r>
+        <w:t xml:space="preserve">This is the solution to</w:t>
+      </w:r>
+      <w:r>
+        <w:t xml:space="preserve"> </w:t>
+      </w:r>
+      <w:hyperlink w:anchor="exr-bias-sq-plus-var">
+        <w:r>
+          <w:rPr>
+            <w:rStyle w:val="Hyperlink"/>
+          </w:rPr>
+          <w:t xml:space="preserve">Exercise 3</w:t>
+        </w:r>
+      </w:hyperlink>
+      <w:r>
+        <w:t xml:space="preserve">, worked in</w:t>
+      </w:r>
+      <w:r>
+        <w:t xml:space="preserve"> </w:t>
+      </w:r>
+      <w:hyperlink w:anchor="sol-bias-sq-plus-var">
+        <w:r>
+          <w:rPr>
+            <w:rStyle w:val="Hyperlink"/>
+          </w:rPr>
+          <w:t xml:space="preserve">Solution 3</w:t>
+        </w:r>
+      </w:hyperlink>
+      <w:r>
+        <w:t xml:space="preserve">.</w:t>
+      </w:r>
+      <w:r>
+        <w:t xml:space="preserve"> </w:t>
+      </w:r>
+      <w:r>
+        <w:t xml:space="preserve">It adds the variance to the squared bias of</w:t>
+      </w:r>
+      <w:r>
+        <w:t xml:space="preserve"> </w:t>
+      </w:r>
+      <w:hyperlink w:anchor="thm-sq-bias-expand">
+        <w:r>
+          <w:rPr>
+            <w:rStyle w:val="Hyperlink"/>
+          </w:rPr>
+          <w:t xml:space="preserve">Theorem 2</w:t>
+        </w:r>
+      </w:hyperlink>
+      <w:r>
+        <w:t xml:space="preserve">.</w:t>
+      </w:r>
+    </w:p>
+    <w:bookmarkStart w:id="60" w:name="exr-mse-expand"/>
+    <w:p>
+      <w:pPr>
+        <w:pStyle w:val="BodyText"/>
       </w:pPr>
       <w:r>
         <w:rPr>
@@ -9446,8 +10101,8 @@
         <w:t xml:space="preserve">.</w:t>
       </w:r>
     </w:p>
-    <w:bookmarkEnd w:id="58"/>
-    <w:bookmarkStart w:id="59" w:name="sol-mse-expand"/>
+    <w:bookmarkEnd w:id="60"/>
+    <w:bookmarkStart w:id="61" w:name="sol-mse-expand"/>
     <w:p>
       <w:pPr>
         <w:pStyle w:val="BodyText"/>
@@ -10251,8 +10906,8 @@
         </m:oMath>
       </m:oMathPara>
     </w:p>
-    <w:bookmarkEnd w:id="59"/>
-    <w:bookmarkStart w:id="61" w:name="thm-mse-bias-variance"/>
+    <w:bookmarkEnd w:id="61"/>
+    <w:bookmarkStart w:id="62" w:name="thm-mse-expand"/>
     <w:p>
       <w:pPr>
         <w:pStyle w:val="FirstParagraph"/>
@@ -10262,7 +10917,7 @@
           <w:b/>
           <w:bCs/>
         </w:rPr>
-        <w:t xml:space="preserve">Theorem 2 (Mean squared error equals bias squared plus variance)</w:t>
+        <w:t xml:space="preserve">Theorem 4 (Expanded mean squared error)</w:t>
       </w:r>
       <w:r>
         <w:t xml:space="preserve"> </w:t>
@@ -10286,14 +10941,288 @@
         </m:acc>
       </m:oMath>
       <w:r>
-        <w:t xml:space="preserve">:</w:t>
+        <w:t xml:space="preserve"> </w:t>
+      </w:r>
+      <w:r>
+        <w:t xml:space="preserve">of an estimand</w:t>
+      </w:r>
+      <w:r>
+        <w:t xml:space="preserve"> </w:t>
+      </w:r>
+      <m:oMath>
+        <m:r>
+          <m:t>θ</m:t>
+        </m:r>
+      </m:oMath>
+      <w:r>
+        <w:t xml:space="preserve">,</w:t>
+      </w:r>
+      <w:r>
+        <w:t xml:space="preserve"> </w:t>
+      </w:r>
+      <w:r>
+        <w:t xml:space="preserve">the</w:t>
+      </w:r>
+      <w:r>
+        <w:t xml:space="preserve"> </w:t>
+      </w:r>
+      <w:hyperlink w:anchor="def-mse">
+        <w:r>
+          <w:rPr>
+            <w:rStyle w:val="Hyperlink"/>
+          </w:rPr>
+          <w:t xml:space="preserve">mean squared error</w:t>
+        </w:r>
+      </w:hyperlink>
+      <w:r>
+        <w:t xml:space="preserve"> </w:t>
+      </w:r>
+      <w:r>
+        <w:t xml:space="preserve">is:</w:t>
       </w:r>
     </w:p>
     <w:p>
       <w:pPr>
         <w:pStyle w:val="BodyText"/>
       </w:pPr>
-      <w:bookmarkStart w:id="60" w:name="eq-mse"/>
+      <m:oMathPara>
+        <m:oMathParaPr>
+          <m:jc m:val="center"/>
+        </m:oMathParaPr>
+        <m:oMath>
+          <m:r>
+            <m:rPr>
+              <m:sty m:val="p"/>
+            </m:rPr>
+            <m:t>MSE</m:t>
+          </m:r>
+          <m:r>
+            <m:t>​</m:t>
+          </m:r>
+          <m:d>
+            <m:dPr>
+              <m:begChr m:val="("/>
+              <m:sepChr m:val=""/>
+              <m:endChr m:val=")"/>
+              <m:grow/>
+            </m:dPr>
+            <m:e>
+              <m:acc>
+                <m:accPr>
+                  <m:chr m:val="̂"/>
+                </m:accPr>
+                <m:e>
+                  <m:r>
+                    <m:t>θ</m:t>
+                  </m:r>
+                </m:e>
+              </m:acc>
+            </m:e>
+          </m:d>
+          <m:r>
+            <m:t>​</m:t>
+          </m:r>
+          <m:r>
+            <m:rPr>
+              <m:sty m:val="p"/>
+            </m:rPr>
+            <m:t>=</m:t>
+          </m:r>
+          <m:r>
+            <m:rPr>
+              <m:sty m:val="p"/>
+            </m:rPr>
+            <m:t>E</m:t>
+          </m:r>
+          <m:r>
+            <m:t>​</m:t>
+          </m:r>
+          <m:d>
+            <m:dPr>
+              <m:begChr m:val="["/>
+              <m:sepChr m:val=""/>
+              <m:endChr m:val="]"/>
+              <m:grow/>
+            </m:dPr>
+            <m:e>
+              <m:sSup>
+                <m:e>
+                  <m:acc>
+                    <m:accPr>
+                      <m:chr m:val="̂"/>
+                    </m:accPr>
+                    <m:e>
+                      <m:r>
+                        <m:t>θ</m:t>
+                      </m:r>
+                    </m:e>
+                  </m:acc>
+                </m:e>
+                <m:sup>
+                  <m:r>
+                    <m:t>2</m:t>
+                  </m:r>
+                </m:sup>
+              </m:sSup>
+            </m:e>
+          </m:d>
+          <m:r>
+            <m:t>​</m:t>
+          </m:r>
+          <m:r>
+            <m:rPr>
+              <m:sty m:val="p"/>
+            </m:rPr>
+            <m:t>−</m:t>
+          </m:r>
+          <m:r>
+            <m:t>2</m:t>
+          </m:r>
+          <m:r>
+            <m:rPr>
+              <m:sty m:val="p"/>
+            </m:rPr>
+            <m:t>E</m:t>
+          </m:r>
+          <m:r>
+            <m:t>​</m:t>
+          </m:r>
+          <m:d>
+            <m:dPr>
+              <m:begChr m:val="["/>
+              <m:sepChr m:val=""/>
+              <m:endChr m:val="]"/>
+              <m:grow/>
+            </m:dPr>
+            <m:e>
+              <m:acc>
+                <m:accPr>
+                  <m:chr m:val="̂"/>
+                </m:accPr>
+                <m:e>
+                  <m:r>
+                    <m:t>θ</m:t>
+                  </m:r>
+                </m:e>
+              </m:acc>
+            </m:e>
+          </m:d>
+          <m:r>
+            <m:t>​</m:t>
+          </m:r>
+          <m:r>
+            <m:t>θ</m:t>
+          </m:r>
+          <m:r>
+            <m:rPr>
+              <m:sty m:val="p"/>
+            </m:rPr>
+            <m:t>+</m:t>
+          </m:r>
+          <m:sSup>
+            <m:e>
+              <m:r>
+                <m:t>θ</m:t>
+              </m:r>
+            </m:e>
+            <m:sup>
+              <m:r>
+                <m:t>2</m:t>
+              </m:r>
+            </m:sup>
+          </m:sSup>
+        </m:oMath>
+      </m:oMathPara>
+    </w:p>
+    <w:bookmarkEnd w:id="62"/>
+    <w:p>
+      <w:pPr>
+        <w:pStyle w:val="FirstParagraph"/>
+      </w:pPr>
+      <w:r>
+        <w:rPr>
+          <w:i/>
+          <w:iCs/>
+        </w:rPr>
+        <w:t xml:space="preserve">Proof</w:t>
+      </w:r>
+      <w:r>
+        <w:t xml:space="preserve">. </w:t>
+      </w:r>
+      <w:r>
+        <w:t xml:space="preserve">This is the solution to</w:t>
+      </w:r>
+      <w:r>
+        <w:t xml:space="preserve"> </w:t>
+      </w:r>
+      <w:hyperlink w:anchor="exr-mse-expand">
+        <w:r>
+          <w:rPr>
+            <w:rStyle w:val="Hyperlink"/>
+          </w:rPr>
+          <w:t xml:space="preserve">Exercise 4</w:t>
+        </w:r>
+      </w:hyperlink>
+      <w:r>
+        <w:t xml:space="preserve">, worked in</w:t>
+      </w:r>
+      <w:r>
+        <w:t xml:space="preserve"> </w:t>
+      </w:r>
+      <w:hyperlink w:anchor="sol-mse-expand">
+        <w:r>
+          <w:rPr>
+            <w:rStyle w:val="Hyperlink"/>
+          </w:rPr>
+          <w:t xml:space="preserve">Solution 4</w:t>
+        </w:r>
+      </w:hyperlink>
+      <w:r>
+        <w:t xml:space="preserve">.</w:t>
+      </w:r>
+    </w:p>
+    <w:bookmarkStart w:id="64" w:name="thm-mse-bias-variance"/>
+    <w:p>
+      <w:pPr>
+        <w:pStyle w:val="BodyText"/>
+      </w:pPr>
+      <w:r>
+        <w:rPr>
+          <w:b/>
+          <w:bCs/>
+        </w:rPr>
+        <w:t xml:space="preserve">Theorem 5 (Mean squared error equals bias squared plus variance)</w:t>
+      </w:r>
+      <w:r>
+        <w:t xml:space="preserve"> </w:t>
+      </w:r>
+      <w:r>
+        <w:t xml:space="preserve">For any one-dimensional estimator</w:t>
+      </w:r>
+      <w:r>
+        <w:t xml:space="preserve"> </w:t>
+      </w:r>
+      <m:oMath>
+        <m:acc>
+          <m:accPr>
+            <m:chr m:val="̂"/>
+          </m:accPr>
+          <m:e>
+            <m:r>
+              <m:t>θ</m:t>
+            </m:r>
+          </m:e>
+        </m:acc>
+      </m:oMath>
+      <w:r>
+        <w:t xml:space="preserve">:</w:t>
+      </w:r>
+    </w:p>
+    <w:p>
+      <w:pPr>
+        <w:pStyle w:val="BodyText"/>
+      </w:pPr>
+      <w:bookmarkStart w:id="63" w:name="eq-mse"/>
       <m:oMathPara>
         <m:oMathParaPr>
           <m:jc m:val="center"/>
@@ -10452,9 +11381,9 @@
           </m:r>
         </m:oMath>
       </m:oMathPara>
-      <w:bookmarkEnd w:id="60"/>
+      <w:bookmarkEnd w:id="63"/>
     </w:p>
-    <w:bookmarkEnd w:id="61"/>
+    <w:bookmarkEnd w:id="64"/>
     <w:p>
       <w:pPr>
         <w:pStyle w:val="FirstParagraph"/>
@@ -10475,12 +11404,12 @@
       <w:r>
         <w:t xml:space="preserve"> </w:t>
       </w:r>
-      <w:hyperlink w:anchor="exr-mse-expand">
+      <w:hyperlink w:anchor="thm-mse-expand">
         <w:r>
           <w:rPr>
             <w:rStyle w:val="Hyperlink"/>
           </w:rPr>
-          <w:t xml:space="preserve">Exercise 4</w:t>
+          <w:t xml:space="preserve">Theorem 4</w:t>
         </w:r>
       </w:hyperlink>
       <w:r>
@@ -10492,12 +11421,12 @@
       <w:r>
         <w:t xml:space="preserve"> </w:t>
       </w:r>
-      <w:hyperlink w:anchor="exr-bias-sq-plus-var">
+      <w:hyperlink w:anchor="thm-bias-sq-plus-var">
         <w:r>
           <w:rPr>
             <w:rStyle w:val="Hyperlink"/>
           </w:rPr>
-          <w:t xml:space="preserve">Exercise 3</w:t>
+          <w:t xml:space="preserve">Theorem 3</w:t>
         </w:r>
       </w:hyperlink>
       <w:r>
@@ -10770,7 +11699,7 @@
         <w:t xml:space="preserve">so they are equal to each other.</w:t>
       </w:r>
     </w:p>
-    <w:bookmarkStart w:id="63" w:name="exm-mse-sample-mean"/>
+    <w:bookmarkStart w:id="66" w:name="exm-mse-sample-mean"/>
     <w:p>
       <w:pPr>
         <w:pStyle w:val="BodyText"/>
@@ -10991,7 +11920,7 @@
           <w:rPr>
             <w:rStyle w:val="Hyperlink"/>
           </w:rPr>
-          <w:t xml:space="preserve">Theorem 2</w:t>
+          <w:t xml:space="preserve">Theorem 5</w:t>
         </w:r>
       </w:hyperlink>
       <w:r>
@@ -12182,7 +13111,7 @@
       <w:r>
         <w:t xml:space="preserve"> </w:t>
       </w:r>
-      <w:hyperlink r:id="rId62">
+      <w:hyperlink r:id="rId65">
         <w:r>
           <w:rPr>
             <w:rStyle w:val="Hyperlink"/>
@@ -12480,8 +13409,8 @@
         <w:t xml:space="preserve">’s.</w:t>
       </w:r>
     </w:p>
-    <w:bookmarkEnd w:id="63"/>
-    <w:bookmarkStart w:id="64" w:name="def-rmse"/>
+    <w:bookmarkEnd w:id="66"/>
+    <w:bookmarkStart w:id="67" w:name="def-rmse"/>
     <w:p>
       <w:pPr>
         <w:pStyle w:val="BodyText"/>
@@ -12654,8 +13583,8 @@
         </m:oMath>
       </m:oMathPara>
     </w:p>
-    <w:bookmarkEnd w:id="64"/>
-    <w:bookmarkStart w:id="65" w:name="exm-rmse-sample-mean"/>
+    <w:bookmarkEnd w:id="67"/>
+    <w:bookmarkStart w:id="68" w:name="exm-rmse-sample-mean"/>
     <w:p>
       <w:pPr>
         <w:pStyle w:val="FirstParagraph"/>
@@ -12743,8 +13672,8 @@
         <w:t xml:space="preserve">.</w:t>
       </w:r>
     </w:p>
-    <w:bookmarkEnd w:id="65"/>
-    <w:bookmarkStart w:id="66" w:name="rem-rmse-units"/>
+    <w:bookmarkEnd w:id="68"/>
+    <w:bookmarkStart w:id="69" w:name="rem-rmse-units"/>
     <w:p>
       <w:pPr>
         <w:pStyle w:val="BodyText"/>
@@ -12763,9 +13692,9 @@
         <w:t xml:space="preserve">The root mean squared error has the same units as the estimand.</w:t>
       </w:r>
     </w:p>
-    <w:bookmarkEnd w:id="66"/>
-    <w:bookmarkEnd w:id="67"/>
-    <w:bookmarkStart w:id="81" w:name="sec-unbiased-estimators"/>
+    <w:bookmarkEnd w:id="69"/>
+    <w:bookmarkEnd w:id="70"/>
+    <w:bookmarkStart w:id="84" w:name="sec-unbiased-estimators"/>
     <w:p>
       <w:pPr>
         <w:pStyle w:val="Heading3"/>
@@ -12774,7 +13703,7 @@
         <w:t xml:space="preserve">3.6 Unbiased estimators</w:t>
       </w:r>
     </w:p>
-    <w:bookmarkStart w:id="68" w:name="def-unbiased"/>
+    <w:bookmarkStart w:id="71" w:name="def-unbiased"/>
     <w:p>
       <w:pPr>
         <w:pStyle w:val="FirstParagraph"/>
@@ -12900,8 +13829,8 @@
         </m:oMath>
       </m:oMathPara>
     </w:p>
-    <w:bookmarkEnd w:id="68"/>
-    <w:bookmarkStart w:id="69" w:name="def-biased"/>
+    <w:bookmarkEnd w:id="71"/>
+    <w:bookmarkStart w:id="72" w:name="def-biased"/>
     <w:p>
       <w:pPr>
         <w:pStyle w:val="FirstParagraph"/>
@@ -13027,8 +13956,8 @@
         </m:oMath>
       </m:oMathPara>
     </w:p>
-    <w:bookmarkEnd w:id="69"/>
-    <w:bookmarkStart w:id="70" w:name="exm-unbiased-sample-mean"/>
+    <w:bookmarkEnd w:id="72"/>
+    <w:bookmarkStart w:id="73" w:name="exm-unbiased-sample-mean"/>
     <w:p>
       <w:pPr>
         <w:pStyle w:val="FirstParagraph"/>
@@ -13242,8 +14171,8 @@
         <w:t xml:space="preserve">.</w:t>
       </w:r>
     </w:p>
-    <w:bookmarkEnd w:id="70"/>
-    <w:bookmarkStart w:id="72" w:name="exm-biased-variance-mle"/>
+    <w:bookmarkEnd w:id="73"/>
+    <w:bookmarkStart w:id="75" w:name="exm-biased-variance-mle"/>
     <w:p>
       <w:pPr>
         <w:pStyle w:val="BodyText"/>
@@ -13421,7 +14350,7 @@
       <w:r>
         <w:t xml:space="preserve"> </w:t>
       </w:r>
-      <w:hyperlink r:id="rId71">
+      <w:hyperlink r:id="rId74">
         <w:r>
           <w:rPr>
             <w:rStyle w:val="Hyperlink"/>
@@ -18593,8 +19522,8 @@
         <w:t xml:space="preserve">grows.</w:t>
       </w:r>
     </w:p>
-    <w:bookmarkEnd w:id="72"/>
-    <w:bookmarkStart w:id="73" w:name="exr-unbiased-exp"/>
+    <w:bookmarkEnd w:id="75"/>
+    <w:bookmarkStart w:id="76" w:name="exr-unbiased-exp"/>
     <w:p>
       <w:pPr>
         <w:pStyle w:val="BodyText"/>
@@ -18725,8 +19654,8 @@
         <w:t xml:space="preserve">.</w:t>
       </w:r>
     </w:p>
-    <w:bookmarkEnd w:id="73"/>
-    <w:bookmarkStart w:id="74" w:name="sol-unbiased-exp"/>
+    <w:bookmarkEnd w:id="76"/>
+    <w:bookmarkStart w:id="77" w:name="sol-unbiased-exp"/>
     <w:p>
       <w:pPr>
         <w:pStyle w:val="BodyText"/>
@@ -18951,8 +19880,8 @@
         <w:t xml:space="preserve">.</w:t>
       </w:r>
     </w:p>
-    <w:bookmarkEnd w:id="74"/>
-    <w:bookmarkStart w:id="75" w:name="exr-unbiased-mse"/>
+    <w:bookmarkEnd w:id="77"/>
+    <w:bookmarkStart w:id="78" w:name="exr-unbiased-mse"/>
     <w:p>
       <w:pPr>
         <w:pStyle w:val="BodyText"/>
@@ -18978,7 +19907,7 @@
           <w:rPr>
             <w:rStyle w:val="Hyperlink"/>
           </w:rPr>
-          <w:t xml:space="preserve">Theorem 2</w:t>
+          <w:t xml:space="preserve">Theorem 5</w:t>
         </w:r>
       </w:hyperlink>
       <w:r>
@@ -19046,8 +19975,8 @@
         <w:t xml:space="preserve">in terms of its variance.</w:t>
       </w:r>
     </w:p>
-    <w:bookmarkEnd w:id="75"/>
-    <w:bookmarkStart w:id="76" w:name="sol-unbiased-mse"/>
+    <w:bookmarkEnd w:id="78"/>
+    <w:bookmarkStart w:id="79" w:name="sol-unbiased-mse"/>
     <w:p>
       <w:pPr>
         <w:pStyle w:val="BodyText"/>
@@ -19386,8 +20315,8 @@
         </m:oMath>
       </m:oMathPara>
     </w:p>
-    <w:bookmarkEnd w:id="76"/>
-    <w:bookmarkStart w:id="79" w:name="thm-unbiased-props"/>
+    <w:bookmarkEnd w:id="79"/>
+    <w:bookmarkStart w:id="82" w:name="thm-unbiased-props"/>
     <w:p>
       <w:pPr>
         <w:pStyle w:val="FirstParagraph"/>
@@ -19397,7 +20326,7 @@
           <w:b/>
           <w:bCs/>
         </w:rPr>
-        <w:t xml:space="preserve">Theorem 3 (Properties of unbiased estimators)</w:t>
+        <w:t xml:space="preserve">Theorem 6 (Properties of unbiased estimators)</w:t>
       </w:r>
       <w:r>
         <w:t xml:space="preserve"> </w:t>
@@ -19459,7 +20388,7 @@
       <w:pPr>
         <w:pStyle w:val="BodyText"/>
       </w:pPr>
-      <w:bookmarkStart w:id="77" w:name="eq-unbiased-exp"/>
+      <w:bookmarkStart w:id="80" w:name="eq-unbiased-exp"/>
       <m:oMathPara>
         <m:oMathParaPr>
           <m:jc m:val="center"/>
@@ -19526,13 +20455,13 @@
           </m:r>
         </m:oMath>
       </m:oMathPara>
-      <w:bookmarkEnd w:id="77"/>
+      <w:bookmarkEnd w:id="80"/>
     </w:p>
     <w:p>
       <w:pPr>
         <w:pStyle w:val="FirstParagraph"/>
       </w:pPr>
-      <w:bookmarkStart w:id="78" w:name="eq-unbiased-mse"/>
+      <w:bookmarkStart w:id="81" w:name="eq-unbiased-mse"/>
       <m:oMathPara>
         <m:oMathParaPr>
           <m:jc m:val="center"/>
@@ -19628,9 +20557,9 @@
           </m:r>
         </m:oMath>
       </m:oMathPara>
-      <w:bookmarkEnd w:id="78"/>
+      <w:bookmarkEnd w:id="81"/>
     </w:p>
-    <w:bookmarkEnd w:id="79"/>
+    <w:bookmarkEnd w:id="82"/>
     <w:p>
       <w:pPr>
         <w:pStyle w:val="FirstParagraph"/>
@@ -19721,7 +20650,7 @@
       <w:r>
         <w:t xml:space="preserve"> </w:t>
       </w:r>
-      <w:hyperlink r:id="rId80">
+      <w:hyperlink r:id="rId83">
         <w:r>
           <w:rPr>
             <w:rStyle w:val="Hyperlink"/>
@@ -19748,8 +20677,8 @@
         <w:t xml:space="preserve">.</w:t>
       </w:r>
     </w:p>
-    <w:bookmarkEnd w:id="81"/>
-    <w:bookmarkStart w:id="84" w:name="mean-absolute-error"/>
+    <w:bookmarkEnd w:id="84"/>
+    <w:bookmarkStart w:id="87" w:name="mean-absolute-error"/>
     <w:p>
       <w:pPr>
         <w:pStyle w:val="Heading3"/>
@@ -19758,7 +20687,7 @@
         <w:t xml:space="preserve">3.7 Mean absolute error</w:t>
       </w:r>
     </w:p>
-    <w:bookmarkStart w:id="82" w:name="def-mae"/>
+    <w:bookmarkStart w:id="85" w:name="def-mae"/>
     <w:p>
       <w:pPr>
         <w:pStyle w:val="FirstParagraph"/>
@@ -19943,8 +20872,8 @@
         </m:oMath>
       </m:oMathPara>
     </w:p>
-    <w:bookmarkEnd w:id="82"/>
-    <w:bookmarkStart w:id="83" w:name="exm-mae-gaussian"/>
+    <w:bookmarkEnd w:id="85"/>
+    <w:bookmarkStart w:id="86" w:name="exm-mae-gaussian"/>
     <w:p>
       <w:pPr>
         <w:pStyle w:val="FirstParagraph"/>
@@ -22343,16 +23272,16 @@
           <w:rPr>
             <w:rStyle w:val="Hyperlink"/>
           </w:rPr>
-          <w:t xml:space="preserve">Theorem 3</w:t>
+          <w:t xml:space="preserve">Theorem 6</w:t>
         </w:r>
       </w:hyperlink>
       <w:r>
         <w:t xml:space="preserve">).</w:t>
       </w:r>
     </w:p>
-    <w:bookmarkEnd w:id="83"/>
-    <w:bookmarkEnd w:id="84"/>
-    <w:bookmarkStart w:id="98" w:name="standard-error"/>
+    <w:bookmarkEnd w:id="86"/>
+    <w:bookmarkEnd w:id="87"/>
+    <w:bookmarkStart w:id="101" w:name="standard-error"/>
     <w:p>
       <w:pPr>
         <w:pStyle w:val="Heading3"/>
@@ -22361,7 +23290,7 @@
         <w:t xml:space="preserve">3.8 Standard error</w:t>
       </w:r>
     </w:p>
-    <w:bookmarkStart w:id="86" w:name="def-SE"/>
+    <w:bookmarkStart w:id="89" w:name="def-SE"/>
     <w:p>
       <w:pPr>
         <w:pStyle w:val="FirstParagraph"/>
@@ -22419,7 +23348,7 @@
       <w:r>
         <w:t xml:space="preserve"> </w:t>
       </w:r>
-      <w:hyperlink r:id="rId85">
+      <w:hyperlink r:id="rId88">
         <w:r>
           <w:rPr>
             <w:rStyle w:val="Hyperlink"/>
@@ -22547,8 +23476,8 @@
         </m:oMath>
       </m:oMathPara>
     </w:p>
-    <w:bookmarkEnd w:id="86"/>
-    <w:bookmarkStart w:id="87" w:name="exm-SE-sample-mean"/>
+    <w:bookmarkEnd w:id="89"/>
+    <w:bookmarkStart w:id="90" w:name="exm-SE-sample-mean"/>
     <w:p>
       <w:pPr>
         <w:pStyle w:val="FirstParagraph"/>
@@ -22860,8 +23789,8 @@
         <w:t xml:space="preserve">.</w:t>
       </w:r>
     </w:p>
-    <w:bookmarkEnd w:id="87"/>
-    <w:bookmarkStart w:id="88" w:name="exr-se-error-sd"/>
+    <w:bookmarkEnd w:id="90"/>
+    <w:bookmarkStart w:id="91" w:name="exr-se-error-sd"/>
     <w:p>
       <w:pPr>
         <w:pStyle w:val="BodyText"/>
@@ -22882,7 +23811,7 @@
       <w:r>
         <w:t xml:space="preserve"> </w:t>
       </w:r>
-      <w:hyperlink r:id="rId85">
+      <w:hyperlink r:id="rId88">
         <w:r>
           <w:rPr>
             <w:rStyle w:val="Hyperlink"/>
@@ -22983,8 +23912,8 @@
         <w:t xml:space="preserve">.</w:t>
       </w:r>
     </w:p>
-    <w:bookmarkEnd w:id="88"/>
-    <w:bookmarkStart w:id="89" w:name="sol-se-error-sd"/>
+    <w:bookmarkEnd w:id="91"/>
+    <w:bookmarkStart w:id="92" w:name="sol-se-error-sd"/>
     <w:p>
       <w:pPr>
         <w:pStyle w:val="BodyText"/>
@@ -23351,8 +24280,8 @@
         </m:oMath>
       </m:oMathPara>
     </w:p>
-    <w:bookmarkEnd w:id="89"/>
-    <w:bookmarkStart w:id="90" w:name="thm-se-error-sd"/>
+    <w:bookmarkEnd w:id="92"/>
+    <w:bookmarkStart w:id="93" w:name="thm-se-error-sd"/>
     <w:p>
       <w:pPr>
         <w:pStyle w:val="FirstParagraph"/>
@@ -23362,7 +24291,7 @@
           <w:b/>
           <w:bCs/>
         </w:rPr>
-        <w:t xml:space="preserve">Theorem 4 (Standard error is the spread of the estimation error)</w:t>
+        <w:t xml:space="preserve">Theorem 7 (Standard error is the spread of the estimation error)</w:t>
       </w:r>
     </w:p>
     <w:p>
@@ -23466,7 +24395,7 @@
         </m:oMath>
       </m:oMathPara>
     </w:p>
-    <w:bookmarkEnd w:id="90"/>
+    <w:bookmarkEnd w:id="93"/>
     <w:p>
       <w:pPr>
         <w:pStyle w:val="FirstParagraph"/>
@@ -23499,7 +24428,7 @@
         <w:t xml:space="preserve">.</w:t>
       </w:r>
     </w:p>
-    <w:bookmarkStart w:id="91" w:name="rem-standard-error-name"/>
+    <w:bookmarkStart w:id="94" w:name="rem-standard-error-name"/>
     <w:p>
       <w:pPr>
         <w:pStyle w:val="BodyText"/>
@@ -23569,7 +24498,7 @@
           <w:rPr>
             <w:rStyle w:val="Hyperlink"/>
           </w:rPr>
-          <w:t xml:space="preserve">Theorem 4</w:t>
+          <w:t xml:space="preserve">Theorem 7</w:t>
         </w:r>
       </w:hyperlink>
       <w:r>
@@ -23609,8 +24538,8 @@
         <w:t xml:space="preserve">so they come up often enough to deserve their own name.</w:t>
       </w:r>
     </w:p>
-    <w:bookmarkEnd w:id="91"/>
-    <w:bookmarkStart w:id="92" w:name="exr-var-mse-bias"/>
+    <w:bookmarkEnd w:id="94"/>
+    <w:bookmarkStart w:id="95" w:name="exr-var-mse-bias"/>
     <w:p>
       <w:pPr>
         <w:pStyle w:val="BodyText"/>
@@ -23636,7 +24565,7 @@
           <w:rPr>
             <w:rStyle w:val="Hyperlink"/>
           </w:rPr>
-          <w:t xml:space="preserve">Theorem 2</w:t>
+          <w:t xml:space="preserve">Theorem 5</w:t>
         </w:r>
       </w:hyperlink>
       <w:r>
@@ -23780,8 +24709,8 @@
         <w:t xml:space="preserve">.</w:t>
       </w:r>
     </w:p>
-    <w:bookmarkEnd w:id="92"/>
-    <w:bookmarkStart w:id="93" w:name="sol-var-mse-bias"/>
+    <w:bookmarkEnd w:id="95"/>
+    <w:bookmarkStart w:id="96" w:name="sol-var-mse-bias"/>
     <w:p>
       <w:pPr>
         <w:pStyle w:val="BodyText"/>
@@ -24708,8 +25637,8 @@
         </m:oMath>
       </m:oMathPara>
     </w:p>
-    <w:bookmarkEnd w:id="93"/>
-    <w:bookmarkStart w:id="94" w:name="cor-var-mse-bias"/>
+    <w:bookmarkEnd w:id="96"/>
+    <w:bookmarkStart w:id="97" w:name="cor-var-mse-bias"/>
     <w:p>
       <w:pPr>
         <w:pStyle w:val="FirstParagraph"/>
@@ -24904,7 +25833,7 @@
         </m:oMath>
       </m:oMathPara>
     </w:p>
-    <w:bookmarkEnd w:id="94"/>
+    <w:bookmarkEnd w:id="97"/>
     <w:p>
       <w:pPr>
         <w:pStyle w:val="FirstParagraph"/>
@@ -24937,7 +25866,7 @@
         <w:t xml:space="preserve">.</w:t>
       </w:r>
     </w:p>
-    <w:bookmarkStart w:id="95" w:name="exr-se-rmse-unbiased"/>
+    <w:bookmarkStart w:id="98" w:name="exr-se-rmse-unbiased"/>
     <w:p>
       <w:pPr>
         <w:pStyle w:val="BodyText"/>
@@ -25045,8 +25974,8 @@
         <w:t xml:space="preserve">.</w:t>
       </w:r>
     </w:p>
-    <w:bookmarkEnd w:id="95"/>
-    <w:bookmarkStart w:id="96" w:name="sol-se-rmse-unbiased"/>
+    <w:bookmarkEnd w:id="98"/>
+    <w:bookmarkStart w:id="99" w:name="sol-se-rmse-unbiased"/>
     <w:p>
       <w:pPr>
         <w:pStyle w:val="BodyText"/>
@@ -25309,8 +26238,8 @@
         </m:oMath>
       </m:oMathPara>
     </w:p>
-    <w:bookmarkEnd w:id="96"/>
-    <w:bookmarkStart w:id="97" w:name="cor-se-rmse-unbiased"/>
+    <w:bookmarkEnd w:id="99"/>
+    <w:bookmarkStart w:id="100" w:name="cor-se-rmse-unbiased"/>
     <w:p>
       <w:pPr>
         <w:pStyle w:val="FirstParagraph"/>
@@ -25468,7 +26397,7 @@
         </m:oMath>
       </m:oMathPara>
     </w:p>
-    <w:bookmarkEnd w:id="97"/>
+    <w:bookmarkEnd w:id="100"/>
     <w:p>
       <w:pPr>
         <w:pStyle w:val="FirstParagraph"/>
@@ -25501,9 +26430,9 @@
         <w:t xml:space="preserve">.</w:t>
       </w:r>
     </w:p>
-    <w:bookmarkEnd w:id="98"/>
-    <w:bookmarkEnd w:id="99"/>
-    <w:bookmarkStart w:id="112" w:name="references"/>
+    <w:bookmarkEnd w:id="101"/>
+    <w:bookmarkEnd w:id="102"/>
+    <w:bookmarkStart w:id="115" w:name="references"/>
     <w:p>
       <w:pPr>
         <w:pStyle w:val="Heading2"/>
@@ -25512,8 +26441,8 @@
         <w:t xml:space="preserve">References</w:t>
       </w:r>
     </w:p>
-    <w:bookmarkStart w:id="111" w:name="refs"/>
-    <w:bookmarkStart w:id="101" w:name="ref-fiveminuteai_probstat"/>
+    <w:bookmarkStart w:id="114" w:name="refs"/>
+    <w:bookmarkStart w:id="104" w:name="ref-fiveminuteai_probstat"/>
     <w:p>
       <w:pPr>
         <w:pStyle w:val="Bibliography"/>
@@ -25537,7 +26466,7 @@
       <w:r>
         <w:t xml:space="preserve"> </w:t>
       </w:r>
-      <w:hyperlink r:id="rId100">
+      <w:hyperlink r:id="rId103">
         <w:r>
           <w:rPr>
             <w:rStyle w:val="Hyperlink"/>
@@ -25549,8 +26478,8 @@
         <w:t xml:space="preserve">.</w:t>
       </w:r>
     </w:p>
-    <w:bookmarkEnd w:id="101"/>
-    <w:bookmarkStart w:id="102" w:name="ref-box_draper_1987"/>
+    <w:bookmarkEnd w:id="104"/>
+    <w:bookmarkStart w:id="105" w:name="ref-box_draper_1987"/>
     <w:p>
       <w:pPr>
         <w:pStyle w:val="Bibliography"/>
@@ -25572,8 +26501,8 @@
         <w:t xml:space="preserve">. Wiley Series in Probability and Mathematical Statistics. Applied Probability and Statistics. Wiley.</w:t>
       </w:r>
     </w:p>
-    <w:bookmarkEnd w:id="102"/>
-    <w:bookmarkStart w:id="104" w:name="ref-dunn2018generalized"/>
+    <w:bookmarkEnd w:id="105"/>
+    <w:bookmarkStart w:id="107" w:name="ref-dunn2018generalized"/>
     <w:p>
       <w:pPr>
         <w:pStyle w:val="Bibliography"/>
@@ -25611,7 +26540,7 @@
       <w:r>
         <w:t xml:space="preserve"> </w:t>
       </w:r>
-      <w:hyperlink r:id="rId103">
+      <w:hyperlink r:id="rId106">
         <w:r>
           <w:rPr>
             <w:rStyle w:val="Hyperlink"/>
@@ -25623,8 +26552,8 @@
         <w:t xml:space="preserve">.</w:t>
       </w:r>
     </w:p>
-    <w:bookmarkEnd w:id="104"/>
-    <w:bookmarkStart w:id="106" w:name="ref-lawrance2020estimand"/>
+    <w:bookmarkEnd w:id="107"/>
+    <w:bookmarkStart w:id="109" w:name="ref-lawrance2020estimand"/>
     <w:p>
       <w:pPr>
         <w:pStyle w:val="Bibliography"/>
@@ -25657,7 +26586,7 @@
       <w:r>
         <w:t xml:space="preserve"> </w:t>
       </w:r>
-      <w:hyperlink r:id="rId105">
+      <w:hyperlink r:id="rId108">
         <w:r>
           <w:rPr>
             <w:rStyle w:val="Hyperlink"/>
@@ -25669,8 +26598,8 @@
         <w:t xml:space="preserve">.</w:t>
       </w:r>
     </w:p>
-    <w:bookmarkEnd w:id="106"/>
-    <w:bookmarkStart w:id="108" w:name="ref-pohl2021estimands"/>
+    <w:bookmarkEnd w:id="109"/>
+    <w:bookmarkStart w:id="111" w:name="ref-pohl2021estimands"/>
     <w:p>
       <w:pPr>
         <w:pStyle w:val="Bibliography"/>
@@ -25730,7 +26659,7 @@
       <w:r>
         <w:t xml:space="preserve"> </w:t>
       </w:r>
-      <w:hyperlink r:id="rId107">
+      <w:hyperlink r:id="rId110">
         <w:r>
           <w:rPr>
             <w:rStyle w:val="Hyperlink"/>
@@ -25742,8 +26671,8 @@
         <w:t xml:space="preserve">.</w:t>
       </w:r>
     </w:p>
-    <w:bookmarkEnd w:id="108"/>
-    <w:bookmarkStart w:id="110" w:name="ref-van2018flexible"/>
+    <w:bookmarkEnd w:id="111"/>
+    <w:bookmarkStart w:id="113" w:name="ref-van2018flexible"/>
     <w:p>
       <w:pPr>
         <w:pStyle w:val="Bibliography"/>
@@ -25767,7 +26696,7 @@
       <w:r>
         <w:t xml:space="preserve"> </w:t>
       </w:r>
-      <w:hyperlink r:id="rId109">
+      <w:hyperlink r:id="rId112">
         <w:r>
           <w:rPr>
             <w:rStyle w:val="Hyperlink"/>
@@ -25779,9 +26708,9 @@
         <w:t xml:space="preserve">.</w:t>
       </w:r>
     </w:p>
-    <w:bookmarkEnd w:id="110"/>
-    <w:bookmarkEnd w:id="111"/>
-    <w:bookmarkEnd w:id="112"/>
+    <w:bookmarkEnd w:id="113"/>
+    <w:bookmarkEnd w:id="114"/>
+    <w:bookmarkEnd w:id="115"/>
     <w:sectPr>
       <w:footnotePr>
         <w:numRestart w:val="eachSect"/>

</xml_diff>

<commit_message>
Deploying to gh-pages from @ Morrison-Lab/sds@449544dff910531d6eaf43b92fbb43ad13dfee83 🚀
</commit_message>
<xml_diff>
--- a/estimation-handout.docx
+++ b/estimation-handout.docx
@@ -15,7 +15,7 @@
         <w:pStyle w:val="Date"/>
       </w:pPr>
       <w:r>
-        <w:t xml:space="preserve">Last modified: 2026-10-15 02:58:11 (PDT)</w:t>
+        <w:t xml:space="preserve">Last modified: 2026-10-15 03:11:32 (PDT)</w:t>
       </w:r>
     </w:p>
     <w:bookmarkStart w:id="14" w:name="scientific-models"/>
@@ -23806,7 +23806,7 @@
         <w:t xml:space="preserve"> </w:t>
       </w:r>
       <w:r>
-        <w:t xml:space="preserve">Show that the</w:t>
+        <w:t xml:space="preserve">Find the</w:t>
       </w:r>
       <w:r>
         <w:t xml:space="preserve"> </w:t>
@@ -23874,7 +23874,7 @@
         <w:t xml:space="preserve"> </w:t>
       </w:r>
       <w:r>
-        <w:t xml:space="preserve">equals the</w:t>
+        <w:t xml:space="preserve">in terms of the</w:t>
       </w:r>
       <w:r>
         <w:t xml:space="preserve"> </w:t>

</xml_diff>

<commit_message>
Deploying to gh-pages from @ Morrison-Lab/sds@23962fbeff95d79dd577bbd698fa99f76b4c691f 🚀
</commit_message>
<xml_diff>
--- a/estimation-handout.docx
+++ b/estimation-handout.docx
@@ -15,7 +15,7 @@
         <w:pStyle w:val="Date"/>
       </w:pPr>
       <w:r>
-        <w:t xml:space="preserve">Last modified: 2026-10-16 04:59:09 (PDT)</w:t>
+        <w:t xml:space="preserve">Last modified: 2026-10-16 05:11:27 (PDT)</w:t>
       </w:r>
     </w:p>
     <w:bookmarkStart w:id="14" w:name="scientific-models"/>
@@ -3814,7 +3814,7 @@
     </w:p>
     <w:bookmarkEnd w:id="35"/>
     <w:bookmarkEnd w:id="36"/>
-    <w:bookmarkStart w:id="102" w:name="sec-est-accuracy"/>
+    <w:bookmarkStart w:id="105" w:name="sec-est-accuracy"/>
     <w:p>
       <w:pPr>
         <w:pStyle w:val="Heading2"/>
@@ -6685,7 +6685,7 @@
     </w:p>
     <w:bookmarkEnd w:id="48"/>
     <w:bookmarkEnd w:id="49"/>
-    <w:bookmarkStart w:id="70" w:name="mean-squared-error"/>
+    <w:bookmarkStart w:id="73" w:name="mean-squared-error"/>
     <w:p>
       <w:pPr>
         <w:pStyle w:val="Heading3"/>
@@ -11753,10 +11753,175 @@
         <w:t xml:space="preserve">so they are equal to each other.</w:t>
       </w:r>
     </w:p>
-    <w:bookmarkStart w:id="66" w:name="exm-mse-sample-mean"/>
+    <w:bookmarkStart w:id="67" w:name="rem-mse-bias-variance-prediction"/>
     <w:p>
       <w:pPr>
         <w:pStyle w:val="BodyText"/>
+      </w:pPr>
+      <w:r>
+        <w:rPr>
+          <w:i/>
+          <w:iCs/>
+        </w:rPr>
+        <w:t xml:space="preserve">Remark 1</w:t>
+      </w:r>
+      <w:r>
+        <w:t xml:space="preserve"> (Estimation versus prediction). </w:t>
+      </w:r>
+      <w:r>
+        <w:t xml:space="preserve">The squared-error split has two forms, and they differ in what the estimate is compared with.</w:t>
+      </w:r>
+    </w:p>
+    <w:p>
+      <w:pPr>
+        <w:pStyle w:val="Compact"/>
+        <w:numPr>
+          <w:ilvl w:val="0"/>
+          <w:numId w:val="1003"/>
+        </w:numPr>
+      </w:pPr>
+      <w:r>
+        <w:rPr>
+          <w:b/>
+          <w:bCs/>
+        </w:rPr>
+        <w:t xml:space="preserve">Estimation.</w:t>
+      </w:r>
+      <w:r>
+        <w:t xml:space="preserve"> </w:t>
+      </w:r>
+      <w:hyperlink w:anchor="thm-mse-bias-variance">
+        <w:r>
+          <w:rPr>
+            <w:rStyle w:val="Hyperlink"/>
+          </w:rPr>
+          <w:t xml:space="preserve">Theorem 5</w:t>
+        </w:r>
+      </w:hyperlink>
+      <w:r>
+        <w:t xml:space="preserve"> </w:t>
+      </w:r>
+      <w:r>
+        <w:t xml:space="preserve">compares an estimator</w:t>
+      </w:r>
+      <w:r>
+        <w:t xml:space="preserve"> </w:t>
+      </w:r>
+      <m:oMath>
+        <m:acc>
+          <m:accPr>
+            <m:chr m:val="̂"/>
+          </m:accPr>
+          <m:e>
+            <m:r>
+              <m:t>θ</m:t>
+            </m:r>
+          </m:e>
+        </m:acc>
+      </m:oMath>
+      <w:r>
+        <w:t xml:space="preserve"> </w:t>
+      </w:r>
+      <w:r>
+        <w:t xml:space="preserve">with a fixed parameter</w:t>
+      </w:r>
+      <w:r>
+        <w:t xml:space="preserve"> </w:t>
+      </w:r>
+      <m:oMath>
+        <m:r>
+          <m:t>θ</m:t>
+        </m:r>
+      </m:oMath>
+      <w:r>
+        <w:t xml:space="preserve">.</w:t>
+      </w:r>
+      <w:r>
+        <w:t xml:space="preserve"> </w:t>
+      </w:r>
+      <w:r>
+        <w:t xml:space="preserve">The target is a constant, so the expected squared error is squared bias plus variance, with no other term.</w:t>
+      </w:r>
+    </w:p>
+    <w:p>
+      <w:pPr>
+        <w:pStyle w:val="Compact"/>
+        <w:numPr>
+          <w:ilvl w:val="0"/>
+          <w:numId w:val="1003"/>
+        </w:numPr>
+      </w:pPr>
+      <w:r>
+        <w:rPr>
+          <w:b/>
+          <w:bCs/>
+        </w:rPr>
+        <w:t xml:space="preserve">Prediction.</w:t>
+      </w:r>
+      <w:r>
+        <w:t xml:space="preserve"> </w:t>
+      </w:r>
+      <w:r>
+        <w:t xml:space="preserve">The target is a new outcome, which is itself random.</w:t>
+      </w:r>
+      <w:r>
+        <w:t xml:space="preserve"> </w:t>
+      </w:r>
+      <w:r>
+        <w:t xml:space="preserve">The model validation notes prove that</w:t>
+      </w:r>
+      <w:r>
+        <w:t xml:space="preserve"> </w:t>
+      </w:r>
+      <w:hyperlink r:id="rId65">
+        <w:r>
+          <w:rPr>
+            <w:rStyle w:val="Hyperlink"/>
+          </w:rPr>
+          <w:t xml:space="preserve">expected squared prediction error</w:t>
+        </w:r>
+      </w:hyperlink>
+      <w:r>
+        <w:t xml:space="preserve"> </w:t>
+      </w:r>
+      <w:r>
+        <w:t xml:space="preserve">equals squared bias plus variance plus the noise variance,</w:t>
+      </w:r>
+      <w:r>
+        <w:t xml:space="preserve"> </w:t>
+      </w:r>
+      <w:r>
+        <w:t xml:space="preserve">the</w:t>
+      </w:r>
+      <w:r>
+        <w:t xml:space="preserve"> </w:t>
+      </w:r>
+      <w:hyperlink r:id="rId66">
+        <w:r>
+          <w:rPr>
+            <w:rStyle w:val="Hyperlink"/>
+          </w:rPr>
+          <w:t xml:space="preserve">irreducible error</w:t>
+        </w:r>
+      </w:hyperlink>
+      <w:r>
+        <w:t xml:space="preserve"> </w:t>
+      </w:r>
+      <w:r>
+        <w:t xml:space="preserve">of that outcome.</w:t>
+      </w:r>
+      <w:r>
+        <w:t xml:space="preserve"> </w:t>
+      </w:r>
+      <w:r>
+        <w:t xml:space="preserve">No choice of prediction can remove the extra term.</w:t>
+      </w:r>
+    </w:p>
+    <w:bookmarkEnd w:id="67"/>
+    <w:bookmarkStart w:id="69" w:name="exm-mse-sample-mean"/>
+    <w:p>
+      <w:pPr>
+        <w:pStyle w:val="FirstParagraph"/>
       </w:pPr>
       <w:r>
         <w:rPr>
@@ -13165,7 +13330,7 @@
       <w:r>
         <w:t xml:space="preserve"> </w:t>
       </w:r>
-      <w:hyperlink r:id="rId65">
+      <w:hyperlink r:id="rId68">
         <w:r>
           <w:rPr>
             <w:rStyle w:val="Hyperlink"/>
@@ -13463,8 +13628,8 @@
         <w:t xml:space="preserve">’s.</w:t>
       </w:r>
     </w:p>
-    <w:bookmarkEnd w:id="66"/>
-    <w:bookmarkStart w:id="67" w:name="def-rmse"/>
+    <w:bookmarkEnd w:id="69"/>
+    <w:bookmarkStart w:id="70" w:name="def-rmse"/>
     <w:p>
       <w:pPr>
         <w:pStyle w:val="BodyText"/>
@@ -13637,8 +13802,8 @@
         </m:oMath>
       </m:oMathPara>
     </w:p>
-    <w:bookmarkEnd w:id="67"/>
-    <w:bookmarkStart w:id="68" w:name="exm-rmse-sample-mean"/>
+    <w:bookmarkEnd w:id="70"/>
+    <w:bookmarkStart w:id="71" w:name="exm-rmse-sample-mean"/>
     <w:p>
       <w:pPr>
         <w:pStyle w:val="FirstParagraph"/>
@@ -13726,8 +13891,8 @@
         <w:t xml:space="preserve">.</w:t>
       </w:r>
     </w:p>
-    <w:bookmarkEnd w:id="68"/>
-    <w:bookmarkStart w:id="69" w:name="rem-rmse-units"/>
+    <w:bookmarkEnd w:id="71"/>
+    <w:bookmarkStart w:id="72" w:name="rem-rmse-units"/>
     <w:p>
       <w:pPr>
         <w:pStyle w:val="BodyText"/>
@@ -13737,7 +13902,7 @@
           <w:i/>
           <w:iCs/>
         </w:rPr>
-        <w:t xml:space="preserve">Remark 1</w:t>
+        <w:t xml:space="preserve">Remark 2</w:t>
       </w:r>
       <w:r>
         <w:t xml:space="preserve"> (Units of the root mean squared error). </w:t>
@@ -13746,7 +13911,7 @@
         <w:t xml:space="preserve">The root mean squared error has the same units as the estimand.</w:t>
       </w:r>
     </w:p>
-    <w:bookmarkEnd w:id="69"/>
+    <w:bookmarkEnd w:id="72"/>
     <w:p>
       <w:pPr>
         <w:pStyle w:val="BodyText"/>
@@ -13761,8 +13926,8 @@
         <w:t xml:space="preserve">covers mean squared error.</w:t>
       </w:r>
     </w:p>
-    <w:bookmarkEnd w:id="70"/>
-    <w:bookmarkStart w:id="84" w:name="sec-unbiased-estimators"/>
+    <w:bookmarkEnd w:id="73"/>
+    <w:bookmarkStart w:id="87" w:name="sec-unbiased-estimators"/>
     <w:p>
       <w:pPr>
         <w:pStyle w:val="Heading3"/>
@@ -13771,7 +13936,7 @@
         <w:t xml:space="preserve">3.6 Unbiased estimators</w:t>
       </w:r>
     </w:p>
-    <w:bookmarkStart w:id="71" w:name="def-unbiased"/>
+    <w:bookmarkStart w:id="74" w:name="def-unbiased"/>
     <w:p>
       <w:pPr>
         <w:pStyle w:val="FirstParagraph"/>
@@ -13897,8 +14062,8 @@
         </m:oMath>
       </m:oMathPara>
     </w:p>
-    <w:bookmarkEnd w:id="71"/>
-    <w:bookmarkStart w:id="72" w:name="def-biased"/>
+    <w:bookmarkEnd w:id="74"/>
+    <w:bookmarkStart w:id="75" w:name="def-biased"/>
     <w:p>
       <w:pPr>
         <w:pStyle w:val="FirstParagraph"/>
@@ -14024,8 +14189,8 @@
         </m:oMath>
       </m:oMathPara>
     </w:p>
-    <w:bookmarkEnd w:id="72"/>
-    <w:bookmarkStart w:id="73" w:name="exm-unbiased-sample-mean"/>
+    <w:bookmarkEnd w:id="75"/>
+    <w:bookmarkStart w:id="76" w:name="exm-unbiased-sample-mean"/>
     <w:p>
       <w:pPr>
         <w:pStyle w:val="FirstParagraph"/>
@@ -14239,8 +14404,8 @@
         <w:t xml:space="preserve">.</w:t>
       </w:r>
     </w:p>
-    <w:bookmarkEnd w:id="73"/>
-    <w:bookmarkStart w:id="75" w:name="exm-biased-variance-mle"/>
+    <w:bookmarkEnd w:id="76"/>
+    <w:bookmarkStart w:id="78" w:name="exm-biased-variance-mle"/>
     <w:p>
       <w:pPr>
         <w:pStyle w:val="BodyText"/>
@@ -14409,7 +14574,7 @@
         <w:pStyle w:val="Compact"/>
         <w:numPr>
           <w:ilvl w:val="0"/>
-          <w:numId w:val="1003"/>
+          <w:numId w:val="1004"/>
         </w:numPr>
       </w:pPr>
       <w:r>
@@ -14418,7 +14583,7 @@
       <w:r>
         <w:t xml:space="preserve"> </w:t>
       </w:r>
-      <w:hyperlink r:id="rId74">
+      <w:hyperlink r:id="rId77">
         <w:r>
           <w:rPr>
             <w:rStyle w:val="Hyperlink"/>
@@ -14573,7 +14738,7 @@
         <w:pStyle w:val="Compact"/>
         <w:numPr>
           <w:ilvl w:val="0"/>
-          <w:numId w:val="1003"/>
+          <w:numId w:val="1004"/>
         </w:numPr>
       </w:pPr>
       <w:r>
@@ -19590,8 +19755,8 @@
         <w:t xml:space="preserve">grows.</w:t>
       </w:r>
     </w:p>
-    <w:bookmarkEnd w:id="75"/>
-    <w:bookmarkStart w:id="76" w:name="exr-unbiased-exp"/>
+    <w:bookmarkEnd w:id="78"/>
+    <w:bookmarkStart w:id="79" w:name="exr-unbiased-exp"/>
     <w:p>
       <w:pPr>
         <w:pStyle w:val="BodyText"/>
@@ -19722,8 +19887,8 @@
         <w:t xml:space="preserve">.</w:t>
       </w:r>
     </w:p>
-    <w:bookmarkEnd w:id="76"/>
-    <w:bookmarkStart w:id="77" w:name="sol-unbiased-exp"/>
+    <w:bookmarkEnd w:id="79"/>
+    <w:bookmarkStart w:id="80" w:name="sol-unbiased-exp"/>
     <w:p>
       <w:pPr>
         <w:pStyle w:val="BodyText"/>
@@ -19948,8 +20113,8 @@
         <w:t xml:space="preserve">.</w:t>
       </w:r>
     </w:p>
-    <w:bookmarkEnd w:id="77"/>
-    <w:bookmarkStart w:id="78" w:name="exr-unbiased-mse"/>
+    <w:bookmarkEnd w:id="80"/>
+    <w:bookmarkStart w:id="81" w:name="exr-unbiased-mse"/>
     <w:p>
       <w:pPr>
         <w:pStyle w:val="BodyText"/>
@@ -20043,8 +20208,8 @@
         <w:t xml:space="preserve">in terms of its variance.</w:t>
       </w:r>
     </w:p>
-    <w:bookmarkEnd w:id="78"/>
-    <w:bookmarkStart w:id="79" w:name="sol-unbiased-mse"/>
+    <w:bookmarkEnd w:id="81"/>
+    <w:bookmarkStart w:id="82" w:name="sol-unbiased-mse"/>
     <w:p>
       <w:pPr>
         <w:pStyle w:val="BodyText"/>
@@ -20383,8 +20548,8 @@
         </m:oMath>
       </m:oMathPara>
     </w:p>
-    <w:bookmarkEnd w:id="79"/>
-    <w:bookmarkStart w:id="82" w:name="thm-unbiased-props"/>
+    <w:bookmarkEnd w:id="82"/>
+    <w:bookmarkStart w:id="85" w:name="thm-unbiased-props"/>
     <w:p>
       <w:pPr>
         <w:pStyle w:val="FirstParagraph"/>
@@ -20456,7 +20621,7 @@
       <w:pPr>
         <w:pStyle w:val="BodyText"/>
       </w:pPr>
-      <w:bookmarkStart w:id="80" w:name="eq-unbiased-exp"/>
+      <w:bookmarkStart w:id="83" w:name="eq-unbiased-exp"/>
       <m:oMathPara>
         <m:oMathParaPr>
           <m:jc m:val="center"/>
@@ -20523,13 +20688,13 @@
           </m:r>
         </m:oMath>
       </m:oMathPara>
-      <w:bookmarkEnd w:id="80"/>
+      <w:bookmarkEnd w:id="83"/>
     </w:p>
     <w:p>
       <w:pPr>
         <w:pStyle w:val="FirstParagraph"/>
       </w:pPr>
-      <w:bookmarkStart w:id="81" w:name="eq-unbiased-mse"/>
+      <w:bookmarkStart w:id="84" w:name="eq-unbiased-mse"/>
       <m:oMathPara>
         <m:oMathParaPr>
           <m:jc m:val="center"/>
@@ -20625,9 +20790,9 @@
           </m:r>
         </m:oMath>
       </m:oMathPara>
-      <w:bookmarkEnd w:id="81"/>
+      <w:bookmarkEnd w:id="84"/>
     </w:p>
-    <w:bookmarkEnd w:id="82"/>
+    <w:bookmarkEnd w:id="85"/>
     <w:p>
       <w:pPr>
         <w:pStyle w:val="FirstParagraph"/>
@@ -20718,7 +20883,7 @@
       <w:r>
         <w:t xml:space="preserve"> </w:t>
       </w:r>
-      <w:hyperlink r:id="rId83">
+      <w:hyperlink r:id="rId86">
         <w:r>
           <w:rPr>
             <w:rStyle w:val="Hyperlink"/>
@@ -20745,8 +20910,8 @@
         <w:t xml:space="preserve">.</w:t>
       </w:r>
     </w:p>
-    <w:bookmarkEnd w:id="84"/>
-    <w:bookmarkStart w:id="87" w:name="mean-absolute-error"/>
+    <w:bookmarkEnd w:id="87"/>
+    <w:bookmarkStart w:id="90" w:name="mean-absolute-error"/>
     <w:p>
       <w:pPr>
         <w:pStyle w:val="Heading3"/>
@@ -20755,7 +20920,7 @@
         <w:t xml:space="preserve">3.7 Mean absolute error</w:t>
       </w:r>
     </w:p>
-    <w:bookmarkStart w:id="85" w:name="def-mae"/>
+    <w:bookmarkStart w:id="88" w:name="def-mae"/>
     <w:p>
       <w:pPr>
         <w:pStyle w:val="FirstParagraph"/>
@@ -20940,8 +21105,8 @@
         </m:oMath>
       </m:oMathPara>
     </w:p>
-    <w:bookmarkEnd w:id="85"/>
-    <w:bookmarkStart w:id="86" w:name="exm-mae-gaussian"/>
+    <w:bookmarkEnd w:id="88"/>
+    <w:bookmarkStart w:id="89" w:name="exm-mae-gaussian"/>
     <w:p>
       <w:pPr>
         <w:pStyle w:val="FirstParagraph"/>
@@ -23347,9 +23512,9 @@
         <w:t xml:space="preserve">).</w:t>
       </w:r>
     </w:p>
-    <w:bookmarkEnd w:id="86"/>
-    <w:bookmarkEnd w:id="87"/>
-    <w:bookmarkStart w:id="101" w:name="standard-error"/>
+    <w:bookmarkEnd w:id="89"/>
+    <w:bookmarkEnd w:id="90"/>
+    <w:bookmarkStart w:id="104" w:name="standard-error"/>
     <w:p>
       <w:pPr>
         <w:pStyle w:val="Heading3"/>
@@ -23358,7 +23523,7 @@
         <w:t xml:space="preserve">3.8 Standard error</w:t>
       </w:r>
     </w:p>
-    <w:bookmarkStart w:id="89" w:name="def-SE"/>
+    <w:bookmarkStart w:id="92" w:name="def-SE"/>
     <w:p>
       <w:pPr>
         <w:pStyle w:val="FirstParagraph"/>
@@ -23416,7 +23581,7 @@
       <w:r>
         <w:t xml:space="preserve"> </w:t>
       </w:r>
-      <w:hyperlink r:id="rId88">
+      <w:hyperlink r:id="rId91">
         <w:r>
           <w:rPr>
             <w:rStyle w:val="Hyperlink"/>
@@ -23544,8 +23709,8 @@
         </m:oMath>
       </m:oMathPara>
     </w:p>
-    <w:bookmarkEnd w:id="89"/>
-    <w:bookmarkStart w:id="90" w:name="exm-SE-sample-mean"/>
+    <w:bookmarkEnd w:id="92"/>
+    <w:bookmarkStart w:id="93" w:name="exm-SE-sample-mean"/>
     <w:p>
       <w:pPr>
         <w:pStyle w:val="FirstParagraph"/>
@@ -23857,8 +24022,8 @@
         <w:t xml:space="preserve">.</w:t>
       </w:r>
     </w:p>
-    <w:bookmarkEnd w:id="90"/>
-    <w:bookmarkStart w:id="91" w:name="exr-se-error-sd"/>
+    <w:bookmarkEnd w:id="93"/>
+    <w:bookmarkStart w:id="94" w:name="exr-se-error-sd"/>
     <w:p>
       <w:pPr>
         <w:pStyle w:val="BodyText"/>
@@ -23879,7 +24044,7 @@
       <w:r>
         <w:t xml:space="preserve"> </w:t>
       </w:r>
-      <w:hyperlink r:id="rId88">
+      <w:hyperlink r:id="rId91">
         <w:r>
           <w:rPr>
             <w:rStyle w:val="Hyperlink"/>
@@ -23980,8 +24145,8 @@
         <w:t xml:space="preserve">.</w:t>
       </w:r>
     </w:p>
-    <w:bookmarkEnd w:id="91"/>
-    <w:bookmarkStart w:id="92" w:name="sol-se-error-sd"/>
+    <w:bookmarkEnd w:id="94"/>
+    <w:bookmarkStart w:id="95" w:name="sol-se-error-sd"/>
     <w:p>
       <w:pPr>
         <w:pStyle w:val="BodyText"/>
@@ -24348,8 +24513,8 @@
         </m:oMath>
       </m:oMathPara>
     </w:p>
-    <w:bookmarkEnd w:id="92"/>
-    <w:bookmarkStart w:id="93" w:name="thm-se-error-sd"/>
+    <w:bookmarkEnd w:id="95"/>
+    <w:bookmarkStart w:id="96" w:name="thm-se-error-sd"/>
     <w:p>
       <w:pPr>
         <w:pStyle w:val="FirstParagraph"/>
@@ -24463,7 +24628,7 @@
         </m:oMath>
       </m:oMathPara>
     </w:p>
-    <w:bookmarkEnd w:id="93"/>
+    <w:bookmarkEnd w:id="96"/>
     <w:p>
       <w:pPr>
         <w:pStyle w:val="FirstParagraph"/>
@@ -24496,7 +24661,7 @@
         <w:t xml:space="preserve">.</w:t>
       </w:r>
     </w:p>
-    <w:bookmarkStart w:id="94" w:name="rem-standard-error-name"/>
+    <w:bookmarkStart w:id="97" w:name="rem-standard-error-name"/>
     <w:p>
       <w:pPr>
         <w:pStyle w:val="BodyText"/>
@@ -24506,7 +24671,7 @@
           <w:i/>
           <w:iCs/>
         </w:rPr>
-        <w:t xml:space="preserve">Remark 2</w:t>
+        <w:t xml:space="preserve">Remark 3</w:t>
       </w:r>
       <w:r>
         <w:t xml:space="preserve"> (The name</w:t>
@@ -24606,8 +24771,8 @@
         <w:t xml:space="preserve">so they come up often enough to deserve their own name.</w:t>
       </w:r>
     </w:p>
-    <w:bookmarkEnd w:id="94"/>
-    <w:bookmarkStart w:id="95" w:name="exr-var-mse-bias"/>
+    <w:bookmarkEnd w:id="97"/>
+    <w:bookmarkStart w:id="98" w:name="exr-var-mse-bias"/>
     <w:p>
       <w:pPr>
         <w:pStyle w:val="BodyText"/>
@@ -24777,8 +24942,8 @@
         <w:t xml:space="preserve">.</w:t>
       </w:r>
     </w:p>
-    <w:bookmarkEnd w:id="95"/>
-    <w:bookmarkStart w:id="96" w:name="sol-var-mse-bias"/>
+    <w:bookmarkEnd w:id="98"/>
+    <w:bookmarkStart w:id="99" w:name="sol-var-mse-bias"/>
     <w:p>
       <w:pPr>
         <w:pStyle w:val="BodyText"/>
@@ -25705,8 +25870,8 @@
         </m:oMath>
       </m:oMathPara>
     </w:p>
-    <w:bookmarkEnd w:id="96"/>
-    <w:bookmarkStart w:id="97" w:name="cor-var-mse-bias"/>
+    <w:bookmarkEnd w:id="99"/>
+    <w:bookmarkStart w:id="100" w:name="cor-var-mse-bias"/>
     <w:p>
       <w:pPr>
         <w:pStyle w:val="FirstParagraph"/>
@@ -25901,7 +26066,7 @@
         </m:oMath>
       </m:oMathPara>
     </w:p>
-    <w:bookmarkEnd w:id="97"/>
+    <w:bookmarkEnd w:id="100"/>
     <w:p>
       <w:pPr>
         <w:pStyle w:val="FirstParagraph"/>
@@ -25934,7 +26099,7 @@
         <w:t xml:space="preserve">.</w:t>
       </w:r>
     </w:p>
-    <w:bookmarkStart w:id="98" w:name="exr-se-rmse-unbiased"/>
+    <w:bookmarkStart w:id="101" w:name="exr-se-rmse-unbiased"/>
     <w:p>
       <w:pPr>
         <w:pStyle w:val="BodyText"/>
@@ -26042,8 +26207,8 @@
         <w:t xml:space="preserve">.</w:t>
       </w:r>
     </w:p>
-    <w:bookmarkEnd w:id="98"/>
-    <w:bookmarkStart w:id="99" w:name="sol-se-rmse-unbiased"/>
+    <w:bookmarkEnd w:id="101"/>
+    <w:bookmarkStart w:id="102" w:name="sol-se-rmse-unbiased"/>
     <w:p>
       <w:pPr>
         <w:pStyle w:val="BodyText"/>
@@ -26306,8 +26471,8 @@
         </m:oMath>
       </m:oMathPara>
     </w:p>
-    <w:bookmarkEnd w:id="99"/>
-    <w:bookmarkStart w:id="100" w:name="cor-se-rmse-unbiased"/>
+    <w:bookmarkEnd w:id="102"/>
+    <w:bookmarkStart w:id="103" w:name="cor-se-rmse-unbiased"/>
     <w:p>
       <w:pPr>
         <w:pStyle w:val="FirstParagraph"/>
@@ -26465,7 +26630,7 @@
         </m:oMath>
       </m:oMathPara>
     </w:p>
-    <w:bookmarkEnd w:id="100"/>
+    <w:bookmarkEnd w:id="103"/>
     <w:p>
       <w:pPr>
         <w:pStyle w:val="FirstParagraph"/>
@@ -26498,9 +26663,9 @@
         <w:t xml:space="preserve">.</w:t>
       </w:r>
     </w:p>
-    <w:bookmarkEnd w:id="101"/>
-    <w:bookmarkEnd w:id="102"/>
-    <w:bookmarkStart w:id="119" w:name="references"/>
+    <w:bookmarkEnd w:id="104"/>
+    <w:bookmarkEnd w:id="105"/>
+    <w:bookmarkStart w:id="122" w:name="references"/>
     <w:p>
       <w:pPr>
         <w:pStyle w:val="Heading2"/>
@@ -26509,8 +26674,8 @@
         <w:t xml:space="preserve">References</w:t>
       </w:r>
     </w:p>
-    <w:bookmarkStart w:id="118" w:name="refs"/>
-    <w:bookmarkStart w:id="104" w:name="ref-fiveminuteai_probstat"/>
+    <w:bookmarkStart w:id="121" w:name="refs"/>
+    <w:bookmarkStart w:id="107" w:name="ref-fiveminuteai_probstat"/>
     <w:p>
       <w:pPr>
         <w:pStyle w:val="Bibliography"/>
@@ -26534,7 +26699,7 @@
       <w:r>
         <w:t xml:space="preserve"> </w:t>
       </w:r>
-      <w:hyperlink r:id="rId103">
+      <w:hyperlink r:id="rId106">
         <w:r>
           <w:rPr>
             <w:rStyle w:val="Hyperlink"/>
@@ -26546,8 +26711,8 @@
         <w:t xml:space="preserve">.</w:t>
       </w:r>
     </w:p>
-    <w:bookmarkEnd w:id="104"/>
-    <w:bookmarkStart w:id="105" w:name="ref-box_draper_1987"/>
+    <w:bookmarkEnd w:id="107"/>
+    <w:bookmarkStart w:id="108" w:name="ref-box_draper_1987"/>
     <w:p>
       <w:pPr>
         <w:pStyle w:val="Bibliography"/>
@@ -26569,8 +26734,8 @@
         <w:t xml:space="preserve">. Wiley Series in Probability and Mathematical Statistics. Applied Probability and Statistics. Wiley.</w:t>
       </w:r>
     </w:p>
-    <w:bookmarkEnd w:id="105"/>
-    <w:bookmarkStart w:id="107" w:name="ref-CaseBerg01"/>
+    <w:bookmarkEnd w:id="108"/>
+    <w:bookmarkStart w:id="110" w:name="ref-CaseBerg01"/>
     <w:p>
       <w:pPr>
         <w:pStyle w:val="Bibliography"/>
@@ -26594,7 +26759,7 @@
       <w:r>
         <w:t xml:space="preserve"> </w:t>
       </w:r>
-      <w:hyperlink r:id="rId106">
+      <w:hyperlink r:id="rId109">
         <w:r>
           <w:rPr>
             <w:rStyle w:val="Hyperlink"/>
@@ -26606,8 +26771,8 @@
         <w:t xml:space="preserve">.</w:t>
       </w:r>
     </w:p>
-    <w:bookmarkEnd w:id="107"/>
-    <w:bookmarkStart w:id="109" w:name="ref-dunn2018generalized"/>
+    <w:bookmarkEnd w:id="110"/>
+    <w:bookmarkStart w:id="112" w:name="ref-dunn2018generalized"/>
     <w:p>
       <w:pPr>
         <w:pStyle w:val="Bibliography"/>
@@ -26645,7 +26810,7 @@
       <w:r>
         <w:t xml:space="preserve"> </w:t>
       </w:r>
-      <w:hyperlink r:id="rId108">
+      <w:hyperlink r:id="rId111">
         <w:r>
           <w:rPr>
             <w:rStyle w:val="Hyperlink"/>
@@ -26657,8 +26822,8 @@
         <w:t xml:space="preserve">.</w:t>
       </w:r>
     </w:p>
-    <w:bookmarkEnd w:id="109"/>
-    <w:bookmarkStart w:id="110" w:name="ref-hoggtanis2015"/>
+    <w:bookmarkEnd w:id="112"/>
+    <w:bookmarkStart w:id="113" w:name="ref-hoggtanis2015"/>
     <w:p>
       <w:pPr>
         <w:pStyle w:val="Bibliography"/>
@@ -26680,8 +26845,8 @@
         <w:t xml:space="preserve">. Tenth edition. Pearson.</w:t>
       </w:r>
     </w:p>
-    <w:bookmarkEnd w:id="110"/>
-    <w:bookmarkStart w:id="112" w:name="ref-lawrance2020estimand"/>
+    <w:bookmarkEnd w:id="113"/>
+    <w:bookmarkStart w:id="115" w:name="ref-lawrance2020estimand"/>
     <w:p>
       <w:pPr>
         <w:pStyle w:val="Bibliography"/>
@@ -26714,7 +26879,7 @@
       <w:r>
         <w:t xml:space="preserve"> </w:t>
       </w:r>
-      <w:hyperlink r:id="rId111">
+      <w:hyperlink r:id="rId114">
         <w:r>
           <w:rPr>
             <w:rStyle w:val="Hyperlink"/>
@@ -26726,8 +26891,8 @@
         <w:t xml:space="preserve">.</w:t>
       </w:r>
     </w:p>
-    <w:bookmarkEnd w:id="112"/>
-    <w:bookmarkStart w:id="114" w:name="ref-pohl2021estimands"/>
+    <w:bookmarkEnd w:id="115"/>
+    <w:bookmarkStart w:id="117" w:name="ref-pohl2021estimands"/>
     <w:p>
       <w:pPr>
         <w:pStyle w:val="Bibliography"/>
@@ -26787,7 +26952,7 @@
       <w:r>
         <w:t xml:space="preserve"> </w:t>
       </w:r>
-      <w:hyperlink r:id="rId113">
+      <w:hyperlink r:id="rId116">
         <w:r>
           <w:rPr>
             <w:rStyle w:val="Hyperlink"/>
@@ -26799,8 +26964,8 @@
         <w:t xml:space="preserve">.</w:t>
       </w:r>
     </w:p>
-    <w:bookmarkEnd w:id="114"/>
-    <w:bookmarkStart w:id="115" w:name="ref-rice2007mathematical"/>
+    <w:bookmarkEnd w:id="117"/>
+    <w:bookmarkStart w:id="118" w:name="ref-rice2007mathematical"/>
     <w:p>
       <w:pPr>
         <w:pStyle w:val="Bibliography"/>
@@ -26822,8 +26987,8 @@
         <w:t xml:space="preserve">. 3rd ed. Cengage Learning.</w:t>
       </w:r>
     </w:p>
-    <w:bookmarkEnd w:id="115"/>
-    <w:bookmarkStart w:id="117" w:name="ref-van2018flexible"/>
+    <w:bookmarkEnd w:id="118"/>
+    <w:bookmarkStart w:id="120" w:name="ref-van2018flexible"/>
     <w:p>
       <w:pPr>
         <w:pStyle w:val="Bibliography"/>
@@ -26847,7 +27012,7 @@
       <w:r>
         <w:t xml:space="preserve"> </w:t>
       </w:r>
-      <w:hyperlink r:id="rId116">
+      <w:hyperlink r:id="rId119">
         <w:r>
           <w:rPr>
             <w:rStyle w:val="Hyperlink"/>
@@ -26859,9 +27024,9 @@
         <w:t xml:space="preserve">.</w:t>
       </w:r>
     </w:p>
-    <w:bookmarkEnd w:id="117"/>
-    <w:bookmarkEnd w:id="118"/>
-    <w:bookmarkEnd w:id="119"/>
+    <w:bookmarkEnd w:id="120"/>
+    <w:bookmarkEnd w:id="121"/>
+    <w:bookmarkEnd w:id="122"/>
     <w:sectPr>
       <w:footnotePr>
         <w:numRestart w:val="eachSect"/>
@@ -27085,6 +27250,9 @@
     <w:abstractNumId w:val="991"/>
   </w:num>
   <w:num w:numId="1003">
+    <w:abstractNumId w:val="991"/>
+  </w:num>
+  <w:num w:numId="1004">
     <w:abstractNumId w:val="991"/>
   </w:num>
 </w:numbering>

</xml_diff>

<commit_message>
Deploying to gh-pages from @ Morrison-Lab/sds@3d19723dc2ee971fb8c334df4feaa109aa0ab801 🚀
</commit_message>
<xml_diff>
--- a/estimation-handout.docx
+++ b/estimation-handout.docx
@@ -15,7 +15,7 @@
         <w:pStyle w:val="Date"/>
       </w:pPr>
       <w:r>
-        <w:t xml:space="preserve">Last modified: 2026-10-16 05:36:08 (PDT)</w:t>
+        <w:t xml:space="preserve">Last modified: 2026-10-16 07:21:05 (PDT)</w:t>
       </w:r>
     </w:p>
     <w:bookmarkStart w:id="14" w:name="scientific-models"/>
@@ -6773,7 +6773,7 @@
           <m:rPr>
             <m:sty m:val="p"/>
           </m:rPr>
-          <m:t>MSE</m:t>
+          <m:t>pMSE</m:t>
         </m:r>
         <m:r>
           <m:t>​</m:t>
@@ -6839,7 +6839,7 @@
             <m:rPr>
               <m:sty m:val="p"/>
             </m:rPr>
-            <m:t>MSE</m:t>
+            <m:t>pMSE</m:t>
           </m:r>
           <m:r>
             <m:t>​</m:t>
@@ -10038,7 +10038,7 @@
           <m:rPr>
             <m:sty m:val="p"/>
           </m:rPr>
-          <m:t>MSE</m:t>
+          <m:t>pMSE</m:t>
         </m:r>
         <m:r>
           <m:t>​</m:t>
@@ -10206,7 +10206,7 @@
                 <m:rPr>
                   <m:sty m:val="p"/>
                 </m:rPr>
-                <m:t>MSE</m:t>
+                <m:t>pMSE</m:t>
               </m:r>
               <m:r>
                 <m:t>​</m:t>
@@ -11067,7 +11067,7 @@
             <m:rPr>
               <m:sty m:val="p"/>
             </m:rPr>
-            <m:t>MSE</m:t>
+            <m:t>pMSE</m:t>
           </m:r>
           <m:r>
             <m:t>​</m:t>
@@ -11305,7 +11305,7 @@
             <m:rPr>
               <m:sty m:val="p"/>
             </m:rPr>
-            <m:t>MSE</m:t>
+            <m:t>pMSE</m:t>
           </m:r>
           <m:r>
             <m:t>​</m:t>
@@ -11513,7 +11513,7 @@
           <m:rPr>
             <m:sty m:val="p"/>
           </m:rPr>
-          <m:t>MSE</m:t>
+          <m:t>pMSE</m:t>
         </m:r>
         <m:r>
           <m:t>​</m:t>
@@ -12217,7 +12217,7 @@
                 <m:rPr>
                   <m:sty m:val="p"/>
                 </m:rPr>
-                <m:t>MSE</m:t>
+                <m:t>pMSE</m:t>
               </m:r>
               <m:r>
                 <m:t>​</m:t>
@@ -12383,7 +12383,7 @@
                 <m:rPr>
                   <m:sty m:val="p"/>
                 </m:rPr>
-                <m:t>MSE</m:t>
+                <m:t>pMSE</m:t>
               </m:r>
               <m:r>
                 <m:t>​</m:t>
@@ -13410,7 +13410,7 @@
                 <m:rPr>
                   <m:sty m:val="p"/>
                 </m:rPr>
-                <m:t>MSE</m:t>
+                <m:t>pMSE</m:t>
               </m:r>
               <m:r>
                 <m:t>​</m:t>
@@ -13506,7 +13506,7 @@
                 <m:rPr>
                   <m:sty m:val="p"/>
                 </m:rPr>
-                <m:t>MSE</m:t>
+                <m:t>pMSE</m:t>
               </m:r>
               <m:r>
                 <m:t>​</m:t>
@@ -13753,7 +13753,7 @@
             <m:rPr>
               <m:sty m:val="p"/>
             </m:rPr>
-            <m:t>RMSE</m:t>
+            <m:t>pRMSE</m:t>
           </m:r>
           <m:r>
             <m:t>​</m:t>
@@ -13810,7 +13810,7 @@
                 <m:rPr>
                   <m:sty m:val="p"/>
                 </m:rPr>
-                <m:t>MSE</m:t>
+                <m:t>pMSE</m:t>
               </m:r>
               <m:r>
                 <m:t>​</m:t>
@@ -20281,7 +20281,7 @@
                 <m:rPr>
                   <m:sty m:val="p"/>
                 </m:rPr>
-                <m:t>MSE</m:t>
+                <m:t>pMSE</m:t>
               </m:r>
               <m:r>
                 <m:t>​</m:t>
@@ -20745,7 +20745,7 @@
             <m:rPr>
               <m:sty m:val="p"/>
             </m:rPr>
-            <m:t>MSE</m:t>
+            <m:t>pMSE</m:t>
           </m:r>
           <m:r>
             <m:t>​</m:t>
@@ -25040,7 +25040,7 @@
                 <m:rPr>
                   <m:sty m:val="p"/>
                 </m:rPr>
-                <m:t>MSE</m:t>
+                <m:t>pMSE</m:t>
               </m:r>
               <m:r>
                 <m:t>​</m:t>
@@ -25232,7 +25232,7 @@
                 <m:rPr>
                   <m:sty m:val="p"/>
                 </m:rPr>
-                <m:t>MSE</m:t>
+                <m:t>pMSE</m:t>
               </m:r>
               <m:r>
                 <m:t>​</m:t>
@@ -25472,7 +25472,7 @@
                 <m:rPr>
                   <m:sty m:val="p"/>
                 </m:rPr>
-                <m:t>MSE</m:t>
+                <m:t>pMSE</m:t>
               </m:r>
               <m:r>
                 <m:t>​</m:t>
@@ -25750,7 +25750,7 @@
                 <m:rPr>
                   <m:sty m:val="p"/>
                 </m:rPr>
-                <m:t>MSE</m:t>
+                <m:t>pMSE</m:t>
               </m:r>
               <m:r>
                 <m:t>​</m:t>
@@ -26038,7 +26038,7 @@
             <m:rPr>
               <m:sty m:val="p"/>
             </m:rPr>
-            <m:t>MSE</m:t>
+            <m:t>pMSE</m:t>
           </m:r>
           <m:r>
             <m:t>​</m:t>
@@ -26314,7 +26314,7 @@
           <m:rPr>
             <m:sty m:val="p"/>
           </m:rPr>
-          <m:t>MSE</m:t>
+          <m:t>pMSE</m:t>
         </m:r>
         <m:r>
           <m:t>​</m:t>
@@ -26412,7 +26412,7 @@
                     <m:rPr>
                       <m:sty m:val="p"/>
                     </m:rPr>
-                    <m:t>MSE</m:t>
+                    <m:t>pMSE</m:t>
                   </m:r>
                   <m:r>
                     <m:t>​</m:t>
@@ -26663,7 +26663,7 @@
                 <m:rPr>
                   <m:sty m:val="p"/>
                 </m:rPr>
-                <m:t>MSE</m:t>
+                <m:t>pMSE</m:t>
               </m:r>
               <m:r>
                 <m:t>​</m:t>

</xml_diff>

<commit_message>
Deploying to gh-pages from @ Morrison-Lab/sds@16427b82b3a3510b13a3268b90e55331ddd4a297 🚀
</commit_message>
<xml_diff>
--- a/estimation-handout.docx
+++ b/estimation-handout.docx
@@ -15,7 +15,7 @@
         <w:pStyle w:val="Date"/>
       </w:pPr>
       <w:r>
-        <w:t xml:space="preserve">Last modified: 2026-10-17 10:19:16 (PDT)</w:t>
+        <w:t xml:space="preserve">Last modified: 2026-10-17 10:42:15 (PDT)</w:t>
       </w:r>
     </w:p>
     <w:bookmarkStart w:id="14" w:name="scientific-models"/>
@@ -6763,6 +6763,22 @@
         <w:t xml:space="preserve">mean squared error</w:t>
       </w:r>
       <w:r>
+        <w:t xml:space="preserve"> </w:t>
+      </w:r>
+      <w:r>
+        <w:t xml:space="preserve">or its</w:t>
+      </w:r>
+      <w:r>
+        <w:t xml:space="preserve"> </w:t>
+      </w:r>
+      <w:r>
+        <w:rPr>
+          <w:b/>
+          <w:bCs/>
+        </w:rPr>
+        <w:t xml:space="preserve">expected squared estimation error (ESEE)</w:t>
+      </w:r>
+      <w:r>
         <w:t xml:space="preserve">, denoted</w:t>
       </w:r>
       <w:r>
@@ -6774,6 +6790,49 @@
             <m:sty m:val="p"/>
           </m:rPr>
           <m:t>pMSE</m:t>
+        </m:r>
+        <m:r>
+          <m:t>​</m:t>
+        </m:r>
+        <m:d>
+          <m:dPr>
+            <m:begChr m:val="("/>
+            <m:sepChr m:val=""/>
+            <m:endChr m:val=")"/>
+            <m:grow/>
+          </m:dPr>
+          <m:e>
+            <m:acc>
+              <m:accPr>
+                <m:chr m:val="̂"/>
+              </m:accPr>
+              <m:e>
+                <m:r>
+                  <m:t>θ</m:t>
+                </m:r>
+              </m:e>
+            </m:acc>
+          </m:e>
+        </m:d>
+        <m:r>
+          <m:t>​</m:t>
+        </m:r>
+      </m:oMath>
+      <w:r>
+        <w:t xml:space="preserve"> </w:t>
+      </w:r>
+      <w:r>
+        <w:t xml:space="preserve">or</w:t>
+      </w:r>
+      <w:r>
+        <w:t xml:space="preserve"> </w:t>
+      </w:r>
+      <m:oMath>
+        <m:r>
+          <m:rPr>
+            <m:sty m:val="p"/>
+          </m:rPr>
+          <m:t>ESEE</m:t>
         </m:r>
         <m:r>
           <m:t>​</m:t>

</xml_diff>

<commit_message>
Deploying to gh-pages from @ Morrison-Lab/sds@963e25e42a768c107acd4d07db71c037f9418544 🚀
</commit_message>
<xml_diff>
--- a/estimation-handout.docx
+++ b/estimation-handout.docx
@@ -15,7 +15,7 @@
         <w:pStyle w:val="Date"/>
       </w:pPr>
       <w:r>
-        <w:t xml:space="preserve">Last modified: 2026-10-17 19:06:28 (PDT)</w:t>
+        <w:t xml:space="preserve">Last modified: 2026-10-17 21:08:29 (PDT)</w:t>
       </w:r>
     </w:p>
     <w:bookmarkStart w:id="14" w:name="scientific-models"/>
@@ -424,7 +424,7 @@
     </w:p>
     <w:bookmarkEnd w:id="13"/>
     <w:bookmarkEnd w:id="14"/>
-    <w:bookmarkStart w:id="36" w:name="estimands-estimates-and-estimators"/>
+    <w:bookmarkStart w:id="37" w:name="estimands-estimates-and-estimators"/>
     <w:p>
       <w:pPr>
         <w:pStyle w:val="Heading2"/>
@@ -433,7 +433,7 @@
         <w:t xml:space="preserve">2 Estimands, estimates, and estimators</w:t>
       </w:r>
     </w:p>
-    <w:bookmarkStart w:id="20" w:name="estimands"/>
+    <w:bookmarkStart w:id="21" w:name="estimands"/>
     <w:p>
       <w:pPr>
         <w:pStyle w:val="Heading3"/>
@@ -708,53 +708,38 @@
               <w:t xml:space="preserve"> </w:t>
             </w:r>
             <w:r>
-              <w:t xml:space="preserve">lower-case Greek letters:</w:t>
+              <w:t xml:space="preserve">lower-case Greek letters.</w:t>
             </w:r>
             <w:r>
               <w:t xml:space="preserve"> </w:t>
             </w:r>
-            <m:oMath>
-              <m:r>
-                <m:t>α</m:t>
-              </m:r>
-              <m:r>
-                <m:rPr>
-                  <m:sty m:val="p"/>
-                </m:rPr>
-                <m:t>,</m:t>
-              </m:r>
-              <m:r>
-                <m:t>β</m:t>
-              </m:r>
-              <m:r>
-                <m:rPr>
-                  <m:sty m:val="p"/>
-                </m:rPr>
-                <m:t>,</m:t>
-              </m:r>
-              <m:r>
-                <m:t>γ</m:t>
-              </m:r>
-              <m:r>
-                <m:rPr>
-                  <m:sty m:val="p"/>
-                </m:rPr>
-                <m:t>,</m:t>
-              </m:r>
-              <m:r>
-                <m:t>δ</m:t>
-              </m:r>
-            </m:oMath>
             <w:r>
-              <w:t xml:space="preserve">, etc.</w:t>
+              <w:t xml:space="preserve">The</w:t>
+            </w:r>
+            <w:r>
+              <w:t xml:space="preserve"> </w:t>
+            </w:r>
+            <w:hyperlink r:id="rId20">
+              <w:r>
+                <w:rPr>
+                  <w:rStyle w:val="Hyperlink"/>
+                </w:rPr>
+                <w:t xml:space="preserve">notation choices page</w:t>
+              </w:r>
+            </w:hyperlink>
+            <w:r>
+              <w:t xml:space="preserve"> </w:t>
+            </w:r>
+            <w:r>
+              <w:t xml:space="preserve">gives our convention and the alternatives.</w:t>
             </w:r>
           </w:p>
           <w:p/>
         </w:tc>
       </w:tr>
     </w:tbl>
-    <w:bookmarkEnd w:id="20"/>
-    <w:bookmarkStart w:id="24" w:name="estimates"/>
+    <w:bookmarkEnd w:id="21"/>
+    <w:bookmarkStart w:id="25" w:name="estimates"/>
     <w:p>
       <w:pPr>
         <w:pStyle w:val="Heading3"/>
@@ -771,7 +756,7 @@
         <w:t xml:space="preserve"> </w:t>
       </w:r>
     </w:p>
-    <w:bookmarkStart w:id="21" w:name="def-estimate"/>
+    <w:bookmarkStart w:id="22" w:name="def-estimate"/>
     <w:p>
       <w:pPr>
         <w:pStyle w:val="BodyText"/>
@@ -1013,8 +998,8 @@
         </m:oMath>
       </m:oMathPara>
     </w:p>
-    <w:bookmarkEnd w:id="21"/>
-    <w:bookmarkStart w:id="23" w:name="exm-estimate"/>
+    <w:bookmarkEnd w:id="22"/>
+    <w:bookmarkStart w:id="24" w:name="exm-estimate"/>
     <w:p>
       <w:pPr>
         <w:pStyle w:val="FirstParagraph"/>
@@ -1041,7 +1026,7 @@
       <w:r>
         <w:t xml:space="preserve"> </w:t>
       </w:r>
-      <w:hyperlink r:id="rId22">
+      <w:hyperlink r:id="rId23">
         <w:r>
           <w:rPr>
             <w:rStyle w:val="Hyperlink"/>
@@ -1087,9 +1072,9 @@
         <w:t xml:space="preserve">the population mean.</w:t>
       </w:r>
     </w:p>
-    <w:bookmarkEnd w:id="23"/>
     <w:bookmarkEnd w:id="24"/>
-    <w:bookmarkStart w:id="34" w:name="estimators"/>
+    <w:bookmarkEnd w:id="25"/>
+    <w:bookmarkStart w:id="35" w:name="estimators"/>
     <w:p>
       <w:pPr>
         <w:pStyle w:val="Heading3"/>
@@ -1103,7 +1088,7 @@
         <w:pStyle w:val="FirstParagraph"/>
       </w:pPr>
     </w:p>
-    <w:bookmarkStart w:id="25" w:name="def-estimator"/>
+    <w:bookmarkStart w:id="26" w:name="def-estimator"/>
     <w:p>
       <w:pPr>
         <w:pStyle w:val="BodyText"/>
@@ -1352,7 +1337,7 @@
         <w:t xml:space="preserve">.</w:t>
       </w:r>
     </w:p>
-    <w:bookmarkEnd w:id="25"/>
+    <w:bookmarkEnd w:id="26"/>
     <w:tbl>
       <w:tblPr>
         <w:tblStyle w:val="Table"/>
@@ -1394,12 +1379,12 @@
                 <wp:inline>
                   <wp:extent cx="152400" cy="152400"/>
                   <wp:effectExtent b="0" l="0" r="0" t="0"/>
-                  <wp:docPr descr="" title="" id="26" name="Picture"/>
+                  <wp:docPr descr="" title="" id="27" name="Picture"/>
                   <a:graphic>
                     <a:graphicData uri="http://schemas.openxmlformats.org/drawingml/2006/picture">
                       <pic:pic>
                         <pic:nvPicPr>
-                          <pic:cNvPr descr="/opt/quarto/share/formats/docx/note.png" id="27" name="Picture"/>
+                          <pic:cNvPr descr="/opt/quarto/share/formats/docx/note.png" id="28" name="Picture"/>
                           <pic:cNvPicPr>
                             <a:picLocks noChangeArrowheads="1" noChangeAspect="1"/>
                           </pic:cNvPicPr>
@@ -1652,12 +1637,12 @@
                 <wp:inline>
                   <wp:extent cx="152400" cy="152400"/>
                   <wp:effectExtent b="0" l="0" r="0" t="0"/>
-                  <wp:docPr descr="" title="" id="28" name="Picture"/>
+                  <wp:docPr descr="" title="" id="29" name="Picture"/>
                   <a:graphic>
                     <a:graphicData uri="http://schemas.openxmlformats.org/drawingml/2006/picture">
                       <pic:pic>
                         <pic:nvPicPr>
-                          <pic:cNvPr descr="/opt/quarto/share/formats/docx/note.png" id="29" name="Picture"/>
+                          <pic:cNvPr descr="/opt/quarto/share/formats/docx/note.png" id="30" name="Picture"/>
                           <pic:cNvPicPr>
                             <a:picLocks noChangeArrowheads="1" noChangeAspect="1"/>
                           </pic:cNvPicPr>
@@ -1720,19 +1705,13 @@
               <w:spacing w:before="16"/>
             </w:pPr>
             <w:r>
-              <w:t xml:space="preserve">Estimators are often symbolized by placing a ^ (</w:t>
-            </w:r>
-            <w:r>
-              <w:t xml:space="preserve">“hat”</w:t>
-            </w:r>
-            <w:r>
-              <w:t xml:space="preserve">) symbol on top of</w:t>
+              <w:t xml:space="preserve">Estimators are often symbolized by placing a hat over the symbol of the</w:t>
             </w:r>
             <w:r>
               <w:t xml:space="preserve"> </w:t>
             </w:r>
             <w:r>
-              <w:t xml:space="preserve">the corresponding estimand; for example,</w:t>
+              <w:t xml:space="preserve">corresponding estimand; for example,</w:t>
             </w:r>
             <w:r>
               <w:t xml:space="preserve"> </w:t>
@@ -1751,6 +1730,29 @@
             </m:oMath>
             <w:r>
               <w:t xml:space="preserve">.</w:t>
+            </w:r>
+            <w:r>
+              <w:t xml:space="preserve"> </w:t>
+            </w:r>
+            <w:r>
+              <w:t xml:space="preserve">The</w:t>
+            </w:r>
+            <w:r>
+              <w:t xml:space="preserve"> </w:t>
+            </w:r>
+            <w:hyperlink r:id="rId20">
+              <w:r>
+                <w:rPr>
+                  <w:rStyle w:val="Hyperlink"/>
+                </w:rPr>
+                <w:t xml:space="preserve">notation choices page</w:t>
+              </w:r>
+            </w:hyperlink>
+            <w:r>
+              <w:t xml:space="preserve"> </w:t>
+            </w:r>
+            <w:r>
+              <w:t xml:space="preserve">gives our convention and the alternatives.</w:t>
             </w:r>
           </w:p>
           <w:p>
@@ -1878,7 +1880,7 @@
         </w:tc>
       </w:tr>
     </w:tbl>
-    <w:bookmarkStart w:id="31" w:name="exm-estimator"/>
+    <w:bookmarkStart w:id="32" w:name="exm-estimator"/>
     <w:p>
       <w:pPr>
         <w:pStyle w:val="FirstParagraph"/>
@@ -2422,7 +2424,7 @@
       <w:r>
         <w:t xml:space="preserve"> </w:t>
       </w:r>
-      <w:hyperlink r:id="rId30">
+      <w:hyperlink r:id="rId31">
         <w:r>
           <w:rPr>
             <w:rStyle w:val="Hyperlink"/>
@@ -2873,8 +2875,8 @@
         <w:t xml:space="preserve">).</w:t>
       </w:r>
     </w:p>
-    <w:bookmarkEnd w:id="31"/>
-    <w:bookmarkStart w:id="32" w:name="def-sampling-distribution"/>
+    <w:bookmarkEnd w:id="32"/>
+    <w:bookmarkStart w:id="33" w:name="def-sampling-distribution"/>
     <w:p>
       <w:pPr>
         <w:pStyle w:val="BodyText"/>
@@ -3098,8 +3100,8 @@
         <w:t xml:space="preserve">.</w:t>
       </w:r>
     </w:p>
-    <w:bookmarkEnd w:id="32"/>
-    <w:bookmarkStart w:id="33" w:name="exm-sampling-distribution"/>
+    <w:bookmarkEnd w:id="33"/>
+    <w:bookmarkStart w:id="34" w:name="exm-sampling-distribution"/>
     <w:p>
       <w:pPr>
         <w:pStyle w:val="BodyText"/>
@@ -3631,9 +3633,9 @@
         <w:t xml:space="preserve">.</w:t>
       </w:r>
     </w:p>
-    <w:bookmarkEnd w:id="33"/>
     <w:bookmarkEnd w:id="34"/>
-    <w:bookmarkStart w:id="35" w:name="Xa5dc809b86f87b03eae203f77f161040593b6ef"/>
+    <w:bookmarkEnd w:id="35"/>
+    <w:bookmarkStart w:id="36" w:name="Xa5dc809b86f87b03eae203f77f161040593b6ef"/>
     <w:p>
       <w:pPr>
         <w:pStyle w:val="Heading3"/>
@@ -3863,9 +3865,9 @@
         <w:t xml:space="preserve">covers parameter estimation and the method of moments.</w:t>
       </w:r>
     </w:p>
-    <w:bookmarkEnd w:id="35"/>
     <w:bookmarkEnd w:id="36"/>
-    <w:bookmarkStart w:id="105" w:name="sec-est-accuracy"/>
+    <w:bookmarkEnd w:id="37"/>
+    <w:bookmarkStart w:id="106" w:name="sec-est-accuracy"/>
     <w:p>
       <w:pPr>
         <w:pStyle w:val="Heading2"/>
@@ -3874,7 +3876,7 @@
         <w:t xml:space="preserve">3 Accuracy of estimators</w:t>
       </w:r>
     </w:p>
-    <w:bookmarkStart w:id="37" w:name="accuracy"/>
+    <w:bookmarkStart w:id="38" w:name="accuracy"/>
     <w:p>
       <w:pPr>
         <w:pStyle w:val="Heading3"/>
@@ -3916,8 +3918,8 @@
         <w:t xml:space="preserve">and ease of computation is usually secondary.</w:t>
       </w:r>
     </w:p>
-    <w:bookmarkEnd w:id="37"/>
-    <w:bookmarkStart w:id="40" w:name="estimation-error"/>
+    <w:bookmarkEnd w:id="38"/>
+    <w:bookmarkStart w:id="41" w:name="estimation-error"/>
     <w:p>
       <w:pPr>
         <w:pStyle w:val="Heading3"/>
@@ -3926,7 +3928,7 @@
         <w:t xml:space="preserve">3.2 Estimation error</w:t>
       </w:r>
     </w:p>
-    <w:bookmarkStart w:id="38" w:name="def-estimation-error"/>
+    <w:bookmarkStart w:id="39" w:name="def-estimation-error"/>
     <w:p>
       <w:pPr>
         <w:pStyle w:val="FirstParagraph"/>
@@ -4092,8 +4094,8 @@
         </m:oMath>
       </m:oMathPara>
     </w:p>
-    <w:bookmarkEnd w:id="38"/>
-    <w:bookmarkStart w:id="39" w:name="exm-estimation-error"/>
+    <w:bookmarkEnd w:id="39"/>
+    <w:bookmarkStart w:id="40" w:name="exm-estimation-error"/>
     <w:p>
       <w:pPr>
         <w:pStyle w:val="FirstParagraph"/>
@@ -4379,7 +4381,7 @@
         <w:t xml:space="preserve">if we did, we would not need to estimate it.</w:t>
       </w:r>
     </w:p>
-    <w:bookmarkEnd w:id="39"/>
+    <w:bookmarkEnd w:id="40"/>
     <w:p>
       <w:pPr>
         <w:pStyle w:val="BodyText"/>
@@ -4426,8 +4428,8 @@
         <w:t xml:space="preserve">.</w:t>
       </w:r>
     </w:p>
-    <w:bookmarkEnd w:id="40"/>
-    <w:bookmarkStart w:id="42" w:name="residuals"/>
+    <w:bookmarkEnd w:id="41"/>
+    <w:bookmarkStart w:id="43" w:name="residuals"/>
     <w:p>
       <w:pPr>
         <w:pStyle w:val="Heading3"/>
@@ -4452,7 +4454,7 @@
       <w:r>
         <w:t xml:space="preserve"> </w:t>
       </w:r>
-      <w:hyperlink r:id="rId41">
+      <w:hyperlink r:id="rId42">
         <w:r>
           <w:rPr>
             <w:rStyle w:val="Hyperlink"/>
@@ -4501,8 +4503,8 @@
         <w:t xml:space="preserve">.</w:t>
       </w:r>
     </w:p>
-    <w:bookmarkEnd w:id="42"/>
-    <w:bookmarkStart w:id="49" w:name="bias"/>
+    <w:bookmarkEnd w:id="43"/>
+    <w:bookmarkStart w:id="50" w:name="bias"/>
     <w:p>
       <w:pPr>
         <w:pStyle w:val="Heading3"/>
@@ -4511,7 +4513,7 @@
         <w:t xml:space="preserve">3.4 Bias</w:t>
       </w:r>
     </w:p>
-    <w:bookmarkStart w:id="44" w:name="def-bias"/>
+    <w:bookmarkStart w:id="45" w:name="def-bias"/>
     <w:p>
       <w:pPr>
         <w:pStyle w:val="FirstParagraph"/>
@@ -4605,7 +4607,7 @@
       <w:pPr>
         <w:pStyle w:val="BodyText"/>
       </w:pPr>
-      <w:bookmarkStart w:id="43" w:name="eq-bias-def"/>
+      <w:bookmarkStart w:id="44" w:name="eq-bias-def"/>
       <m:oMathPara>
         <m:oMathParaPr>
           <m:jc m:val="center"/>
@@ -4733,7 +4735,7 @@
           </m:r>
         </m:oMath>
       </m:oMathPara>
-      <w:bookmarkEnd w:id="43"/>
+      <w:bookmarkEnd w:id="44"/>
     </w:p>
     <w:p>
       <w:pPr>
@@ -4752,8 +4754,8 @@
         <w:t xml:space="preserve">.</w:t>
       </w:r>
     </w:p>
-    <w:bookmarkEnd w:id="44"/>
-    <w:bookmarkStart w:id="45" w:name="exr-bias-exprs"/>
+    <w:bookmarkEnd w:id="45"/>
+    <w:bookmarkStart w:id="46" w:name="exr-bias-exprs"/>
     <w:p>
       <w:pPr>
         <w:pStyle w:val="BodyText"/>
@@ -4901,8 +4903,8 @@
         <w:t xml:space="preserve">.</w:t>
       </w:r>
     </w:p>
-    <w:bookmarkEnd w:id="45"/>
-    <w:bookmarkStart w:id="46" w:name="sol-bias-exprs"/>
+    <w:bookmarkEnd w:id="46"/>
+    <w:bookmarkStart w:id="47" w:name="sol-bias-exprs"/>
     <w:p>
       <w:pPr>
         <w:pStyle w:val="BodyText"/>
@@ -5279,8 +5281,8 @@
         </m:oMath>
       </m:oMathPara>
     </w:p>
-    <w:bookmarkEnd w:id="46"/>
-    <w:bookmarkStart w:id="47" w:name="thm-bias-exprs"/>
+    <w:bookmarkEnd w:id="47"/>
+    <w:bookmarkStart w:id="48" w:name="thm-bias-exprs"/>
     <w:p>
       <w:pPr>
         <w:pStyle w:val="FirstParagraph"/>
@@ -5384,7 +5386,7 @@
         </m:oMath>
       </m:oMathPara>
     </w:p>
-    <w:bookmarkEnd w:id="47"/>
+    <w:bookmarkEnd w:id="48"/>
     <w:p>
       <w:pPr>
         <w:pStyle w:val="FirstParagraph"/>
@@ -5417,7 +5419,7 @@
         <w:t xml:space="preserve">.</w:t>
       </w:r>
     </w:p>
-    <w:bookmarkStart w:id="48" w:name="exm-bias-sample-mean"/>
+    <w:bookmarkStart w:id="49" w:name="exm-bias-sample-mean"/>
     <w:p>
       <w:pPr>
         <w:pStyle w:val="BodyText"/>
@@ -6751,9 +6753,9 @@
         <w:t xml:space="preserve">uses only one.</w:t>
       </w:r>
     </w:p>
-    <w:bookmarkEnd w:id="48"/>
     <w:bookmarkEnd w:id="49"/>
-    <w:bookmarkStart w:id="73" w:name="mean-squared-error"/>
+    <w:bookmarkEnd w:id="50"/>
+    <w:bookmarkStart w:id="74" w:name="mean-squared-error"/>
     <w:p>
       <w:pPr>
         <w:pStyle w:val="Heading3"/>
@@ -6762,7 +6764,7 @@
         <w:t xml:space="preserve">3.5 Population mean squared error of an estimator</w:t>
       </w:r>
     </w:p>
-    <w:bookmarkStart w:id="50" w:name="def-mse"/>
+    <w:bookmarkStart w:id="51" w:name="def-mse"/>
     <w:p>
       <w:pPr>
         <w:pStyle w:val="FirstParagraph"/>
@@ -7109,8 +7111,8 @@
         <w:t xml:space="preserve">.</w:t>
       </w:r>
     </w:p>
-    <w:bookmarkEnd w:id="50"/>
-    <w:bookmarkStart w:id="51" w:name="exr-sq-bias-expand"/>
+    <w:bookmarkEnd w:id="51"/>
+    <w:bookmarkStart w:id="52" w:name="exr-sq-bias-expand"/>
     <w:p>
       <w:pPr>
         <w:pStyle w:val="BodyText"/>
@@ -7282,8 +7284,8 @@
         <w:t xml:space="preserve">.</w:t>
       </w:r>
     </w:p>
-    <w:bookmarkEnd w:id="51"/>
-    <w:bookmarkStart w:id="52" w:name="sol-sq-bias-expand"/>
+    <w:bookmarkEnd w:id="52"/>
+    <w:bookmarkStart w:id="53" w:name="sol-sq-bias-expand"/>
     <w:p>
       <w:pPr>
         <w:pStyle w:val="BodyText"/>
@@ -7603,8 +7605,8 @@
         </m:oMath>
       </m:oMathPara>
     </w:p>
-    <w:bookmarkEnd w:id="52"/>
-    <w:bookmarkStart w:id="53" w:name="thm-sq-bias-expand"/>
+    <w:bookmarkEnd w:id="53"/>
+    <w:bookmarkStart w:id="54" w:name="thm-sq-bias-expand"/>
     <w:p>
       <w:pPr>
         <w:pStyle w:val="FirstParagraph"/>
@@ -7872,7 +7874,7 @@
         </m:oMath>
       </m:oMathPara>
     </w:p>
-    <w:bookmarkEnd w:id="53"/>
+    <w:bookmarkEnd w:id="54"/>
     <w:p>
       <w:pPr>
         <w:pStyle w:val="FirstParagraph"/>
@@ -7919,7 +7921,7 @@
         <w:t xml:space="preserve">.</w:t>
       </w:r>
     </w:p>
-    <w:bookmarkStart w:id="54" w:name="exr-bias-sq-plus-var"/>
+    <w:bookmarkStart w:id="55" w:name="exr-bias-sq-plus-var"/>
     <w:p>
       <w:pPr>
         <w:pStyle w:val="BodyText"/>
@@ -8164,8 +8166,8 @@
         <w:t xml:space="preserve">.</w:t>
       </w:r>
     </w:p>
-    <w:bookmarkEnd w:id="54"/>
-    <w:bookmarkStart w:id="58" w:name="sol-bias-sq-plus-var"/>
+    <w:bookmarkEnd w:id="55"/>
+    <w:bookmarkStart w:id="59" w:name="sol-bias-sq-plus-var"/>
     <w:p>
       <w:pPr>
         <w:pStyle w:val="BodyText"/>
@@ -8189,7 +8191,7 @@
       <w:r>
         <w:t xml:space="preserve">(</w:t>
       </w:r>
-      <w:hyperlink r:id="rId55">
+      <w:hyperlink r:id="rId56">
         <w:r>
           <w:rPr>
             <w:rStyle w:val="Hyperlink"/>
@@ -8205,7 +8207,7 @@
       <w:pPr>
         <w:pStyle w:val="BodyText"/>
       </w:pPr>
-      <w:bookmarkStart w:id="56" w:name="eq-bias-sq-plus-var-exr"/>
+      <w:bookmarkStart w:id="57" w:name="eq-bias-sq-plus-var-exr"/>
       <m:oMathPara>
         <m:oMathParaPr>
           <m:jc m:val="center"/>
@@ -8373,7 +8375,7 @@
           </m:r>
         </m:oMath>
       </m:oMathPara>
-      <w:bookmarkEnd w:id="56"/>
+      <w:bookmarkEnd w:id="57"/>
     </w:p>
     <w:p>
       <w:pPr>
@@ -8404,7 +8406,7 @@
       <w:pPr>
         <w:pStyle w:val="BodyText"/>
       </w:pPr>
-      <w:bookmarkStart w:id="57" w:name="eq-bias-sq-plus-var-exr-2"/>
+      <w:bookmarkStart w:id="58" w:name="eq-bias-sq-plus-var-exr-2"/>
       <m:oMathPara>
         <m:oMathParaPr>
           <m:jc m:val="center"/>
@@ -9802,10 +9804,10 @@
           </m:r>
         </m:oMath>
       </m:oMathPara>
-      <w:bookmarkEnd w:id="57"/>
+      <w:bookmarkEnd w:id="58"/>
     </w:p>
-    <w:bookmarkEnd w:id="58"/>
-    <w:bookmarkStart w:id="59" w:name="thm-bias-sq-plus-var"/>
+    <w:bookmarkEnd w:id="59"/>
+    <w:bookmarkStart w:id="60" w:name="thm-bias-sq-plus-var"/>
     <w:p>
       <w:pPr>
         <w:pStyle w:val="FirstParagraph"/>
@@ -10078,7 +10080,7 @@
         </m:oMath>
       </m:oMathPara>
     </w:p>
-    <w:bookmarkEnd w:id="59"/>
+    <w:bookmarkEnd w:id="60"/>
     <w:p>
       <w:pPr>
         <w:pStyle w:val="FirstParagraph"/>
@@ -10145,7 +10147,7 @@
         <w:t xml:space="preserve">.</w:t>
       </w:r>
     </w:p>
-    <w:bookmarkStart w:id="60" w:name="exr-mse-expand"/>
+    <w:bookmarkStart w:id="61" w:name="exr-mse-expand"/>
     <w:p>
       <w:pPr>
         <w:pStyle w:val="BodyText"/>
@@ -10318,8 +10320,8 @@
         <w:t xml:space="preserve">.</w:t>
       </w:r>
     </w:p>
-    <w:bookmarkEnd w:id="60"/>
-    <w:bookmarkStart w:id="61" w:name="sol-mse-expand"/>
+    <w:bookmarkEnd w:id="61"/>
+    <w:bookmarkStart w:id="62" w:name="sol-mse-expand"/>
     <w:p>
       <w:pPr>
         <w:pStyle w:val="BodyText"/>
@@ -11123,8 +11125,8 @@
         </m:oMath>
       </m:oMathPara>
     </w:p>
-    <w:bookmarkEnd w:id="61"/>
-    <w:bookmarkStart w:id="62" w:name="thm-mse-expand"/>
+    <w:bookmarkEnd w:id="62"/>
+    <w:bookmarkStart w:id="63" w:name="thm-mse-expand"/>
     <w:p>
       <w:pPr>
         <w:pStyle w:val="FirstParagraph"/>
@@ -11351,7 +11353,7 @@
         </m:oMath>
       </m:oMathPara>
     </w:p>
-    <w:bookmarkEnd w:id="62"/>
+    <w:bookmarkEnd w:id="63"/>
     <w:p>
       <w:pPr>
         <w:pStyle w:val="FirstParagraph"/>
@@ -11398,7 +11400,7 @@
         <w:t xml:space="preserve">.</w:t>
       </w:r>
     </w:p>
-    <w:bookmarkStart w:id="64" w:name="thm-mse-bias-variance"/>
+    <w:bookmarkStart w:id="65" w:name="thm-mse-bias-variance"/>
     <w:p>
       <w:pPr>
         <w:pStyle w:val="BodyText"/>
@@ -11439,7 +11441,7 @@
       <w:pPr>
         <w:pStyle w:val="BodyText"/>
       </w:pPr>
-      <w:bookmarkStart w:id="63" w:name="eq-mse"/>
+      <w:bookmarkStart w:id="64" w:name="eq-mse"/>
       <m:oMathPara>
         <m:oMathParaPr>
           <m:jc m:val="center"/>
@@ -11598,9 +11600,9 @@
           </m:r>
         </m:oMath>
       </m:oMathPara>
-      <w:bookmarkEnd w:id="63"/>
+      <w:bookmarkEnd w:id="64"/>
     </w:p>
-    <w:bookmarkEnd w:id="64"/>
+    <w:bookmarkEnd w:id="65"/>
     <w:p>
       <w:pPr>
         <w:pStyle w:val="FirstParagraph"/>
@@ -11916,7 +11918,7 @@
         <w:t xml:space="preserve">so they are equal to each other.</w:t>
       </w:r>
     </w:p>
-    <w:bookmarkStart w:id="67" w:name="rem-mse-bias-variance-prediction"/>
+    <w:bookmarkStart w:id="68" w:name="rem-mse-bias-variance-prediction"/>
     <w:p>
       <w:pPr>
         <w:pStyle w:val="BodyText"/>
@@ -12036,7 +12038,7 @@
       <w:r>
         <w:t xml:space="preserve"> </w:t>
       </w:r>
-      <w:hyperlink r:id="rId65">
+      <w:hyperlink r:id="rId66">
         <w:r>
           <w:rPr>
             <w:rStyle w:val="Hyperlink"/>
@@ -12059,7 +12061,7 @@
       <w:r>
         <w:t xml:space="preserve"> </w:t>
       </w:r>
-      <w:hyperlink r:id="rId66">
+      <w:hyperlink r:id="rId67">
         <w:r>
           <w:rPr>
             <w:rStyle w:val="Hyperlink"/>
@@ -12080,8 +12082,8 @@
         <w:t xml:space="preserve">No choice of prediction can remove the extra term.</w:t>
       </w:r>
     </w:p>
-    <w:bookmarkEnd w:id="67"/>
-    <w:bookmarkStart w:id="69" w:name="exm-mse-sample-mean"/>
+    <w:bookmarkEnd w:id="68"/>
+    <w:bookmarkStart w:id="70" w:name="exm-mse-sample-mean"/>
     <w:p>
       <w:pPr>
         <w:pStyle w:val="FirstParagraph"/>
@@ -13493,7 +13495,7 @@
       <w:r>
         <w:t xml:space="preserve"> </w:t>
       </w:r>
-      <w:hyperlink r:id="rId68">
+      <w:hyperlink r:id="rId69">
         <w:r>
           <w:rPr>
             <w:rStyle w:val="Hyperlink"/>
@@ -13791,8 +13793,8 @@
         <w:t xml:space="preserve">’s.</w:t>
       </w:r>
     </w:p>
-    <w:bookmarkEnd w:id="69"/>
-    <w:bookmarkStart w:id="70" w:name="def-rmse"/>
+    <w:bookmarkEnd w:id="70"/>
+    <w:bookmarkStart w:id="71" w:name="def-rmse"/>
     <w:p>
       <w:pPr>
         <w:pStyle w:val="BodyText"/>
@@ -14004,8 +14006,8 @@
         <w:t xml:space="preserve">.</w:t>
       </w:r>
     </w:p>
-    <w:bookmarkEnd w:id="70"/>
-    <w:bookmarkStart w:id="71" w:name="exm-rmse-sample-mean"/>
+    <w:bookmarkEnd w:id="71"/>
+    <w:bookmarkStart w:id="72" w:name="exm-rmse-sample-mean"/>
     <w:p>
       <w:pPr>
         <w:pStyle w:val="BodyText"/>
@@ -14093,8 +14095,8 @@
         <w:t xml:space="preserve">.</w:t>
       </w:r>
     </w:p>
-    <w:bookmarkEnd w:id="71"/>
-    <w:bookmarkStart w:id="72" w:name="rem-rmse-units"/>
+    <w:bookmarkEnd w:id="72"/>
+    <w:bookmarkStart w:id="73" w:name="rem-rmse-units"/>
     <w:p>
       <w:pPr>
         <w:pStyle w:val="BodyText"/>
@@ -14113,7 +14115,7 @@
         <w:t xml:space="preserve">The pRMSE has the same units as the estimand.</w:t>
       </w:r>
     </w:p>
-    <w:bookmarkEnd w:id="72"/>
+    <w:bookmarkEnd w:id="73"/>
     <w:p>
       <w:pPr>
         <w:pStyle w:val="BodyText"/>
@@ -14128,8 +14130,8 @@
         <w:t xml:space="preserve">covers mean squared error.</w:t>
       </w:r>
     </w:p>
-    <w:bookmarkEnd w:id="73"/>
-    <w:bookmarkStart w:id="87" w:name="sec-unbiased-estimators"/>
+    <w:bookmarkEnd w:id="74"/>
+    <w:bookmarkStart w:id="88" w:name="sec-unbiased-estimators"/>
     <w:p>
       <w:pPr>
         <w:pStyle w:val="Heading3"/>
@@ -14138,7 +14140,7 @@
         <w:t xml:space="preserve">3.6 Unbiased estimators</w:t>
       </w:r>
     </w:p>
-    <w:bookmarkStart w:id="74" w:name="def-unbiased"/>
+    <w:bookmarkStart w:id="75" w:name="def-unbiased"/>
     <w:p>
       <w:pPr>
         <w:pStyle w:val="FirstParagraph"/>
@@ -14264,8 +14266,8 @@
         </m:oMath>
       </m:oMathPara>
     </w:p>
-    <w:bookmarkEnd w:id="74"/>
-    <w:bookmarkStart w:id="75" w:name="def-biased"/>
+    <w:bookmarkEnd w:id="75"/>
+    <w:bookmarkStart w:id="76" w:name="def-biased"/>
     <w:p>
       <w:pPr>
         <w:pStyle w:val="FirstParagraph"/>
@@ -14391,8 +14393,8 @@
         </m:oMath>
       </m:oMathPara>
     </w:p>
-    <w:bookmarkEnd w:id="75"/>
-    <w:bookmarkStart w:id="76" w:name="exm-unbiased-sample-mean"/>
+    <w:bookmarkEnd w:id="76"/>
+    <w:bookmarkStart w:id="77" w:name="exm-unbiased-sample-mean"/>
     <w:p>
       <w:pPr>
         <w:pStyle w:val="FirstParagraph"/>
@@ -14606,8 +14608,8 @@
         <w:t xml:space="preserve">.</w:t>
       </w:r>
     </w:p>
-    <w:bookmarkEnd w:id="76"/>
-    <w:bookmarkStart w:id="78" w:name="exm-biased-variance-mle"/>
+    <w:bookmarkEnd w:id="77"/>
+    <w:bookmarkStart w:id="79" w:name="exm-biased-variance-mle"/>
     <w:p>
       <w:pPr>
         <w:pStyle w:val="BodyText"/>
@@ -14785,7 +14787,7 @@
       <w:r>
         <w:t xml:space="preserve"> </w:t>
       </w:r>
-      <w:hyperlink r:id="rId77">
+      <w:hyperlink r:id="rId78">
         <w:r>
           <w:rPr>
             <w:rStyle w:val="Hyperlink"/>
@@ -19957,8 +19959,8 @@
         <w:t xml:space="preserve">grows.</w:t>
       </w:r>
     </w:p>
-    <w:bookmarkEnd w:id="78"/>
-    <w:bookmarkStart w:id="79" w:name="exr-unbiased-exp"/>
+    <w:bookmarkEnd w:id="79"/>
+    <w:bookmarkStart w:id="80" w:name="exr-unbiased-exp"/>
     <w:p>
       <w:pPr>
         <w:pStyle w:val="BodyText"/>
@@ -20089,8 +20091,8 @@
         <w:t xml:space="preserve">.</w:t>
       </w:r>
     </w:p>
-    <w:bookmarkEnd w:id="79"/>
-    <w:bookmarkStart w:id="80" w:name="sol-unbiased-exp"/>
+    <w:bookmarkEnd w:id="80"/>
+    <w:bookmarkStart w:id="81" w:name="sol-unbiased-exp"/>
     <w:p>
       <w:pPr>
         <w:pStyle w:val="BodyText"/>
@@ -20315,8 +20317,8 @@
         <w:t xml:space="preserve">.</w:t>
       </w:r>
     </w:p>
-    <w:bookmarkEnd w:id="80"/>
-    <w:bookmarkStart w:id="81" w:name="exr-unbiased-mse"/>
+    <w:bookmarkEnd w:id="81"/>
+    <w:bookmarkStart w:id="82" w:name="exr-unbiased-mse"/>
     <w:p>
       <w:pPr>
         <w:pStyle w:val="BodyText"/>
@@ -20410,8 +20412,8 @@
         <w:t xml:space="preserve">in terms of its variance.</w:t>
       </w:r>
     </w:p>
-    <w:bookmarkEnd w:id="81"/>
-    <w:bookmarkStart w:id="82" w:name="sol-unbiased-mse"/>
+    <w:bookmarkEnd w:id="82"/>
+    <w:bookmarkStart w:id="83" w:name="sol-unbiased-mse"/>
     <w:p>
       <w:pPr>
         <w:pStyle w:val="BodyText"/>
@@ -20750,8 +20752,8 @@
         </m:oMath>
       </m:oMathPara>
     </w:p>
-    <w:bookmarkEnd w:id="82"/>
-    <w:bookmarkStart w:id="85" w:name="thm-unbiased-props"/>
+    <w:bookmarkEnd w:id="83"/>
+    <w:bookmarkStart w:id="86" w:name="thm-unbiased-props"/>
     <w:p>
       <w:pPr>
         <w:pStyle w:val="FirstParagraph"/>
@@ -20823,7 +20825,7 @@
       <w:pPr>
         <w:pStyle w:val="BodyText"/>
       </w:pPr>
-      <w:bookmarkStart w:id="83" w:name="eq-unbiased-exp"/>
+      <w:bookmarkStart w:id="84" w:name="eq-unbiased-exp"/>
       <m:oMathPara>
         <m:oMathParaPr>
           <m:jc m:val="center"/>
@@ -20890,13 +20892,13 @@
           </m:r>
         </m:oMath>
       </m:oMathPara>
-      <w:bookmarkEnd w:id="83"/>
+      <w:bookmarkEnd w:id="84"/>
     </w:p>
     <w:p>
       <w:pPr>
         <w:pStyle w:val="FirstParagraph"/>
       </w:pPr>
-      <w:bookmarkStart w:id="84" w:name="eq-unbiased-mse"/>
+      <w:bookmarkStart w:id="85" w:name="eq-unbiased-mse"/>
       <m:oMathPara>
         <m:oMathParaPr>
           <m:jc m:val="center"/>
@@ -20992,9 +20994,9 @@
           </m:r>
         </m:oMath>
       </m:oMathPara>
-      <w:bookmarkEnd w:id="84"/>
+      <w:bookmarkEnd w:id="85"/>
     </w:p>
-    <w:bookmarkEnd w:id="85"/>
+    <w:bookmarkEnd w:id="86"/>
     <w:p>
       <w:pPr>
         <w:pStyle w:val="FirstParagraph"/>
@@ -21085,7 +21087,7 @@
       <w:r>
         <w:t xml:space="preserve"> </w:t>
       </w:r>
-      <w:hyperlink r:id="rId86">
+      <w:hyperlink r:id="rId87">
         <w:r>
           <w:rPr>
             <w:rStyle w:val="Hyperlink"/>
@@ -21112,8 +21114,8 @@
         <w:t xml:space="preserve">.</w:t>
       </w:r>
     </w:p>
-    <w:bookmarkEnd w:id="87"/>
-    <w:bookmarkStart w:id="90" w:name="mean-absolute-error"/>
+    <w:bookmarkEnd w:id="88"/>
+    <w:bookmarkStart w:id="91" w:name="mean-absolute-error"/>
     <w:p>
       <w:pPr>
         <w:pStyle w:val="Heading3"/>
@@ -21122,7 +21124,7 @@
         <w:t xml:space="preserve">3.7 Population mean absolute error</w:t>
       </w:r>
     </w:p>
-    <w:bookmarkStart w:id="88" w:name="def-mae"/>
+    <w:bookmarkStart w:id="89" w:name="def-mae"/>
     <w:p>
       <w:pPr>
         <w:pStyle w:val="FirstParagraph"/>
@@ -21349,8 +21351,8 @@
         <w:t xml:space="preserve">.</w:t>
       </w:r>
     </w:p>
-    <w:bookmarkEnd w:id="88"/>
-    <w:bookmarkStart w:id="89" w:name="exm-mae-gaussian"/>
+    <w:bookmarkEnd w:id="89"/>
+    <w:bookmarkStart w:id="90" w:name="exm-mae-gaussian"/>
     <w:p>
       <w:pPr>
         <w:pStyle w:val="BodyText"/>
@@ -23756,9 +23758,9 @@
         <w:t xml:space="preserve">).</w:t>
       </w:r>
     </w:p>
-    <w:bookmarkEnd w:id="89"/>
     <w:bookmarkEnd w:id="90"/>
-    <w:bookmarkStart w:id="104" w:name="standard-error"/>
+    <w:bookmarkEnd w:id="91"/>
+    <w:bookmarkStart w:id="105" w:name="standard-error"/>
     <w:p>
       <w:pPr>
         <w:pStyle w:val="Heading3"/>
@@ -23767,7 +23769,7 @@
         <w:t xml:space="preserve">3.8 Standard error</w:t>
       </w:r>
     </w:p>
-    <w:bookmarkStart w:id="92" w:name="def-SE"/>
+    <w:bookmarkStart w:id="93" w:name="def-SE"/>
     <w:p>
       <w:pPr>
         <w:pStyle w:val="FirstParagraph"/>
@@ -23825,7 +23827,7 @@
       <w:r>
         <w:t xml:space="preserve"> </w:t>
       </w:r>
-      <w:hyperlink r:id="rId91">
+      <w:hyperlink r:id="rId92">
         <w:r>
           <w:rPr>
             <w:rStyle w:val="Hyperlink"/>
@@ -23970,8 +23972,8 @@
         <w:t xml:space="preserve">.</w:t>
       </w:r>
     </w:p>
-    <w:bookmarkEnd w:id="92"/>
-    <w:bookmarkStart w:id="93" w:name="exm-SE-sample-mean"/>
+    <w:bookmarkEnd w:id="93"/>
+    <w:bookmarkStart w:id="94" w:name="exm-SE-sample-mean"/>
     <w:p>
       <w:pPr>
         <w:pStyle w:val="BodyText"/>
@@ -24283,8 +24285,8 @@
         <w:t xml:space="preserve">.</w:t>
       </w:r>
     </w:p>
-    <w:bookmarkEnd w:id="93"/>
-    <w:bookmarkStart w:id="94" w:name="exr-se-error-sd"/>
+    <w:bookmarkEnd w:id="94"/>
+    <w:bookmarkStart w:id="95" w:name="exr-se-error-sd"/>
     <w:p>
       <w:pPr>
         <w:pStyle w:val="BodyText"/>
@@ -24305,7 +24307,7 @@
       <w:r>
         <w:t xml:space="preserve"> </w:t>
       </w:r>
-      <w:hyperlink r:id="rId91">
+      <w:hyperlink r:id="rId92">
         <w:r>
           <w:rPr>
             <w:rStyle w:val="Hyperlink"/>
@@ -24406,8 +24408,8 @@
         <w:t xml:space="preserve">.</w:t>
       </w:r>
     </w:p>
-    <w:bookmarkEnd w:id="94"/>
-    <w:bookmarkStart w:id="95" w:name="sol-se-error-sd"/>
+    <w:bookmarkEnd w:id="95"/>
+    <w:bookmarkStart w:id="96" w:name="sol-se-error-sd"/>
     <w:p>
       <w:pPr>
         <w:pStyle w:val="BodyText"/>
@@ -24774,8 +24776,8 @@
         </m:oMath>
       </m:oMathPara>
     </w:p>
-    <w:bookmarkEnd w:id="95"/>
-    <w:bookmarkStart w:id="96" w:name="thm-se-error-sd"/>
+    <w:bookmarkEnd w:id="96"/>
+    <w:bookmarkStart w:id="97" w:name="thm-se-error-sd"/>
     <w:p>
       <w:pPr>
         <w:pStyle w:val="FirstParagraph"/>
@@ -24889,7 +24891,7 @@
         </m:oMath>
       </m:oMathPara>
     </w:p>
-    <w:bookmarkEnd w:id="96"/>
+    <w:bookmarkEnd w:id="97"/>
     <w:p>
       <w:pPr>
         <w:pStyle w:val="FirstParagraph"/>
@@ -24922,7 +24924,7 @@
         <w:t xml:space="preserve">.</w:t>
       </w:r>
     </w:p>
-    <w:bookmarkStart w:id="97" w:name="rem-standard-error-name"/>
+    <w:bookmarkStart w:id="98" w:name="rem-standard-error-name"/>
     <w:p>
       <w:pPr>
         <w:pStyle w:val="BodyText"/>
@@ -25032,8 +25034,8 @@
         <w:t xml:space="preserve">so they come up often enough to deserve their own name.</w:t>
       </w:r>
     </w:p>
-    <w:bookmarkEnd w:id="97"/>
-    <w:bookmarkStart w:id="98" w:name="exr-var-mse-bias"/>
+    <w:bookmarkEnd w:id="98"/>
+    <w:bookmarkStart w:id="99" w:name="exr-var-mse-bias"/>
     <w:p>
       <w:pPr>
         <w:pStyle w:val="BodyText"/>
@@ -25203,8 +25205,8 @@
         <w:t xml:space="preserve">.</w:t>
       </w:r>
     </w:p>
-    <w:bookmarkEnd w:id="98"/>
-    <w:bookmarkStart w:id="99" w:name="sol-var-mse-bias"/>
+    <w:bookmarkEnd w:id="99"/>
+    <w:bookmarkStart w:id="100" w:name="sol-var-mse-bias"/>
     <w:p>
       <w:pPr>
         <w:pStyle w:val="BodyText"/>
@@ -26131,8 +26133,8 @@
         </m:oMath>
       </m:oMathPara>
     </w:p>
-    <w:bookmarkEnd w:id="99"/>
-    <w:bookmarkStart w:id="100" w:name="cor-var-mse-bias"/>
+    <w:bookmarkEnd w:id="100"/>
+    <w:bookmarkStart w:id="101" w:name="cor-var-mse-bias"/>
     <w:p>
       <w:pPr>
         <w:pStyle w:val="FirstParagraph"/>
@@ -26327,7 +26329,7 @@
         </m:oMath>
       </m:oMathPara>
     </w:p>
-    <w:bookmarkEnd w:id="100"/>
+    <w:bookmarkEnd w:id="101"/>
     <w:p>
       <w:pPr>
         <w:pStyle w:val="FirstParagraph"/>
@@ -26360,7 +26362,7 @@
         <w:t xml:space="preserve">.</w:t>
       </w:r>
     </w:p>
-    <w:bookmarkStart w:id="101" w:name="exr-se-rmse-unbiased"/>
+    <w:bookmarkStart w:id="102" w:name="exr-se-rmse-unbiased"/>
     <w:p>
       <w:pPr>
         <w:pStyle w:val="BodyText"/>
@@ -26468,8 +26470,8 @@
         <w:t xml:space="preserve">.</w:t>
       </w:r>
     </w:p>
-    <w:bookmarkEnd w:id="101"/>
-    <w:bookmarkStart w:id="102" w:name="sol-se-rmse-unbiased"/>
+    <w:bookmarkEnd w:id="102"/>
+    <w:bookmarkStart w:id="103" w:name="sol-se-rmse-unbiased"/>
     <w:p>
       <w:pPr>
         <w:pStyle w:val="BodyText"/>
@@ -26732,8 +26734,8 @@
         </m:oMath>
       </m:oMathPara>
     </w:p>
-    <w:bookmarkEnd w:id="102"/>
-    <w:bookmarkStart w:id="103" w:name="cor-se-rmse-unbiased"/>
+    <w:bookmarkEnd w:id="103"/>
+    <w:bookmarkStart w:id="104" w:name="cor-se-rmse-unbiased"/>
     <w:p>
       <w:pPr>
         <w:pStyle w:val="FirstParagraph"/>
@@ -26891,7 +26893,7 @@
         </m:oMath>
       </m:oMathPara>
     </w:p>
-    <w:bookmarkEnd w:id="103"/>
+    <w:bookmarkEnd w:id="104"/>
     <w:p>
       <w:pPr>
         <w:pStyle w:val="FirstParagraph"/>
@@ -26924,9 +26926,9 @@
         <w:t xml:space="preserve">.</w:t>
       </w:r>
     </w:p>
-    <w:bookmarkEnd w:id="104"/>
     <w:bookmarkEnd w:id="105"/>
-    <w:bookmarkStart w:id="106" w:name="further-reading"/>
+    <w:bookmarkEnd w:id="106"/>
+    <w:bookmarkStart w:id="107" w:name="further-reading"/>
     <w:p>
       <w:pPr>
         <w:pStyle w:val="Heading2"/>
@@ -27020,8 +27022,8 @@
         <w:t xml:space="preserve">— the distribution of a statistic across samples</w:t>
       </w:r>
     </w:p>
-    <w:bookmarkEnd w:id="106"/>
-    <w:bookmarkStart w:id="139" w:name="references"/>
+    <w:bookmarkEnd w:id="107"/>
+    <w:bookmarkStart w:id="140" w:name="references"/>
     <w:p>
       <w:pPr>
         <w:pStyle w:val="Heading2"/>
@@ -27030,8 +27032,8 @@
         <w:t xml:space="preserve">References</w:t>
       </w:r>
     </w:p>
-    <w:bookmarkStart w:id="138" w:name="refs"/>
-    <w:bookmarkStart w:id="108" w:name="ref-fiveminuteai_probstat"/>
+    <w:bookmarkStart w:id="139" w:name="refs"/>
+    <w:bookmarkStart w:id="109" w:name="ref-fiveminuteai_probstat"/>
     <w:p>
       <w:pPr>
         <w:pStyle w:val="Bibliography"/>
@@ -27055,7 +27057,7 @@
       <w:r>
         <w:t xml:space="preserve"> </w:t>
       </w:r>
-      <w:hyperlink r:id="rId107">
+      <w:hyperlink r:id="rId108">
         <w:r>
           <w:rPr>
             <w:rStyle w:val="Hyperlink"/>
@@ -27067,8 +27069,8 @@
         <w:t xml:space="preserve">.</w:t>
       </w:r>
     </w:p>
-    <w:bookmarkEnd w:id="108"/>
-    <w:bookmarkStart w:id="109" w:name="ref-box_draper_1987"/>
+    <w:bookmarkEnd w:id="109"/>
+    <w:bookmarkStart w:id="110" w:name="ref-box_draper_1987"/>
     <w:p>
       <w:pPr>
         <w:pStyle w:val="Bibliography"/>
@@ -27090,8 +27092,8 @@
         <w:t xml:space="preserve">. Wiley Series in Probability and Mathematical Statistics. Applied Probability and Statistics. Wiley.</w:t>
       </w:r>
     </w:p>
-    <w:bookmarkEnd w:id="109"/>
-    <w:bookmarkStart w:id="111" w:name="ref-CaseBerg01"/>
+    <w:bookmarkEnd w:id="110"/>
+    <w:bookmarkStart w:id="112" w:name="ref-CaseBerg01"/>
     <w:p>
       <w:pPr>
         <w:pStyle w:val="Bibliography"/>
@@ -27115,7 +27117,7 @@
       <w:r>
         <w:t xml:space="preserve"> </w:t>
       </w:r>
-      <w:hyperlink r:id="rId110">
+      <w:hyperlink r:id="rId111">
         <w:r>
           <w:rPr>
             <w:rStyle w:val="Hyperlink"/>
@@ -27127,8 +27129,8 @@
         <w:t xml:space="preserve">.</w:t>
       </w:r>
     </w:p>
-    <w:bookmarkEnd w:id="111"/>
-    <w:bookmarkStart w:id="113" w:name="ref-dunn2018generalized"/>
+    <w:bookmarkEnd w:id="112"/>
+    <w:bookmarkStart w:id="114" w:name="ref-dunn2018generalized"/>
     <w:p>
       <w:pPr>
         <w:pStyle w:val="Bibliography"/>
@@ -27166,7 +27168,7 @@
       <w:r>
         <w:t xml:space="preserve"> </w:t>
       </w:r>
-      <w:hyperlink r:id="rId112">
+      <w:hyperlink r:id="rId113">
         <w:r>
           <w:rPr>
             <w:rStyle w:val="Hyperlink"/>
@@ -27178,8 +27180,8 @@
         <w:t xml:space="preserve">.</w:t>
       </w:r>
     </w:p>
-    <w:bookmarkEnd w:id="113"/>
-    <w:bookmarkStart w:id="114" w:name="ref-hoggtanis2015"/>
+    <w:bookmarkEnd w:id="114"/>
+    <w:bookmarkStart w:id="115" w:name="ref-hoggtanis2015"/>
     <w:p>
       <w:pPr>
         <w:pStyle w:val="Bibliography"/>
@@ -27201,8 +27203,8 @@
         <w:t xml:space="preserve">. Tenth edition. Pearson.</w:t>
       </w:r>
     </w:p>
-    <w:bookmarkEnd w:id="114"/>
-    <w:bookmarkStart w:id="116" w:name="ref-lawrance2020estimand"/>
+    <w:bookmarkEnd w:id="115"/>
+    <w:bookmarkStart w:id="117" w:name="ref-lawrance2020estimand"/>
     <w:p>
       <w:pPr>
         <w:pStyle w:val="Bibliography"/>
@@ -27235,7 +27237,7 @@
       <w:r>
         <w:t xml:space="preserve"> </w:t>
       </w:r>
-      <w:hyperlink r:id="rId115">
+      <w:hyperlink r:id="rId116">
         <w:r>
           <w:rPr>
             <w:rStyle w:val="Hyperlink"/>
@@ -27247,8 +27249,8 @@
         <w:t xml:space="preserve">.</w:t>
       </w:r>
     </w:p>
-    <w:bookmarkEnd w:id="116"/>
-    <w:bookmarkStart w:id="118" w:name="ref-pohl2021estimands"/>
+    <w:bookmarkEnd w:id="117"/>
+    <w:bookmarkStart w:id="119" w:name="ref-pohl2021estimands"/>
     <w:p>
       <w:pPr>
         <w:pStyle w:val="Bibliography"/>
@@ -27308,7 +27310,7 @@
       <w:r>
         <w:t xml:space="preserve"> </w:t>
       </w:r>
-      <w:hyperlink r:id="rId117">
+      <w:hyperlink r:id="rId118">
         <w:r>
           <w:rPr>
             <w:rStyle w:val="Hyperlink"/>
@@ -27320,8 +27322,8 @@
         <w:t xml:space="preserve">.</w:t>
       </w:r>
     </w:p>
-    <w:bookmarkEnd w:id="118"/>
-    <w:bookmarkStart w:id="119" w:name="ref-rice2007mathematical"/>
+    <w:bookmarkEnd w:id="119"/>
+    <w:bookmarkStart w:id="120" w:name="ref-rice2007mathematical"/>
     <w:p>
       <w:pPr>
         <w:pStyle w:val="Bibliography"/>
@@ -27343,8 +27345,8 @@
         <w:t xml:space="preserve">. 3rd ed. Cengage Learning.</w:t>
       </w:r>
     </w:p>
-    <w:bookmarkEnd w:id="119"/>
-    <w:bookmarkStart w:id="121" w:name="ref-van2018flexible"/>
+    <w:bookmarkEnd w:id="120"/>
+    <w:bookmarkStart w:id="122" w:name="ref-van2018flexible"/>
     <w:p>
       <w:pPr>
         <w:pStyle w:val="Bibliography"/>
@@ -27368,7 +27370,7 @@
       <w:r>
         <w:t xml:space="preserve"> </w:t>
       </w:r>
-      <w:hyperlink r:id="rId120">
+      <w:hyperlink r:id="rId121">
         <w:r>
           <w:rPr>
             <w:rStyle w:val="Hyperlink"/>
@@ -27380,8 +27382,8 @@
         <w:t xml:space="preserve">.</w:t>
       </w:r>
     </w:p>
-    <w:bookmarkEnd w:id="121"/>
-    <w:bookmarkStart w:id="123" w:name="ref-wikipedia_bias_of_an_estimator"/>
+    <w:bookmarkEnd w:id="122"/>
+    <w:bookmarkStart w:id="124" w:name="ref-wikipedia_bias_of_an_estimator"/>
     <w:p>
       <w:pPr>
         <w:pStyle w:val="Bibliography"/>
@@ -27440,7 +27442,7 @@
       <w:r>
         <w:t xml:space="preserve"> </w:t>
       </w:r>
-      <w:hyperlink r:id="rId122">
+      <w:hyperlink r:id="rId123">
         <w:r>
           <w:rPr>
             <w:rStyle w:val="Hyperlink"/>
@@ -27452,8 +27454,8 @@
         <w:t xml:space="preserve">.</w:t>
       </w:r>
     </w:p>
-    <w:bookmarkEnd w:id="123"/>
-    <w:bookmarkStart w:id="125" w:name="ref-wikipedia_estimand"/>
+    <w:bookmarkEnd w:id="124"/>
+    <w:bookmarkStart w:id="126" w:name="ref-wikipedia_estimand"/>
     <w:p>
       <w:pPr>
         <w:pStyle w:val="Bibliography"/>
@@ -27512,7 +27514,7 @@
       <w:r>
         <w:t xml:space="preserve"> </w:t>
       </w:r>
-      <w:hyperlink r:id="rId124">
+      <w:hyperlink r:id="rId125">
         <w:r>
           <w:rPr>
             <w:rStyle w:val="Hyperlink"/>
@@ -27524,8 +27526,8 @@
         <w:t xml:space="preserve">.</w:t>
       </w:r>
     </w:p>
-    <w:bookmarkEnd w:id="125"/>
-    <w:bookmarkStart w:id="127" w:name="ref-wikipedia_estimator"/>
+    <w:bookmarkEnd w:id="126"/>
+    <w:bookmarkStart w:id="128" w:name="ref-wikipedia_estimator"/>
     <w:p>
       <w:pPr>
         <w:pStyle w:val="Bibliography"/>
@@ -27584,7 +27586,7 @@
       <w:r>
         <w:t xml:space="preserve"> </w:t>
       </w:r>
-      <w:hyperlink r:id="rId126">
+      <w:hyperlink r:id="rId127">
         <w:r>
           <w:rPr>
             <w:rStyle w:val="Hyperlink"/>
@@ -27596,8 +27598,8 @@
         <w:t xml:space="preserve">.</w:t>
       </w:r>
     </w:p>
-    <w:bookmarkEnd w:id="127"/>
-    <w:bookmarkStart w:id="129" w:name="ref-wikipedia_mean_absolute_error"/>
+    <w:bookmarkEnd w:id="128"/>
+    <w:bookmarkStart w:id="130" w:name="ref-wikipedia_mean_absolute_error"/>
     <w:p>
       <w:pPr>
         <w:pStyle w:val="Bibliography"/>
@@ -27656,7 +27658,7 @@
       <w:r>
         <w:t xml:space="preserve"> </w:t>
       </w:r>
-      <w:hyperlink r:id="rId128">
+      <w:hyperlink r:id="rId129">
         <w:r>
           <w:rPr>
             <w:rStyle w:val="Hyperlink"/>
@@ -27668,8 +27670,8 @@
         <w:t xml:space="preserve">.</w:t>
       </w:r>
     </w:p>
-    <w:bookmarkEnd w:id="129"/>
-    <w:bookmarkStart w:id="131" w:name="ref-wikipedia_mean_squared_error"/>
+    <w:bookmarkEnd w:id="130"/>
+    <w:bookmarkStart w:id="132" w:name="ref-wikipedia_mean_squared_error"/>
     <w:p>
       <w:pPr>
         <w:pStyle w:val="Bibliography"/>
@@ -27728,7 +27730,7 @@
       <w:r>
         <w:t xml:space="preserve"> </w:t>
       </w:r>
-      <w:hyperlink r:id="rId130">
+      <w:hyperlink r:id="rId131">
         <w:r>
           <w:rPr>
             <w:rStyle w:val="Hyperlink"/>
@@ -27740,8 +27742,8 @@
         <w:t xml:space="preserve">.</w:t>
       </w:r>
     </w:p>
-    <w:bookmarkEnd w:id="131"/>
-    <w:bookmarkStart w:id="133" w:name="ref-wikipedia_root_mean_square_deviation"/>
+    <w:bookmarkEnd w:id="132"/>
+    <w:bookmarkStart w:id="134" w:name="ref-wikipedia_root_mean_square_deviation"/>
     <w:p>
       <w:pPr>
         <w:pStyle w:val="Bibliography"/>
@@ -27800,7 +27802,7 @@
       <w:r>
         <w:t xml:space="preserve"> </w:t>
       </w:r>
-      <w:hyperlink r:id="rId132">
+      <w:hyperlink r:id="rId133">
         <w:r>
           <w:rPr>
             <w:rStyle w:val="Hyperlink"/>
@@ -27812,8 +27814,8 @@
         <w:t xml:space="preserve">.</w:t>
       </w:r>
     </w:p>
-    <w:bookmarkEnd w:id="133"/>
-    <w:bookmarkStart w:id="135" w:name="ref-wikipedia_sampling_distribution"/>
+    <w:bookmarkEnd w:id="134"/>
+    <w:bookmarkStart w:id="136" w:name="ref-wikipedia_sampling_distribution"/>
     <w:p>
       <w:pPr>
         <w:pStyle w:val="Bibliography"/>
@@ -27872,7 +27874,7 @@
       <w:r>
         <w:t xml:space="preserve"> </w:t>
       </w:r>
-      <w:hyperlink r:id="rId134">
+      <w:hyperlink r:id="rId135">
         <w:r>
           <w:rPr>
             <w:rStyle w:val="Hyperlink"/>
@@ -27884,8 +27886,8 @@
         <w:t xml:space="preserve">.</w:t>
       </w:r>
     </w:p>
-    <w:bookmarkEnd w:id="135"/>
-    <w:bookmarkStart w:id="137" w:name="ref-wikipedia_standard_error"/>
+    <w:bookmarkEnd w:id="136"/>
+    <w:bookmarkStart w:id="138" w:name="ref-wikipedia_standard_error"/>
     <w:p>
       <w:pPr>
         <w:pStyle w:val="Bibliography"/>
@@ -27944,7 +27946,7 @@
       <w:r>
         <w:t xml:space="preserve"> </w:t>
       </w:r>
-      <w:hyperlink r:id="rId136">
+      <w:hyperlink r:id="rId137">
         <w:r>
           <w:rPr>
             <w:rStyle w:val="Hyperlink"/>
@@ -27956,9 +27958,9 @@
         <w:t xml:space="preserve">.</w:t>
       </w:r>
     </w:p>
-    <w:bookmarkEnd w:id="137"/>
     <w:bookmarkEnd w:id="138"/>
     <w:bookmarkEnd w:id="139"/>
+    <w:bookmarkEnd w:id="140"/>
     <w:sectPr>
       <w:footnotePr>
         <w:numRestart w:val="eachSect"/>

</xml_diff>

<commit_message>
Deploying to gh-pages from @ Morrison-Lab/sds@c24cd031d8eec72899438fa443cfc7211766851f 🚀
</commit_message>
<xml_diff>
--- a/estimation-handout.docx
+++ b/estimation-handout.docx
@@ -15,10 +15,10 @@
         <w:pStyle w:val="Date"/>
       </w:pPr>
       <w:r>
-        <w:t xml:space="preserve">Last modified: 2026-10-19 09:50:23 (PDT)</w:t>
+        <w:t xml:space="preserve">Last modified: 2026-10-19 10:06:41 (PDT)</w:t>
       </w:r>
     </w:p>
-    <w:bookmarkStart w:id="14" w:name="scientific-models"/>
+    <w:bookmarkStart w:id="15" w:name="scientific-models"/>
     <w:p>
       <w:pPr>
         <w:pStyle w:val="Heading2"/>
@@ -27,7 +27,7 @@
         <w:t xml:space="preserve">1 Scientific models</w:t>
       </w:r>
     </w:p>
-    <w:bookmarkStart w:id="9" w:name="def-model"/>
+    <w:bookmarkStart w:id="10" w:name="def-scientific-model"/>
     <w:p>
       <w:pPr>
         <w:pStyle w:val="FirstParagraph"/>
@@ -52,6 +52,11 @@
       <w:r>
         <w:t xml:space="preserve"> </w:t>
       </w:r>
+      <w:bookmarkStart w:id="9" w:name="def-model"/>
+      <w:bookmarkEnd w:id="9"/>
+      <w:r>
+        <w:t xml:space="preserve"> </w:t>
+      </w:r>
       <w:r>
         <w:t xml:space="preserve">are attempts to describe</w:t>
       </w:r>
@@ -72,8 +77,8 @@
         <w:t xml:space="preserve">that occur in the world and universe around us.</w:t>
       </w:r>
     </w:p>
-    <w:bookmarkEnd w:id="9"/>
-    <w:bookmarkStart w:id="10" w:name="exm-model"/>
+    <w:bookmarkEnd w:id="10"/>
+    <w:bookmarkStart w:id="11" w:name="exm-model"/>
     <w:p>
       <w:pPr>
         <w:pStyle w:val="BodyText"/>
@@ -117,8 +122,8 @@
         <w:t xml:space="preserve">or the effects of environmental factors on individuals.</w:t>
       </w:r>
     </w:p>
-    <w:bookmarkEnd w:id="10"/>
-    <w:bookmarkStart w:id="11" w:name="models-as-approximations"/>
+    <w:bookmarkEnd w:id="11"/>
+    <w:bookmarkStart w:id="12" w:name="models-as-approximations"/>
     <w:p>
       <w:pPr>
         <w:pStyle w:val="Heading3"/>
@@ -176,8 +181,8 @@
         <w:t xml:space="preserve">.</w:t>
       </w:r>
     </w:p>
-    <w:bookmarkEnd w:id="11"/>
-    <w:bookmarkStart w:id="13" w:name="X25ad704657d63f033c046a464c24982cc83d45b"/>
+    <w:bookmarkEnd w:id="12"/>
+    <w:bookmarkStart w:id="14" w:name="X25ad704657d63f033c046a464c24982cc83d45b"/>
     <w:p>
       <w:pPr>
         <w:pStyle w:val="Heading3"/>
@@ -288,7 +293,7 @@
       <w:r>
         <w:t xml:space="preserve"> </w:t>
       </w:r>
-      <w:hyperlink r:id="rId12">
+      <w:hyperlink r:id="rId13">
         <w:r>
           <w:rPr>
             <w:rStyle w:val="Hyperlink"/>
@@ -422,9 +427,9 @@
         <w:t xml:space="preserve">for more details.</w:t>
       </w:r>
     </w:p>
-    <w:bookmarkEnd w:id="13"/>
     <w:bookmarkEnd w:id="14"/>
-    <w:bookmarkStart w:id="38" w:name="estimands-estimates-and-estimators"/>
+    <w:bookmarkEnd w:id="15"/>
+    <w:bookmarkStart w:id="39" w:name="estimands-estimates-and-estimators"/>
     <w:p>
       <w:pPr>
         <w:pStyle w:val="Heading2"/>
@@ -433,7 +438,7 @@
         <w:t xml:space="preserve">2 Estimands, estimates, and estimators</w:t>
       </w:r>
     </w:p>
-    <w:bookmarkStart w:id="21" w:name="estimands"/>
+    <w:bookmarkStart w:id="22" w:name="estimands"/>
     <w:p>
       <w:pPr>
         <w:pStyle w:val="Heading3"/>
@@ -447,7 +452,7 @@
         <w:pStyle w:val="FirstParagraph"/>
       </w:pPr>
     </w:p>
-    <w:bookmarkStart w:id="15" w:name="def-estimand"/>
+    <w:bookmarkStart w:id="16" w:name="def-estimand"/>
     <w:p>
       <w:pPr>
         <w:pStyle w:val="BodyText"/>
@@ -522,8 +527,8 @@
         <w:t xml:space="preserve">.</w:t>
       </w:r>
     </w:p>
-    <w:bookmarkEnd w:id="15"/>
-    <w:bookmarkStart w:id="16" w:name="exm-estimand"/>
+    <w:bookmarkEnd w:id="16"/>
+    <w:bookmarkStart w:id="17" w:name="exm-estimand"/>
     <w:p>
       <w:pPr>
         <w:pStyle w:val="BodyText"/>
@@ -578,7 +583,7 @@
         <w:t xml:space="preserve">.</w:t>
       </w:r>
     </w:p>
-    <w:bookmarkEnd w:id="16"/>
+    <w:bookmarkEnd w:id="17"/>
     <w:p>
       <w:pPr>
         <w:pStyle w:val="BodyText"/>
@@ -634,18 +639,18 @@
                 <wp:inline>
                   <wp:extent cx="152400" cy="152400"/>
                   <wp:effectExtent b="0" l="0" r="0" t="0"/>
-                  <wp:docPr descr="" title="" id="18" name="Picture"/>
+                  <wp:docPr descr="" title="" id="19" name="Picture"/>
                   <a:graphic>
                     <a:graphicData uri="http://schemas.openxmlformats.org/drawingml/2006/picture">
                       <pic:pic>
                         <pic:nvPicPr>
-                          <pic:cNvPr descr="/opt/quarto/share/formats/docx/note.png" id="19" name="Picture"/>
+                          <pic:cNvPr descr="/opt/quarto/share/formats/docx/note.png" id="20" name="Picture"/>
                           <pic:cNvPicPr>
                             <a:picLocks noChangeArrowheads="1" noChangeAspect="1"/>
                           </pic:cNvPicPr>
                         </pic:nvPicPr>
                         <pic:blipFill>
-                          <a:blip r:embed="rId17"/>
+                          <a:blip r:embed="rId18"/>
                           <a:stretch>
                             <a:fillRect/>
                           </a:stretch>
@@ -719,7 +724,7 @@
             <w:r>
               <w:t xml:space="preserve"> </w:t>
             </w:r>
-            <w:hyperlink r:id="rId20">
+            <w:hyperlink r:id="rId21">
               <w:r>
                 <w:rPr>
                   <w:rStyle w:val="Hyperlink"/>
@@ -738,8 +743,8 @@
         </w:tc>
       </w:tr>
     </w:tbl>
-    <w:bookmarkEnd w:id="21"/>
-    <w:bookmarkStart w:id="25" w:name="estimates"/>
+    <w:bookmarkEnd w:id="22"/>
+    <w:bookmarkStart w:id="26" w:name="estimates"/>
     <w:p>
       <w:pPr>
         <w:pStyle w:val="Heading3"/>
@@ -756,7 +761,7 @@
         <w:t xml:space="preserve"> </w:t>
       </w:r>
     </w:p>
-    <w:bookmarkStart w:id="22" w:name="def-estimate"/>
+    <w:bookmarkStart w:id="23" w:name="def-estimate"/>
     <w:p>
       <w:pPr>
         <w:pStyle w:val="BodyText"/>
@@ -998,8 +1003,8 @@
         </m:oMath>
       </m:oMathPara>
     </w:p>
-    <w:bookmarkEnd w:id="22"/>
-    <w:bookmarkStart w:id="24" w:name="exm-estimate"/>
+    <w:bookmarkEnd w:id="23"/>
+    <w:bookmarkStart w:id="25" w:name="exm-estimate"/>
     <w:p>
       <w:pPr>
         <w:pStyle w:val="FirstParagraph"/>
@@ -1026,7 +1031,7 @@
       <w:r>
         <w:t xml:space="preserve"> </w:t>
       </w:r>
-      <w:hyperlink r:id="rId23">
+      <w:hyperlink r:id="rId24">
         <w:r>
           <w:rPr>
             <w:rStyle w:val="Hyperlink"/>
@@ -1072,9 +1077,9 @@
         <w:t xml:space="preserve">the population mean.</w:t>
       </w:r>
     </w:p>
-    <w:bookmarkEnd w:id="24"/>
     <w:bookmarkEnd w:id="25"/>
-    <w:bookmarkStart w:id="36" w:name="estimators"/>
+    <w:bookmarkEnd w:id="26"/>
+    <w:bookmarkStart w:id="37" w:name="estimators"/>
     <w:p>
       <w:pPr>
         <w:pStyle w:val="Heading3"/>
@@ -1088,7 +1093,7 @@
         <w:pStyle w:val="FirstParagraph"/>
       </w:pPr>
     </w:p>
-    <w:bookmarkStart w:id="26" w:name="def-estimator"/>
+    <w:bookmarkStart w:id="27" w:name="def-estimator"/>
     <w:p>
       <w:pPr>
         <w:pStyle w:val="BodyText"/>
@@ -1337,7 +1342,7 @@
         <w:t xml:space="preserve">.</w:t>
       </w:r>
     </w:p>
-    <w:bookmarkEnd w:id="26"/>
+    <w:bookmarkEnd w:id="27"/>
     <w:tbl>
       <w:tblPr>
         <w:tblStyle w:val="Table"/>
@@ -1379,18 +1384,18 @@
                 <wp:inline>
                   <wp:extent cx="152400" cy="152400"/>
                   <wp:effectExtent b="0" l="0" r="0" t="0"/>
-                  <wp:docPr descr="" title="" id="27" name="Picture"/>
+                  <wp:docPr descr="" title="" id="28" name="Picture"/>
                   <a:graphic>
                     <a:graphicData uri="http://schemas.openxmlformats.org/drawingml/2006/picture">
                       <pic:pic>
                         <pic:nvPicPr>
-                          <pic:cNvPr descr="/opt/quarto/share/formats/docx/note.png" id="28" name="Picture"/>
+                          <pic:cNvPr descr="/opt/quarto/share/formats/docx/note.png" id="29" name="Picture"/>
                           <pic:cNvPicPr>
                             <a:picLocks noChangeArrowheads="1" noChangeAspect="1"/>
                           </pic:cNvPicPr>
                         </pic:nvPicPr>
                         <pic:blipFill>
-                          <a:blip r:embed="rId17"/>
+                          <a:blip r:embed="rId18"/>
                           <a:stretch>
                             <a:fillRect/>
                           </a:stretch>
@@ -1637,18 +1642,18 @@
                 <wp:inline>
                   <wp:extent cx="152400" cy="152400"/>
                   <wp:effectExtent b="0" l="0" r="0" t="0"/>
-                  <wp:docPr descr="" title="" id="29" name="Picture"/>
+                  <wp:docPr descr="" title="" id="30" name="Picture"/>
                   <a:graphic>
                     <a:graphicData uri="http://schemas.openxmlformats.org/drawingml/2006/picture">
                       <pic:pic>
                         <pic:nvPicPr>
-                          <pic:cNvPr descr="/opt/quarto/share/formats/docx/note.png" id="30" name="Picture"/>
+                          <pic:cNvPr descr="/opt/quarto/share/formats/docx/note.png" id="31" name="Picture"/>
                           <pic:cNvPicPr>
                             <a:picLocks noChangeArrowheads="1" noChangeAspect="1"/>
                           </pic:cNvPicPr>
                         </pic:nvPicPr>
                         <pic:blipFill>
-                          <a:blip r:embed="rId17"/>
+                          <a:blip r:embed="rId18"/>
                           <a:stretch>
                             <a:fillRect/>
                           </a:stretch>
@@ -1740,7 +1745,7 @@
             <w:r>
               <w:t xml:space="preserve"> </w:t>
             </w:r>
-            <w:hyperlink r:id="rId20">
+            <w:hyperlink r:id="rId21">
               <w:r>
                 <w:rPr>
                   <w:rStyle w:val="Hyperlink"/>
@@ -1880,7 +1885,7 @@
         </w:tc>
       </w:tr>
     </w:tbl>
-    <w:bookmarkStart w:id="32" w:name="exm-estimator"/>
+    <w:bookmarkStart w:id="33" w:name="exm-estimator"/>
     <w:p>
       <w:pPr>
         <w:pStyle w:val="FirstParagraph"/>
@@ -2424,7 +2429,7 @@
       <w:r>
         <w:t xml:space="preserve"> </w:t>
       </w:r>
-      <w:hyperlink r:id="rId31">
+      <w:hyperlink r:id="rId32">
         <w:r>
           <w:rPr>
             <w:rStyle w:val="Hyperlink"/>
@@ -2875,8 +2880,8 @@
         <w:t xml:space="preserve">).</w:t>
       </w:r>
     </w:p>
-    <w:bookmarkEnd w:id="32"/>
-    <w:bookmarkStart w:id="34" w:name="def-sampling-distribution"/>
+    <w:bookmarkEnd w:id="33"/>
+    <w:bookmarkStart w:id="35" w:name="def-sampling-distribution"/>
     <w:p>
       <w:pPr>
         <w:pStyle w:val="BodyText"/>
@@ -3085,7 +3090,7 @@
       <w:r>
         <w:t xml:space="preserve"> </w:t>
       </w:r>
-      <w:hyperlink r:id="rId33">
+      <w:hyperlink r:id="rId34">
         <w:r>
           <w:rPr>
             <w:rStyle w:val="Hyperlink"/>
@@ -3117,8 +3122,8 @@
         <w:t xml:space="preserve">.</w:t>
       </w:r>
     </w:p>
-    <w:bookmarkEnd w:id="34"/>
-    <w:bookmarkStart w:id="35" w:name="exm-sampling-distribution"/>
+    <w:bookmarkEnd w:id="35"/>
+    <w:bookmarkStart w:id="36" w:name="exm-sampling-distribution"/>
     <w:p>
       <w:pPr>
         <w:pStyle w:val="BodyText"/>
@@ -3650,9 +3655,9 @@
         <w:t xml:space="preserve">.</w:t>
       </w:r>
     </w:p>
-    <w:bookmarkEnd w:id="35"/>
     <w:bookmarkEnd w:id="36"/>
-    <w:bookmarkStart w:id="37" w:name="Xa5dc809b86f87b03eae203f77f161040593b6ef"/>
+    <w:bookmarkEnd w:id="37"/>
+    <w:bookmarkStart w:id="38" w:name="Xa5dc809b86f87b03eae203f77f161040593b6ef"/>
     <w:p>
       <w:pPr>
         <w:pStyle w:val="Heading3"/>
@@ -3882,9 +3887,9 @@
         <w:t xml:space="preserve">covers parameter estimation and the method of moments.</w:t>
       </w:r>
     </w:p>
-    <w:bookmarkEnd w:id="37"/>
     <w:bookmarkEnd w:id="38"/>
-    <w:bookmarkStart w:id="108" w:name="sec-est-accuracy"/>
+    <w:bookmarkEnd w:id="39"/>
+    <w:bookmarkStart w:id="109" w:name="sec-est-accuracy"/>
     <w:p>
       <w:pPr>
         <w:pStyle w:val="Heading2"/>
@@ -3893,7 +3898,7 @@
         <w:t xml:space="preserve">3 Accuracy of estimators</w:t>
       </w:r>
     </w:p>
-    <w:bookmarkStart w:id="39" w:name="accuracy"/>
+    <w:bookmarkStart w:id="40" w:name="accuracy"/>
     <w:p>
       <w:pPr>
         <w:pStyle w:val="Heading3"/>
@@ -3935,8 +3940,8 @@
         <w:t xml:space="preserve">and ease of computation is usually secondary.</w:t>
       </w:r>
     </w:p>
-    <w:bookmarkEnd w:id="39"/>
-    <w:bookmarkStart w:id="42" w:name="estimation-error"/>
+    <w:bookmarkEnd w:id="40"/>
+    <w:bookmarkStart w:id="43" w:name="estimation-error"/>
     <w:p>
       <w:pPr>
         <w:pStyle w:val="Heading3"/>
@@ -3945,7 +3950,7 @@
         <w:t xml:space="preserve">3.2 Estimation error</w:t>
       </w:r>
     </w:p>
-    <w:bookmarkStart w:id="40" w:name="def-estimation-error"/>
+    <w:bookmarkStart w:id="41" w:name="def-estimation-error"/>
     <w:p>
       <w:pPr>
         <w:pStyle w:val="FirstParagraph"/>
@@ -4111,8 +4116,8 @@
         </m:oMath>
       </m:oMathPara>
     </w:p>
-    <w:bookmarkEnd w:id="40"/>
-    <w:bookmarkStart w:id="41" w:name="exm-estimation-error"/>
+    <w:bookmarkEnd w:id="41"/>
+    <w:bookmarkStart w:id="42" w:name="exm-estimation-error"/>
     <w:p>
       <w:pPr>
         <w:pStyle w:val="FirstParagraph"/>
@@ -4398,7 +4403,7 @@
         <w:t xml:space="preserve">if we did, we would not need to estimate it.</w:t>
       </w:r>
     </w:p>
-    <w:bookmarkEnd w:id="41"/>
+    <w:bookmarkEnd w:id="42"/>
     <w:p>
       <w:pPr>
         <w:pStyle w:val="BodyText"/>
@@ -4445,8 +4450,8 @@
         <w:t xml:space="preserve">.</w:t>
       </w:r>
     </w:p>
-    <w:bookmarkEnd w:id="42"/>
-    <w:bookmarkStart w:id="44" w:name="residuals"/>
+    <w:bookmarkEnd w:id="43"/>
+    <w:bookmarkStart w:id="45" w:name="residuals"/>
     <w:p>
       <w:pPr>
         <w:pStyle w:val="Heading3"/>
@@ -4471,7 +4476,7 @@
       <w:r>
         <w:t xml:space="preserve"> </w:t>
       </w:r>
-      <w:hyperlink r:id="rId43">
+      <w:hyperlink r:id="rId44">
         <w:r>
           <w:rPr>
             <w:rStyle w:val="Hyperlink"/>
@@ -4520,8 +4525,8 @@
         <w:t xml:space="preserve">.</w:t>
       </w:r>
     </w:p>
-    <w:bookmarkEnd w:id="44"/>
-    <w:bookmarkStart w:id="51" w:name="bias"/>
+    <w:bookmarkEnd w:id="45"/>
+    <w:bookmarkStart w:id="52" w:name="bias"/>
     <w:p>
       <w:pPr>
         <w:pStyle w:val="Heading3"/>
@@ -4530,7 +4535,7 @@
         <w:t xml:space="preserve">3.4 Bias</w:t>
       </w:r>
     </w:p>
-    <w:bookmarkStart w:id="46" w:name="def-bias"/>
+    <w:bookmarkStart w:id="47" w:name="def-bias"/>
     <w:p>
       <w:pPr>
         <w:pStyle w:val="FirstParagraph"/>
@@ -4624,7 +4629,7 @@
       <w:pPr>
         <w:pStyle w:val="BodyText"/>
       </w:pPr>
-      <w:bookmarkStart w:id="45" w:name="eq-bias-def"/>
+      <w:bookmarkStart w:id="46" w:name="eq-bias-def"/>
       <m:oMathPara>
         <m:oMathParaPr>
           <m:jc m:val="center"/>
@@ -4752,7 +4757,7 @@
           </m:r>
         </m:oMath>
       </m:oMathPara>
-      <w:bookmarkEnd w:id="45"/>
+      <w:bookmarkEnd w:id="46"/>
     </w:p>
     <w:p>
       <w:pPr>
@@ -4771,8 +4776,8 @@
         <w:t xml:space="preserve">.</w:t>
       </w:r>
     </w:p>
-    <w:bookmarkEnd w:id="46"/>
-    <w:bookmarkStart w:id="47" w:name="exr-bias-exprs"/>
+    <w:bookmarkEnd w:id="47"/>
+    <w:bookmarkStart w:id="48" w:name="exr-bias-exprs"/>
     <w:p>
       <w:pPr>
         <w:pStyle w:val="BodyText"/>
@@ -4931,8 +4936,8 @@
         <w:t xml:space="preserve">.</w:t>
       </w:r>
     </w:p>
-    <w:bookmarkEnd w:id="47"/>
-    <w:bookmarkStart w:id="48" w:name="sol-bias-exprs"/>
+    <w:bookmarkEnd w:id="48"/>
+    <w:bookmarkStart w:id="49" w:name="sol-bias-exprs"/>
     <w:p>
       <w:pPr>
         <w:pStyle w:val="BodyText"/>
@@ -5309,8 +5314,8 @@
         </m:oMath>
       </m:oMathPara>
     </w:p>
-    <w:bookmarkEnd w:id="48"/>
-    <w:bookmarkStart w:id="49" w:name="thm-bias-exprs"/>
+    <w:bookmarkEnd w:id="49"/>
+    <w:bookmarkStart w:id="50" w:name="thm-bias-exprs"/>
     <w:p>
       <w:pPr>
         <w:pStyle w:val="FirstParagraph"/>
@@ -5414,7 +5419,7 @@
         </m:oMath>
       </m:oMathPara>
     </w:p>
-    <w:bookmarkEnd w:id="49"/>
+    <w:bookmarkEnd w:id="50"/>
     <w:p>
       <w:pPr>
         <w:pStyle w:val="FirstParagraph"/>
@@ -5447,7 +5452,7 @@
         <w:t xml:space="preserve">.</w:t>
       </w:r>
     </w:p>
-    <w:bookmarkStart w:id="50" w:name="exm-bias-sample-mean"/>
+    <w:bookmarkStart w:id="51" w:name="exm-bias-sample-mean"/>
     <w:p>
       <w:pPr>
         <w:pStyle w:val="BodyText"/>
@@ -6781,9 +6786,9 @@
         <w:t xml:space="preserve">uses only one.</w:t>
       </w:r>
     </w:p>
-    <w:bookmarkEnd w:id="50"/>
     <w:bookmarkEnd w:id="51"/>
-    <w:bookmarkStart w:id="76" w:name="mean-squared-error"/>
+    <w:bookmarkEnd w:id="52"/>
+    <w:bookmarkStart w:id="77" w:name="mean-squared-error"/>
     <w:p>
       <w:pPr>
         <w:pStyle w:val="Heading3"/>
@@ -6792,7 +6797,7 @@
         <w:t xml:space="preserve">3.5 Population mean squared error of an estimator</w:t>
       </w:r>
     </w:p>
-    <w:bookmarkStart w:id="52" w:name="def-mse"/>
+    <w:bookmarkStart w:id="53" w:name="def-mse"/>
     <w:p>
       <w:pPr>
         <w:pStyle w:val="FirstParagraph"/>
@@ -7139,8 +7144,8 @@
         <w:t xml:space="preserve">.</w:t>
       </w:r>
     </w:p>
-    <w:bookmarkEnd w:id="52"/>
-    <w:bookmarkStart w:id="53" w:name="exr-sq-bias-expand"/>
+    <w:bookmarkEnd w:id="53"/>
+    <w:bookmarkStart w:id="54" w:name="exr-sq-bias-expand"/>
     <w:p>
       <w:pPr>
         <w:pStyle w:val="BodyText"/>
@@ -7312,8 +7317,8 @@
         <w:t xml:space="preserve">.</w:t>
       </w:r>
     </w:p>
-    <w:bookmarkEnd w:id="53"/>
-    <w:bookmarkStart w:id="54" w:name="sol-sq-bias-expand"/>
+    <w:bookmarkEnd w:id="54"/>
+    <w:bookmarkStart w:id="55" w:name="sol-sq-bias-expand"/>
     <w:p>
       <w:pPr>
         <w:pStyle w:val="BodyText"/>
@@ -7633,8 +7638,8 @@
         </m:oMath>
       </m:oMathPara>
     </w:p>
-    <w:bookmarkEnd w:id="54"/>
-    <w:bookmarkStart w:id="55" w:name="thm-sq-bias-expand"/>
+    <w:bookmarkEnd w:id="55"/>
+    <w:bookmarkStart w:id="56" w:name="thm-sq-bias-expand"/>
     <w:p>
       <w:pPr>
         <w:pStyle w:val="FirstParagraph"/>
@@ -7902,7 +7907,7 @@
         </m:oMath>
       </m:oMathPara>
     </w:p>
-    <w:bookmarkEnd w:id="55"/>
+    <w:bookmarkEnd w:id="56"/>
     <w:p>
       <w:pPr>
         <w:pStyle w:val="FirstParagraph"/>
@@ -7949,7 +7954,7 @@
         <w:t xml:space="preserve">.</w:t>
       </w:r>
     </w:p>
-    <w:bookmarkStart w:id="56" w:name="exr-bias-sq-plus-var"/>
+    <w:bookmarkStart w:id="57" w:name="exr-bias-sq-plus-var"/>
     <w:p>
       <w:pPr>
         <w:pStyle w:val="BodyText"/>
@@ -8194,8 +8199,8 @@
         <w:t xml:space="preserve">.</w:t>
       </w:r>
     </w:p>
-    <w:bookmarkEnd w:id="56"/>
-    <w:bookmarkStart w:id="61" w:name="sol-bias-sq-plus-var"/>
+    <w:bookmarkEnd w:id="57"/>
+    <w:bookmarkStart w:id="62" w:name="sol-bias-sq-plus-var"/>
     <w:p>
       <w:pPr>
         <w:pStyle w:val="BodyText"/>
@@ -8219,7 +8224,7 @@
       <w:r>
         <w:t xml:space="preserve">(</w:t>
       </w:r>
-      <w:hyperlink r:id="rId57">
+      <w:hyperlink r:id="rId58">
         <w:r>
           <w:rPr>
             <w:rStyle w:val="Hyperlink"/>
@@ -8235,7 +8240,7 @@
       <w:pPr>
         <w:pStyle w:val="BodyText"/>
       </w:pPr>
-      <w:bookmarkStart w:id="58" w:name="eq-bias-sq-plus-var-exr"/>
+      <w:bookmarkStart w:id="59" w:name="eq-bias-sq-plus-var-exr"/>
       <m:oMathPara>
         <m:oMathParaPr>
           <m:jc m:val="center"/>
@@ -8403,7 +8408,7 @@
           </m:r>
         </m:oMath>
       </m:oMathPara>
-      <w:bookmarkEnd w:id="58"/>
+      <w:bookmarkEnd w:id="59"/>
     </w:p>
     <w:p>
       <w:pPr>
@@ -8415,7 +8420,7 @@
       <w:r>
         <w:t xml:space="preserve"> </w:t>
       </w:r>
-      <w:hyperlink r:id="rId59">
+      <w:hyperlink r:id="rId60">
         <w:r>
           <w:rPr>
             <w:rStyle w:val="Hyperlink"/>
@@ -8850,7 +8855,7 @@
       <w:pPr>
         <w:pStyle w:val="BodyText"/>
       </w:pPr>
-      <w:bookmarkStart w:id="60" w:name="eq-bias-sq-plus-var-exr-2"/>
+      <w:bookmarkStart w:id="61" w:name="eq-bias-sq-plus-var-exr-2"/>
       <m:oMathPara>
         <m:oMathParaPr>
           <m:jc m:val="center"/>
@@ -10079,10 +10084,10 @@
           </m:r>
         </m:oMath>
       </m:oMathPara>
-      <w:bookmarkEnd w:id="60"/>
+      <w:bookmarkEnd w:id="61"/>
     </w:p>
-    <w:bookmarkEnd w:id="61"/>
-    <w:bookmarkStart w:id="62" w:name="thm-bias-sq-plus-var"/>
+    <w:bookmarkEnd w:id="62"/>
+    <w:bookmarkStart w:id="63" w:name="thm-bias-sq-plus-var"/>
     <w:p>
       <w:pPr>
         <w:pStyle w:val="FirstParagraph"/>
@@ -10355,7 +10360,7 @@
         </m:oMath>
       </m:oMathPara>
     </w:p>
-    <w:bookmarkEnd w:id="62"/>
+    <w:bookmarkEnd w:id="63"/>
     <w:p>
       <w:pPr>
         <w:pStyle w:val="FirstParagraph"/>
@@ -10422,7 +10427,7 @@
         <w:t xml:space="preserve">.</w:t>
       </w:r>
     </w:p>
-    <w:bookmarkStart w:id="63" w:name="exr-mse-expand"/>
+    <w:bookmarkStart w:id="64" w:name="exr-mse-expand"/>
     <w:p>
       <w:pPr>
         <w:pStyle w:val="BodyText"/>
@@ -10595,8 +10600,8 @@
         <w:t xml:space="preserve">.</w:t>
       </w:r>
     </w:p>
-    <w:bookmarkEnd w:id="63"/>
-    <w:bookmarkStart w:id="64" w:name="sol-mse-expand"/>
+    <w:bookmarkEnd w:id="64"/>
+    <w:bookmarkStart w:id="65" w:name="sol-mse-expand"/>
     <w:p>
       <w:pPr>
         <w:pStyle w:val="BodyText"/>
@@ -11400,8 +11405,8 @@
         </m:oMath>
       </m:oMathPara>
     </w:p>
-    <w:bookmarkEnd w:id="64"/>
-    <w:bookmarkStart w:id="65" w:name="thm-mse-expand"/>
+    <w:bookmarkEnd w:id="65"/>
+    <w:bookmarkStart w:id="66" w:name="thm-mse-expand"/>
     <w:p>
       <w:pPr>
         <w:pStyle w:val="FirstParagraph"/>
@@ -11628,7 +11633,7 @@
         </m:oMath>
       </m:oMathPara>
     </w:p>
-    <w:bookmarkEnd w:id="65"/>
+    <w:bookmarkEnd w:id="66"/>
     <w:p>
       <w:pPr>
         <w:pStyle w:val="FirstParagraph"/>
@@ -11675,7 +11680,7 @@
         <w:t xml:space="preserve">.</w:t>
       </w:r>
     </w:p>
-    <w:bookmarkStart w:id="67" w:name="thm-mse-bias-variance"/>
+    <w:bookmarkStart w:id="68" w:name="thm-mse-bias-variance"/>
     <w:p>
       <w:pPr>
         <w:pStyle w:val="BodyText"/>
@@ -11716,7 +11721,7 @@
       <w:pPr>
         <w:pStyle w:val="BodyText"/>
       </w:pPr>
-      <w:bookmarkStart w:id="66" w:name="eq-mse"/>
+      <w:bookmarkStart w:id="67" w:name="eq-mse"/>
       <m:oMathPara>
         <m:oMathParaPr>
           <m:jc m:val="center"/>
@@ -11875,9 +11880,9 @@
           </m:r>
         </m:oMath>
       </m:oMathPara>
-      <w:bookmarkEnd w:id="66"/>
+      <w:bookmarkEnd w:id="67"/>
     </w:p>
-    <w:bookmarkEnd w:id="67"/>
+    <w:bookmarkEnd w:id="68"/>
     <w:p>
       <w:pPr>
         <w:pStyle w:val="FirstParagraph"/>
@@ -12193,7 +12198,7 @@
         <w:t xml:space="preserve">so they are equal to each other.</w:t>
       </w:r>
     </w:p>
-    <w:bookmarkStart w:id="70" w:name="rem-mse-bias-variance-prediction"/>
+    <w:bookmarkStart w:id="71" w:name="rem-mse-bias-variance-prediction"/>
     <w:p>
       <w:pPr>
         <w:pStyle w:val="BodyText"/>
@@ -12313,7 +12318,7 @@
       <w:r>
         <w:t xml:space="preserve"> </w:t>
       </w:r>
-      <w:hyperlink r:id="rId68">
+      <w:hyperlink r:id="rId69">
         <w:r>
           <w:rPr>
             <w:rStyle w:val="Hyperlink"/>
@@ -12336,7 +12341,7 @@
       <w:r>
         <w:t xml:space="preserve"> </w:t>
       </w:r>
-      <w:hyperlink r:id="rId69">
+      <w:hyperlink r:id="rId70">
         <w:r>
           <w:rPr>
             <w:rStyle w:val="Hyperlink"/>
@@ -12357,8 +12362,8 @@
         <w:t xml:space="preserve">No choice of prediction can remove the extra term.</w:t>
       </w:r>
     </w:p>
-    <w:bookmarkEnd w:id="70"/>
-    <w:bookmarkStart w:id="72" w:name="exm-mse-sample-mean"/>
+    <w:bookmarkEnd w:id="71"/>
+    <w:bookmarkStart w:id="73" w:name="exm-mse-sample-mean"/>
     <w:p>
       <w:pPr>
         <w:pStyle w:val="FirstParagraph"/>
@@ -13770,7 +13775,7 @@
       <w:r>
         <w:t xml:space="preserve"> </w:t>
       </w:r>
-      <w:hyperlink r:id="rId71">
+      <w:hyperlink r:id="rId72">
         <w:r>
           <w:rPr>
             <w:rStyle w:val="Hyperlink"/>
@@ -14068,8 +14073,8 @@
         <w:t xml:space="preserve">’s.</w:t>
       </w:r>
     </w:p>
-    <w:bookmarkEnd w:id="72"/>
-    <w:bookmarkStart w:id="73" w:name="def-rmse"/>
+    <w:bookmarkEnd w:id="73"/>
+    <w:bookmarkStart w:id="74" w:name="def-rmse"/>
     <w:p>
       <w:pPr>
         <w:pStyle w:val="BodyText"/>
@@ -14281,8 +14286,8 @@
         <w:t xml:space="preserve">.</w:t>
       </w:r>
     </w:p>
-    <w:bookmarkEnd w:id="73"/>
-    <w:bookmarkStart w:id="74" w:name="exm-rmse-sample-mean"/>
+    <w:bookmarkEnd w:id="74"/>
+    <w:bookmarkStart w:id="75" w:name="exm-rmse-sample-mean"/>
     <w:p>
       <w:pPr>
         <w:pStyle w:val="BodyText"/>
@@ -14370,8 +14375,8 @@
         <w:t xml:space="preserve">.</w:t>
       </w:r>
     </w:p>
-    <w:bookmarkEnd w:id="74"/>
-    <w:bookmarkStart w:id="75" w:name="rem-rmse-units"/>
+    <w:bookmarkEnd w:id="75"/>
+    <w:bookmarkStart w:id="76" w:name="rem-rmse-units"/>
     <w:p>
       <w:pPr>
         <w:pStyle w:val="BodyText"/>
@@ -14390,7 +14395,7 @@
         <w:t xml:space="preserve">The pRMSE has the same units as the estimand.</w:t>
       </w:r>
     </w:p>
-    <w:bookmarkEnd w:id="75"/>
+    <w:bookmarkEnd w:id="76"/>
     <w:p>
       <w:pPr>
         <w:pStyle w:val="BodyText"/>
@@ -14405,8 +14410,8 @@
         <w:t xml:space="preserve">covers mean squared error.</w:t>
       </w:r>
     </w:p>
-    <w:bookmarkEnd w:id="76"/>
-    <w:bookmarkStart w:id="90" w:name="sec-unbiased-estimators"/>
+    <w:bookmarkEnd w:id="77"/>
+    <w:bookmarkStart w:id="91" w:name="sec-unbiased-estimators"/>
     <w:p>
       <w:pPr>
         <w:pStyle w:val="Heading3"/>
@@ -14415,7 +14420,7 @@
         <w:t xml:space="preserve">3.6 Unbiased estimators</w:t>
       </w:r>
     </w:p>
-    <w:bookmarkStart w:id="77" w:name="def-unbiased"/>
+    <w:bookmarkStart w:id="78" w:name="def-unbiased"/>
     <w:p>
       <w:pPr>
         <w:pStyle w:val="FirstParagraph"/>
@@ -14541,8 +14546,8 @@
         </m:oMath>
       </m:oMathPara>
     </w:p>
-    <w:bookmarkEnd w:id="77"/>
-    <w:bookmarkStart w:id="78" w:name="def-biased"/>
+    <w:bookmarkEnd w:id="78"/>
+    <w:bookmarkStart w:id="79" w:name="def-biased"/>
     <w:p>
       <w:pPr>
         <w:pStyle w:val="FirstParagraph"/>
@@ -14668,8 +14673,8 @@
         </m:oMath>
       </m:oMathPara>
     </w:p>
-    <w:bookmarkEnd w:id="78"/>
-    <w:bookmarkStart w:id="79" w:name="exm-unbiased-sample-mean"/>
+    <w:bookmarkEnd w:id="79"/>
+    <w:bookmarkStart w:id="80" w:name="exm-unbiased-sample-mean"/>
     <w:p>
       <w:pPr>
         <w:pStyle w:val="FirstParagraph"/>
@@ -14883,8 +14888,8 @@
         <w:t xml:space="preserve">.</w:t>
       </w:r>
     </w:p>
-    <w:bookmarkEnd w:id="79"/>
-    <w:bookmarkStart w:id="81" w:name="exm-biased-variance-mle"/>
+    <w:bookmarkEnd w:id="80"/>
+    <w:bookmarkStart w:id="82" w:name="exm-biased-variance-mle"/>
     <w:p>
       <w:pPr>
         <w:pStyle w:val="BodyText"/>
@@ -15062,7 +15067,7 @@
       <w:r>
         <w:t xml:space="preserve"> </w:t>
       </w:r>
-      <w:hyperlink r:id="rId80">
+      <w:hyperlink r:id="rId81">
         <w:r>
           <w:rPr>
             <w:rStyle w:val="Hyperlink"/>
@@ -20234,8 +20239,8 @@
         <w:t xml:space="preserve">grows.</w:t>
       </w:r>
     </w:p>
-    <w:bookmarkEnd w:id="81"/>
-    <w:bookmarkStart w:id="82" w:name="exr-unbiased-exp"/>
+    <w:bookmarkEnd w:id="82"/>
+    <w:bookmarkStart w:id="83" w:name="exr-unbiased-exp"/>
     <w:p>
       <w:pPr>
         <w:pStyle w:val="BodyText"/>
@@ -20366,8 +20371,8 @@
         <w:t xml:space="preserve">.</w:t>
       </w:r>
     </w:p>
-    <w:bookmarkEnd w:id="82"/>
-    <w:bookmarkStart w:id="83" w:name="sol-unbiased-exp"/>
+    <w:bookmarkEnd w:id="83"/>
+    <w:bookmarkStart w:id="84" w:name="sol-unbiased-exp"/>
     <w:p>
       <w:pPr>
         <w:pStyle w:val="BodyText"/>
@@ -20592,8 +20597,8 @@
         <w:t xml:space="preserve">.</w:t>
       </w:r>
     </w:p>
-    <w:bookmarkEnd w:id="83"/>
-    <w:bookmarkStart w:id="84" w:name="exr-unbiased-mse"/>
+    <w:bookmarkEnd w:id="84"/>
+    <w:bookmarkStart w:id="85" w:name="exr-unbiased-mse"/>
     <w:p>
       <w:pPr>
         <w:pStyle w:val="BodyText"/>
@@ -20687,8 +20692,8 @@
         <w:t xml:space="preserve">in terms of its variance.</w:t>
       </w:r>
     </w:p>
-    <w:bookmarkEnd w:id="84"/>
-    <w:bookmarkStart w:id="85" w:name="sol-unbiased-mse"/>
+    <w:bookmarkEnd w:id="85"/>
+    <w:bookmarkStart w:id="86" w:name="sol-unbiased-mse"/>
     <w:p>
       <w:pPr>
         <w:pStyle w:val="BodyText"/>
@@ -21027,8 +21032,8 @@
         </m:oMath>
       </m:oMathPara>
     </w:p>
-    <w:bookmarkEnd w:id="85"/>
-    <w:bookmarkStart w:id="88" w:name="thm-unbiased-props"/>
+    <w:bookmarkEnd w:id="86"/>
+    <w:bookmarkStart w:id="89" w:name="thm-unbiased-props"/>
     <w:p>
       <w:pPr>
         <w:pStyle w:val="FirstParagraph"/>
@@ -21100,7 +21105,7 @@
       <w:pPr>
         <w:pStyle w:val="BodyText"/>
       </w:pPr>
-      <w:bookmarkStart w:id="86" w:name="eq-unbiased-exp"/>
+      <w:bookmarkStart w:id="87" w:name="eq-unbiased-exp"/>
       <m:oMathPara>
         <m:oMathParaPr>
           <m:jc m:val="center"/>
@@ -21167,13 +21172,13 @@
           </m:r>
         </m:oMath>
       </m:oMathPara>
-      <w:bookmarkEnd w:id="86"/>
+      <w:bookmarkEnd w:id="87"/>
     </w:p>
     <w:p>
       <w:pPr>
         <w:pStyle w:val="FirstParagraph"/>
       </w:pPr>
-      <w:bookmarkStart w:id="87" w:name="eq-unbiased-mse"/>
+      <w:bookmarkStart w:id="88" w:name="eq-unbiased-mse"/>
       <m:oMathPara>
         <m:oMathParaPr>
           <m:jc m:val="center"/>
@@ -21269,9 +21274,9 @@
           </m:r>
         </m:oMath>
       </m:oMathPara>
-      <w:bookmarkEnd w:id="87"/>
+      <w:bookmarkEnd w:id="88"/>
     </w:p>
-    <w:bookmarkEnd w:id="88"/>
+    <w:bookmarkEnd w:id="89"/>
     <w:p>
       <w:pPr>
         <w:pStyle w:val="FirstParagraph"/>
@@ -21362,7 +21367,7 @@
       <w:r>
         <w:t xml:space="preserve"> </w:t>
       </w:r>
-      <w:hyperlink r:id="rId89">
+      <w:hyperlink r:id="rId90">
         <w:r>
           <w:rPr>
             <w:rStyle w:val="Hyperlink"/>
@@ -21389,8 +21394,8 @@
         <w:t xml:space="preserve">.</w:t>
       </w:r>
     </w:p>
-    <w:bookmarkEnd w:id="90"/>
-    <w:bookmarkStart w:id="93" w:name="mean-absolute-error"/>
+    <w:bookmarkEnd w:id="91"/>
+    <w:bookmarkStart w:id="94" w:name="mean-absolute-error"/>
     <w:p>
       <w:pPr>
         <w:pStyle w:val="Heading3"/>
@@ -21399,7 +21404,7 @@
         <w:t xml:space="preserve">3.7 Population mean absolute error</w:t>
       </w:r>
     </w:p>
-    <w:bookmarkStart w:id="91" w:name="def-mae"/>
+    <w:bookmarkStart w:id="92" w:name="def-mae"/>
     <w:p>
       <w:pPr>
         <w:pStyle w:val="FirstParagraph"/>
@@ -21626,8 +21631,8 @@
         <w:t xml:space="preserve">.</w:t>
       </w:r>
     </w:p>
-    <w:bookmarkEnd w:id="91"/>
-    <w:bookmarkStart w:id="92" w:name="exm-mae-gaussian"/>
+    <w:bookmarkEnd w:id="92"/>
+    <w:bookmarkStart w:id="93" w:name="exm-mae-gaussian"/>
     <w:p>
       <w:pPr>
         <w:pStyle w:val="BodyText"/>
@@ -24033,9 +24038,9 @@
         <w:t xml:space="preserve">).</w:t>
       </w:r>
     </w:p>
-    <w:bookmarkEnd w:id="92"/>
     <w:bookmarkEnd w:id="93"/>
-    <w:bookmarkStart w:id="107" w:name="standard-error"/>
+    <w:bookmarkEnd w:id="94"/>
+    <w:bookmarkStart w:id="108" w:name="standard-error"/>
     <w:p>
       <w:pPr>
         <w:pStyle w:val="Heading3"/>
@@ -24044,7 +24049,7 @@
         <w:t xml:space="preserve">3.8 Standard error</w:t>
       </w:r>
     </w:p>
-    <w:bookmarkStart w:id="95" w:name="def-SE"/>
+    <w:bookmarkStart w:id="96" w:name="def-SE"/>
     <w:p>
       <w:pPr>
         <w:pStyle w:val="FirstParagraph"/>
@@ -24102,7 +24107,7 @@
       <w:r>
         <w:t xml:space="preserve"> </w:t>
       </w:r>
-      <w:hyperlink r:id="rId94">
+      <w:hyperlink r:id="rId95">
         <w:r>
           <w:rPr>
             <w:rStyle w:val="Hyperlink"/>
@@ -24247,8 +24252,8 @@
         <w:t xml:space="preserve">.</w:t>
       </w:r>
     </w:p>
-    <w:bookmarkEnd w:id="95"/>
-    <w:bookmarkStart w:id="96" w:name="exm-SE-sample-mean"/>
+    <w:bookmarkEnd w:id="96"/>
+    <w:bookmarkStart w:id="97" w:name="exm-SE-sample-mean"/>
     <w:p>
       <w:pPr>
         <w:pStyle w:val="BodyText"/>
@@ -24560,8 +24565,8 @@
         <w:t xml:space="preserve">.</w:t>
       </w:r>
     </w:p>
-    <w:bookmarkEnd w:id="96"/>
-    <w:bookmarkStart w:id="97" w:name="exr-se-error-sd"/>
+    <w:bookmarkEnd w:id="97"/>
+    <w:bookmarkStart w:id="98" w:name="exr-se-error-sd"/>
     <w:p>
       <w:pPr>
         <w:pStyle w:val="BodyText"/>
@@ -24582,7 +24587,7 @@
       <w:r>
         <w:t xml:space="preserve"> </w:t>
       </w:r>
-      <w:hyperlink r:id="rId94">
+      <w:hyperlink r:id="rId95">
         <w:r>
           <w:rPr>
             <w:rStyle w:val="Hyperlink"/>
@@ -24683,8 +24688,8 @@
         <w:t xml:space="preserve">.</w:t>
       </w:r>
     </w:p>
-    <w:bookmarkEnd w:id="97"/>
-    <w:bookmarkStart w:id="98" w:name="sol-se-error-sd"/>
+    <w:bookmarkEnd w:id="98"/>
+    <w:bookmarkStart w:id="99" w:name="sol-se-error-sd"/>
     <w:p>
       <w:pPr>
         <w:pStyle w:val="BodyText"/>
@@ -25051,8 +25056,8 @@
         </m:oMath>
       </m:oMathPara>
     </w:p>
-    <w:bookmarkEnd w:id="98"/>
-    <w:bookmarkStart w:id="99" w:name="thm-se-error-sd"/>
+    <w:bookmarkEnd w:id="99"/>
+    <w:bookmarkStart w:id="100" w:name="thm-se-error-sd"/>
     <w:p>
       <w:pPr>
         <w:pStyle w:val="FirstParagraph"/>
@@ -25166,7 +25171,7 @@
         </m:oMath>
       </m:oMathPara>
     </w:p>
-    <w:bookmarkEnd w:id="99"/>
+    <w:bookmarkEnd w:id="100"/>
     <w:p>
       <w:pPr>
         <w:pStyle w:val="FirstParagraph"/>
@@ -25199,7 +25204,7 @@
         <w:t xml:space="preserve">.</w:t>
       </w:r>
     </w:p>
-    <w:bookmarkStart w:id="100" w:name="rem-standard-error-name"/>
+    <w:bookmarkStart w:id="101" w:name="rem-standard-error-name"/>
     <w:p>
       <w:pPr>
         <w:pStyle w:val="BodyText"/>
@@ -25309,8 +25314,8 @@
         <w:t xml:space="preserve">so they come up often enough to deserve their own name.</w:t>
       </w:r>
     </w:p>
-    <w:bookmarkEnd w:id="100"/>
-    <w:bookmarkStart w:id="101" w:name="exr-var-mse-bias"/>
+    <w:bookmarkEnd w:id="101"/>
+    <w:bookmarkStart w:id="102" w:name="exr-var-mse-bias"/>
     <w:p>
       <w:pPr>
         <w:pStyle w:val="BodyText"/>
@@ -25480,8 +25485,8 @@
         <w:t xml:space="preserve">.</w:t>
       </w:r>
     </w:p>
-    <w:bookmarkEnd w:id="101"/>
-    <w:bookmarkStart w:id="102" w:name="sol-var-mse-bias"/>
+    <w:bookmarkEnd w:id="102"/>
+    <w:bookmarkStart w:id="103" w:name="sol-var-mse-bias"/>
     <w:p>
       <w:pPr>
         <w:pStyle w:val="BodyText"/>
@@ -26408,8 +26413,8 @@
         </m:oMath>
       </m:oMathPara>
     </w:p>
-    <w:bookmarkEnd w:id="102"/>
-    <w:bookmarkStart w:id="103" w:name="cor-var-mse-bias"/>
+    <w:bookmarkEnd w:id="103"/>
+    <w:bookmarkStart w:id="104" w:name="cor-var-mse-bias"/>
     <w:p>
       <w:pPr>
         <w:pStyle w:val="FirstParagraph"/>
@@ -26604,7 +26609,7 @@
         </m:oMath>
       </m:oMathPara>
     </w:p>
-    <w:bookmarkEnd w:id="103"/>
+    <w:bookmarkEnd w:id="104"/>
     <w:p>
       <w:pPr>
         <w:pStyle w:val="FirstParagraph"/>
@@ -26637,7 +26642,7 @@
         <w:t xml:space="preserve">.</w:t>
       </w:r>
     </w:p>
-    <w:bookmarkStart w:id="104" w:name="exr-se-rmse-unbiased"/>
+    <w:bookmarkStart w:id="105" w:name="exr-se-rmse-unbiased"/>
     <w:p>
       <w:pPr>
         <w:pStyle w:val="BodyText"/>
@@ -26745,8 +26750,8 @@
         <w:t xml:space="preserve">.</w:t>
       </w:r>
     </w:p>
-    <w:bookmarkEnd w:id="104"/>
-    <w:bookmarkStart w:id="105" w:name="sol-se-rmse-unbiased"/>
+    <w:bookmarkEnd w:id="105"/>
+    <w:bookmarkStart w:id="106" w:name="sol-se-rmse-unbiased"/>
     <w:p>
       <w:pPr>
         <w:pStyle w:val="BodyText"/>
@@ -27009,8 +27014,8 @@
         </m:oMath>
       </m:oMathPara>
     </w:p>
-    <w:bookmarkEnd w:id="105"/>
-    <w:bookmarkStart w:id="106" w:name="cor-se-rmse-unbiased"/>
+    <w:bookmarkEnd w:id="106"/>
+    <w:bookmarkStart w:id="107" w:name="cor-se-rmse-unbiased"/>
     <w:p>
       <w:pPr>
         <w:pStyle w:val="FirstParagraph"/>
@@ -27168,7 +27173,7 @@
         </m:oMath>
       </m:oMathPara>
     </w:p>
-    <w:bookmarkEnd w:id="106"/>
+    <w:bookmarkEnd w:id="107"/>
     <w:p>
       <w:pPr>
         <w:pStyle w:val="FirstParagraph"/>
@@ -27201,9 +27206,9 @@
         <w:t xml:space="preserve">.</w:t>
       </w:r>
     </w:p>
-    <w:bookmarkEnd w:id="107"/>
     <w:bookmarkEnd w:id="108"/>
-    <w:bookmarkStart w:id="141" w:name="references"/>
+    <w:bookmarkEnd w:id="109"/>
+    <w:bookmarkStart w:id="142" w:name="references"/>
     <w:p>
       <w:pPr>
         <w:pStyle w:val="Heading2"/>
@@ -27212,8 +27217,8 @@
         <w:t xml:space="preserve">References</w:t>
       </w:r>
     </w:p>
-    <w:bookmarkStart w:id="140" w:name="refs"/>
-    <w:bookmarkStart w:id="109" w:name="ref-box_draper_1987"/>
+    <w:bookmarkStart w:id="141" w:name="refs"/>
+    <w:bookmarkStart w:id="110" w:name="ref-box_draper_1987"/>
     <w:p>
       <w:pPr>
         <w:pStyle w:val="Bibliography"/>
@@ -27244,8 +27249,8 @@
         <w:t xml:space="preserve">. in Wiley series in probability and mathematical statistics. Applied probability and statistics. New York: Wiley, 1987.</w:t>
       </w:r>
     </w:p>
-    <w:bookmarkEnd w:id="109"/>
-    <w:bookmarkStart w:id="111" w:name="ref-dunn2018generalized"/>
+    <w:bookmarkEnd w:id="110"/>
+    <w:bookmarkStart w:id="112" w:name="ref-dunn2018generalized"/>
     <w:p>
       <w:pPr>
         <w:pStyle w:val="Bibliography"/>
@@ -27292,7 +27297,7 @@
       <w:r>
         <w:t xml:space="preserve"> </w:t>
       </w:r>
-      <w:hyperlink r:id="rId110">
+      <w:hyperlink r:id="rId111">
         <w:r>
           <w:rPr>
             <w:rStyle w:val="Hyperlink"/>
@@ -27304,8 +27309,8 @@
         <w:t xml:space="preserve">.</w:t>
       </w:r>
     </w:p>
-    <w:bookmarkEnd w:id="111"/>
-    <w:bookmarkStart w:id="113" w:name="ref-van2018flexible"/>
+    <w:bookmarkEnd w:id="112"/>
+    <w:bookmarkStart w:id="114" w:name="ref-van2018flexible"/>
     <w:p>
       <w:pPr>
         <w:pStyle w:val="Bibliography"/>
@@ -27338,7 +27343,7 @@
       <w:r>
         <w:t xml:space="preserve"> </w:t>
       </w:r>
-      <w:hyperlink r:id="rId112">
+      <w:hyperlink r:id="rId113">
         <w:r>
           <w:rPr>
             <w:rStyle w:val="Hyperlink"/>
@@ -27347,8 +27352,8 @@
         </w:r>
       </w:hyperlink>
     </w:p>
-    <w:bookmarkEnd w:id="113"/>
-    <w:bookmarkStart w:id="115" w:name="ref-pohl2021estimands"/>
+    <w:bookmarkEnd w:id="114"/>
+    <w:bookmarkStart w:id="116" w:name="ref-pohl2021estimands"/>
     <w:p>
       <w:pPr>
         <w:pStyle w:val="Bibliography"/>
@@ -27414,7 +27419,7 @@
       <w:r>
         <w:t xml:space="preserve"> </w:t>
       </w:r>
-      <w:hyperlink r:id="rId114">
+      <w:hyperlink r:id="rId115">
         <w:r>
           <w:rPr>
             <w:rStyle w:val="Hyperlink"/>
@@ -27426,8 +27431,8 @@
         <w:t xml:space="preserve">.</w:t>
       </w:r>
     </w:p>
-    <w:bookmarkEnd w:id="115"/>
-    <w:bookmarkStart w:id="117" w:name="ref-lawrance2020estimand"/>
+    <w:bookmarkEnd w:id="116"/>
+    <w:bookmarkStart w:id="118" w:name="ref-lawrance2020estimand"/>
     <w:p>
       <w:pPr>
         <w:pStyle w:val="Bibliography"/>
@@ -27479,7 +27484,7 @@
       <w:r>
         <w:t xml:space="preserve"> </w:t>
       </w:r>
-      <w:hyperlink r:id="rId116">
+      <w:hyperlink r:id="rId117">
         <w:r>
           <w:rPr>
             <w:rStyle w:val="Hyperlink"/>
@@ -27491,8 +27496,8 @@
         <w:t xml:space="preserve">.</w:t>
       </w:r>
     </w:p>
-    <w:bookmarkEnd w:id="117"/>
-    <w:bookmarkStart w:id="119" w:name="ref-wikipedia_estimand"/>
+    <w:bookmarkEnd w:id="118"/>
+    <w:bookmarkStart w:id="120" w:name="ref-wikipedia_estimand"/>
     <w:p>
       <w:pPr>
         <w:pStyle w:val="Bibliography"/>
@@ -27539,7 +27544,7 @@
       <w:r>
         <w:t xml:space="preserve"> </w:t>
       </w:r>
-      <w:hyperlink r:id="rId118">
+      <w:hyperlink r:id="rId119">
         <w:r>
           <w:rPr>
             <w:rStyle w:val="Hyperlink"/>
@@ -27548,8 +27553,8 @@
         </w:r>
       </w:hyperlink>
     </w:p>
-    <w:bookmarkEnd w:id="119"/>
-    <w:bookmarkStart w:id="121" w:name="ref-wikipedia_estimator"/>
+    <w:bookmarkEnd w:id="120"/>
+    <w:bookmarkStart w:id="122" w:name="ref-wikipedia_estimator"/>
     <w:p>
       <w:pPr>
         <w:pStyle w:val="Bibliography"/>
@@ -27596,7 +27601,7 @@
       <w:r>
         <w:t xml:space="preserve"> </w:t>
       </w:r>
-      <w:hyperlink r:id="rId120">
+      <w:hyperlink r:id="rId121">
         <w:r>
           <w:rPr>
             <w:rStyle w:val="Hyperlink"/>
@@ -27605,8 +27610,8 @@
         </w:r>
       </w:hyperlink>
     </w:p>
-    <w:bookmarkEnd w:id="121"/>
-    <w:bookmarkStart w:id="123" w:name="ref-wikipedia_sampling_distribution"/>
+    <w:bookmarkEnd w:id="122"/>
+    <w:bookmarkStart w:id="124" w:name="ref-wikipedia_sampling_distribution"/>
     <w:p>
       <w:pPr>
         <w:pStyle w:val="Bibliography"/>
@@ -27653,7 +27658,7 @@
       <w:r>
         <w:t xml:space="preserve"> </w:t>
       </w:r>
-      <w:hyperlink r:id="rId122">
+      <w:hyperlink r:id="rId123">
         <w:r>
           <w:rPr>
             <w:rStyle w:val="Hyperlink"/>
@@ -27662,8 +27667,8 @@
         </w:r>
       </w:hyperlink>
     </w:p>
-    <w:bookmarkEnd w:id="123"/>
-    <w:bookmarkStart w:id="124" w:name="ref-hoggtanis2015"/>
+    <w:bookmarkEnd w:id="124"/>
+    <w:bookmarkStart w:id="125" w:name="ref-hoggtanis2015"/>
     <w:p>
       <w:pPr>
         <w:pStyle w:val="Bibliography"/>
@@ -27694,8 +27699,8 @@
         <w:t xml:space="preserve">, Tenth edition. Boston: Pearson, 2019.</w:t>
       </w:r>
     </w:p>
-    <w:bookmarkEnd w:id="124"/>
-    <w:bookmarkStart w:id="126" w:name="ref-CaseBerg01"/>
+    <w:bookmarkEnd w:id="125"/>
+    <w:bookmarkStart w:id="127" w:name="ref-CaseBerg01"/>
     <w:p>
       <w:pPr>
         <w:pStyle w:val="Bibliography"/>
@@ -27728,7 +27733,7 @@
       <w:r>
         <w:t xml:space="preserve"> </w:t>
       </w:r>
-      <w:hyperlink r:id="rId125">
+      <w:hyperlink r:id="rId126">
         <w:r>
           <w:rPr>
             <w:rStyle w:val="Hyperlink"/>
@@ -27737,8 +27742,8 @@
         </w:r>
       </w:hyperlink>
     </w:p>
-    <w:bookmarkEnd w:id="126"/>
-    <w:bookmarkStart w:id="127" w:name="ref-rice2007mathematical"/>
+    <w:bookmarkEnd w:id="127"/>
+    <w:bookmarkStart w:id="128" w:name="ref-rice2007mathematical"/>
     <w:p>
       <w:pPr>
         <w:pStyle w:val="Bibliography"/>
@@ -27769,8 +27774,8 @@
         <w:t xml:space="preserve">, 3rd ed. Belmont, CA: Cengage Learning, 2007.</w:t>
       </w:r>
     </w:p>
-    <w:bookmarkEnd w:id="127"/>
-    <w:bookmarkStart w:id="129" w:name="ref-wikipedia_bias_of_an_estimator"/>
+    <w:bookmarkEnd w:id="128"/>
+    <w:bookmarkStart w:id="130" w:name="ref-wikipedia_bias_of_an_estimator"/>
     <w:p>
       <w:pPr>
         <w:pStyle w:val="Bibliography"/>
@@ -27817,7 +27822,7 @@
       <w:r>
         <w:t xml:space="preserve"> </w:t>
       </w:r>
-      <w:hyperlink r:id="rId128">
+      <w:hyperlink r:id="rId129">
         <w:r>
           <w:rPr>
             <w:rStyle w:val="Hyperlink"/>
@@ -27826,8 +27831,8 @@
         </w:r>
       </w:hyperlink>
     </w:p>
-    <w:bookmarkEnd w:id="129"/>
-    <w:bookmarkStart w:id="131" w:name="ref-wikipedia_mean_squared_error"/>
+    <w:bookmarkEnd w:id="130"/>
+    <w:bookmarkStart w:id="132" w:name="ref-wikipedia_mean_squared_error"/>
     <w:p>
       <w:pPr>
         <w:pStyle w:val="Bibliography"/>
@@ -27874,7 +27879,7 @@
       <w:r>
         <w:t xml:space="preserve"> </w:t>
       </w:r>
-      <w:hyperlink r:id="rId130">
+      <w:hyperlink r:id="rId131">
         <w:r>
           <w:rPr>
             <w:rStyle w:val="Hyperlink"/>
@@ -27883,8 +27888,8 @@
         </w:r>
       </w:hyperlink>
     </w:p>
-    <w:bookmarkEnd w:id="131"/>
-    <w:bookmarkStart w:id="133" w:name="ref-wikipedia_root_mean_square_deviation"/>
+    <w:bookmarkEnd w:id="132"/>
+    <w:bookmarkStart w:id="134" w:name="ref-wikipedia_root_mean_square_deviation"/>
     <w:p>
       <w:pPr>
         <w:pStyle w:val="Bibliography"/>
@@ -27931,7 +27936,7 @@
       <w:r>
         <w:t xml:space="preserve"> </w:t>
       </w:r>
-      <w:hyperlink r:id="rId132">
+      <w:hyperlink r:id="rId133">
         <w:r>
           <w:rPr>
             <w:rStyle w:val="Hyperlink"/>
@@ -27940,8 +27945,8 @@
         </w:r>
       </w:hyperlink>
     </w:p>
-    <w:bookmarkEnd w:id="133"/>
-    <w:bookmarkStart w:id="135" w:name="ref-fiveminuteai_probstat"/>
+    <w:bookmarkEnd w:id="134"/>
+    <w:bookmarkStart w:id="136" w:name="ref-fiveminuteai_probstat"/>
     <w:p>
       <w:pPr>
         <w:pStyle w:val="Bibliography"/>
@@ -27973,7 +27978,7 @@
       <w:r>
         <w:t xml:space="preserve"> </w:t>
       </w:r>
-      <w:hyperlink r:id="rId134">
+      <w:hyperlink r:id="rId135">
         <w:r>
           <w:rPr>
             <w:rStyle w:val="Hyperlink"/>
@@ -27982,8 +27987,8 @@
         </w:r>
       </w:hyperlink>
     </w:p>
-    <w:bookmarkEnd w:id="135"/>
-    <w:bookmarkStart w:id="137" w:name="ref-wikipedia_mean_absolute_error"/>
+    <w:bookmarkEnd w:id="136"/>
+    <w:bookmarkStart w:id="138" w:name="ref-wikipedia_mean_absolute_error"/>
     <w:p>
       <w:pPr>
         <w:pStyle w:val="Bibliography"/>
@@ -28030,7 +28035,7 @@
       <w:r>
         <w:t xml:space="preserve"> </w:t>
       </w:r>
-      <w:hyperlink r:id="rId136">
+      <w:hyperlink r:id="rId137">
         <w:r>
           <w:rPr>
             <w:rStyle w:val="Hyperlink"/>
@@ -28039,8 +28044,8 @@
         </w:r>
       </w:hyperlink>
     </w:p>
-    <w:bookmarkEnd w:id="137"/>
-    <w:bookmarkStart w:id="139" w:name="ref-wikipedia_standard_error"/>
+    <w:bookmarkEnd w:id="138"/>
+    <w:bookmarkStart w:id="140" w:name="ref-wikipedia_standard_error"/>
     <w:p>
       <w:pPr>
         <w:pStyle w:val="Bibliography"/>
@@ -28087,7 +28092,7 @@
       <w:r>
         <w:t xml:space="preserve"> </w:t>
       </w:r>
-      <w:hyperlink r:id="rId138">
+      <w:hyperlink r:id="rId139">
         <w:r>
           <w:rPr>
             <w:rStyle w:val="Hyperlink"/>
@@ -28096,9 +28101,9 @@
         </w:r>
       </w:hyperlink>
     </w:p>
-    <w:bookmarkEnd w:id="139"/>
     <w:bookmarkEnd w:id="140"/>
     <w:bookmarkEnd w:id="141"/>
+    <w:bookmarkEnd w:id="142"/>
     <w:sectPr>
       <w:footnotePr>
         <w:numRestart w:val="eachSect"/>

</xml_diff>

<commit_message>
Deploying to gh-pages from @ Morrison-Lab/sds@0e609e61869651e9bbdf7c3c1285a82947700157 🚀
</commit_message>
<xml_diff>
--- a/estimation-handout.docx
+++ b/estimation-handout.docx
@@ -15,7 +15,7 @@
         <w:pStyle w:val="Date"/>
       </w:pPr>
       <w:r>
-        <w:t xml:space="preserve">Last modified: 2026-10-22 01:42:18 (PDT)</w:t>
+        <w:t xml:space="preserve">Last modified: 2026-10-22 02:04:59 (PDT)</w:t>
       </w:r>
     </w:p>
     <w:bookmarkStart w:id="15" w:name="scientific-models"/>
@@ -3889,7 +3889,7 @@
     </w:p>
     <w:bookmarkEnd w:id="38"/>
     <w:bookmarkEnd w:id="39"/>
-    <w:bookmarkStart w:id="109" w:name="sec-est-accuracy"/>
+    <w:bookmarkStart w:id="110" w:name="sec-est-accuracy"/>
     <w:p>
       <w:pPr>
         <w:pStyle w:val="Heading2"/>
@@ -6788,7 +6788,7 @@
     </w:p>
     <w:bookmarkEnd w:id="51"/>
     <w:bookmarkEnd w:id="52"/>
-    <w:bookmarkStart w:id="77" w:name="mean-squared-error"/>
+    <w:bookmarkStart w:id="78" w:name="mean-squared-error"/>
     <w:p>
       <w:pPr>
         <w:pStyle w:val="Heading3"/>
@@ -12363,7 +12363,7 @@
       </w:r>
     </w:p>
     <w:bookmarkEnd w:id="71"/>
-    <w:bookmarkStart w:id="73" w:name="exm-mse-sample-mean"/>
+    <w:bookmarkStart w:id="74" w:name="exm-mse-sample-mean"/>
     <w:p>
       <w:pPr>
         <w:pStyle w:val="FirstParagraph"/>
@@ -13792,6 +13792,58 @@
       <w:r>
         <w:t xml:space="preserve">whose covariance terms are all zero for independent variables.</w:t>
       </w:r>
+      <w:r>
+        <w:t xml:space="preserve"> </w:t>
+      </w:r>
+      <w:r>
+        <w:t xml:space="preserve">The result</w:t>
+      </w:r>
+      <w:r>
+        <w:t xml:space="preserve"> </w:t>
+      </w:r>
+      <m:oMath>
+        <m:sSup>
+          <m:e>
+            <m:r>
+              <m:t>σ</m:t>
+            </m:r>
+          </m:e>
+          <m:sup>
+            <m:r>
+              <m:t>2</m:t>
+            </m:r>
+          </m:sup>
+        </m:sSup>
+        <m:r>
+          <m:rPr>
+            <m:sty m:val="p"/>
+          </m:rPr>
+          <m:t>/</m:t>
+        </m:r>
+        <m:r>
+          <m:t>n</m:t>
+        </m:r>
+      </m:oMath>
+      <w:r>
+        <w:t xml:space="preserve"> </w:t>
+      </w:r>
+      <w:r>
+        <w:t xml:space="preserve">is the</w:t>
+      </w:r>
+      <w:r>
+        <w:t xml:space="preserve"> </w:t>
+      </w:r>
+      <w:hyperlink r:id="rId73">
+        <w:r>
+          <w:rPr>
+            <w:rStyle w:val="Hyperlink"/>
+          </w:rPr>
+          <w:t xml:space="preserve">variance of an IID sample mean</w:t>
+        </w:r>
+      </w:hyperlink>
+      <w:r>
+        <w:t xml:space="preserve">.</w:t>
+      </w:r>
     </w:p>
     <w:p>
       <w:pPr>
@@ -14073,8 +14125,8 @@
         <w:t xml:space="preserve">’s.</w:t>
       </w:r>
     </w:p>
-    <w:bookmarkEnd w:id="73"/>
-    <w:bookmarkStart w:id="74" w:name="def-rmse"/>
+    <w:bookmarkEnd w:id="74"/>
+    <w:bookmarkStart w:id="75" w:name="def-rmse"/>
     <w:p>
       <w:pPr>
         <w:pStyle w:val="BodyText"/>
@@ -14286,8 +14338,8 @@
         <w:t xml:space="preserve">.</w:t>
       </w:r>
     </w:p>
-    <w:bookmarkEnd w:id="74"/>
-    <w:bookmarkStart w:id="75" w:name="exm-rmse-sample-mean"/>
+    <w:bookmarkEnd w:id="75"/>
+    <w:bookmarkStart w:id="76" w:name="exm-rmse-sample-mean"/>
     <w:p>
       <w:pPr>
         <w:pStyle w:val="BodyText"/>
@@ -14375,8 +14427,8 @@
         <w:t xml:space="preserve">.</w:t>
       </w:r>
     </w:p>
-    <w:bookmarkEnd w:id="75"/>
-    <w:bookmarkStart w:id="76" w:name="rem-rmse-units"/>
+    <w:bookmarkEnd w:id="76"/>
+    <w:bookmarkStart w:id="77" w:name="rem-rmse-units"/>
     <w:p>
       <w:pPr>
         <w:pStyle w:val="BodyText"/>
@@ -14395,7 +14447,7 @@
         <w:t xml:space="preserve">The pRMSE has the same units as the estimand.</w:t>
       </w:r>
     </w:p>
-    <w:bookmarkEnd w:id="76"/>
+    <w:bookmarkEnd w:id="77"/>
     <w:p>
       <w:pPr>
         <w:pStyle w:val="BodyText"/>
@@ -14410,8 +14462,8 @@
         <w:t xml:space="preserve">covers mean squared error.</w:t>
       </w:r>
     </w:p>
-    <w:bookmarkEnd w:id="77"/>
-    <w:bookmarkStart w:id="91" w:name="sec-unbiased-estimators"/>
+    <w:bookmarkEnd w:id="78"/>
+    <w:bookmarkStart w:id="92" w:name="sec-unbiased-estimators"/>
     <w:p>
       <w:pPr>
         <w:pStyle w:val="Heading3"/>
@@ -14420,7 +14472,7 @@
         <w:t xml:space="preserve">3.6 Unbiased estimators</w:t>
       </w:r>
     </w:p>
-    <w:bookmarkStart w:id="78" w:name="def-unbiased"/>
+    <w:bookmarkStart w:id="79" w:name="def-unbiased"/>
     <w:p>
       <w:pPr>
         <w:pStyle w:val="FirstParagraph"/>
@@ -14546,8 +14598,8 @@
         </m:oMath>
       </m:oMathPara>
     </w:p>
-    <w:bookmarkEnd w:id="78"/>
-    <w:bookmarkStart w:id="79" w:name="def-biased"/>
+    <w:bookmarkEnd w:id="79"/>
+    <w:bookmarkStart w:id="80" w:name="def-biased"/>
     <w:p>
       <w:pPr>
         <w:pStyle w:val="FirstParagraph"/>
@@ -14673,8 +14725,8 @@
         </m:oMath>
       </m:oMathPara>
     </w:p>
-    <w:bookmarkEnd w:id="79"/>
-    <w:bookmarkStart w:id="80" w:name="exm-unbiased-sample-mean"/>
+    <w:bookmarkEnd w:id="80"/>
+    <w:bookmarkStart w:id="81" w:name="exm-unbiased-sample-mean"/>
     <w:p>
       <w:pPr>
         <w:pStyle w:val="FirstParagraph"/>
@@ -14888,8 +14940,8 @@
         <w:t xml:space="preserve">.</w:t>
       </w:r>
     </w:p>
-    <w:bookmarkEnd w:id="80"/>
-    <w:bookmarkStart w:id="82" w:name="exm-biased-variance-mle"/>
+    <w:bookmarkEnd w:id="81"/>
+    <w:bookmarkStart w:id="83" w:name="exm-biased-variance-mle"/>
     <w:p>
       <w:pPr>
         <w:pStyle w:val="BodyText"/>
@@ -15067,7 +15119,7 @@
       <w:r>
         <w:t xml:space="preserve"> </w:t>
       </w:r>
-      <w:hyperlink r:id="rId81">
+      <w:hyperlink r:id="rId82">
         <w:r>
           <w:rPr>
             <w:rStyle w:val="Hyperlink"/>
@@ -20239,8 +20291,8 @@
         <w:t xml:space="preserve">grows.</w:t>
       </w:r>
     </w:p>
-    <w:bookmarkEnd w:id="82"/>
-    <w:bookmarkStart w:id="83" w:name="exr-unbiased-exp"/>
+    <w:bookmarkEnd w:id="83"/>
+    <w:bookmarkStart w:id="84" w:name="exr-unbiased-exp"/>
     <w:p>
       <w:pPr>
         <w:pStyle w:val="BodyText"/>
@@ -20371,8 +20423,8 @@
         <w:t xml:space="preserve">.</w:t>
       </w:r>
     </w:p>
-    <w:bookmarkEnd w:id="83"/>
-    <w:bookmarkStart w:id="84" w:name="sol-unbiased-exp"/>
+    <w:bookmarkEnd w:id="84"/>
+    <w:bookmarkStart w:id="85" w:name="sol-unbiased-exp"/>
     <w:p>
       <w:pPr>
         <w:pStyle w:val="BodyText"/>
@@ -20597,8 +20649,8 @@
         <w:t xml:space="preserve">.</w:t>
       </w:r>
     </w:p>
-    <w:bookmarkEnd w:id="84"/>
-    <w:bookmarkStart w:id="85" w:name="exr-unbiased-mse"/>
+    <w:bookmarkEnd w:id="85"/>
+    <w:bookmarkStart w:id="86" w:name="exr-unbiased-mse"/>
     <w:p>
       <w:pPr>
         <w:pStyle w:val="BodyText"/>
@@ -20692,8 +20744,8 @@
         <w:t xml:space="preserve">in terms of its variance.</w:t>
       </w:r>
     </w:p>
-    <w:bookmarkEnd w:id="85"/>
-    <w:bookmarkStart w:id="86" w:name="sol-unbiased-mse"/>
+    <w:bookmarkEnd w:id="86"/>
+    <w:bookmarkStart w:id="87" w:name="sol-unbiased-mse"/>
     <w:p>
       <w:pPr>
         <w:pStyle w:val="BodyText"/>
@@ -21032,8 +21084,8 @@
         </m:oMath>
       </m:oMathPara>
     </w:p>
-    <w:bookmarkEnd w:id="86"/>
-    <w:bookmarkStart w:id="89" w:name="thm-unbiased-props"/>
+    <w:bookmarkEnd w:id="87"/>
+    <w:bookmarkStart w:id="90" w:name="thm-unbiased-props"/>
     <w:p>
       <w:pPr>
         <w:pStyle w:val="FirstParagraph"/>
@@ -21105,7 +21157,7 @@
       <w:pPr>
         <w:pStyle w:val="BodyText"/>
       </w:pPr>
-      <w:bookmarkStart w:id="87" w:name="eq-unbiased-exp"/>
+      <w:bookmarkStart w:id="88" w:name="eq-unbiased-exp"/>
       <m:oMathPara>
         <m:oMathParaPr>
           <m:jc m:val="center"/>
@@ -21172,13 +21224,13 @@
           </m:r>
         </m:oMath>
       </m:oMathPara>
-      <w:bookmarkEnd w:id="87"/>
+      <w:bookmarkEnd w:id="88"/>
     </w:p>
     <w:p>
       <w:pPr>
         <w:pStyle w:val="FirstParagraph"/>
       </w:pPr>
-      <w:bookmarkStart w:id="88" w:name="eq-unbiased-mse"/>
+      <w:bookmarkStart w:id="89" w:name="eq-unbiased-mse"/>
       <m:oMathPara>
         <m:oMathParaPr>
           <m:jc m:val="center"/>
@@ -21274,9 +21326,9 @@
           </m:r>
         </m:oMath>
       </m:oMathPara>
-      <w:bookmarkEnd w:id="88"/>
+      <w:bookmarkEnd w:id="89"/>
     </w:p>
-    <w:bookmarkEnd w:id="89"/>
+    <w:bookmarkEnd w:id="90"/>
     <w:p>
       <w:pPr>
         <w:pStyle w:val="FirstParagraph"/>
@@ -21367,7 +21419,7 @@
       <w:r>
         <w:t xml:space="preserve"> </w:t>
       </w:r>
-      <w:hyperlink r:id="rId90">
+      <w:hyperlink r:id="rId91">
         <w:r>
           <w:rPr>
             <w:rStyle w:val="Hyperlink"/>
@@ -21394,8 +21446,8 @@
         <w:t xml:space="preserve">.</w:t>
       </w:r>
     </w:p>
-    <w:bookmarkEnd w:id="91"/>
-    <w:bookmarkStart w:id="94" w:name="mean-absolute-error"/>
+    <w:bookmarkEnd w:id="92"/>
+    <w:bookmarkStart w:id="95" w:name="mean-absolute-error"/>
     <w:p>
       <w:pPr>
         <w:pStyle w:val="Heading3"/>
@@ -21404,7 +21456,7 @@
         <w:t xml:space="preserve">3.7 Population mean absolute error</w:t>
       </w:r>
     </w:p>
-    <w:bookmarkStart w:id="92" w:name="def-mae"/>
+    <w:bookmarkStart w:id="93" w:name="def-mae"/>
     <w:p>
       <w:pPr>
         <w:pStyle w:val="FirstParagraph"/>
@@ -21631,8 +21683,8 @@
         <w:t xml:space="preserve">.</w:t>
       </w:r>
     </w:p>
-    <w:bookmarkEnd w:id="92"/>
-    <w:bookmarkStart w:id="93" w:name="exm-mae-gaussian"/>
+    <w:bookmarkEnd w:id="93"/>
+    <w:bookmarkStart w:id="94" w:name="exm-mae-gaussian"/>
     <w:p>
       <w:pPr>
         <w:pStyle w:val="BodyText"/>
@@ -24038,9 +24090,9 @@
         <w:t xml:space="preserve">).</w:t>
       </w:r>
     </w:p>
-    <w:bookmarkEnd w:id="93"/>
     <w:bookmarkEnd w:id="94"/>
-    <w:bookmarkStart w:id="108" w:name="standard-error"/>
+    <w:bookmarkEnd w:id="95"/>
+    <w:bookmarkStart w:id="109" w:name="standard-error"/>
     <w:p>
       <w:pPr>
         <w:pStyle w:val="Heading3"/>
@@ -24049,7 +24101,7 @@
         <w:t xml:space="preserve">3.8 Standard error</w:t>
       </w:r>
     </w:p>
-    <w:bookmarkStart w:id="96" w:name="def-SE"/>
+    <w:bookmarkStart w:id="97" w:name="def-SE"/>
     <w:p>
       <w:pPr>
         <w:pStyle w:val="FirstParagraph"/>
@@ -24107,7 +24159,7 @@
       <w:r>
         <w:t xml:space="preserve"> </w:t>
       </w:r>
-      <w:hyperlink r:id="rId95">
+      <w:hyperlink r:id="rId96">
         <w:r>
           <w:rPr>
             <w:rStyle w:val="Hyperlink"/>
@@ -24252,8 +24304,8 @@
         <w:t xml:space="preserve">.</w:t>
       </w:r>
     </w:p>
-    <w:bookmarkEnd w:id="96"/>
-    <w:bookmarkStart w:id="97" w:name="exm-SE-sample-mean"/>
+    <w:bookmarkEnd w:id="97"/>
+    <w:bookmarkStart w:id="98" w:name="exm-SE-sample-mean"/>
     <w:p>
       <w:pPr>
         <w:pStyle w:val="BodyText"/>
@@ -24565,8 +24617,8 @@
         <w:t xml:space="preserve">.</w:t>
       </w:r>
     </w:p>
-    <w:bookmarkEnd w:id="97"/>
-    <w:bookmarkStart w:id="98" w:name="exr-se-error-sd"/>
+    <w:bookmarkEnd w:id="98"/>
+    <w:bookmarkStart w:id="99" w:name="exr-se-error-sd"/>
     <w:p>
       <w:pPr>
         <w:pStyle w:val="BodyText"/>
@@ -24587,7 +24639,7 @@
       <w:r>
         <w:t xml:space="preserve"> </w:t>
       </w:r>
-      <w:hyperlink r:id="rId95">
+      <w:hyperlink r:id="rId96">
         <w:r>
           <w:rPr>
             <w:rStyle w:val="Hyperlink"/>
@@ -24688,8 +24740,8 @@
         <w:t xml:space="preserve">.</w:t>
       </w:r>
     </w:p>
-    <w:bookmarkEnd w:id="98"/>
-    <w:bookmarkStart w:id="99" w:name="sol-se-error-sd"/>
+    <w:bookmarkEnd w:id="99"/>
+    <w:bookmarkStart w:id="100" w:name="sol-se-error-sd"/>
     <w:p>
       <w:pPr>
         <w:pStyle w:val="BodyText"/>
@@ -25056,8 +25108,8 @@
         </m:oMath>
       </m:oMathPara>
     </w:p>
-    <w:bookmarkEnd w:id="99"/>
-    <w:bookmarkStart w:id="100" w:name="thm-se-error-sd"/>
+    <w:bookmarkEnd w:id="100"/>
+    <w:bookmarkStart w:id="101" w:name="thm-se-error-sd"/>
     <w:p>
       <w:pPr>
         <w:pStyle w:val="FirstParagraph"/>
@@ -25171,7 +25223,7 @@
         </m:oMath>
       </m:oMathPara>
     </w:p>
-    <w:bookmarkEnd w:id="100"/>
+    <w:bookmarkEnd w:id="101"/>
     <w:p>
       <w:pPr>
         <w:pStyle w:val="FirstParagraph"/>
@@ -25204,7 +25256,7 @@
         <w:t xml:space="preserve">.</w:t>
       </w:r>
     </w:p>
-    <w:bookmarkStart w:id="101" w:name="rem-standard-error-name"/>
+    <w:bookmarkStart w:id="102" w:name="rem-standard-error-name"/>
     <w:p>
       <w:pPr>
         <w:pStyle w:val="BodyText"/>
@@ -25314,8 +25366,8 @@
         <w:t xml:space="preserve">so they come up often enough to deserve their own name.</w:t>
       </w:r>
     </w:p>
-    <w:bookmarkEnd w:id="101"/>
-    <w:bookmarkStart w:id="102" w:name="exr-var-mse-bias"/>
+    <w:bookmarkEnd w:id="102"/>
+    <w:bookmarkStart w:id="103" w:name="exr-var-mse-bias"/>
     <w:p>
       <w:pPr>
         <w:pStyle w:val="BodyText"/>
@@ -25485,8 +25537,8 @@
         <w:t xml:space="preserve">.</w:t>
       </w:r>
     </w:p>
-    <w:bookmarkEnd w:id="102"/>
-    <w:bookmarkStart w:id="103" w:name="sol-var-mse-bias"/>
+    <w:bookmarkEnd w:id="103"/>
+    <w:bookmarkStart w:id="104" w:name="sol-var-mse-bias"/>
     <w:p>
       <w:pPr>
         <w:pStyle w:val="BodyText"/>
@@ -26413,8 +26465,8 @@
         </m:oMath>
       </m:oMathPara>
     </w:p>
-    <w:bookmarkEnd w:id="103"/>
-    <w:bookmarkStart w:id="104" w:name="cor-var-mse-bias"/>
+    <w:bookmarkEnd w:id="104"/>
+    <w:bookmarkStart w:id="105" w:name="cor-var-mse-bias"/>
     <w:p>
       <w:pPr>
         <w:pStyle w:val="FirstParagraph"/>
@@ -26609,7 +26661,7 @@
         </m:oMath>
       </m:oMathPara>
     </w:p>
-    <w:bookmarkEnd w:id="104"/>
+    <w:bookmarkEnd w:id="105"/>
     <w:p>
       <w:pPr>
         <w:pStyle w:val="FirstParagraph"/>
@@ -26642,7 +26694,7 @@
         <w:t xml:space="preserve">.</w:t>
       </w:r>
     </w:p>
-    <w:bookmarkStart w:id="105" w:name="exr-se-rmse-unbiased"/>
+    <w:bookmarkStart w:id="106" w:name="exr-se-rmse-unbiased"/>
     <w:p>
       <w:pPr>
         <w:pStyle w:val="BodyText"/>
@@ -26750,8 +26802,8 @@
         <w:t xml:space="preserve">.</w:t>
       </w:r>
     </w:p>
-    <w:bookmarkEnd w:id="105"/>
-    <w:bookmarkStart w:id="106" w:name="sol-se-rmse-unbiased"/>
+    <w:bookmarkEnd w:id="106"/>
+    <w:bookmarkStart w:id="107" w:name="sol-se-rmse-unbiased"/>
     <w:p>
       <w:pPr>
         <w:pStyle w:val="BodyText"/>
@@ -27014,8 +27066,8 @@
         </m:oMath>
       </m:oMathPara>
     </w:p>
-    <w:bookmarkEnd w:id="106"/>
-    <w:bookmarkStart w:id="107" w:name="cor-se-rmse-unbiased"/>
+    <w:bookmarkEnd w:id="107"/>
+    <w:bookmarkStart w:id="108" w:name="cor-se-rmse-unbiased"/>
     <w:p>
       <w:pPr>
         <w:pStyle w:val="FirstParagraph"/>
@@ -27173,7 +27225,7 @@
         </m:oMath>
       </m:oMathPara>
     </w:p>
-    <w:bookmarkEnd w:id="107"/>
+    <w:bookmarkEnd w:id="108"/>
     <w:p>
       <w:pPr>
         <w:pStyle w:val="FirstParagraph"/>
@@ -27206,9 +27258,9 @@
         <w:t xml:space="preserve">.</w:t>
       </w:r>
     </w:p>
-    <w:bookmarkEnd w:id="108"/>
     <w:bookmarkEnd w:id="109"/>
-    <w:bookmarkStart w:id="142" w:name="references"/>
+    <w:bookmarkEnd w:id="110"/>
+    <w:bookmarkStart w:id="143" w:name="references"/>
     <w:p>
       <w:pPr>
         <w:pStyle w:val="Heading2"/>
@@ -27217,8 +27269,8 @@
         <w:t xml:space="preserve">References</w:t>
       </w:r>
     </w:p>
-    <w:bookmarkStart w:id="141" w:name="refs"/>
-    <w:bookmarkStart w:id="110" w:name="ref-box_draper_1987"/>
+    <w:bookmarkStart w:id="142" w:name="refs"/>
+    <w:bookmarkStart w:id="111" w:name="ref-box_draper_1987"/>
     <w:p>
       <w:pPr>
         <w:pStyle w:val="Bibliography"/>
@@ -27249,8 +27301,8 @@
         <w:t xml:space="preserve">. in Wiley series in probability and mathematical statistics. Applied probability and statistics. New York: Wiley, 1987.</w:t>
       </w:r>
     </w:p>
-    <w:bookmarkEnd w:id="110"/>
-    <w:bookmarkStart w:id="112" w:name="ref-dunn2018generalized"/>
+    <w:bookmarkEnd w:id="111"/>
+    <w:bookmarkStart w:id="113" w:name="ref-dunn2018generalized"/>
     <w:p>
       <w:pPr>
         <w:pStyle w:val="Bibliography"/>
@@ -27297,7 +27349,7 @@
       <w:r>
         <w:t xml:space="preserve"> </w:t>
       </w:r>
-      <w:hyperlink r:id="rId111">
+      <w:hyperlink r:id="rId112">
         <w:r>
           <w:rPr>
             <w:rStyle w:val="Hyperlink"/>
@@ -27309,8 +27361,8 @@
         <w:t xml:space="preserve">.</w:t>
       </w:r>
     </w:p>
-    <w:bookmarkEnd w:id="112"/>
-    <w:bookmarkStart w:id="114" w:name="ref-van2018flexible"/>
+    <w:bookmarkEnd w:id="113"/>
+    <w:bookmarkStart w:id="115" w:name="ref-van2018flexible"/>
     <w:p>
       <w:pPr>
         <w:pStyle w:val="Bibliography"/>
@@ -27343,7 +27395,7 @@
       <w:r>
         <w:t xml:space="preserve"> </w:t>
       </w:r>
-      <w:hyperlink r:id="rId113">
+      <w:hyperlink r:id="rId114">
         <w:r>
           <w:rPr>
             <w:rStyle w:val="Hyperlink"/>
@@ -27352,8 +27404,8 @@
         </w:r>
       </w:hyperlink>
     </w:p>
-    <w:bookmarkEnd w:id="114"/>
-    <w:bookmarkStart w:id="116" w:name="ref-pohl2021estimands"/>
+    <w:bookmarkEnd w:id="115"/>
+    <w:bookmarkStart w:id="117" w:name="ref-pohl2021estimands"/>
     <w:p>
       <w:pPr>
         <w:pStyle w:val="Bibliography"/>
@@ -27419,7 +27471,7 @@
       <w:r>
         <w:t xml:space="preserve"> </w:t>
       </w:r>
-      <w:hyperlink r:id="rId115">
+      <w:hyperlink r:id="rId116">
         <w:r>
           <w:rPr>
             <w:rStyle w:val="Hyperlink"/>
@@ -27431,8 +27483,8 @@
         <w:t xml:space="preserve">.</w:t>
       </w:r>
     </w:p>
-    <w:bookmarkEnd w:id="116"/>
-    <w:bookmarkStart w:id="118" w:name="ref-lawrance2020estimand"/>
+    <w:bookmarkEnd w:id="117"/>
+    <w:bookmarkStart w:id="119" w:name="ref-lawrance2020estimand"/>
     <w:p>
       <w:pPr>
         <w:pStyle w:val="Bibliography"/>
@@ -27484,7 +27536,7 @@
       <w:r>
         <w:t xml:space="preserve"> </w:t>
       </w:r>
-      <w:hyperlink r:id="rId117">
+      <w:hyperlink r:id="rId118">
         <w:r>
           <w:rPr>
             <w:rStyle w:val="Hyperlink"/>
@@ -27496,8 +27548,8 @@
         <w:t xml:space="preserve">.</w:t>
       </w:r>
     </w:p>
-    <w:bookmarkEnd w:id="118"/>
-    <w:bookmarkStart w:id="120" w:name="ref-wikipedia_estimand"/>
+    <w:bookmarkEnd w:id="119"/>
+    <w:bookmarkStart w:id="121" w:name="ref-wikipedia_estimand"/>
     <w:p>
       <w:pPr>
         <w:pStyle w:val="Bibliography"/>
@@ -27544,7 +27596,7 @@
       <w:r>
         <w:t xml:space="preserve"> </w:t>
       </w:r>
-      <w:hyperlink r:id="rId119">
+      <w:hyperlink r:id="rId120">
         <w:r>
           <w:rPr>
             <w:rStyle w:val="Hyperlink"/>
@@ -27553,8 +27605,8 @@
         </w:r>
       </w:hyperlink>
     </w:p>
-    <w:bookmarkEnd w:id="120"/>
-    <w:bookmarkStart w:id="122" w:name="ref-wikipedia_estimator"/>
+    <w:bookmarkEnd w:id="121"/>
+    <w:bookmarkStart w:id="123" w:name="ref-wikipedia_estimator"/>
     <w:p>
       <w:pPr>
         <w:pStyle w:val="Bibliography"/>
@@ -27601,7 +27653,7 @@
       <w:r>
         <w:t xml:space="preserve"> </w:t>
       </w:r>
-      <w:hyperlink r:id="rId121">
+      <w:hyperlink r:id="rId122">
         <w:r>
           <w:rPr>
             <w:rStyle w:val="Hyperlink"/>
@@ -27610,8 +27662,8 @@
         </w:r>
       </w:hyperlink>
     </w:p>
-    <w:bookmarkEnd w:id="122"/>
-    <w:bookmarkStart w:id="124" w:name="ref-wikipedia_sampling_distribution"/>
+    <w:bookmarkEnd w:id="123"/>
+    <w:bookmarkStart w:id="125" w:name="ref-wikipedia_sampling_distribution"/>
     <w:p>
       <w:pPr>
         <w:pStyle w:val="Bibliography"/>
@@ -27658,7 +27710,7 @@
       <w:r>
         <w:t xml:space="preserve"> </w:t>
       </w:r>
-      <w:hyperlink r:id="rId123">
+      <w:hyperlink r:id="rId124">
         <w:r>
           <w:rPr>
             <w:rStyle w:val="Hyperlink"/>
@@ -27667,8 +27719,8 @@
         </w:r>
       </w:hyperlink>
     </w:p>
-    <w:bookmarkEnd w:id="124"/>
-    <w:bookmarkStart w:id="125" w:name="ref-hoggtanis2015"/>
+    <w:bookmarkEnd w:id="125"/>
+    <w:bookmarkStart w:id="126" w:name="ref-hoggtanis2015"/>
     <w:p>
       <w:pPr>
         <w:pStyle w:val="Bibliography"/>
@@ -27699,8 +27751,8 @@
         <w:t xml:space="preserve">, Tenth edition. Boston: Pearson, 2019.</w:t>
       </w:r>
     </w:p>
-    <w:bookmarkEnd w:id="125"/>
-    <w:bookmarkStart w:id="127" w:name="ref-CaseBerg01"/>
+    <w:bookmarkEnd w:id="126"/>
+    <w:bookmarkStart w:id="128" w:name="ref-CaseBerg01"/>
     <w:p>
       <w:pPr>
         <w:pStyle w:val="Bibliography"/>
@@ -27733,7 +27785,7 @@
       <w:r>
         <w:t xml:space="preserve"> </w:t>
       </w:r>
-      <w:hyperlink r:id="rId126">
+      <w:hyperlink r:id="rId127">
         <w:r>
           <w:rPr>
             <w:rStyle w:val="Hyperlink"/>
@@ -27742,8 +27794,8 @@
         </w:r>
       </w:hyperlink>
     </w:p>
-    <w:bookmarkEnd w:id="127"/>
-    <w:bookmarkStart w:id="128" w:name="ref-rice2007mathematical"/>
+    <w:bookmarkEnd w:id="128"/>
+    <w:bookmarkStart w:id="129" w:name="ref-rice2007mathematical"/>
     <w:p>
       <w:pPr>
         <w:pStyle w:val="Bibliography"/>
@@ -27774,8 +27826,8 @@
         <w:t xml:space="preserve">, 3rd ed. Belmont, CA: Cengage Learning, 2007.</w:t>
       </w:r>
     </w:p>
-    <w:bookmarkEnd w:id="128"/>
-    <w:bookmarkStart w:id="130" w:name="ref-wikipedia_bias_of_an_estimator"/>
+    <w:bookmarkEnd w:id="129"/>
+    <w:bookmarkStart w:id="131" w:name="ref-wikipedia_bias_of_an_estimator"/>
     <w:p>
       <w:pPr>
         <w:pStyle w:val="Bibliography"/>
@@ -27822,7 +27874,7 @@
       <w:r>
         <w:t xml:space="preserve"> </w:t>
       </w:r>
-      <w:hyperlink r:id="rId129">
+      <w:hyperlink r:id="rId130">
         <w:r>
           <w:rPr>
             <w:rStyle w:val="Hyperlink"/>
@@ -27831,8 +27883,8 @@
         </w:r>
       </w:hyperlink>
     </w:p>
-    <w:bookmarkEnd w:id="130"/>
-    <w:bookmarkStart w:id="132" w:name="ref-wikipedia_mean_squared_error"/>
+    <w:bookmarkEnd w:id="131"/>
+    <w:bookmarkStart w:id="133" w:name="ref-wikipedia_mean_squared_error"/>
     <w:p>
       <w:pPr>
         <w:pStyle w:val="Bibliography"/>
@@ -27879,7 +27931,7 @@
       <w:r>
         <w:t xml:space="preserve"> </w:t>
       </w:r>
-      <w:hyperlink r:id="rId131">
+      <w:hyperlink r:id="rId132">
         <w:r>
           <w:rPr>
             <w:rStyle w:val="Hyperlink"/>
@@ -27888,8 +27940,8 @@
         </w:r>
       </w:hyperlink>
     </w:p>
-    <w:bookmarkEnd w:id="132"/>
-    <w:bookmarkStart w:id="134" w:name="ref-wikipedia_root_mean_square_deviation"/>
+    <w:bookmarkEnd w:id="133"/>
+    <w:bookmarkStart w:id="135" w:name="ref-wikipedia_root_mean_square_deviation"/>
     <w:p>
       <w:pPr>
         <w:pStyle w:val="Bibliography"/>
@@ -27936,7 +27988,7 @@
       <w:r>
         <w:t xml:space="preserve"> </w:t>
       </w:r>
-      <w:hyperlink r:id="rId133">
+      <w:hyperlink r:id="rId134">
         <w:r>
           <w:rPr>
             <w:rStyle w:val="Hyperlink"/>
@@ -27945,8 +27997,8 @@
         </w:r>
       </w:hyperlink>
     </w:p>
-    <w:bookmarkEnd w:id="134"/>
-    <w:bookmarkStart w:id="136" w:name="ref-fiveminuteai_probstat"/>
+    <w:bookmarkEnd w:id="135"/>
+    <w:bookmarkStart w:id="137" w:name="ref-fiveminuteai_probstat"/>
     <w:p>
       <w:pPr>
         <w:pStyle w:val="Bibliography"/>
@@ -27978,7 +28030,7 @@
       <w:r>
         <w:t xml:space="preserve"> </w:t>
       </w:r>
-      <w:hyperlink r:id="rId135">
+      <w:hyperlink r:id="rId136">
         <w:r>
           <w:rPr>
             <w:rStyle w:val="Hyperlink"/>
@@ -27987,8 +28039,8 @@
         </w:r>
       </w:hyperlink>
     </w:p>
-    <w:bookmarkEnd w:id="136"/>
-    <w:bookmarkStart w:id="138" w:name="ref-wikipedia_mean_absolute_error"/>
+    <w:bookmarkEnd w:id="137"/>
+    <w:bookmarkStart w:id="139" w:name="ref-wikipedia_mean_absolute_error"/>
     <w:p>
       <w:pPr>
         <w:pStyle w:val="Bibliography"/>
@@ -28035,7 +28087,7 @@
       <w:r>
         <w:t xml:space="preserve"> </w:t>
       </w:r>
-      <w:hyperlink r:id="rId137">
+      <w:hyperlink r:id="rId138">
         <w:r>
           <w:rPr>
             <w:rStyle w:val="Hyperlink"/>
@@ -28044,8 +28096,8 @@
         </w:r>
       </w:hyperlink>
     </w:p>
-    <w:bookmarkEnd w:id="138"/>
-    <w:bookmarkStart w:id="140" w:name="ref-wikipedia_standard_error"/>
+    <w:bookmarkEnd w:id="139"/>
+    <w:bookmarkStart w:id="141" w:name="ref-wikipedia_standard_error"/>
     <w:p>
       <w:pPr>
         <w:pStyle w:val="Bibliography"/>
@@ -28092,7 +28144,7 @@
       <w:r>
         <w:t xml:space="preserve"> </w:t>
       </w:r>
-      <w:hyperlink r:id="rId139">
+      <w:hyperlink r:id="rId140">
         <w:r>
           <w:rPr>
             <w:rStyle w:val="Hyperlink"/>
@@ -28101,9 +28153,9 @@
         </w:r>
       </w:hyperlink>
     </w:p>
-    <w:bookmarkEnd w:id="140"/>
     <w:bookmarkEnd w:id="141"/>
     <w:bookmarkEnd w:id="142"/>
+    <w:bookmarkEnd w:id="143"/>
     <w:sectPr>
       <w:footnotePr>
         <w:numRestart w:val="eachSect"/>

</xml_diff>

<commit_message>
Deploying to gh-pages from @ Morrison-Lab/sds@626b823c5797e06adedafc6ad0e8bc4130f767ea 🚀
</commit_message>
<xml_diff>
--- a/estimation-handout.docx
+++ b/estimation-handout.docx
@@ -15,7 +15,7 @@
         <w:pStyle w:val="Date"/>
       </w:pPr>
       <w:r>
-        <w:t xml:space="preserve">Last modified: 2026-10-27 10:45:41 (PDT)</w:t>
+        <w:t xml:space="preserve">Last modified: 2026-10-27 11:13:53 (PDT)</w:t>
       </w:r>
     </w:p>
     <w:bookmarkStart w:id="15" w:name="scientific-models"/>
@@ -3890,7 +3890,7 @@
     </w:p>
     <w:bookmarkEnd w:id="38"/>
     <w:bookmarkEnd w:id="39"/>
-    <w:bookmarkStart w:id="110" w:name="sec-est-accuracy"/>
+    <w:bookmarkStart w:id="111" w:name="sec-est-accuracy"/>
     <w:p>
       <w:pPr>
         <w:pStyle w:val="Heading2"/>
@@ -6805,7 +6805,7 @@
     </w:p>
     <w:bookmarkEnd w:id="51"/>
     <w:bookmarkEnd w:id="52"/>
-    <w:bookmarkStart w:id="78" w:name="mean-squared-error"/>
+    <w:bookmarkStart w:id="79" w:name="mean-squared-error"/>
     <w:p>
       <w:pPr>
         <w:pStyle w:val="Heading3"/>
@@ -12252,7 +12252,7 @@
         <w:t xml:space="preserve">so they are equal to each other.</w:t>
       </w:r>
     </w:p>
-    <w:bookmarkStart w:id="71" w:name="rem-mse-bias-variance-prediction"/>
+    <w:bookmarkStart w:id="72" w:name="rem-mse-bias-variance-prediction"/>
     <w:p>
       <w:pPr>
         <w:pStyle w:val="BodyText"/>
@@ -12400,7 +12400,7 @@
           <w:rPr>
             <w:rStyle w:val="Hyperlink"/>
           </w:rPr>
-          <w:t xml:space="preserve">irreducible error</w:t>
+          <w:t xml:space="preserve">residual variance</w:t>
         </w:r>
       </w:hyperlink>
       <w:r>
@@ -12413,11 +12413,28 @@
         <w:t xml:space="preserve"> </w:t>
       </w:r>
       <w:r>
-        <w:t xml:space="preserve">No choice of prediction can remove the extra term.</w:t>
+        <w:t xml:space="preserve">No choice of prediction using the same</w:t>
+      </w:r>
+      <w:r>
+        <w:t xml:space="preserve"> </w:t>
+      </w:r>
+      <w:hyperlink r:id="rId71">
+        <w:r>
+          <w:rPr>
+            <w:rStyle w:val="Hyperlink"/>
+          </w:rPr>
+          <w:t xml:space="preserve">covariates</w:t>
+        </w:r>
+      </w:hyperlink>
+      <w:r>
+        <w:t xml:space="preserve"> </w:t>
+      </w:r>
+      <w:r>
+        <w:t xml:space="preserve">can remove the extra term.</w:t>
       </w:r>
     </w:p>
-    <w:bookmarkEnd w:id="71"/>
-    <w:bookmarkStart w:id="74" w:name="exm-mse-sample-mean"/>
+    <w:bookmarkEnd w:id="72"/>
+    <w:bookmarkStart w:id="75" w:name="exm-mse-sample-mean"/>
     <w:p>
       <w:pPr>
         <w:pStyle w:val="FirstParagraph"/>
@@ -13829,7 +13846,7 @@
       <w:r>
         <w:t xml:space="preserve"> </w:t>
       </w:r>
-      <w:hyperlink r:id="rId72">
+      <w:hyperlink r:id="rId73">
         <w:r>
           <w:rPr>
             <w:rStyle w:val="Hyperlink"/>
@@ -13887,7 +13904,7 @@
       <w:r>
         <w:t xml:space="preserve"> </w:t>
       </w:r>
-      <w:hyperlink r:id="rId73">
+      <w:hyperlink r:id="rId74">
         <w:r>
           <w:rPr>
             <w:rStyle w:val="Hyperlink"/>
@@ -14179,8 +14196,8 @@
         <w:t xml:space="preserve">’s.</w:t>
       </w:r>
     </w:p>
-    <w:bookmarkEnd w:id="74"/>
-    <w:bookmarkStart w:id="75" w:name="def-rmse"/>
+    <w:bookmarkEnd w:id="75"/>
+    <w:bookmarkStart w:id="76" w:name="def-rmse"/>
     <w:p>
       <w:pPr>
         <w:pStyle w:val="BodyText"/>
@@ -14392,8 +14409,8 @@
         <w:t xml:space="preserve">.</w:t>
       </w:r>
     </w:p>
-    <w:bookmarkEnd w:id="75"/>
-    <w:bookmarkStart w:id="76" w:name="exm-rmse-sample-mean"/>
+    <w:bookmarkEnd w:id="76"/>
+    <w:bookmarkStart w:id="77" w:name="exm-rmse-sample-mean"/>
     <w:p>
       <w:pPr>
         <w:pStyle w:val="BodyText"/>
@@ -14481,8 +14498,8 @@
         <w:t xml:space="preserve">.</w:t>
       </w:r>
     </w:p>
-    <w:bookmarkEnd w:id="76"/>
-    <w:bookmarkStart w:id="77" w:name="rem-rmse-units"/>
+    <w:bookmarkEnd w:id="77"/>
+    <w:bookmarkStart w:id="78" w:name="rem-rmse-units"/>
     <w:p>
       <w:pPr>
         <w:pStyle w:val="BodyText"/>
@@ -14501,7 +14518,7 @@
         <w:t xml:space="preserve">The pRMSE has the same units as the estimand.</w:t>
       </w:r>
     </w:p>
-    <w:bookmarkEnd w:id="77"/>
+    <w:bookmarkEnd w:id="78"/>
     <w:p>
       <w:pPr>
         <w:pStyle w:val="BodyText"/>
@@ -14516,8 +14533,8 @@
         <w:t xml:space="preserve">covers mean squared error.</w:t>
       </w:r>
     </w:p>
-    <w:bookmarkEnd w:id="78"/>
-    <w:bookmarkStart w:id="92" w:name="sec-unbiased-estimators"/>
+    <w:bookmarkEnd w:id="79"/>
+    <w:bookmarkStart w:id="93" w:name="sec-unbiased-estimators"/>
     <w:p>
       <w:pPr>
         <w:pStyle w:val="Heading3"/>
@@ -14526,7 +14543,7 @@
         <w:t xml:space="preserve">3.6 Unbiased estimators</w:t>
       </w:r>
     </w:p>
-    <w:bookmarkStart w:id="79" w:name="def-unbiased"/>
+    <w:bookmarkStart w:id="80" w:name="def-unbiased"/>
     <w:p>
       <w:pPr>
         <w:pStyle w:val="FirstParagraph"/>
@@ -14652,8 +14669,8 @@
         </m:oMath>
       </m:oMathPara>
     </w:p>
-    <w:bookmarkEnd w:id="79"/>
-    <w:bookmarkStart w:id="80" w:name="def-biased"/>
+    <w:bookmarkEnd w:id="80"/>
+    <w:bookmarkStart w:id="81" w:name="def-biased"/>
     <w:p>
       <w:pPr>
         <w:pStyle w:val="FirstParagraph"/>
@@ -14779,8 +14796,8 @@
         </m:oMath>
       </m:oMathPara>
     </w:p>
-    <w:bookmarkEnd w:id="80"/>
-    <w:bookmarkStart w:id="81" w:name="exm-unbiased-sample-mean"/>
+    <w:bookmarkEnd w:id="81"/>
+    <w:bookmarkStart w:id="82" w:name="exm-unbiased-sample-mean"/>
     <w:p>
       <w:pPr>
         <w:pStyle w:val="FirstParagraph"/>
@@ -14994,8 +15011,8 @@
         <w:t xml:space="preserve">.</w:t>
       </w:r>
     </w:p>
-    <w:bookmarkEnd w:id="81"/>
-    <w:bookmarkStart w:id="83" w:name="exm-biased-variance-mle"/>
+    <w:bookmarkEnd w:id="82"/>
+    <w:bookmarkStart w:id="84" w:name="exm-biased-variance-mle"/>
     <w:p>
       <w:pPr>
         <w:pStyle w:val="BodyText"/>
@@ -15173,7 +15190,7 @@
       <w:r>
         <w:t xml:space="preserve"> </w:t>
       </w:r>
-      <w:hyperlink r:id="rId82">
+      <w:hyperlink r:id="rId83">
         <w:r>
           <w:rPr>
             <w:rStyle w:val="Hyperlink"/>
@@ -20371,8 +20388,8 @@
         <w:t xml:space="preserve">grows.</w:t>
       </w:r>
     </w:p>
-    <w:bookmarkEnd w:id="83"/>
-    <w:bookmarkStart w:id="84" w:name="exr-unbiased-exp"/>
+    <w:bookmarkEnd w:id="84"/>
+    <w:bookmarkStart w:id="85" w:name="exr-unbiased-exp"/>
     <w:p>
       <w:pPr>
         <w:pStyle w:val="BodyText"/>
@@ -20504,8 +20521,8 @@
         <w:t xml:space="preserve">.</w:t>
       </w:r>
     </w:p>
-    <w:bookmarkEnd w:id="84"/>
-    <w:bookmarkStart w:id="85" w:name="sol-unbiased-exp"/>
+    <w:bookmarkEnd w:id="85"/>
+    <w:bookmarkStart w:id="86" w:name="sol-unbiased-exp"/>
     <w:p>
       <w:pPr>
         <w:pStyle w:val="BodyText"/>
@@ -20732,8 +20749,8 @@
         <w:t xml:space="preserve">.</w:t>
       </w:r>
     </w:p>
-    <w:bookmarkEnd w:id="85"/>
-    <w:bookmarkStart w:id="86" w:name="exr-unbiased-mse"/>
+    <w:bookmarkEnd w:id="86"/>
+    <w:bookmarkStart w:id="87" w:name="exr-unbiased-mse"/>
     <w:p>
       <w:pPr>
         <w:pStyle w:val="BodyText"/>
@@ -20827,8 +20844,8 @@
         <w:t xml:space="preserve">in terms of its variance.</w:t>
       </w:r>
     </w:p>
-    <w:bookmarkEnd w:id="86"/>
-    <w:bookmarkStart w:id="87" w:name="sol-unbiased-mse"/>
+    <w:bookmarkEnd w:id="87"/>
+    <w:bookmarkStart w:id="88" w:name="sol-unbiased-mse"/>
     <w:p>
       <w:pPr>
         <w:pStyle w:val="BodyText"/>
@@ -21167,8 +21184,8 @@
         </m:oMath>
       </m:oMathPara>
     </w:p>
-    <w:bookmarkEnd w:id="87"/>
-    <w:bookmarkStart w:id="90" w:name="thm-unbiased-props"/>
+    <w:bookmarkEnd w:id="88"/>
+    <w:bookmarkStart w:id="91" w:name="thm-unbiased-props"/>
     <w:p>
       <w:pPr>
         <w:pStyle w:val="FirstParagraph"/>
@@ -21240,7 +21257,7 @@
       <w:pPr>
         <w:pStyle w:val="BodyText"/>
       </w:pPr>
-      <w:bookmarkStart w:id="88" w:name="eq-unbiased-exp"/>
+      <w:bookmarkStart w:id="89" w:name="eq-unbiased-exp"/>
       <m:oMathPara>
         <m:oMathParaPr>
           <m:jc m:val="center"/>
@@ -21308,13 +21325,13 @@
           </m:r>
         </m:oMath>
       </m:oMathPara>
-      <w:bookmarkEnd w:id="88"/>
+      <w:bookmarkEnd w:id="89"/>
     </w:p>
     <w:p>
       <w:pPr>
         <w:pStyle w:val="FirstParagraph"/>
       </w:pPr>
-      <w:bookmarkStart w:id="89" w:name="eq-unbiased-mse"/>
+      <w:bookmarkStart w:id="90" w:name="eq-unbiased-mse"/>
       <m:oMathPara>
         <m:oMathParaPr>
           <m:jc m:val="center"/>
@@ -21410,9 +21427,9 @@
           </m:r>
         </m:oMath>
       </m:oMathPara>
-      <w:bookmarkEnd w:id="89"/>
+      <w:bookmarkEnd w:id="90"/>
     </w:p>
-    <w:bookmarkEnd w:id="90"/>
+    <w:bookmarkEnd w:id="91"/>
     <w:p>
       <w:pPr>
         <w:pStyle w:val="FirstParagraph"/>
@@ -21503,7 +21520,7 @@
       <w:r>
         <w:t xml:space="preserve"> </w:t>
       </w:r>
-      <w:hyperlink r:id="rId91">
+      <w:hyperlink r:id="rId92">
         <w:r>
           <w:rPr>
             <w:rStyle w:val="Hyperlink"/>
@@ -21530,8 +21547,8 @@
         <w:t xml:space="preserve">.</w:t>
       </w:r>
     </w:p>
-    <w:bookmarkEnd w:id="92"/>
-    <w:bookmarkStart w:id="95" w:name="mean-absolute-error"/>
+    <w:bookmarkEnd w:id="93"/>
+    <w:bookmarkStart w:id="96" w:name="mean-absolute-error"/>
     <w:p>
       <w:pPr>
         <w:pStyle w:val="Heading3"/>
@@ -21540,7 +21557,7 @@
         <w:t xml:space="preserve">3.7 Population mean absolute error</w:t>
       </w:r>
     </w:p>
-    <w:bookmarkStart w:id="93" w:name="def-mae"/>
+    <w:bookmarkStart w:id="94" w:name="def-mae"/>
     <w:p>
       <w:pPr>
         <w:pStyle w:val="FirstParagraph"/>
@@ -21768,8 +21785,8 @@
         <w:t xml:space="preserve">.</w:t>
       </w:r>
     </w:p>
-    <w:bookmarkEnd w:id="93"/>
-    <w:bookmarkStart w:id="94" w:name="exm-mae-gaussian"/>
+    <w:bookmarkEnd w:id="94"/>
+    <w:bookmarkStart w:id="95" w:name="exm-mae-gaussian"/>
     <w:p>
       <w:pPr>
         <w:pStyle w:val="BodyText"/>
@@ -24178,9 +24195,9 @@
         <w:t xml:space="preserve">).</w:t>
       </w:r>
     </w:p>
-    <w:bookmarkEnd w:id="94"/>
     <w:bookmarkEnd w:id="95"/>
-    <w:bookmarkStart w:id="109" w:name="standard-error"/>
+    <w:bookmarkEnd w:id="96"/>
+    <w:bookmarkStart w:id="110" w:name="standard-error"/>
     <w:p>
       <w:pPr>
         <w:pStyle w:val="Heading3"/>
@@ -24189,7 +24206,7 @@
         <w:t xml:space="preserve">3.8 Standard error</w:t>
       </w:r>
     </w:p>
-    <w:bookmarkStart w:id="97" w:name="def-SE"/>
+    <w:bookmarkStart w:id="98" w:name="def-SE"/>
     <w:p>
       <w:pPr>
         <w:pStyle w:val="FirstParagraph"/>
@@ -24247,7 +24264,7 @@
       <w:r>
         <w:t xml:space="preserve"> </w:t>
       </w:r>
-      <w:hyperlink r:id="rId96">
+      <w:hyperlink r:id="rId97">
         <w:r>
           <w:rPr>
             <w:rStyle w:val="Hyperlink"/>
@@ -24392,8 +24409,8 @@
         <w:t xml:space="preserve">.</w:t>
       </w:r>
     </w:p>
-    <w:bookmarkEnd w:id="97"/>
-    <w:bookmarkStart w:id="98" w:name="exm-SE-sample-mean"/>
+    <w:bookmarkEnd w:id="98"/>
+    <w:bookmarkStart w:id="99" w:name="exm-SE-sample-mean"/>
     <w:p>
       <w:pPr>
         <w:pStyle w:val="BodyText"/>
@@ -24705,8 +24722,8 @@
         <w:t xml:space="preserve">.</w:t>
       </w:r>
     </w:p>
-    <w:bookmarkEnd w:id="98"/>
-    <w:bookmarkStart w:id="99" w:name="exr-se-error-sd"/>
+    <w:bookmarkEnd w:id="99"/>
+    <w:bookmarkStart w:id="100" w:name="exr-se-error-sd"/>
     <w:p>
       <w:pPr>
         <w:pStyle w:val="BodyText"/>
@@ -24727,7 +24744,7 @@
       <w:r>
         <w:t xml:space="preserve"> </w:t>
       </w:r>
-      <w:hyperlink r:id="rId96">
+      <w:hyperlink r:id="rId97">
         <w:r>
           <w:rPr>
             <w:rStyle w:val="Hyperlink"/>
@@ -24828,8 +24845,8 @@
         <w:t xml:space="preserve">.</w:t>
       </w:r>
     </w:p>
-    <w:bookmarkEnd w:id="99"/>
-    <w:bookmarkStart w:id="100" w:name="sol-se-error-sd"/>
+    <w:bookmarkEnd w:id="100"/>
+    <w:bookmarkStart w:id="101" w:name="sol-se-error-sd"/>
     <w:p>
       <w:pPr>
         <w:pStyle w:val="BodyText"/>
@@ -25196,8 +25213,8 @@
         </m:oMath>
       </m:oMathPara>
     </w:p>
-    <w:bookmarkEnd w:id="100"/>
-    <w:bookmarkStart w:id="101" w:name="thm-se-error-sd"/>
+    <w:bookmarkEnd w:id="101"/>
+    <w:bookmarkStart w:id="102" w:name="thm-se-error-sd"/>
     <w:p>
       <w:pPr>
         <w:pStyle w:val="FirstParagraph"/>
@@ -25311,7 +25328,7 @@
         </m:oMath>
       </m:oMathPara>
     </w:p>
-    <w:bookmarkEnd w:id="101"/>
+    <w:bookmarkEnd w:id="102"/>
     <w:p>
       <w:pPr>
         <w:pStyle w:val="FirstParagraph"/>
@@ -25344,7 +25361,7 @@
         <w:t xml:space="preserve">.</w:t>
       </w:r>
     </w:p>
-    <w:bookmarkStart w:id="102" w:name="rem-standard-error-name"/>
+    <w:bookmarkStart w:id="103" w:name="rem-standard-error-name"/>
     <w:p>
       <w:pPr>
         <w:pStyle w:val="BodyText"/>
@@ -25454,8 +25471,8 @@
         <w:t xml:space="preserve">so they come up often enough to deserve their own name.</w:t>
       </w:r>
     </w:p>
-    <w:bookmarkEnd w:id="102"/>
-    <w:bookmarkStart w:id="103" w:name="exr-var-mse-bias"/>
+    <w:bookmarkEnd w:id="103"/>
+    <w:bookmarkStart w:id="104" w:name="exr-var-mse-bias"/>
     <w:p>
       <w:pPr>
         <w:pStyle w:val="BodyText"/>
@@ -25625,8 +25642,8 @@
         <w:t xml:space="preserve">.</w:t>
       </w:r>
     </w:p>
-    <w:bookmarkEnd w:id="103"/>
-    <w:bookmarkStart w:id="104" w:name="sol-var-mse-bias"/>
+    <w:bookmarkEnd w:id="104"/>
+    <w:bookmarkStart w:id="105" w:name="sol-var-mse-bias"/>
     <w:p>
       <w:pPr>
         <w:pStyle w:val="BodyText"/>
@@ -26553,8 +26570,8 @@
         </m:oMath>
       </m:oMathPara>
     </w:p>
-    <w:bookmarkEnd w:id="104"/>
-    <w:bookmarkStart w:id="105" w:name="cor-var-mse-bias"/>
+    <w:bookmarkEnd w:id="105"/>
+    <w:bookmarkStart w:id="106" w:name="cor-var-mse-bias"/>
     <w:p>
       <w:pPr>
         <w:pStyle w:val="FirstParagraph"/>
@@ -26749,7 +26766,7 @@
         </m:oMath>
       </m:oMathPara>
     </w:p>
-    <w:bookmarkEnd w:id="105"/>
+    <w:bookmarkEnd w:id="106"/>
     <w:p>
       <w:pPr>
         <w:pStyle w:val="FirstParagraph"/>
@@ -26782,7 +26799,7 @@
         <w:t xml:space="preserve">.</w:t>
       </w:r>
     </w:p>
-    <w:bookmarkStart w:id="106" w:name="exr-se-rmse-unbiased"/>
+    <w:bookmarkStart w:id="107" w:name="exr-se-rmse-unbiased"/>
     <w:p>
       <w:pPr>
         <w:pStyle w:val="BodyText"/>
@@ -26890,8 +26907,8 @@
         <w:t xml:space="preserve">.</w:t>
       </w:r>
     </w:p>
-    <w:bookmarkEnd w:id="106"/>
-    <w:bookmarkStart w:id="107" w:name="sol-se-rmse-unbiased"/>
+    <w:bookmarkEnd w:id="107"/>
+    <w:bookmarkStart w:id="108" w:name="sol-se-rmse-unbiased"/>
     <w:p>
       <w:pPr>
         <w:pStyle w:val="BodyText"/>
@@ -27154,8 +27171,8 @@
         </m:oMath>
       </m:oMathPara>
     </w:p>
-    <w:bookmarkEnd w:id="107"/>
-    <w:bookmarkStart w:id="108" w:name="cor-se-rmse-unbiased"/>
+    <w:bookmarkEnd w:id="108"/>
+    <w:bookmarkStart w:id="109" w:name="cor-se-rmse-unbiased"/>
     <w:p>
       <w:pPr>
         <w:pStyle w:val="FirstParagraph"/>
@@ -27313,7 +27330,7 @@
         </m:oMath>
       </m:oMathPara>
     </w:p>
-    <w:bookmarkEnd w:id="108"/>
+    <w:bookmarkEnd w:id="109"/>
     <w:p>
       <w:pPr>
         <w:pStyle w:val="FirstParagraph"/>
@@ -27346,9 +27363,9 @@
         <w:t xml:space="preserve">.</w:t>
       </w:r>
     </w:p>
-    <w:bookmarkEnd w:id="109"/>
     <w:bookmarkEnd w:id="110"/>
-    <w:bookmarkStart w:id="143" w:name="references"/>
+    <w:bookmarkEnd w:id="111"/>
+    <w:bookmarkStart w:id="144" w:name="references"/>
     <w:p>
       <w:pPr>
         <w:pStyle w:val="Heading2"/>
@@ -27357,8 +27374,8 @@
         <w:t xml:space="preserve">References</w:t>
       </w:r>
     </w:p>
-    <w:bookmarkStart w:id="142" w:name="refs"/>
-    <w:bookmarkStart w:id="111" w:name="ref-box_draper_1987"/>
+    <w:bookmarkStart w:id="143" w:name="refs"/>
+    <w:bookmarkStart w:id="112" w:name="ref-box_draper_1987"/>
     <w:p>
       <w:pPr>
         <w:pStyle w:val="Bibliography"/>
@@ -27389,8 +27406,8 @@
         <w:t xml:space="preserve">. in Wiley series in probability and mathematical statistics. Applied probability and statistics. New York: Wiley, 1987.</w:t>
       </w:r>
     </w:p>
-    <w:bookmarkEnd w:id="111"/>
-    <w:bookmarkStart w:id="113" w:name="ref-dunn2018generalized"/>
+    <w:bookmarkEnd w:id="112"/>
+    <w:bookmarkStart w:id="114" w:name="ref-dunn2018generalized"/>
     <w:p>
       <w:pPr>
         <w:pStyle w:val="Bibliography"/>
@@ -27437,7 +27454,7 @@
       <w:r>
         <w:t xml:space="preserve"> </w:t>
       </w:r>
-      <w:hyperlink r:id="rId112">
+      <w:hyperlink r:id="rId113">
         <w:r>
           <w:rPr>
             <w:rStyle w:val="Hyperlink"/>
@@ -27449,8 +27466,8 @@
         <w:t xml:space="preserve">.</w:t>
       </w:r>
     </w:p>
-    <w:bookmarkEnd w:id="113"/>
-    <w:bookmarkStart w:id="115" w:name="ref-van2018flexible"/>
+    <w:bookmarkEnd w:id="114"/>
+    <w:bookmarkStart w:id="116" w:name="ref-van2018flexible"/>
     <w:p>
       <w:pPr>
         <w:pStyle w:val="Bibliography"/>
@@ -27483,7 +27500,7 @@
       <w:r>
         <w:t xml:space="preserve"> </w:t>
       </w:r>
-      <w:hyperlink r:id="rId114">
+      <w:hyperlink r:id="rId115">
         <w:r>
           <w:rPr>
             <w:rStyle w:val="Hyperlink"/>
@@ -27492,8 +27509,8 @@
         </w:r>
       </w:hyperlink>
     </w:p>
-    <w:bookmarkEnd w:id="115"/>
-    <w:bookmarkStart w:id="117" w:name="ref-pohl2021estimands"/>
+    <w:bookmarkEnd w:id="116"/>
+    <w:bookmarkStart w:id="118" w:name="ref-pohl2021estimands"/>
     <w:p>
       <w:pPr>
         <w:pStyle w:val="Bibliography"/>
@@ -27559,7 +27576,7 @@
       <w:r>
         <w:t xml:space="preserve"> </w:t>
       </w:r>
-      <w:hyperlink r:id="rId116">
+      <w:hyperlink r:id="rId117">
         <w:r>
           <w:rPr>
             <w:rStyle w:val="Hyperlink"/>
@@ -27571,8 +27588,8 @@
         <w:t xml:space="preserve">.</w:t>
       </w:r>
     </w:p>
-    <w:bookmarkEnd w:id="117"/>
-    <w:bookmarkStart w:id="119" w:name="ref-lawrance2020estimand"/>
+    <w:bookmarkEnd w:id="118"/>
+    <w:bookmarkStart w:id="120" w:name="ref-lawrance2020estimand"/>
     <w:p>
       <w:pPr>
         <w:pStyle w:val="Bibliography"/>
@@ -27624,7 +27641,7 @@
       <w:r>
         <w:t xml:space="preserve"> </w:t>
       </w:r>
-      <w:hyperlink r:id="rId118">
+      <w:hyperlink r:id="rId119">
         <w:r>
           <w:rPr>
             <w:rStyle w:val="Hyperlink"/>
@@ -27636,8 +27653,8 @@
         <w:t xml:space="preserve">.</w:t>
       </w:r>
     </w:p>
-    <w:bookmarkEnd w:id="119"/>
-    <w:bookmarkStart w:id="121" w:name="ref-wikipedia_estimand"/>
+    <w:bookmarkEnd w:id="120"/>
+    <w:bookmarkStart w:id="122" w:name="ref-wikipedia_estimand"/>
     <w:p>
       <w:pPr>
         <w:pStyle w:val="Bibliography"/>
@@ -27684,7 +27701,7 @@
       <w:r>
         <w:t xml:space="preserve"> </w:t>
       </w:r>
-      <w:hyperlink r:id="rId120">
+      <w:hyperlink r:id="rId121">
         <w:r>
           <w:rPr>
             <w:rStyle w:val="Hyperlink"/>
@@ -27693,8 +27710,8 @@
         </w:r>
       </w:hyperlink>
     </w:p>
-    <w:bookmarkEnd w:id="121"/>
-    <w:bookmarkStart w:id="123" w:name="ref-wikipedia_estimator"/>
+    <w:bookmarkEnd w:id="122"/>
+    <w:bookmarkStart w:id="124" w:name="ref-wikipedia_estimator"/>
     <w:p>
       <w:pPr>
         <w:pStyle w:val="Bibliography"/>
@@ -27741,7 +27758,7 @@
       <w:r>
         <w:t xml:space="preserve"> </w:t>
       </w:r>
-      <w:hyperlink r:id="rId122">
+      <w:hyperlink r:id="rId123">
         <w:r>
           <w:rPr>
             <w:rStyle w:val="Hyperlink"/>
@@ -27750,8 +27767,8 @@
         </w:r>
       </w:hyperlink>
     </w:p>
-    <w:bookmarkEnd w:id="123"/>
-    <w:bookmarkStart w:id="125" w:name="ref-wikipedia_sampling_distribution"/>
+    <w:bookmarkEnd w:id="124"/>
+    <w:bookmarkStart w:id="126" w:name="ref-wikipedia_sampling_distribution"/>
     <w:p>
       <w:pPr>
         <w:pStyle w:val="Bibliography"/>
@@ -27798,7 +27815,7 @@
       <w:r>
         <w:t xml:space="preserve"> </w:t>
       </w:r>
-      <w:hyperlink r:id="rId124">
+      <w:hyperlink r:id="rId125">
         <w:r>
           <w:rPr>
             <w:rStyle w:val="Hyperlink"/>
@@ -27807,8 +27824,8 @@
         </w:r>
       </w:hyperlink>
     </w:p>
-    <w:bookmarkEnd w:id="125"/>
-    <w:bookmarkStart w:id="126" w:name="ref-hoggtanis2015"/>
+    <w:bookmarkEnd w:id="126"/>
+    <w:bookmarkStart w:id="127" w:name="ref-hoggtanis2015"/>
     <w:p>
       <w:pPr>
         <w:pStyle w:val="Bibliography"/>
@@ -27839,8 +27856,8 @@
         <w:t xml:space="preserve">, Tenth edition. Boston: Pearson, 2019.</w:t>
       </w:r>
     </w:p>
-    <w:bookmarkEnd w:id="126"/>
-    <w:bookmarkStart w:id="128" w:name="ref-CaseBerg01"/>
+    <w:bookmarkEnd w:id="127"/>
+    <w:bookmarkStart w:id="129" w:name="ref-CaseBerg01"/>
     <w:p>
       <w:pPr>
         <w:pStyle w:val="Bibliography"/>
@@ -27873,7 +27890,7 @@
       <w:r>
         <w:t xml:space="preserve"> </w:t>
       </w:r>
-      <w:hyperlink r:id="rId127">
+      <w:hyperlink r:id="rId128">
         <w:r>
           <w:rPr>
             <w:rStyle w:val="Hyperlink"/>
@@ -27882,8 +27899,8 @@
         </w:r>
       </w:hyperlink>
     </w:p>
-    <w:bookmarkEnd w:id="128"/>
-    <w:bookmarkStart w:id="129" w:name="ref-rice2007mathematical"/>
+    <w:bookmarkEnd w:id="129"/>
+    <w:bookmarkStart w:id="130" w:name="ref-rice2007mathematical"/>
     <w:p>
       <w:pPr>
         <w:pStyle w:val="Bibliography"/>
@@ -27914,8 +27931,8 @@
         <w:t xml:space="preserve">, 3rd ed. Belmont, CA: Cengage Learning, 2007.</w:t>
       </w:r>
     </w:p>
-    <w:bookmarkEnd w:id="129"/>
-    <w:bookmarkStart w:id="131" w:name="ref-wikipedia_bias_of_an_estimator"/>
+    <w:bookmarkEnd w:id="130"/>
+    <w:bookmarkStart w:id="132" w:name="ref-wikipedia_bias_of_an_estimator"/>
     <w:p>
       <w:pPr>
         <w:pStyle w:val="Bibliography"/>
@@ -27962,7 +27979,7 @@
       <w:r>
         <w:t xml:space="preserve"> </w:t>
       </w:r>
-      <w:hyperlink r:id="rId130">
+      <w:hyperlink r:id="rId131">
         <w:r>
           <w:rPr>
             <w:rStyle w:val="Hyperlink"/>
@@ -27971,8 +27988,8 @@
         </w:r>
       </w:hyperlink>
     </w:p>
-    <w:bookmarkEnd w:id="131"/>
-    <w:bookmarkStart w:id="133" w:name="ref-wikipedia_mean_squared_error"/>
+    <w:bookmarkEnd w:id="132"/>
+    <w:bookmarkStart w:id="134" w:name="ref-wikipedia_mean_squared_error"/>
     <w:p>
       <w:pPr>
         <w:pStyle w:val="Bibliography"/>
@@ -28019,7 +28036,7 @@
       <w:r>
         <w:t xml:space="preserve"> </w:t>
       </w:r>
-      <w:hyperlink r:id="rId132">
+      <w:hyperlink r:id="rId133">
         <w:r>
           <w:rPr>
             <w:rStyle w:val="Hyperlink"/>
@@ -28028,8 +28045,8 @@
         </w:r>
       </w:hyperlink>
     </w:p>
-    <w:bookmarkEnd w:id="133"/>
-    <w:bookmarkStart w:id="135" w:name="ref-wikipedia_root_mean_square_deviation"/>
+    <w:bookmarkEnd w:id="134"/>
+    <w:bookmarkStart w:id="136" w:name="ref-wikipedia_root_mean_square_deviation"/>
     <w:p>
       <w:pPr>
         <w:pStyle w:val="Bibliography"/>
@@ -28076,7 +28093,7 @@
       <w:r>
         <w:t xml:space="preserve"> </w:t>
       </w:r>
-      <w:hyperlink r:id="rId134">
+      <w:hyperlink r:id="rId135">
         <w:r>
           <w:rPr>
             <w:rStyle w:val="Hyperlink"/>
@@ -28085,8 +28102,8 @@
         </w:r>
       </w:hyperlink>
     </w:p>
-    <w:bookmarkEnd w:id="135"/>
-    <w:bookmarkStart w:id="137" w:name="ref-fiveminuteai_probstat"/>
+    <w:bookmarkEnd w:id="136"/>
+    <w:bookmarkStart w:id="138" w:name="ref-fiveminuteai_probstat"/>
     <w:p>
       <w:pPr>
         <w:pStyle w:val="Bibliography"/>
@@ -28118,7 +28135,7 @@
       <w:r>
         <w:t xml:space="preserve"> </w:t>
       </w:r>
-      <w:hyperlink r:id="rId136">
+      <w:hyperlink r:id="rId137">
         <w:r>
           <w:rPr>
             <w:rStyle w:val="Hyperlink"/>
@@ -28127,8 +28144,8 @@
         </w:r>
       </w:hyperlink>
     </w:p>
-    <w:bookmarkEnd w:id="137"/>
-    <w:bookmarkStart w:id="139" w:name="ref-wikipedia_mean_absolute_error"/>
+    <w:bookmarkEnd w:id="138"/>
+    <w:bookmarkStart w:id="140" w:name="ref-wikipedia_mean_absolute_error"/>
     <w:p>
       <w:pPr>
         <w:pStyle w:val="Bibliography"/>
@@ -28175,7 +28192,7 @@
       <w:r>
         <w:t xml:space="preserve"> </w:t>
       </w:r>
-      <w:hyperlink r:id="rId138">
+      <w:hyperlink r:id="rId139">
         <w:r>
           <w:rPr>
             <w:rStyle w:val="Hyperlink"/>
@@ -28184,8 +28201,8 @@
         </w:r>
       </w:hyperlink>
     </w:p>
-    <w:bookmarkEnd w:id="139"/>
-    <w:bookmarkStart w:id="141" w:name="ref-wikipedia_standard_error"/>
+    <w:bookmarkEnd w:id="140"/>
+    <w:bookmarkStart w:id="142" w:name="ref-wikipedia_standard_error"/>
     <w:p>
       <w:pPr>
         <w:pStyle w:val="Bibliography"/>
@@ -28232,7 +28249,7 @@
       <w:r>
         <w:t xml:space="preserve"> </w:t>
       </w:r>
-      <w:hyperlink r:id="rId140">
+      <w:hyperlink r:id="rId141">
         <w:r>
           <w:rPr>
             <w:rStyle w:val="Hyperlink"/>
@@ -28241,9 +28258,9 @@
         </w:r>
       </w:hyperlink>
     </w:p>
-    <w:bookmarkEnd w:id="141"/>
     <w:bookmarkEnd w:id="142"/>
     <w:bookmarkEnd w:id="143"/>
+    <w:bookmarkEnd w:id="144"/>
     <w:sectPr>
       <w:footnotePr>
         <w:numRestart w:val="eachSect"/>

</xml_diff>

<commit_message>
Deploying to gh-pages from @ Morrison-Lab/sds@aca011a673ab6be698b218e1267ca5ac5b67c911 🚀
</commit_message>
<xml_diff>
--- a/estimation-handout.docx
+++ b/estimation-handout.docx
@@ -15,7 +15,7 @@
         <w:pStyle w:val="Date"/>
       </w:pPr>
       <w:r>
-        <w:t xml:space="preserve">Last modified: 2026-10-29 15:05:35 (PDT)</w:t>
+        <w:t xml:space="preserve">Last modified: 2026-10-29 15:24:42 (PDT)</w:t>
       </w:r>
     </w:p>
     <w:bookmarkStart w:id="15" w:name="scientific-models"/>
@@ -3890,7 +3890,7 @@
     </w:p>
     <w:bookmarkEnd w:id="38"/>
     <w:bookmarkEnd w:id="39"/>
-    <w:bookmarkStart w:id="111" w:name="sec-est-accuracy"/>
+    <w:bookmarkStart w:id="112" w:name="sec-est-accuracy"/>
     <w:p>
       <w:pPr>
         <w:pStyle w:val="Heading2"/>
@@ -6805,7 +6805,7 @@
     </w:p>
     <w:bookmarkEnd w:id="51"/>
     <w:bookmarkEnd w:id="52"/>
-    <w:bookmarkStart w:id="79" w:name="mean-squared-error"/>
+    <w:bookmarkStart w:id="80" w:name="mean-squared-error"/>
     <w:p>
       <w:pPr>
         <w:pStyle w:val="Heading3"/>
@@ -11938,6 +11938,833 @@
     <w:p>
       <w:pPr>
         <w:pStyle w:val="FirstParagraph"/>
+      </w:pPr>
+      <w:r>
+        <w:rPr>
+          <w:i/>
+          <w:iCs/>
+        </w:rPr>
+        <w:t xml:space="preserve">Proof</w:t>
+      </w:r>
+      <w:r>
+        <w:t xml:space="preserve"> (Shorter proof). </w:t>
+      </w:r>
+      <w:r>
+        <w:t xml:space="preserve">Apply the</w:t>
+      </w:r>
+      <w:r>
+        <w:t xml:space="preserve"> </w:t>
+      </w:r>
+      <w:hyperlink r:id="rId69">
+        <w:r>
+          <w:rPr>
+            <w:rStyle w:val="Hyperlink"/>
+          </w:rPr>
+          <w:t xml:space="preserve">second moment is variance plus squared mean</w:t>
+        </w:r>
+      </w:hyperlink>
+      <w:r>
+        <w:t xml:space="preserve"> </w:t>
+      </w:r>
+      <w:r>
+        <w:t xml:space="preserve">lemma to the</w:t>
+      </w:r>
+      <w:r>
+        <w:t xml:space="preserve"> </w:t>
+      </w:r>
+      <w:hyperlink w:anchor="def-estimation-error">
+        <w:r>
+          <w:rPr>
+            <w:rStyle w:val="Hyperlink"/>
+          </w:rPr>
+          <w:t xml:space="preserve">estimation error</w:t>
+        </w:r>
+      </w:hyperlink>
+      <w:r>
+        <w:t xml:space="preserve"> </w:t>
+      </w:r>
+      <m:oMath>
+        <m:r>
+          <m:t>Z</m:t>
+        </m:r>
+        <m:r>
+          <m:rPr>
+            <m:sty m:val="p"/>
+          </m:rPr>
+          <m:t>=</m:t>
+        </m:r>
+        <m:r>
+          <m:t>ε</m:t>
+        </m:r>
+        <m:r>
+          <m:t>​</m:t>
+        </m:r>
+        <m:d>
+          <m:dPr>
+            <m:begChr m:val="("/>
+            <m:sepChr m:val=""/>
+            <m:endChr m:val=")"/>
+            <m:grow/>
+          </m:dPr>
+          <m:e>
+            <m:acc>
+              <m:accPr>
+                <m:chr m:val="̂"/>
+              </m:accPr>
+              <m:e>
+                <m:r>
+                  <m:t>θ</m:t>
+                </m:r>
+              </m:e>
+            </m:acc>
+          </m:e>
+        </m:d>
+        <m:r>
+          <m:t>​</m:t>
+        </m:r>
+      </m:oMath>
+      <w:r>
+        <w:t xml:space="preserve">:</w:t>
+      </w:r>
+    </w:p>
+    <w:p>
+      <w:pPr>
+        <w:pStyle w:val="BodyText"/>
+      </w:pPr>
+      <m:oMathPara>
+        <m:oMathParaPr>
+          <m:jc m:val="center"/>
+        </m:oMathParaPr>
+        <m:oMath>
+          <m:eqArr>
+            <m:e>
+              <m:r>
+                <m:rPr>
+                  <m:sty m:val="p"/>
+                </m:rPr>
+                <m:t>pMSE</m:t>
+              </m:r>
+              <m:r>
+                <m:t>​</m:t>
+              </m:r>
+              <m:d>
+                <m:dPr>
+                  <m:begChr m:val="("/>
+                  <m:sepChr m:val=""/>
+                  <m:endChr m:val=")"/>
+                  <m:grow/>
+                </m:dPr>
+                <m:e>
+                  <m:acc>
+                    <m:accPr>
+                      <m:chr m:val="̂"/>
+                    </m:accPr>
+                    <m:e>
+                      <m:r>
+                        <m:t>θ</m:t>
+                      </m:r>
+                    </m:e>
+                  </m:acc>
+                </m:e>
+              </m:d>
+              <m:r>
+                <m:t>​</m:t>
+              </m:r>
+              <m:r>
+                <m:t>&amp;</m:t>
+              </m:r>
+              <m:r>
+                <m:rPr>
+                  <m:sty m:val="p"/>
+                </m:rPr>
+                <m:t>=</m:t>
+              </m:r>
+              <m:r>
+                <m:rPr>
+                  <m:scr m:val="double-struck"/>
+                  <m:sty m:val="p"/>
+                </m:rPr>
+                <m:t>E</m:t>
+              </m:r>
+              <m:r>
+                <m:t>​</m:t>
+              </m:r>
+              <m:d>
+                <m:dPr>
+                  <m:begChr m:val="["/>
+                  <m:sepChr m:val=""/>
+                  <m:endChr m:val="]"/>
+                  <m:grow/>
+                </m:dPr>
+                <m:e>
+                  <m:sSup>
+                    <m:e>
+                      <m:r>
+                        <m:t>​</m:t>
+                      </m:r>
+                      <m:d>
+                        <m:dPr>
+                          <m:begChr m:val="("/>
+                          <m:sepChr m:val=""/>
+                          <m:endChr m:val=")"/>
+                          <m:grow/>
+                        </m:dPr>
+                        <m:e>
+                          <m:r>
+                            <m:t>ε</m:t>
+                          </m:r>
+                          <m:r>
+                            <m:t>​</m:t>
+                          </m:r>
+                          <m:d>
+                            <m:dPr>
+                              <m:begChr m:val="("/>
+                              <m:sepChr m:val=""/>
+                              <m:endChr m:val=")"/>
+                              <m:grow/>
+                            </m:dPr>
+                            <m:e>
+                              <m:acc>
+                                <m:accPr>
+                                  <m:chr m:val="̂"/>
+                                </m:accPr>
+                                <m:e>
+                                  <m:r>
+                                    <m:t>θ</m:t>
+                                  </m:r>
+                                </m:e>
+                              </m:acc>
+                            </m:e>
+                          </m:d>
+                          <m:r>
+                            <m:t>​</m:t>
+                          </m:r>
+                        </m:e>
+                      </m:d>
+                      <m:r>
+                        <m:t>​</m:t>
+                      </m:r>
+                    </m:e>
+                    <m:sup>
+                      <m:r>
+                        <m:t>2</m:t>
+                      </m:r>
+                    </m:sup>
+                  </m:sSup>
+                </m:e>
+              </m:d>
+              <m:r>
+                <m:t>​</m:t>
+              </m:r>
+              <m:r>
+                <m:t>&amp;</m:t>
+              </m:r>
+              <m:r>
+                <m:t>&amp;</m:t>
+              </m:r>
+              <m:r>
+                <m:rPr>
+                  <m:nor/>
+                  <m:sty m:val="p"/>
+                </m:rPr>
+                <m:t>(definition of pMSE)</m:t>
+              </m:r>
+            </m:e>
+            <m:e>
+              <m:r>
+                <m:t>&amp;</m:t>
+              </m:r>
+              <m:r>
+                <m:rPr>
+                  <m:sty m:val="p"/>
+                </m:rPr>
+                <m:t>=</m:t>
+              </m:r>
+              <m:r>
+                <m:rPr>
+                  <m:sty m:val="p"/>
+                </m:rPr>
+                <m:t>Var</m:t>
+              </m:r>
+              <m:r>
+                <m:t>​</m:t>
+              </m:r>
+              <m:d>
+                <m:dPr>
+                  <m:begChr m:val="("/>
+                  <m:sepChr m:val=""/>
+                  <m:endChr m:val=")"/>
+                  <m:grow/>
+                </m:dPr>
+                <m:e>
+                  <m:r>
+                    <m:t>ε</m:t>
+                  </m:r>
+                  <m:r>
+                    <m:t>​</m:t>
+                  </m:r>
+                  <m:d>
+                    <m:dPr>
+                      <m:begChr m:val="("/>
+                      <m:sepChr m:val=""/>
+                      <m:endChr m:val=")"/>
+                      <m:grow/>
+                    </m:dPr>
+                    <m:e>
+                      <m:acc>
+                        <m:accPr>
+                          <m:chr m:val="̂"/>
+                        </m:accPr>
+                        <m:e>
+                          <m:r>
+                            <m:t>θ</m:t>
+                          </m:r>
+                        </m:e>
+                      </m:acc>
+                    </m:e>
+                  </m:d>
+                  <m:r>
+                    <m:t>​</m:t>
+                  </m:r>
+                </m:e>
+              </m:d>
+              <m:r>
+                <m:t>​</m:t>
+              </m:r>
+              <m:r>
+                <m:rPr>
+                  <m:sty m:val="p"/>
+                </m:rPr>
+                <m:t>+</m:t>
+              </m:r>
+              <m:sSup>
+                <m:e>
+                  <m:r>
+                    <m:t>​</m:t>
+                  </m:r>
+                  <m:d>
+                    <m:dPr>
+                      <m:begChr m:val="("/>
+                      <m:sepChr m:val=""/>
+                      <m:endChr m:val=")"/>
+                      <m:grow/>
+                    </m:dPr>
+                    <m:e>
+                      <m:r>
+                        <m:rPr>
+                          <m:scr m:val="double-struck"/>
+                          <m:sty m:val="p"/>
+                        </m:rPr>
+                        <m:t>E</m:t>
+                      </m:r>
+                      <m:r>
+                        <m:t>​</m:t>
+                      </m:r>
+                      <m:d>
+                        <m:dPr>
+                          <m:begChr m:val="["/>
+                          <m:sepChr m:val=""/>
+                          <m:endChr m:val="]"/>
+                          <m:grow/>
+                        </m:dPr>
+                        <m:e>
+                          <m:r>
+                            <m:t>ε</m:t>
+                          </m:r>
+                          <m:r>
+                            <m:t>​</m:t>
+                          </m:r>
+                          <m:d>
+                            <m:dPr>
+                              <m:begChr m:val="("/>
+                              <m:sepChr m:val=""/>
+                              <m:endChr m:val=")"/>
+                              <m:grow/>
+                            </m:dPr>
+                            <m:e>
+                              <m:acc>
+                                <m:accPr>
+                                  <m:chr m:val="̂"/>
+                                </m:accPr>
+                                <m:e>
+                                  <m:r>
+                                    <m:t>θ</m:t>
+                                  </m:r>
+                                </m:e>
+                              </m:acc>
+                            </m:e>
+                          </m:d>
+                          <m:r>
+                            <m:t>​</m:t>
+                          </m:r>
+                        </m:e>
+                      </m:d>
+                      <m:r>
+                        <m:t>​</m:t>
+                      </m:r>
+                    </m:e>
+                  </m:d>
+                  <m:r>
+                    <m:t>​</m:t>
+                  </m:r>
+                </m:e>
+                <m:sup>
+                  <m:r>
+                    <m:t>2</m:t>
+                  </m:r>
+                </m:sup>
+              </m:sSup>
+              <m:r>
+                <m:t>&amp;</m:t>
+              </m:r>
+              <m:r>
+                <m:t>&amp;</m:t>
+              </m:r>
+              <m:r>
+                <m:rPr>
+                  <m:nor/>
+                  <m:sty m:val="p"/>
+                </m:rPr>
+                <m:t>(second moment is variance plus squared mean)</m:t>
+              </m:r>
+            </m:e>
+            <m:e>
+              <m:r>
+                <m:t>&amp;</m:t>
+              </m:r>
+              <m:r>
+                <m:rPr>
+                  <m:sty m:val="p"/>
+                </m:rPr>
+                <m:t>=</m:t>
+              </m:r>
+              <m:r>
+                <m:rPr>
+                  <m:sty m:val="p"/>
+                </m:rPr>
+                <m:t>Var</m:t>
+              </m:r>
+              <m:r>
+                <m:t>​</m:t>
+              </m:r>
+              <m:d>
+                <m:dPr>
+                  <m:begChr m:val="("/>
+                  <m:sepChr m:val=""/>
+                  <m:endChr m:val=")"/>
+                  <m:grow/>
+                </m:dPr>
+                <m:e>
+                  <m:r>
+                    <m:t>ε</m:t>
+                  </m:r>
+                  <m:r>
+                    <m:t>​</m:t>
+                  </m:r>
+                  <m:d>
+                    <m:dPr>
+                      <m:begChr m:val="("/>
+                      <m:sepChr m:val=""/>
+                      <m:endChr m:val=")"/>
+                      <m:grow/>
+                    </m:dPr>
+                    <m:e>
+                      <m:acc>
+                        <m:accPr>
+                          <m:chr m:val="̂"/>
+                        </m:accPr>
+                        <m:e>
+                          <m:r>
+                            <m:t>θ</m:t>
+                          </m:r>
+                        </m:e>
+                      </m:acc>
+                    </m:e>
+                  </m:d>
+                  <m:r>
+                    <m:t>​</m:t>
+                  </m:r>
+                </m:e>
+              </m:d>
+              <m:r>
+                <m:t>​</m:t>
+              </m:r>
+              <m:r>
+                <m:rPr>
+                  <m:sty m:val="p"/>
+                </m:rPr>
+                <m:t>+</m:t>
+              </m:r>
+              <m:sSup>
+                <m:e>
+                  <m:r>
+                    <m:t>​</m:t>
+                  </m:r>
+                  <m:d>
+                    <m:dPr>
+                      <m:begChr m:val="("/>
+                      <m:sepChr m:val=""/>
+                      <m:endChr m:val=")"/>
+                      <m:grow/>
+                    </m:dPr>
+                    <m:e>
+                      <m:r>
+                        <m:rPr>
+                          <m:sty m:val="p"/>
+                        </m:rPr>
+                        <m:t>Bias</m:t>
+                      </m:r>
+                      <m:r>
+                        <m:t>​</m:t>
+                      </m:r>
+                      <m:d>
+                        <m:dPr>
+                          <m:begChr m:val="("/>
+                          <m:sepChr m:val=""/>
+                          <m:endChr m:val=")"/>
+                          <m:grow/>
+                        </m:dPr>
+                        <m:e>
+                          <m:acc>
+                            <m:accPr>
+                              <m:chr m:val="̂"/>
+                            </m:accPr>
+                            <m:e>
+                              <m:r>
+                                <m:t>θ</m:t>
+                              </m:r>
+                            </m:e>
+                          </m:acc>
+                        </m:e>
+                      </m:d>
+                      <m:r>
+                        <m:t>​</m:t>
+                      </m:r>
+                    </m:e>
+                  </m:d>
+                  <m:r>
+                    <m:t>​</m:t>
+                  </m:r>
+                </m:e>
+                <m:sup>
+                  <m:r>
+                    <m:t>2</m:t>
+                  </m:r>
+                </m:sup>
+              </m:sSup>
+              <m:r>
+                <m:t>&amp;</m:t>
+              </m:r>
+              <m:r>
+                <m:t>&amp;</m:t>
+              </m:r>
+              <m:r>
+                <m:rPr>
+                  <m:nor/>
+                  <m:sty m:val="p"/>
+                </m:rPr>
+                <m:t>(definition of bias)</m:t>
+              </m:r>
+            </m:e>
+            <m:e>
+              <m:r>
+                <m:t>&amp;</m:t>
+              </m:r>
+              <m:r>
+                <m:rPr>
+                  <m:sty m:val="p"/>
+                </m:rPr>
+                <m:t>=</m:t>
+              </m:r>
+              <m:r>
+                <m:rPr>
+                  <m:sty m:val="p"/>
+                </m:rPr>
+                <m:t>Var</m:t>
+              </m:r>
+              <m:r>
+                <m:t>​</m:t>
+              </m:r>
+              <m:d>
+                <m:dPr>
+                  <m:begChr m:val="("/>
+                  <m:sepChr m:val=""/>
+                  <m:endChr m:val=")"/>
+                  <m:grow/>
+                </m:dPr>
+                <m:e>
+                  <m:acc>
+                    <m:accPr>
+                      <m:chr m:val="̂"/>
+                    </m:accPr>
+                    <m:e>
+                      <m:r>
+                        <m:t>θ</m:t>
+                      </m:r>
+                    </m:e>
+                  </m:acc>
+                  <m:r>
+                    <m:rPr>
+                      <m:sty m:val="p"/>
+                    </m:rPr>
+                    <m:t>−</m:t>
+                  </m:r>
+                  <m:r>
+                    <m:t>θ</m:t>
+                  </m:r>
+                </m:e>
+              </m:d>
+              <m:r>
+                <m:t>​</m:t>
+              </m:r>
+              <m:r>
+                <m:rPr>
+                  <m:sty m:val="p"/>
+                </m:rPr>
+                <m:t>+</m:t>
+              </m:r>
+              <m:sSup>
+                <m:e>
+                  <m:r>
+                    <m:t>​</m:t>
+                  </m:r>
+                  <m:d>
+                    <m:dPr>
+                      <m:begChr m:val="("/>
+                      <m:sepChr m:val=""/>
+                      <m:endChr m:val=")"/>
+                      <m:grow/>
+                    </m:dPr>
+                    <m:e>
+                      <m:r>
+                        <m:rPr>
+                          <m:sty m:val="p"/>
+                        </m:rPr>
+                        <m:t>Bias</m:t>
+                      </m:r>
+                      <m:r>
+                        <m:t>​</m:t>
+                      </m:r>
+                      <m:d>
+                        <m:dPr>
+                          <m:begChr m:val="("/>
+                          <m:sepChr m:val=""/>
+                          <m:endChr m:val=")"/>
+                          <m:grow/>
+                        </m:dPr>
+                        <m:e>
+                          <m:acc>
+                            <m:accPr>
+                              <m:chr m:val="̂"/>
+                            </m:accPr>
+                            <m:e>
+                              <m:r>
+                                <m:t>θ</m:t>
+                              </m:r>
+                            </m:e>
+                          </m:acc>
+                        </m:e>
+                      </m:d>
+                      <m:r>
+                        <m:t>​</m:t>
+                      </m:r>
+                    </m:e>
+                  </m:d>
+                  <m:r>
+                    <m:t>​</m:t>
+                  </m:r>
+                </m:e>
+                <m:sup>
+                  <m:r>
+                    <m:t>2</m:t>
+                  </m:r>
+                </m:sup>
+              </m:sSup>
+              <m:r>
+                <m:t>&amp;</m:t>
+              </m:r>
+              <m:r>
+                <m:t>&amp;</m:t>
+              </m:r>
+              <m:r>
+                <m:rPr>
+                  <m:nor/>
+                  <m:sty m:val="p"/>
+                </m:rPr>
+                <m:t>(definition of estimation error)</m:t>
+              </m:r>
+            </m:e>
+            <m:e>
+              <m:r>
+                <m:t>&amp;</m:t>
+              </m:r>
+              <m:r>
+                <m:rPr>
+                  <m:sty m:val="p"/>
+                </m:rPr>
+                <m:t>=</m:t>
+              </m:r>
+              <m:r>
+                <m:rPr>
+                  <m:sty m:val="p"/>
+                </m:rPr>
+                <m:t>Var</m:t>
+              </m:r>
+              <m:r>
+                <m:t>​</m:t>
+              </m:r>
+              <m:d>
+                <m:dPr>
+                  <m:begChr m:val="("/>
+                  <m:sepChr m:val=""/>
+                  <m:endChr m:val=")"/>
+                  <m:grow/>
+                </m:dPr>
+                <m:e>
+                  <m:acc>
+                    <m:accPr>
+                      <m:chr m:val="̂"/>
+                    </m:accPr>
+                    <m:e>
+                      <m:r>
+                        <m:t>θ</m:t>
+                      </m:r>
+                    </m:e>
+                  </m:acc>
+                </m:e>
+              </m:d>
+              <m:r>
+                <m:t>​</m:t>
+              </m:r>
+              <m:r>
+                <m:rPr>
+                  <m:sty m:val="p"/>
+                </m:rPr>
+                <m:t>+</m:t>
+              </m:r>
+              <m:sSup>
+                <m:e>
+                  <m:r>
+                    <m:t>​</m:t>
+                  </m:r>
+                  <m:d>
+                    <m:dPr>
+                      <m:begChr m:val="("/>
+                      <m:sepChr m:val=""/>
+                      <m:endChr m:val=")"/>
+                      <m:grow/>
+                    </m:dPr>
+                    <m:e>
+                      <m:r>
+                        <m:rPr>
+                          <m:sty m:val="p"/>
+                        </m:rPr>
+                        <m:t>Bias</m:t>
+                      </m:r>
+                      <m:r>
+                        <m:t>​</m:t>
+                      </m:r>
+                      <m:d>
+                        <m:dPr>
+                          <m:begChr m:val="("/>
+                          <m:sepChr m:val=""/>
+                          <m:endChr m:val=")"/>
+                          <m:grow/>
+                        </m:dPr>
+                        <m:e>
+                          <m:acc>
+                            <m:accPr>
+                              <m:chr m:val="̂"/>
+                            </m:accPr>
+                            <m:e>
+                              <m:r>
+                                <m:t>θ</m:t>
+                              </m:r>
+                            </m:e>
+                          </m:acc>
+                        </m:e>
+                      </m:d>
+                      <m:r>
+                        <m:t>​</m:t>
+                      </m:r>
+                    </m:e>
+                  </m:d>
+                  <m:r>
+                    <m:t>​</m:t>
+                  </m:r>
+                </m:e>
+                <m:sup>
+                  <m:r>
+                    <m:t>2</m:t>
+                  </m:r>
+                </m:sup>
+              </m:sSup>
+              <m:r>
+                <m:t>&amp;</m:t>
+              </m:r>
+              <m:r>
+                <m:t>&amp;</m:t>
+              </m:r>
+              <m:r>
+                <m:rPr>
+                  <m:nor/>
+                  <m:sty m:val="p"/>
+                </m:rPr>
+                <m:t>(subtracting a constant does not change a variance)</m:t>
+              </m:r>
+            </m:e>
+          </m:eqArr>
+        </m:oMath>
+      </m:oMathPara>
+    </w:p>
+    <w:p>
+      <w:pPr>
+        <w:pStyle w:val="FirstParagraph"/>
+      </w:pPr>
+      <w:r>
+        <w:t xml:space="preserve">Unlike the</w:t>
+      </w:r>
+      <w:r>
+        <w:t xml:space="preserve"> </w:t>
+      </w:r>
+      <w:hyperlink w:anchor="thm-mse-expand">
+        <w:r>
+          <w:rPr>
+            <w:rStyle w:val="Hyperlink"/>
+          </w:rPr>
+          <w:t xml:space="preserve">expansion route</w:t>
+        </w:r>
+      </w:hyperlink>
+      <w:r>
+        <w:t xml:space="preserve">,</w:t>
+      </w:r>
+      <w:r>
+        <w:t xml:space="preserve"> </w:t>
+      </w:r>
+      <w:r>
+        <w:t xml:space="preserve">this proof never expands the square.</w:t>
+      </w:r>
+    </w:p>
+    <w:p>
+      <w:pPr>
+        <w:pStyle w:val="BodyText"/>
+      </w:pPr>
+      <w:r>
+        <w:t xml:space="preserve">Source:</w:t>
+      </w:r>
+      <w:r>
+        <w:t xml:space="preserve"> </w:t>
+      </w:r>
+      <w:r>
+        <w:t xml:space="preserve">Wikipedia contributors [13]</w:t>
+      </w:r>
+      <w:r>
+        <w:t xml:space="preserve">.</w:t>
+      </w:r>
+    </w:p>
+    <w:p>
+      <w:pPr>
+        <w:pStyle w:val="BodyText"/>
       </w:pPr>
       <w:r>
         <w:rPr>
@@ -12252,7 +13079,7 @@
         <w:t xml:space="preserve">so they are equal to each other.</w:t>
       </w:r>
     </w:p>
-    <w:bookmarkStart w:id="72" w:name="rem-mse-bias-variance-prediction"/>
+    <w:bookmarkStart w:id="73" w:name="rem-mse-bias-variance-prediction"/>
     <w:p>
       <w:pPr>
         <w:pStyle w:val="BodyText"/>
@@ -12372,7 +13199,7 @@
       <w:r>
         <w:t xml:space="preserve"> </w:t>
       </w:r>
-      <w:hyperlink r:id="rId69">
+      <w:hyperlink r:id="rId70">
         <w:r>
           <w:rPr>
             <w:rStyle w:val="Hyperlink"/>
@@ -12395,7 +13222,7 @@
       <w:r>
         <w:t xml:space="preserve"> </w:t>
       </w:r>
-      <w:hyperlink r:id="rId70">
+      <w:hyperlink r:id="rId71">
         <w:r>
           <w:rPr>
             <w:rStyle w:val="Hyperlink"/>
@@ -12418,7 +13245,7 @@
       <w:r>
         <w:t xml:space="preserve"> </w:t>
       </w:r>
-      <w:hyperlink r:id="rId71">
+      <w:hyperlink r:id="rId72">
         <w:r>
           <w:rPr>
             <w:rStyle w:val="Hyperlink"/>
@@ -12433,8 +13260,8 @@
         <w:t xml:space="preserve">can remove the extra term.</w:t>
       </w:r>
     </w:p>
-    <w:bookmarkEnd w:id="72"/>
-    <w:bookmarkStart w:id="75" w:name="exm-mse-sample-mean"/>
+    <w:bookmarkEnd w:id="73"/>
+    <w:bookmarkStart w:id="76" w:name="exm-mse-sample-mean"/>
     <w:p>
       <w:pPr>
         <w:pStyle w:val="FirstParagraph"/>
@@ -13846,7 +14673,7 @@
       <w:r>
         <w:t xml:space="preserve"> </w:t>
       </w:r>
-      <w:hyperlink r:id="rId73">
+      <w:hyperlink r:id="rId74">
         <w:r>
           <w:rPr>
             <w:rStyle w:val="Hyperlink"/>
@@ -13904,7 +14731,7 @@
       <w:r>
         <w:t xml:space="preserve"> </w:t>
       </w:r>
-      <w:hyperlink r:id="rId74">
+      <w:hyperlink r:id="rId75">
         <w:r>
           <w:rPr>
             <w:rStyle w:val="Hyperlink"/>
@@ -14196,8 +15023,8 @@
         <w:t xml:space="preserve">’s.</w:t>
       </w:r>
     </w:p>
-    <w:bookmarkEnd w:id="75"/>
-    <w:bookmarkStart w:id="76" w:name="def-rmse"/>
+    <w:bookmarkEnd w:id="76"/>
+    <w:bookmarkStart w:id="77" w:name="def-rmse"/>
     <w:p>
       <w:pPr>
         <w:pStyle w:val="BodyText"/>
@@ -14409,8 +15236,8 @@
         <w:t xml:space="preserve">.</w:t>
       </w:r>
     </w:p>
-    <w:bookmarkEnd w:id="76"/>
-    <w:bookmarkStart w:id="77" w:name="exm-rmse-sample-mean"/>
+    <w:bookmarkEnd w:id="77"/>
+    <w:bookmarkStart w:id="78" w:name="exm-rmse-sample-mean"/>
     <w:p>
       <w:pPr>
         <w:pStyle w:val="BodyText"/>
@@ -14498,8 +15325,8 @@
         <w:t xml:space="preserve">.</w:t>
       </w:r>
     </w:p>
-    <w:bookmarkEnd w:id="77"/>
-    <w:bookmarkStart w:id="78" w:name="rem-rmse-units"/>
+    <w:bookmarkEnd w:id="78"/>
+    <w:bookmarkStart w:id="79" w:name="rem-rmse-units"/>
     <w:p>
       <w:pPr>
         <w:pStyle w:val="BodyText"/>
@@ -14518,7 +15345,7 @@
         <w:t xml:space="preserve">The pRMSE has the same units as the estimand.</w:t>
       </w:r>
     </w:p>
-    <w:bookmarkEnd w:id="78"/>
+    <w:bookmarkEnd w:id="79"/>
     <w:p>
       <w:pPr>
         <w:pStyle w:val="BodyText"/>
@@ -14533,8 +15360,8 @@
         <w:t xml:space="preserve">covers mean squared error.</w:t>
       </w:r>
     </w:p>
-    <w:bookmarkEnd w:id="79"/>
-    <w:bookmarkStart w:id="93" w:name="sec-unbiased-estimators"/>
+    <w:bookmarkEnd w:id="80"/>
+    <w:bookmarkStart w:id="94" w:name="sec-unbiased-estimators"/>
     <w:p>
       <w:pPr>
         <w:pStyle w:val="Heading3"/>
@@ -14543,7 +15370,7 @@
         <w:t xml:space="preserve">3.6 Unbiased estimators</w:t>
       </w:r>
     </w:p>
-    <w:bookmarkStart w:id="80" w:name="def-unbiased"/>
+    <w:bookmarkStart w:id="81" w:name="def-unbiased"/>
     <w:p>
       <w:pPr>
         <w:pStyle w:val="FirstParagraph"/>
@@ -14669,8 +15496,8 @@
         </m:oMath>
       </m:oMathPara>
     </w:p>
-    <w:bookmarkEnd w:id="80"/>
-    <w:bookmarkStart w:id="81" w:name="def-biased"/>
+    <w:bookmarkEnd w:id="81"/>
+    <w:bookmarkStart w:id="82" w:name="def-biased"/>
     <w:p>
       <w:pPr>
         <w:pStyle w:val="FirstParagraph"/>
@@ -14796,8 +15623,8 @@
         </m:oMath>
       </m:oMathPara>
     </w:p>
-    <w:bookmarkEnd w:id="81"/>
-    <w:bookmarkStart w:id="82" w:name="exm-unbiased-sample-mean"/>
+    <w:bookmarkEnd w:id="82"/>
+    <w:bookmarkStart w:id="83" w:name="exm-unbiased-sample-mean"/>
     <w:p>
       <w:pPr>
         <w:pStyle w:val="FirstParagraph"/>
@@ -15011,8 +15838,8 @@
         <w:t xml:space="preserve">.</w:t>
       </w:r>
     </w:p>
-    <w:bookmarkEnd w:id="82"/>
-    <w:bookmarkStart w:id="84" w:name="exm-biased-variance-mle"/>
+    <w:bookmarkEnd w:id="83"/>
+    <w:bookmarkStart w:id="85" w:name="exm-biased-variance-mle"/>
     <w:p>
       <w:pPr>
         <w:pStyle w:val="BodyText"/>
@@ -15190,7 +16017,7 @@
       <w:r>
         <w:t xml:space="preserve"> </w:t>
       </w:r>
-      <w:hyperlink r:id="rId83">
+      <w:hyperlink r:id="rId84">
         <w:r>
           <w:rPr>
             <w:rStyle w:val="Hyperlink"/>
@@ -20388,8 +21215,8 @@
         <w:t xml:space="preserve">grows.</w:t>
       </w:r>
     </w:p>
-    <w:bookmarkEnd w:id="84"/>
-    <w:bookmarkStart w:id="85" w:name="exr-unbiased-exp"/>
+    <w:bookmarkEnd w:id="85"/>
+    <w:bookmarkStart w:id="86" w:name="exr-unbiased-exp"/>
     <w:p>
       <w:pPr>
         <w:pStyle w:val="BodyText"/>
@@ -20521,8 +21348,8 @@
         <w:t xml:space="preserve">.</w:t>
       </w:r>
     </w:p>
-    <w:bookmarkEnd w:id="85"/>
-    <w:bookmarkStart w:id="86" w:name="sol-unbiased-exp"/>
+    <w:bookmarkEnd w:id="86"/>
+    <w:bookmarkStart w:id="87" w:name="sol-unbiased-exp"/>
     <w:p>
       <w:pPr>
         <w:pStyle w:val="BodyText"/>
@@ -20749,8 +21576,8 @@
         <w:t xml:space="preserve">.</w:t>
       </w:r>
     </w:p>
-    <w:bookmarkEnd w:id="86"/>
-    <w:bookmarkStart w:id="87" w:name="exr-unbiased-mse"/>
+    <w:bookmarkEnd w:id="87"/>
+    <w:bookmarkStart w:id="88" w:name="exr-unbiased-mse"/>
     <w:p>
       <w:pPr>
         <w:pStyle w:val="BodyText"/>
@@ -20844,8 +21671,8 @@
         <w:t xml:space="preserve">in terms of its variance.</w:t>
       </w:r>
     </w:p>
-    <w:bookmarkEnd w:id="87"/>
-    <w:bookmarkStart w:id="88" w:name="sol-unbiased-mse"/>
+    <w:bookmarkEnd w:id="88"/>
+    <w:bookmarkStart w:id="89" w:name="sol-unbiased-mse"/>
     <w:p>
       <w:pPr>
         <w:pStyle w:val="BodyText"/>
@@ -21184,8 +22011,8 @@
         </m:oMath>
       </m:oMathPara>
     </w:p>
-    <w:bookmarkEnd w:id="88"/>
-    <w:bookmarkStart w:id="91" w:name="thm-unbiased-props"/>
+    <w:bookmarkEnd w:id="89"/>
+    <w:bookmarkStart w:id="92" w:name="thm-unbiased-props"/>
     <w:p>
       <w:pPr>
         <w:pStyle w:val="FirstParagraph"/>
@@ -21257,7 +22084,7 @@
       <w:pPr>
         <w:pStyle w:val="BodyText"/>
       </w:pPr>
-      <w:bookmarkStart w:id="89" w:name="eq-unbiased-exp"/>
+      <w:bookmarkStart w:id="90" w:name="eq-unbiased-exp"/>
       <m:oMathPara>
         <m:oMathParaPr>
           <m:jc m:val="center"/>
@@ -21325,13 +22152,13 @@
           </m:r>
         </m:oMath>
       </m:oMathPara>
-      <w:bookmarkEnd w:id="89"/>
+      <w:bookmarkEnd w:id="90"/>
     </w:p>
     <w:p>
       <w:pPr>
         <w:pStyle w:val="FirstParagraph"/>
       </w:pPr>
-      <w:bookmarkStart w:id="90" w:name="eq-unbiased-mse"/>
+      <w:bookmarkStart w:id="91" w:name="eq-unbiased-mse"/>
       <m:oMathPara>
         <m:oMathParaPr>
           <m:jc m:val="center"/>
@@ -21427,9 +22254,9 @@
           </m:r>
         </m:oMath>
       </m:oMathPara>
-      <w:bookmarkEnd w:id="90"/>
+      <w:bookmarkEnd w:id="91"/>
     </w:p>
-    <w:bookmarkEnd w:id="91"/>
+    <w:bookmarkEnd w:id="92"/>
     <w:p>
       <w:pPr>
         <w:pStyle w:val="FirstParagraph"/>
@@ -21520,7 +22347,7 @@
       <w:r>
         <w:t xml:space="preserve"> </w:t>
       </w:r>
-      <w:hyperlink r:id="rId92">
+      <w:hyperlink r:id="rId93">
         <w:r>
           <w:rPr>
             <w:rStyle w:val="Hyperlink"/>
@@ -21547,8 +22374,8 @@
         <w:t xml:space="preserve">.</w:t>
       </w:r>
     </w:p>
-    <w:bookmarkEnd w:id="93"/>
-    <w:bookmarkStart w:id="96" w:name="mean-absolute-error"/>
+    <w:bookmarkEnd w:id="94"/>
+    <w:bookmarkStart w:id="97" w:name="mean-absolute-error"/>
     <w:p>
       <w:pPr>
         <w:pStyle w:val="Heading3"/>
@@ -21557,7 +22384,7 @@
         <w:t xml:space="preserve">3.7 Population mean absolute error</w:t>
       </w:r>
     </w:p>
-    <w:bookmarkStart w:id="94" w:name="def-mae"/>
+    <w:bookmarkStart w:id="95" w:name="def-mae"/>
     <w:p>
       <w:pPr>
         <w:pStyle w:val="FirstParagraph"/>
@@ -21785,8 +22612,8 @@
         <w:t xml:space="preserve">.</w:t>
       </w:r>
     </w:p>
-    <w:bookmarkEnd w:id="94"/>
-    <w:bookmarkStart w:id="95" w:name="exm-mae-gaussian"/>
+    <w:bookmarkEnd w:id="95"/>
+    <w:bookmarkStart w:id="96" w:name="exm-mae-gaussian"/>
     <w:p>
       <w:pPr>
         <w:pStyle w:val="BodyText"/>
@@ -24195,9 +25022,9 @@
         <w:t xml:space="preserve">).</w:t>
       </w:r>
     </w:p>
-    <w:bookmarkEnd w:id="95"/>
     <w:bookmarkEnd w:id="96"/>
-    <w:bookmarkStart w:id="110" w:name="standard-error"/>
+    <w:bookmarkEnd w:id="97"/>
+    <w:bookmarkStart w:id="111" w:name="standard-error"/>
     <w:p>
       <w:pPr>
         <w:pStyle w:val="Heading3"/>
@@ -24206,7 +25033,7 @@
         <w:t xml:space="preserve">3.8 Standard error</w:t>
       </w:r>
     </w:p>
-    <w:bookmarkStart w:id="98" w:name="def-SE"/>
+    <w:bookmarkStart w:id="99" w:name="def-SE"/>
     <w:p>
       <w:pPr>
         <w:pStyle w:val="FirstParagraph"/>
@@ -24264,7 +25091,7 @@
       <w:r>
         <w:t xml:space="preserve"> </w:t>
       </w:r>
-      <w:hyperlink r:id="rId97">
+      <w:hyperlink r:id="rId98">
         <w:r>
           <w:rPr>
             <w:rStyle w:val="Hyperlink"/>
@@ -24409,8 +25236,8 @@
         <w:t xml:space="preserve">.</w:t>
       </w:r>
     </w:p>
-    <w:bookmarkEnd w:id="98"/>
-    <w:bookmarkStart w:id="99" w:name="exm-SE-sample-mean"/>
+    <w:bookmarkEnd w:id="99"/>
+    <w:bookmarkStart w:id="100" w:name="exm-SE-sample-mean"/>
     <w:p>
       <w:pPr>
         <w:pStyle w:val="BodyText"/>
@@ -24722,8 +25549,8 @@
         <w:t xml:space="preserve">.</w:t>
       </w:r>
     </w:p>
-    <w:bookmarkEnd w:id="99"/>
-    <w:bookmarkStart w:id="100" w:name="exr-se-error-sd"/>
+    <w:bookmarkEnd w:id="100"/>
+    <w:bookmarkStart w:id="101" w:name="exr-se-error-sd"/>
     <w:p>
       <w:pPr>
         <w:pStyle w:val="BodyText"/>
@@ -24744,7 +25571,7 @@
       <w:r>
         <w:t xml:space="preserve"> </w:t>
       </w:r>
-      <w:hyperlink r:id="rId97">
+      <w:hyperlink r:id="rId98">
         <w:r>
           <w:rPr>
             <w:rStyle w:val="Hyperlink"/>
@@ -24845,8 +25672,8 @@
         <w:t xml:space="preserve">.</w:t>
       </w:r>
     </w:p>
-    <w:bookmarkEnd w:id="100"/>
-    <w:bookmarkStart w:id="101" w:name="sol-se-error-sd"/>
+    <w:bookmarkEnd w:id="101"/>
+    <w:bookmarkStart w:id="102" w:name="sol-se-error-sd"/>
     <w:p>
       <w:pPr>
         <w:pStyle w:val="BodyText"/>
@@ -25213,8 +26040,8 @@
         </m:oMath>
       </m:oMathPara>
     </w:p>
-    <w:bookmarkEnd w:id="101"/>
-    <w:bookmarkStart w:id="102" w:name="thm-se-error-sd"/>
+    <w:bookmarkEnd w:id="102"/>
+    <w:bookmarkStart w:id="103" w:name="thm-se-error-sd"/>
     <w:p>
       <w:pPr>
         <w:pStyle w:val="FirstParagraph"/>
@@ -25328,7 +26155,7 @@
         </m:oMath>
       </m:oMathPara>
     </w:p>
-    <w:bookmarkEnd w:id="102"/>
+    <w:bookmarkEnd w:id="103"/>
     <w:p>
       <w:pPr>
         <w:pStyle w:val="FirstParagraph"/>
@@ -25361,7 +26188,7 @@
         <w:t xml:space="preserve">.</w:t>
       </w:r>
     </w:p>
-    <w:bookmarkStart w:id="103" w:name="rem-standard-error-name"/>
+    <w:bookmarkStart w:id="104" w:name="rem-standard-error-name"/>
     <w:p>
       <w:pPr>
         <w:pStyle w:val="BodyText"/>
@@ -25471,8 +26298,8 @@
         <w:t xml:space="preserve">so they come up often enough to deserve their own name.</w:t>
       </w:r>
     </w:p>
-    <w:bookmarkEnd w:id="103"/>
-    <w:bookmarkStart w:id="104" w:name="exr-var-mse-bias"/>
+    <w:bookmarkEnd w:id="104"/>
+    <w:bookmarkStart w:id="105" w:name="exr-var-mse-bias"/>
     <w:p>
       <w:pPr>
         <w:pStyle w:val="BodyText"/>
@@ -25642,8 +26469,8 @@
         <w:t xml:space="preserve">.</w:t>
       </w:r>
     </w:p>
-    <w:bookmarkEnd w:id="104"/>
-    <w:bookmarkStart w:id="105" w:name="sol-var-mse-bias"/>
+    <w:bookmarkEnd w:id="105"/>
+    <w:bookmarkStart w:id="106" w:name="sol-var-mse-bias"/>
     <w:p>
       <w:pPr>
         <w:pStyle w:val="BodyText"/>
@@ -26570,8 +27397,8 @@
         </m:oMath>
       </m:oMathPara>
     </w:p>
-    <w:bookmarkEnd w:id="105"/>
-    <w:bookmarkStart w:id="106" w:name="cor-var-mse-bias"/>
+    <w:bookmarkEnd w:id="106"/>
+    <w:bookmarkStart w:id="107" w:name="cor-var-mse-bias"/>
     <w:p>
       <w:pPr>
         <w:pStyle w:val="FirstParagraph"/>
@@ -26766,7 +27593,7 @@
         </m:oMath>
       </m:oMathPara>
     </w:p>
-    <w:bookmarkEnd w:id="106"/>
+    <w:bookmarkEnd w:id="107"/>
     <w:p>
       <w:pPr>
         <w:pStyle w:val="FirstParagraph"/>
@@ -26799,7 +27626,7 @@
         <w:t xml:space="preserve">.</w:t>
       </w:r>
     </w:p>
-    <w:bookmarkStart w:id="107" w:name="exr-se-rmse-unbiased"/>
+    <w:bookmarkStart w:id="108" w:name="exr-se-rmse-unbiased"/>
     <w:p>
       <w:pPr>
         <w:pStyle w:val="BodyText"/>
@@ -26907,8 +27734,8 @@
         <w:t xml:space="preserve">.</w:t>
       </w:r>
     </w:p>
-    <w:bookmarkEnd w:id="107"/>
-    <w:bookmarkStart w:id="108" w:name="sol-se-rmse-unbiased"/>
+    <w:bookmarkEnd w:id="108"/>
+    <w:bookmarkStart w:id="109" w:name="sol-se-rmse-unbiased"/>
     <w:p>
       <w:pPr>
         <w:pStyle w:val="BodyText"/>
@@ -27171,8 +27998,8 @@
         </m:oMath>
       </m:oMathPara>
     </w:p>
-    <w:bookmarkEnd w:id="108"/>
-    <w:bookmarkStart w:id="109" w:name="cor-se-rmse-unbiased"/>
+    <w:bookmarkEnd w:id="109"/>
+    <w:bookmarkStart w:id="110" w:name="cor-se-rmse-unbiased"/>
     <w:p>
       <w:pPr>
         <w:pStyle w:val="FirstParagraph"/>
@@ -27330,7 +28157,7 @@
         </m:oMath>
       </m:oMathPara>
     </w:p>
-    <w:bookmarkEnd w:id="109"/>
+    <w:bookmarkEnd w:id="110"/>
     <w:p>
       <w:pPr>
         <w:pStyle w:val="FirstParagraph"/>
@@ -27363,9 +28190,9 @@
         <w:t xml:space="preserve">.</w:t>
       </w:r>
     </w:p>
-    <w:bookmarkEnd w:id="110"/>
     <w:bookmarkEnd w:id="111"/>
-    <w:bookmarkStart w:id="144" w:name="references"/>
+    <w:bookmarkEnd w:id="112"/>
+    <w:bookmarkStart w:id="145" w:name="references"/>
     <w:p>
       <w:pPr>
         <w:pStyle w:val="Heading2"/>
@@ -27374,8 +28201,8 @@
         <w:t xml:space="preserve">References</w:t>
       </w:r>
     </w:p>
-    <w:bookmarkStart w:id="143" w:name="refs"/>
-    <w:bookmarkStart w:id="112" w:name="ref-box_draper_1987"/>
+    <w:bookmarkStart w:id="144" w:name="refs"/>
+    <w:bookmarkStart w:id="113" w:name="ref-box_draper_1987"/>
     <w:p>
       <w:pPr>
         <w:pStyle w:val="Bibliography"/>
@@ -27406,8 +28233,8 @@
         <w:t xml:space="preserve">. in Wiley series in probability and mathematical statistics. Applied probability and statistics. New York: Wiley, 1987.</w:t>
       </w:r>
     </w:p>
-    <w:bookmarkEnd w:id="112"/>
-    <w:bookmarkStart w:id="114" w:name="ref-dunn2018generalized"/>
+    <w:bookmarkEnd w:id="113"/>
+    <w:bookmarkStart w:id="115" w:name="ref-dunn2018generalized"/>
     <w:p>
       <w:pPr>
         <w:pStyle w:val="Bibliography"/>
@@ -27454,7 +28281,7 @@
       <w:r>
         <w:t xml:space="preserve"> </w:t>
       </w:r>
-      <w:hyperlink r:id="rId113">
+      <w:hyperlink r:id="rId114">
         <w:r>
           <w:rPr>
             <w:rStyle w:val="Hyperlink"/>
@@ -27466,8 +28293,8 @@
         <w:t xml:space="preserve">.</w:t>
       </w:r>
     </w:p>
-    <w:bookmarkEnd w:id="114"/>
-    <w:bookmarkStart w:id="116" w:name="ref-van2018flexible"/>
+    <w:bookmarkEnd w:id="115"/>
+    <w:bookmarkStart w:id="117" w:name="ref-van2018flexible"/>
     <w:p>
       <w:pPr>
         <w:pStyle w:val="Bibliography"/>
@@ -27500,7 +28327,7 @@
       <w:r>
         <w:t xml:space="preserve"> </w:t>
       </w:r>
-      <w:hyperlink r:id="rId115">
+      <w:hyperlink r:id="rId116">
         <w:r>
           <w:rPr>
             <w:rStyle w:val="Hyperlink"/>
@@ -27509,8 +28336,8 @@
         </w:r>
       </w:hyperlink>
     </w:p>
-    <w:bookmarkEnd w:id="116"/>
-    <w:bookmarkStart w:id="118" w:name="ref-pohl2021estimands"/>
+    <w:bookmarkEnd w:id="117"/>
+    <w:bookmarkStart w:id="119" w:name="ref-pohl2021estimands"/>
     <w:p>
       <w:pPr>
         <w:pStyle w:val="Bibliography"/>
@@ -27576,7 +28403,7 @@
       <w:r>
         <w:t xml:space="preserve"> </w:t>
       </w:r>
-      <w:hyperlink r:id="rId117">
+      <w:hyperlink r:id="rId118">
         <w:r>
           <w:rPr>
             <w:rStyle w:val="Hyperlink"/>
@@ -27588,8 +28415,8 @@
         <w:t xml:space="preserve">.</w:t>
       </w:r>
     </w:p>
-    <w:bookmarkEnd w:id="118"/>
-    <w:bookmarkStart w:id="120" w:name="ref-lawrance2020estimand"/>
+    <w:bookmarkEnd w:id="119"/>
+    <w:bookmarkStart w:id="121" w:name="ref-lawrance2020estimand"/>
     <w:p>
       <w:pPr>
         <w:pStyle w:val="Bibliography"/>
@@ -27641,7 +28468,7 @@
       <w:r>
         <w:t xml:space="preserve"> </w:t>
       </w:r>
-      <w:hyperlink r:id="rId119">
+      <w:hyperlink r:id="rId120">
         <w:r>
           <w:rPr>
             <w:rStyle w:val="Hyperlink"/>
@@ -27653,8 +28480,8 @@
         <w:t xml:space="preserve">.</w:t>
       </w:r>
     </w:p>
-    <w:bookmarkEnd w:id="120"/>
-    <w:bookmarkStart w:id="122" w:name="ref-wikipedia_estimand"/>
+    <w:bookmarkEnd w:id="121"/>
+    <w:bookmarkStart w:id="123" w:name="ref-wikipedia_estimand"/>
     <w:p>
       <w:pPr>
         <w:pStyle w:val="Bibliography"/>
@@ -27701,7 +28528,7 @@
       <w:r>
         <w:t xml:space="preserve"> </w:t>
       </w:r>
-      <w:hyperlink r:id="rId121">
+      <w:hyperlink r:id="rId122">
         <w:r>
           <w:rPr>
             <w:rStyle w:val="Hyperlink"/>
@@ -27710,8 +28537,8 @@
         </w:r>
       </w:hyperlink>
     </w:p>
-    <w:bookmarkEnd w:id="122"/>
-    <w:bookmarkStart w:id="124" w:name="ref-wikipedia_estimator"/>
+    <w:bookmarkEnd w:id="123"/>
+    <w:bookmarkStart w:id="125" w:name="ref-wikipedia_estimator"/>
     <w:p>
       <w:pPr>
         <w:pStyle w:val="Bibliography"/>
@@ -27758,7 +28585,7 @@
       <w:r>
         <w:t xml:space="preserve"> </w:t>
       </w:r>
-      <w:hyperlink r:id="rId123">
+      <w:hyperlink r:id="rId124">
         <w:r>
           <w:rPr>
             <w:rStyle w:val="Hyperlink"/>
@@ -27767,8 +28594,8 @@
         </w:r>
       </w:hyperlink>
     </w:p>
-    <w:bookmarkEnd w:id="124"/>
-    <w:bookmarkStart w:id="126" w:name="ref-wikipedia_sampling_distribution"/>
+    <w:bookmarkEnd w:id="125"/>
+    <w:bookmarkStart w:id="127" w:name="ref-wikipedia_sampling_distribution"/>
     <w:p>
       <w:pPr>
         <w:pStyle w:val="Bibliography"/>
@@ -27815,7 +28642,7 @@
       <w:r>
         <w:t xml:space="preserve"> </w:t>
       </w:r>
-      <w:hyperlink r:id="rId125">
+      <w:hyperlink r:id="rId126">
         <w:r>
           <w:rPr>
             <w:rStyle w:val="Hyperlink"/>
@@ -27824,8 +28651,8 @@
         </w:r>
       </w:hyperlink>
     </w:p>
-    <w:bookmarkEnd w:id="126"/>
-    <w:bookmarkStart w:id="127" w:name="ref-hoggtanis2015"/>
+    <w:bookmarkEnd w:id="127"/>
+    <w:bookmarkStart w:id="128" w:name="ref-hoggtanis2015"/>
     <w:p>
       <w:pPr>
         <w:pStyle w:val="Bibliography"/>
@@ -27856,8 +28683,8 @@
         <w:t xml:space="preserve">, Tenth edition. Boston: Pearson, 2019.</w:t>
       </w:r>
     </w:p>
-    <w:bookmarkEnd w:id="127"/>
-    <w:bookmarkStart w:id="129" w:name="ref-CaseBerg01"/>
+    <w:bookmarkEnd w:id="128"/>
+    <w:bookmarkStart w:id="130" w:name="ref-CaseBerg01"/>
     <w:p>
       <w:pPr>
         <w:pStyle w:val="Bibliography"/>
@@ -27890,7 +28717,7 @@
       <w:r>
         <w:t xml:space="preserve"> </w:t>
       </w:r>
-      <w:hyperlink r:id="rId128">
+      <w:hyperlink r:id="rId129">
         <w:r>
           <w:rPr>
             <w:rStyle w:val="Hyperlink"/>
@@ -27899,8 +28726,8 @@
         </w:r>
       </w:hyperlink>
     </w:p>
-    <w:bookmarkEnd w:id="129"/>
-    <w:bookmarkStart w:id="130" w:name="ref-rice2007mathematical"/>
+    <w:bookmarkEnd w:id="130"/>
+    <w:bookmarkStart w:id="131" w:name="ref-rice2007mathematical"/>
     <w:p>
       <w:pPr>
         <w:pStyle w:val="Bibliography"/>
@@ -27931,8 +28758,8 @@
         <w:t xml:space="preserve">, 3rd ed. Belmont, CA: Cengage Learning, 2007.</w:t>
       </w:r>
     </w:p>
-    <w:bookmarkEnd w:id="130"/>
-    <w:bookmarkStart w:id="132" w:name="ref-wikipedia_bias_of_an_estimator"/>
+    <w:bookmarkEnd w:id="131"/>
+    <w:bookmarkStart w:id="133" w:name="ref-wikipedia_bias_of_an_estimator"/>
     <w:p>
       <w:pPr>
         <w:pStyle w:val="Bibliography"/>
@@ -27979,7 +28806,7 @@
       <w:r>
         <w:t xml:space="preserve"> </w:t>
       </w:r>
-      <w:hyperlink r:id="rId131">
+      <w:hyperlink r:id="rId132">
         <w:r>
           <w:rPr>
             <w:rStyle w:val="Hyperlink"/>
@@ -27988,8 +28815,8 @@
         </w:r>
       </w:hyperlink>
     </w:p>
-    <w:bookmarkEnd w:id="132"/>
-    <w:bookmarkStart w:id="134" w:name="ref-wikipedia_mean_squared_error"/>
+    <w:bookmarkEnd w:id="133"/>
+    <w:bookmarkStart w:id="135" w:name="ref-wikipedia_mean_squared_error"/>
     <w:p>
       <w:pPr>
         <w:pStyle w:val="Bibliography"/>
@@ -28036,7 +28863,7 @@
       <w:r>
         <w:t xml:space="preserve"> </w:t>
       </w:r>
-      <w:hyperlink r:id="rId133">
+      <w:hyperlink r:id="rId134">
         <w:r>
           <w:rPr>
             <w:rStyle w:val="Hyperlink"/>
@@ -28045,8 +28872,8 @@
         </w:r>
       </w:hyperlink>
     </w:p>
-    <w:bookmarkEnd w:id="134"/>
-    <w:bookmarkStart w:id="136" w:name="ref-wikipedia_root_mean_square_deviation"/>
+    <w:bookmarkEnd w:id="135"/>
+    <w:bookmarkStart w:id="137" w:name="ref-wikipedia_root_mean_square_deviation"/>
     <w:p>
       <w:pPr>
         <w:pStyle w:val="Bibliography"/>
@@ -28093,7 +28920,7 @@
       <w:r>
         <w:t xml:space="preserve"> </w:t>
       </w:r>
-      <w:hyperlink r:id="rId135">
+      <w:hyperlink r:id="rId136">
         <w:r>
           <w:rPr>
             <w:rStyle w:val="Hyperlink"/>
@@ -28102,8 +28929,8 @@
         </w:r>
       </w:hyperlink>
     </w:p>
-    <w:bookmarkEnd w:id="136"/>
-    <w:bookmarkStart w:id="138" w:name="ref-fiveminuteai_probstat"/>
+    <w:bookmarkEnd w:id="137"/>
+    <w:bookmarkStart w:id="139" w:name="ref-fiveminuteai_probstat"/>
     <w:p>
       <w:pPr>
         <w:pStyle w:val="Bibliography"/>
@@ -28135,7 +28962,7 @@
       <w:r>
         <w:t xml:space="preserve"> </w:t>
       </w:r>
-      <w:hyperlink r:id="rId137">
+      <w:hyperlink r:id="rId138">
         <w:r>
           <w:rPr>
             <w:rStyle w:val="Hyperlink"/>
@@ -28144,8 +28971,8 @@
         </w:r>
       </w:hyperlink>
     </w:p>
-    <w:bookmarkEnd w:id="138"/>
-    <w:bookmarkStart w:id="140" w:name="ref-wikipedia_mean_absolute_error"/>
+    <w:bookmarkEnd w:id="139"/>
+    <w:bookmarkStart w:id="141" w:name="ref-wikipedia_mean_absolute_error"/>
     <w:p>
       <w:pPr>
         <w:pStyle w:val="Bibliography"/>
@@ -28192,7 +29019,7 @@
       <w:r>
         <w:t xml:space="preserve"> </w:t>
       </w:r>
-      <w:hyperlink r:id="rId139">
+      <w:hyperlink r:id="rId140">
         <w:r>
           <w:rPr>
             <w:rStyle w:val="Hyperlink"/>
@@ -28201,8 +29028,8 @@
         </w:r>
       </w:hyperlink>
     </w:p>
-    <w:bookmarkEnd w:id="140"/>
-    <w:bookmarkStart w:id="142" w:name="ref-wikipedia_standard_error"/>
+    <w:bookmarkEnd w:id="141"/>
+    <w:bookmarkStart w:id="143" w:name="ref-wikipedia_standard_error"/>
     <w:p>
       <w:pPr>
         <w:pStyle w:val="Bibliography"/>
@@ -28249,7 +29076,7 @@
       <w:r>
         <w:t xml:space="preserve"> </w:t>
       </w:r>
-      <w:hyperlink r:id="rId141">
+      <w:hyperlink r:id="rId142">
         <w:r>
           <w:rPr>
             <w:rStyle w:val="Hyperlink"/>
@@ -28258,9 +29085,9 @@
         </w:r>
       </w:hyperlink>
     </w:p>
-    <w:bookmarkEnd w:id="142"/>
     <w:bookmarkEnd w:id="143"/>
     <w:bookmarkEnd w:id="144"/>
+    <w:bookmarkEnd w:id="145"/>
     <w:sectPr>
       <w:footnotePr>
         <w:numRestart w:val="eachSect"/>

</xml_diff>